<commit_message>
add jwt token to login, update documentation
</commit_message>
<xml_diff>
--- a/szakdolgozat.docx
+++ b/szakdolgozat.docx
@@ -1,6 +1,6 @@
 
 <file path=word/document.xml><?xml version="1.0" encoding="utf-8"?>
-<w:document xmlns:wpc="http://schemas.microsoft.com/office/word/2010/wordprocessingCanvas" xmlns:cx="http://schemas.microsoft.com/office/drawing/2014/chartex" xmlns:cx1="http://schemas.microsoft.com/office/drawing/2015/9/8/chartex" xmlns:cx2="http://schemas.microsoft.com/office/drawing/2015/10/21/chartex" xmlns:cx3="http://schemas.microsoft.com/office/drawing/2016/5/9/chartex" xmlns:cx4="http://schemas.microsoft.com/office/drawing/2016/5/10/chartex" xmlns:cx5="http://schemas.microsoft.com/office/drawing/2016/5/11/chartex" xmlns:cx6="http://schemas.microsoft.com/office/drawing/2016/5/12/chartex" xmlns:cx7="http://schemas.microsoft.com/office/drawing/2016/5/13/chartex" xmlns:cx8="http://schemas.microsoft.com/office/drawing/2016/5/14/chartex" xmlns:mc="http://schemas.openxmlformats.org/markup-compatibility/2006" xmlns:aink="http://schemas.microsoft.com/office/drawing/2016/ink" xmlns:am3d="http://schemas.microsoft.com/office/drawing/2017/model3d" xmlns:o="urn:schemas-microsoft-com:office:office" xmlns:oel="http://schemas.microsoft.com/office/2019/extlst" xmlns:r="http://schemas.openxmlformats.org/officeDocument/2006/relationships" xmlns:m="http://schemas.openxmlformats.org/officeDocument/2006/math" xmlns:v="urn:schemas-microsoft-com:vml" xmlns:wp14="http://schemas.microsoft.com/office/word/2010/wordprocessingDrawing" xmlns:wp="http://schemas.openxmlformats.org/drawingml/2006/wordprocessingDrawing" xmlns:w10="urn:schemas-microsoft-com:office:word" xmlns:w="http://schemas.openxmlformats.org/wordprocessingml/2006/main" xmlns:w14="http://schemas.microsoft.com/office/word/2010/wordml" xmlns:w15="http://schemas.microsoft.com/office/word/2012/wordml" xmlns:w16cex="http://schemas.microsoft.com/office/word/2018/wordml/cex" xmlns:w16cid="http://schemas.microsoft.com/office/word/2016/wordml/cid" xmlns:w16="http://schemas.microsoft.com/office/word/2018/wordml" xmlns:w16du="http://schemas.microsoft.com/office/word/2023/wordml/word16du" xmlns:w16sdtdh="http://schemas.microsoft.com/office/word/2020/wordml/sdtdatahash" xmlns:w16sdtfl="http://schemas.microsoft.com/office/word/2024/wordml/sdtformatlock" xmlns:w16se="http://schemas.microsoft.com/office/word/2015/wordml/symex" xmlns:wpg="http://schemas.microsoft.com/office/word/2010/wordprocessingGroup" xmlns:wpi="http://schemas.microsoft.com/office/word/2010/wordprocessingInk" xmlns:wne="http://schemas.microsoft.com/office/word/2006/wordml" xmlns:wps="http://schemas.microsoft.com/office/word/2010/wordprocessingShape" mc:Ignorable="w14 w15 w16se w16cid w16 w16cex w16sdtdh w16sdtfl w16du wp14">
+<w:document xmlns:wpc="http://schemas.microsoft.com/office/word/2010/wordprocessingCanvas" xmlns:cx="http://schemas.microsoft.com/office/drawing/2014/chartex" xmlns:cx1="http://schemas.microsoft.com/office/drawing/2015/9/8/chartex" xmlns:cx2="http://schemas.microsoft.com/office/drawing/2015/10/21/chartex" xmlns:cx3="http://schemas.microsoft.com/office/drawing/2016/5/9/chartex" xmlns:cx4="http://schemas.microsoft.com/office/drawing/2016/5/10/chartex" xmlns:cx5="http://schemas.microsoft.com/office/drawing/2016/5/11/chartex" xmlns:cx6="http://schemas.microsoft.com/office/drawing/2016/5/12/chartex" xmlns:cx7="http://schemas.microsoft.com/office/drawing/2016/5/13/chartex" xmlns:cx8="http://schemas.microsoft.com/office/drawing/2016/5/14/chartex" xmlns:mc="http://schemas.openxmlformats.org/markup-compatibility/2006" xmlns:aink="http://schemas.microsoft.com/office/drawing/2016/ink" xmlns:am3d="http://schemas.microsoft.com/office/drawing/2017/model3d" xmlns:o="urn:schemas-microsoft-com:office:office" xmlns:oel="http://schemas.microsoft.com/office/2019/extlst" xmlns:r="http://schemas.openxmlformats.org/officeDocument/2006/relationships" xmlns:m="http://schemas.openxmlformats.org/officeDocument/2006/math" xmlns:v="urn:schemas-microsoft-com:vml" xmlns:wp14="http://schemas.microsoft.com/office/word/2010/wordprocessingDrawing" xmlns:wp="http://schemas.openxmlformats.org/drawingml/2006/wordprocessingDrawing" xmlns:w10="urn:schemas-microsoft-com:office:word" xmlns:w="http://schemas.openxmlformats.org/wordprocessingml/2006/main" xmlns:w14="http://schemas.microsoft.com/office/word/2010/wordml" xmlns:w15="http://schemas.microsoft.com/office/word/2012/wordml" xmlns:w16cei="http://schemas.microsoft.com/office/word/2026/wordml/cei" xmlns:w16cex="http://schemas.microsoft.com/office/word/2018/wordml/cex" xmlns:w16cid="http://schemas.microsoft.com/office/word/2016/wordml/cid" xmlns:w16="http://schemas.microsoft.com/office/word/2018/wordml" xmlns:w16du="http://schemas.microsoft.com/office/word/2023/wordml/word16du" xmlns:w16sdtdh="http://schemas.microsoft.com/office/word/2020/wordml/sdtdatahash" xmlns:w16sdtfl="http://schemas.microsoft.com/office/word/2024/wordml/sdtformatlock" xmlns:w16se="http://schemas.microsoft.com/office/word/2015/wordml/symex" xmlns:wpg="http://schemas.microsoft.com/office/word/2010/wordprocessingGroup" xmlns:wpi="http://schemas.microsoft.com/office/word/2010/wordprocessingInk" xmlns:wne="http://schemas.microsoft.com/office/word/2006/wordml" xmlns:wps="http://schemas.microsoft.com/office/word/2010/wordprocessingShape" mc:Ignorable="w14 w15 w16se w16cid w16 w16cex w16sdtdh w16sdtfl w16du wp14">
   <w:body>
     <w:p>
       <w:pPr>
@@ -2419,6 +2419,179 @@
         <w:jc w:val="both"/>
         <w:rPr>
           <w:rFonts w:ascii="Arial" w:hAnsi="Arial" w:cs="Arial"/>
+          <w:sz w:val="28"/>
+          <w:szCs w:val="28"/>
+        </w:rPr>
+      </w:pPr>
+      <w:r>
+        <w:rPr>
+          <w:rFonts w:ascii="Arial" w:hAnsi="Arial" w:cs="Arial"/>
+          <w:sz w:val="28"/>
+          <w:szCs w:val="28"/>
+        </w:rPr>
+        <w:t>2.18. JWT (JSON Web Token)</w:t>
+      </w:r>
+    </w:p>
+    <w:p>
+      <w:pPr>
+        <w:spacing w:line="360" w:lineRule="auto"/>
+        <w:jc w:val="both"/>
+        <w:rPr>
+          <w:rFonts w:ascii="Arial" w:hAnsi="Arial" w:cs="Arial"/>
+        </w:rPr>
+      </w:pPr>
+      <w:r>
+        <w:rPr>
+          <w:rFonts w:ascii="Arial" w:hAnsi="Arial" w:cs="Arial"/>
+        </w:rPr>
+        <w:t xml:space="preserve">A </w:t>
+      </w:r>
+      <w:r>
+        <w:rPr>
+          <w:rFonts w:ascii="Arial" w:hAnsi="Arial" w:cs="Arial"/>
+          <w:i/>
+          <w:iCs/>
+        </w:rPr>
+        <w:t>JWT</w:t>
+      </w:r>
+      <w:r>
+        <w:rPr>
+          <w:rFonts w:ascii="Arial" w:hAnsi="Arial" w:cs="Arial"/>
+        </w:rPr>
+        <w:t xml:space="preserve"> egy nyílt szabvány (RFC 7519), amely lehetővé teszi, hogy a felek egymás között kompakt és önmagában értelmezhető módon, JSON objektumként adjanak át hitelesített adatokat. A token digitálisan alá van írva, így az információ ellenőrizhető és megbízható, az aláírás pedig biztosítja, hogy az üzenet útközben nem módosult. A projektemben a </w:t>
+      </w:r>
+      <w:r>
+        <w:rPr>
+          <w:rFonts w:ascii="Arial" w:hAnsi="Arial" w:cs="Arial"/>
+          <w:i/>
+          <w:iCs/>
+        </w:rPr>
+        <w:t>JWT</w:t>
+      </w:r>
+      <w:r>
+        <w:rPr>
+          <w:rFonts w:ascii="Arial" w:hAnsi="Arial" w:cs="Arial"/>
+        </w:rPr>
+        <w:t>-t a felhasználók hitelesítésére használ</w:t>
+      </w:r>
+      <w:r>
+        <w:rPr>
+          <w:rFonts w:ascii="Arial" w:hAnsi="Arial" w:cs="Arial"/>
+        </w:rPr>
+        <w:t>ta</w:t>
+      </w:r>
+      <w:r>
+        <w:rPr>
+          <w:rFonts w:ascii="Arial" w:hAnsi="Arial" w:cs="Arial"/>
+        </w:rPr>
+        <w:t>m: sikeres bejelentkezés után a szerver egy tokent állít ki, amelyet a kliens ezután minden védett végponthoz tartozó kérésnél a Bearer séma szerint csatol. A szerver oldalon a FastAPI dependency-je ellenőrzi a token érvényességét (aláírás, lejárati idő), és ez alapján azonosítja a kérést küldő felhasználót</w:t>
+      </w:r>
+      <w:r>
+        <w:rPr>
+          <w:rFonts w:ascii="Arial" w:hAnsi="Arial" w:cs="Arial"/>
+        </w:rPr>
+        <w:t>.</w:t>
+      </w:r>
+    </w:p>
+    <w:p>
+      <w:pPr>
+        <w:spacing w:line="360" w:lineRule="auto"/>
+        <w:jc w:val="both"/>
+        <w:rPr>
+          <w:rFonts w:ascii="Arial" w:hAnsi="Arial" w:cs="Arial"/>
+          <w:sz w:val="28"/>
+          <w:szCs w:val="28"/>
+        </w:rPr>
+      </w:pPr>
+      <w:r>
+        <w:rPr>
+          <w:rFonts w:ascii="Arial" w:hAnsi="Arial" w:cs="Arial"/>
+          <w:sz w:val="28"/>
+          <w:szCs w:val="28"/>
+        </w:rPr>
+        <w:lastRenderedPageBreak/>
+        <w:t>2.19. GitHub</w:t>
+      </w:r>
+    </w:p>
+    <w:p>
+      <w:pPr>
+        <w:spacing w:line="360" w:lineRule="auto"/>
+        <w:jc w:val="both"/>
+        <w:rPr>
+          <w:rFonts w:ascii="Arial" w:hAnsi="Arial" w:cs="Arial"/>
+        </w:rPr>
+      </w:pPr>
+      <w:r>
+        <w:rPr>
+          <w:rFonts w:ascii="Arial" w:hAnsi="Arial" w:cs="Arial"/>
+        </w:rPr>
+        <w:t xml:space="preserve">A </w:t>
+      </w:r>
+      <w:r>
+        <w:rPr>
+          <w:rFonts w:ascii="Arial" w:hAnsi="Arial" w:cs="Arial"/>
+          <w:i/>
+          <w:iCs/>
+        </w:rPr>
+        <w:t>GitHub</w:t>
+      </w:r>
+      <w:r>
+        <w:rPr>
+          <w:rFonts w:ascii="Arial" w:hAnsi="Arial" w:cs="Arial"/>
+        </w:rPr>
+        <w:t xml:space="preserve"> egy webalapú platform, amely a </w:t>
+      </w:r>
+      <w:r>
+        <w:rPr>
+          <w:rFonts w:ascii="Arial" w:hAnsi="Arial" w:cs="Arial"/>
+          <w:i/>
+          <w:iCs/>
+        </w:rPr>
+        <w:t>Git</w:t>
+      </w:r>
+      <w:r>
+        <w:rPr>
+          <w:rFonts w:ascii="Arial" w:hAnsi="Arial" w:cs="Arial"/>
+        </w:rPr>
+        <w:t xml:space="preserve"> verziókezelő rendszerre épül, és lehetővé teszi a forráskód tárolását, verzió</w:t>
+      </w:r>
+      <w:r>
+        <w:rPr>
+          <w:rFonts w:ascii="Arial" w:hAnsi="Arial" w:cs="Arial"/>
+        </w:rPr>
+        <w:t>kezelését</w:t>
+      </w:r>
+      <w:r>
+        <w:rPr>
+          <w:rFonts w:ascii="Arial" w:hAnsi="Arial" w:cs="Arial"/>
+        </w:rPr>
+        <w:t xml:space="preserve"> és a csapatmunkát elősegítő funkciók</w:t>
+      </w:r>
+      <w:r>
+        <w:rPr>
+          <w:rFonts w:ascii="Arial" w:hAnsi="Arial" w:cs="Arial"/>
+        </w:rPr>
+        <w:t xml:space="preserve"> </w:t>
+      </w:r>
+      <w:r>
+        <w:rPr>
+          <w:rFonts w:ascii="Arial" w:hAnsi="Arial" w:cs="Arial"/>
+        </w:rPr>
+        <w:t>használatát. A projekt fejlesztése és verziókövetése során a GitHubot használtam a kód tárolására és a változtatások nyomonkövetésére</w:t>
+      </w:r>
+      <w:r>
+        <w:rPr>
+          <w:rFonts w:ascii="Arial" w:hAnsi="Arial" w:cs="Arial"/>
+        </w:rPr>
+        <w:t>.</w:t>
+      </w:r>
+    </w:p>
+    <w:p>
+      <w:pPr>
+        <w:spacing w:line="360" w:lineRule="auto"/>
+        <w:jc w:val="both"/>
+        <w:rPr>
+          <w:rFonts w:ascii="Arial" w:hAnsi="Arial" w:cs="Arial"/>
           <w:b/>
           <w:bCs/>
           <w:sz w:val="32"/>
@@ -2473,9 +2646,8 @@
         <w:rPr>
           <w:noProof/>
         </w:rPr>
-        <w:lastRenderedPageBreak/>
         <w:drawing>
-          <wp:inline distT="0" distB="0" distL="0" distR="0" wp14:anchorId="2B56FBAB" wp14:editId="5E201FA5">
+          <wp:inline distT="0" distB="0" distL="0" distR="0" wp14:anchorId="2B56FBAB" wp14:editId="3FFC7246">
             <wp:extent cx="5760720" cy="3867785"/>
             <wp:effectExtent l="0" t="0" r="0" b="0"/>
             <wp:docPr id="1970030540" name="Picture 1"/>
@@ -2724,7 +2896,14 @@
         <w:rPr>
           <w:rFonts w:ascii="Arial" w:hAnsi="Arial" w:cs="Arial"/>
         </w:rPr>
-        <w:t>azaz a felhasználói fiókokkal kapcsolatos adatok tárolásáért és nyilvántartásáért felelős. A tábla képezi az alkalmazás felhasználókezelési és hitelesítési</w:t>
+        <w:t xml:space="preserve">azaz a felhasználói fiókokkal kapcsolatos adatok tárolásáért és nyilvántartásáért felelős. A tábla képezi az alkalmazás felhasználókezelési és </w:t>
+      </w:r>
+      <w:r>
+        <w:rPr>
+          <w:rFonts w:ascii="Arial" w:hAnsi="Arial" w:cs="Arial"/>
+        </w:rPr>
+        <w:lastRenderedPageBreak/>
+        <w:t>hitelesítési</w:t>
       </w:r>
       <w:r>
         <w:rPr>
@@ -2824,14 +3003,7 @@
         <w:rPr>
           <w:rFonts w:ascii="Arial" w:hAnsi="Arial" w:cs="Arial"/>
         </w:rPr>
-        <w:t xml:space="preserve">amely nemcsak kapcsolattartási célokat szolgál, hanem gyakran a fiók visszaigazolására, jelszó-visszaállítási </w:t>
-      </w:r>
-      <w:r>
-        <w:rPr>
-          <w:rFonts w:ascii="Arial" w:hAnsi="Arial" w:cs="Arial"/>
-        </w:rPr>
-        <w:lastRenderedPageBreak/>
-        <w:t>folyamatok lebonyolítására, illetve a bejelentkezés alternatív módjaként is felhasználásra kerül</w:t>
+        <w:t>amely nemcsak kapcsolattartási célokat szolgál, hanem gyakran a fiók visszaigazolására, jelszó-visszaállítási folyamatok lebonyolítására, illetve a bejelentkezés alternatív módjaként is felhasználásra kerül</w:t>
       </w:r>
       <w:r>
         <w:rPr>
@@ -3064,6 +3236,7 @@
         <w:rPr>
           <w:rFonts w:ascii="Arial" w:hAnsi="Arial" w:cs="Arial"/>
         </w:rPr>
+        <w:lastRenderedPageBreak/>
         <w:t xml:space="preserve">Az </w:t>
       </w:r>
       <w:r>
@@ -3160,90 +3333,312 @@
         <w:rPr>
           <w:rFonts w:ascii="Arial" w:hAnsi="Arial" w:cs="Arial"/>
         </w:rPr>
+        <w:t>A három tábla együttes, relációs adatbázis-modellként történő kezelése biztosítja, hogy az alkalmazás komplex lekérdezések</w:t>
+      </w:r>
+      <w:r>
+        <w:rPr>
+          <w:rFonts w:ascii="Arial" w:hAnsi="Arial" w:cs="Arial"/>
+        </w:rPr>
+        <w:t xml:space="preserve"> </w:t>
+      </w:r>
+      <w:r>
+        <w:rPr>
+          <w:rFonts w:ascii="Arial" w:hAnsi="Arial" w:cs="Arial"/>
+        </w:rPr>
+        <w:t>végrehajtására is képes legyen, anélkül, hogy redundáns adattárolásra lenne szükség.</w:t>
+      </w:r>
+    </w:p>
+    <w:p>
+      <w:pPr>
+        <w:spacing w:line="360" w:lineRule="auto"/>
+        <w:jc w:val="both"/>
+        <w:rPr>
+          <w:rFonts w:ascii="Arial" w:hAnsi="Arial" w:cs="Arial"/>
+        </w:rPr>
+      </w:pPr>
+      <w:r>
+        <w:rPr>
+          <w:rFonts w:ascii="Arial" w:hAnsi="Arial" w:cs="Arial"/>
+        </w:rPr>
+        <w:t>3.2.3. Meglátogatott helyek</w:t>
+      </w:r>
+    </w:p>
+    <w:p>
+      <w:pPr>
+        <w:spacing w:line="360" w:lineRule="auto"/>
+        <w:jc w:val="both"/>
+        <w:rPr>
+          <w:rFonts w:ascii="Arial" w:hAnsi="Arial" w:cs="Arial"/>
+        </w:rPr>
+      </w:pPr>
+      <w:r>
+        <w:rPr>
+          <w:rFonts w:ascii="Arial" w:hAnsi="Arial" w:cs="Arial"/>
+        </w:rPr>
+        <w:t xml:space="preserve">Ez a táblacsoport két táblából áll: </w:t>
+      </w:r>
+      <w:r>
+        <w:rPr>
+          <w:rFonts w:ascii="Arial" w:hAnsi="Arial" w:cs="Arial"/>
+          <w:i/>
+          <w:iCs/>
+        </w:rPr>
+        <w:t>Visited_places</w:t>
+      </w:r>
+      <w:r>
+        <w:rPr>
+          <w:rFonts w:ascii="Arial" w:hAnsi="Arial" w:cs="Arial"/>
+        </w:rPr>
+        <w:t xml:space="preserve"> és </w:t>
+      </w:r>
+      <w:r>
+        <w:rPr>
+          <w:rFonts w:ascii="Arial" w:hAnsi="Arial" w:cs="Arial"/>
+          <w:i/>
+          <w:iCs/>
+        </w:rPr>
+        <w:t>Images</w:t>
+      </w:r>
+      <w:r>
+        <w:rPr>
+          <w:rFonts w:ascii="Arial" w:hAnsi="Arial" w:cs="Arial"/>
+        </w:rPr>
+        <w:t>. E</w:t>
+      </w:r>
+      <w:r>
+        <w:rPr>
+          <w:rFonts w:ascii="Arial" w:hAnsi="Arial" w:cs="Arial"/>
+        </w:rPr>
+        <w:t>zen</w:t>
+      </w:r>
+      <w:r>
+        <w:rPr>
+          <w:rFonts w:ascii="Arial" w:hAnsi="Arial" w:cs="Arial"/>
+        </w:rPr>
+        <w:t xml:space="preserve"> táblák együttesen felelősek a felhasználók korábbi utazásai során bejárt helyszínekre vonatkozó adatok, valamint az azokhoz kapcsolódó fényképek tárolásáért és kezeléséért.</w:t>
+      </w:r>
+    </w:p>
+    <w:p>
+      <w:pPr>
+        <w:spacing w:line="360" w:lineRule="auto"/>
+        <w:jc w:val="both"/>
+        <w:rPr>
+          <w:rFonts w:ascii="Arial" w:hAnsi="Arial" w:cs="Arial"/>
+        </w:rPr>
+      </w:pPr>
+      <w:r>
+        <w:rPr>
+          <w:rFonts w:ascii="Arial" w:hAnsi="Arial" w:cs="Arial"/>
+        </w:rPr>
+        <w:t xml:space="preserve">A </w:t>
+      </w:r>
+      <w:r>
+        <w:rPr>
+          <w:rFonts w:ascii="Arial" w:hAnsi="Arial" w:cs="Arial"/>
+          <w:i/>
+          <w:iCs/>
+        </w:rPr>
+        <w:t>Visited_places</w:t>
+      </w:r>
+      <w:r>
+        <w:rPr>
+          <w:rFonts w:ascii="Arial" w:hAnsi="Arial" w:cs="Arial"/>
+        </w:rPr>
+        <w:t xml:space="preserve"> tábla tartalmazza a meglátogatott helyszínek alapadatait, így többek között a helyszín megnevezését, földrajzi elhelyezkedését, a látogatás időpontját, valamint azt a felhasználót, akihez tartozik. </w:t>
+      </w:r>
+      <w:r>
+        <w:rPr>
+          <w:rFonts w:ascii="Arial" w:hAnsi="Arial" w:cs="Arial"/>
+        </w:rPr>
+        <w:t>Lehetővé teszi</w:t>
+      </w:r>
+      <w:r>
+        <w:rPr>
+          <w:rFonts w:ascii="Arial" w:hAnsi="Arial" w:cs="Arial"/>
+        </w:rPr>
+        <w:t>, hogy az alkalmazás nyilvántartást vezessen arról, hogy egy adott felhasználó mely helyszíneken járt már, ezáltal megalapozva az utazási előzmények, statisztikák vagy</w:t>
+      </w:r>
+      <w:r>
+        <w:rPr>
+          <w:rFonts w:ascii="Arial" w:hAnsi="Arial" w:cs="Arial"/>
+        </w:rPr>
+        <w:t xml:space="preserve"> </w:t>
+      </w:r>
+      <w:r>
+        <w:rPr>
+          <w:rFonts w:ascii="Arial" w:hAnsi="Arial" w:cs="Arial"/>
+        </w:rPr>
+        <w:t xml:space="preserve">személyre szabott </w:t>
+      </w:r>
+      <w:r>
+        <w:rPr>
+          <w:rFonts w:ascii="Arial" w:hAnsi="Arial" w:cs="Arial"/>
+        </w:rPr>
+        <w:t>utazások tervezését</w:t>
+      </w:r>
+      <w:r>
+        <w:rPr>
+          <w:rFonts w:ascii="Arial" w:hAnsi="Arial" w:cs="Arial"/>
+        </w:rPr>
+        <w:t xml:space="preserve"> is.</w:t>
+      </w:r>
+    </w:p>
+    <w:p>
+      <w:pPr>
+        <w:spacing w:line="360" w:lineRule="auto"/>
+        <w:jc w:val="both"/>
+        <w:rPr>
+          <w:rFonts w:ascii="Arial" w:hAnsi="Arial" w:cs="Arial"/>
+        </w:rPr>
+      </w:pPr>
+      <w:r>
+        <w:rPr>
+          <w:rFonts w:ascii="Arial" w:hAnsi="Arial" w:cs="Arial"/>
+        </w:rPr>
+        <w:t xml:space="preserve">Az </w:t>
+      </w:r>
+      <w:r>
+        <w:rPr>
+          <w:rFonts w:ascii="Arial" w:hAnsi="Arial" w:cs="Arial"/>
+          <w:i/>
+          <w:iCs/>
+        </w:rPr>
+        <w:t>Images</w:t>
+      </w:r>
+      <w:r>
+        <w:rPr>
+          <w:rFonts w:ascii="Arial" w:hAnsi="Arial" w:cs="Arial"/>
+        </w:rPr>
+        <w:t xml:space="preserve"> tábla a meglátogatott helyszínekhez feltöltött fényképek metaadatait (fájl elérési útja, feltöltés időpontja) tárolja. </w:t>
+      </w:r>
+    </w:p>
+    <w:p>
+      <w:pPr>
+        <w:spacing w:line="360" w:lineRule="auto"/>
+        <w:jc w:val="both"/>
+        <w:rPr>
+          <w:rFonts w:ascii="Arial" w:hAnsi="Arial" w:cs="Arial"/>
+        </w:rPr>
+      </w:pPr>
+      <w:r>
+        <w:rPr>
+          <w:rFonts w:ascii="Arial" w:hAnsi="Arial" w:cs="Arial"/>
+        </w:rPr>
+        <w:t xml:space="preserve">A két tábla együttes alkalmazása </w:t>
+      </w:r>
+      <w:r>
+        <w:rPr>
+          <w:rFonts w:ascii="Arial" w:hAnsi="Arial" w:cs="Arial"/>
+        </w:rPr>
+        <w:t>által</w:t>
+      </w:r>
+      <w:r>
+        <w:rPr>
+          <w:rFonts w:ascii="Arial" w:hAnsi="Arial" w:cs="Arial"/>
+        </w:rPr>
+        <w:t xml:space="preserve"> a rendszer nemcsak szöveges, hanem képi formában is képes megőrizni és megjeleníteni a felhasználók utazási emlékeit</w:t>
+      </w:r>
+      <w:r>
+        <w:rPr>
+          <w:rFonts w:ascii="Arial" w:hAnsi="Arial" w:cs="Arial"/>
+        </w:rPr>
+        <w:t>.</w:t>
+      </w:r>
+    </w:p>
+    <w:p>
+      <w:pPr>
+        <w:spacing w:line="360" w:lineRule="auto"/>
+        <w:jc w:val="both"/>
+        <w:rPr>
+          <w:rFonts w:ascii="Arial" w:hAnsi="Arial" w:cs="Arial"/>
+        </w:rPr>
+      </w:pPr>
+      <w:r>
+        <w:rPr>
+          <w:rFonts w:ascii="Arial" w:hAnsi="Arial" w:cs="Arial"/>
+        </w:rPr>
+        <w:t>3.2.4. Utazástervezés</w:t>
+      </w:r>
+    </w:p>
+    <w:p>
+      <w:pPr>
+        <w:spacing w:line="360" w:lineRule="auto"/>
+        <w:jc w:val="both"/>
+        <w:rPr>
+          <w:rFonts w:ascii="Arial" w:hAnsi="Arial" w:cs="Arial"/>
+        </w:rPr>
+      </w:pPr>
+      <w:r>
+        <w:rPr>
+          <w:rFonts w:ascii="Arial" w:hAnsi="Arial" w:cs="Arial"/>
+        </w:rPr>
+        <w:t xml:space="preserve">Ez a csoport szintén 2 táblából tevődik össze, Planned_trips és Planned_trip _stops. </w:t>
+      </w:r>
+      <w:r>
+        <w:rPr>
+          <w:rFonts w:ascii="Arial" w:hAnsi="Arial" w:cs="Arial"/>
+        </w:rPr>
+        <w:t>E</w:t>
+      </w:r>
+      <w:r>
+        <w:rPr>
+          <w:rFonts w:ascii="Arial" w:hAnsi="Arial" w:cs="Arial"/>
+        </w:rPr>
+        <w:t>zek</w:t>
+      </w:r>
+      <w:r>
+        <w:rPr>
+          <w:rFonts w:ascii="Arial" w:hAnsi="Arial" w:cs="Arial"/>
+        </w:rPr>
+        <w:t xml:space="preserve"> együttesen felelősek a felhasználók által megtervezett, jövőbeli utazásokra vonatkozó adatok tárolásáért és kezeléséért, ez</w:t>
+      </w:r>
+      <w:r>
+        <w:rPr>
+          <w:rFonts w:ascii="Arial" w:hAnsi="Arial" w:cs="Arial"/>
+        </w:rPr>
+        <w:t>zel</w:t>
+      </w:r>
+      <w:r>
+        <w:rPr>
+          <w:rFonts w:ascii="Arial" w:hAnsi="Arial" w:cs="Arial"/>
+        </w:rPr>
+        <w:t xml:space="preserve"> lehetővé téve az alkalmazás számára az utazástervezési funkciók megvalósítását.</w:t>
+      </w:r>
+    </w:p>
+    <w:p>
+      <w:pPr>
+        <w:spacing w:line="360" w:lineRule="auto"/>
+        <w:jc w:val="both"/>
+        <w:rPr>
+          <w:rFonts w:ascii="Arial" w:hAnsi="Arial" w:cs="Arial"/>
+        </w:rPr>
+      </w:pPr>
+      <w:r>
+        <w:rPr>
+          <w:rFonts w:ascii="Arial" w:hAnsi="Arial" w:cs="Arial"/>
+        </w:rPr>
+        <w:t xml:space="preserve">A </w:t>
+      </w:r>
+      <w:r>
+        <w:rPr>
+          <w:rFonts w:ascii="Arial" w:hAnsi="Arial" w:cs="Arial"/>
+          <w:i/>
+          <w:iCs/>
+        </w:rPr>
+        <w:t>Planned_trips</w:t>
+      </w:r>
+      <w:r>
+        <w:rPr>
+          <w:rFonts w:ascii="Arial" w:hAnsi="Arial" w:cs="Arial"/>
+        </w:rPr>
+        <w:t xml:space="preserve"> tábla tartalmazza a tervezett utazások alapadatait, így többek között az utazás megnevezését, tervezett kezdő és záró dátumát, valamint azt a felhasználót, </w:t>
+      </w:r>
+      <w:r>
+        <w:rPr>
+          <w:rFonts w:ascii="Arial" w:hAnsi="Arial" w:cs="Arial"/>
+        </w:rPr>
         <w:lastRenderedPageBreak/>
-        <w:t>A három tábla együttes, relációs adatbázis-modellként történő kezelése biztosítja, hogy az alkalmazás komplex lekérdezések</w:t>
-      </w:r>
-      <w:r>
-        <w:rPr>
-          <w:rFonts w:ascii="Arial" w:hAnsi="Arial" w:cs="Arial"/>
-        </w:rPr>
-        <w:t xml:space="preserve"> </w:t>
-      </w:r>
-      <w:r>
-        <w:rPr>
-          <w:rFonts w:ascii="Arial" w:hAnsi="Arial" w:cs="Arial"/>
-        </w:rPr>
-        <w:t>végrehajtására is képes legyen, anélkül, hogy redundáns adattárolásra lenne szükség.</w:t>
-      </w:r>
-    </w:p>
-    <w:p>
-      <w:pPr>
-        <w:spacing w:line="360" w:lineRule="auto"/>
-        <w:jc w:val="both"/>
-        <w:rPr>
-          <w:rFonts w:ascii="Arial" w:hAnsi="Arial" w:cs="Arial"/>
-        </w:rPr>
-      </w:pPr>
-      <w:r>
-        <w:rPr>
-          <w:rFonts w:ascii="Arial" w:hAnsi="Arial" w:cs="Arial"/>
-        </w:rPr>
-        <w:t>3.2.3. Meglátogatott helyek</w:t>
-      </w:r>
-    </w:p>
-    <w:p>
-      <w:pPr>
-        <w:spacing w:line="360" w:lineRule="auto"/>
-        <w:jc w:val="both"/>
-        <w:rPr>
-          <w:rFonts w:ascii="Arial" w:hAnsi="Arial" w:cs="Arial"/>
-        </w:rPr>
-      </w:pPr>
-      <w:r>
-        <w:rPr>
-          <w:rFonts w:ascii="Arial" w:hAnsi="Arial" w:cs="Arial"/>
-        </w:rPr>
-        <w:t xml:space="preserve">Ez a táblacsoport két táblából áll: </w:t>
-      </w:r>
-      <w:r>
-        <w:rPr>
-          <w:rFonts w:ascii="Arial" w:hAnsi="Arial" w:cs="Arial"/>
-          <w:i/>
-          <w:iCs/>
-        </w:rPr>
-        <w:t>Visited_places</w:t>
-      </w:r>
-      <w:r>
-        <w:rPr>
-          <w:rFonts w:ascii="Arial" w:hAnsi="Arial" w:cs="Arial"/>
-        </w:rPr>
-        <w:t xml:space="preserve"> és </w:t>
-      </w:r>
-      <w:r>
-        <w:rPr>
-          <w:rFonts w:ascii="Arial" w:hAnsi="Arial" w:cs="Arial"/>
-          <w:i/>
-          <w:iCs/>
-        </w:rPr>
-        <w:t>Images</w:t>
-      </w:r>
-      <w:r>
-        <w:rPr>
-          <w:rFonts w:ascii="Arial" w:hAnsi="Arial" w:cs="Arial"/>
-        </w:rPr>
-        <w:t>. E</w:t>
-      </w:r>
-      <w:r>
-        <w:rPr>
-          <w:rFonts w:ascii="Arial" w:hAnsi="Arial" w:cs="Arial"/>
-        </w:rPr>
-        <w:t>zen</w:t>
-      </w:r>
-      <w:r>
-        <w:rPr>
-          <w:rFonts w:ascii="Arial" w:hAnsi="Arial" w:cs="Arial"/>
-        </w:rPr>
-        <w:t xml:space="preserve"> táblák együttesen felelősek a felhasználók korábbi utazásai során bejárt helyszínekre vonatkozó adatok, valamint az azokhoz kapcsolódó fényképek tárolásáért és kezeléséért.</w:t>
+        <w:t>akihez az adott utazásterv tartozik. Ez a tábla képezi az utazástervezés „fő” egységét, amelyhez a további, részletesebb adatok kapcsolódnak.</w:t>
       </w:r>
     </w:p>
     <w:p>
@@ -3266,222 +3661,6 @@
           <w:i/>
           <w:iCs/>
         </w:rPr>
-        <w:t>Visited_places</w:t>
-      </w:r>
-      <w:r>
-        <w:rPr>
-          <w:rFonts w:ascii="Arial" w:hAnsi="Arial" w:cs="Arial"/>
-        </w:rPr>
-        <w:t xml:space="preserve"> tábla tartalmazza a meglátogatott helyszínek alapadatait, így többek között a helyszín megnevezését, földrajzi elhelyezkedését, a látogatás időpontját, valamint azt a felhasználót, akihez tartozik. </w:t>
-      </w:r>
-      <w:r>
-        <w:rPr>
-          <w:rFonts w:ascii="Arial" w:hAnsi="Arial" w:cs="Arial"/>
-        </w:rPr>
-        <w:t>Lehetővé teszi</w:t>
-      </w:r>
-      <w:r>
-        <w:rPr>
-          <w:rFonts w:ascii="Arial" w:hAnsi="Arial" w:cs="Arial"/>
-        </w:rPr>
-        <w:t>, hogy az alkalmazás nyilvántartást vezessen arról, hogy egy adott felhasználó mely helyszíneken járt már, ezáltal megalapozva az utazási előzmények, statisztikák vagy</w:t>
-      </w:r>
-      <w:r>
-        <w:rPr>
-          <w:rFonts w:ascii="Arial" w:hAnsi="Arial" w:cs="Arial"/>
-        </w:rPr>
-        <w:t xml:space="preserve"> </w:t>
-      </w:r>
-      <w:r>
-        <w:rPr>
-          <w:rFonts w:ascii="Arial" w:hAnsi="Arial" w:cs="Arial"/>
-        </w:rPr>
-        <w:t xml:space="preserve">személyre szabott </w:t>
-      </w:r>
-      <w:r>
-        <w:rPr>
-          <w:rFonts w:ascii="Arial" w:hAnsi="Arial" w:cs="Arial"/>
-        </w:rPr>
-        <w:t>utazások tervezését</w:t>
-      </w:r>
-      <w:r>
-        <w:rPr>
-          <w:rFonts w:ascii="Arial" w:hAnsi="Arial" w:cs="Arial"/>
-        </w:rPr>
-        <w:t xml:space="preserve"> is.</w:t>
-      </w:r>
-    </w:p>
-    <w:p>
-      <w:pPr>
-        <w:spacing w:line="360" w:lineRule="auto"/>
-        <w:jc w:val="both"/>
-        <w:rPr>
-          <w:rFonts w:ascii="Arial" w:hAnsi="Arial" w:cs="Arial"/>
-        </w:rPr>
-      </w:pPr>
-      <w:r>
-        <w:rPr>
-          <w:rFonts w:ascii="Arial" w:hAnsi="Arial" w:cs="Arial"/>
-        </w:rPr>
-        <w:t xml:space="preserve">Az </w:t>
-      </w:r>
-      <w:r>
-        <w:rPr>
-          <w:rFonts w:ascii="Arial" w:hAnsi="Arial" w:cs="Arial"/>
-          <w:i/>
-          <w:iCs/>
-        </w:rPr>
-        <w:t>Images</w:t>
-      </w:r>
-      <w:r>
-        <w:rPr>
-          <w:rFonts w:ascii="Arial" w:hAnsi="Arial" w:cs="Arial"/>
-        </w:rPr>
-        <w:t xml:space="preserve"> tábla a meglátogatott helyszínekhez feltöltött fényképek metaadatait (fájl elérési útja, feltöltés időpontja) tárolja. </w:t>
-      </w:r>
-    </w:p>
-    <w:p>
-      <w:pPr>
-        <w:spacing w:line="360" w:lineRule="auto"/>
-        <w:jc w:val="both"/>
-        <w:rPr>
-          <w:rFonts w:ascii="Arial" w:hAnsi="Arial" w:cs="Arial"/>
-        </w:rPr>
-      </w:pPr>
-      <w:r>
-        <w:rPr>
-          <w:rFonts w:ascii="Arial" w:hAnsi="Arial" w:cs="Arial"/>
-        </w:rPr>
-        <w:t xml:space="preserve">A két tábla együttes alkalmazása </w:t>
-      </w:r>
-      <w:r>
-        <w:rPr>
-          <w:rFonts w:ascii="Arial" w:hAnsi="Arial" w:cs="Arial"/>
-        </w:rPr>
-        <w:t>által</w:t>
-      </w:r>
-      <w:r>
-        <w:rPr>
-          <w:rFonts w:ascii="Arial" w:hAnsi="Arial" w:cs="Arial"/>
-        </w:rPr>
-        <w:t xml:space="preserve"> a rendszer nemcsak szöveges, hanem képi formában is képes megőrizni és megjeleníteni a felhasználók utazási emlékeit</w:t>
-      </w:r>
-      <w:r>
-        <w:rPr>
-          <w:rFonts w:ascii="Arial" w:hAnsi="Arial" w:cs="Arial"/>
-        </w:rPr>
-        <w:t>.</w:t>
-      </w:r>
-    </w:p>
-    <w:p>
-      <w:pPr>
-        <w:spacing w:line="360" w:lineRule="auto"/>
-        <w:jc w:val="both"/>
-        <w:rPr>
-          <w:rFonts w:ascii="Arial" w:hAnsi="Arial" w:cs="Arial"/>
-        </w:rPr>
-      </w:pPr>
-      <w:r>
-        <w:rPr>
-          <w:rFonts w:ascii="Arial" w:hAnsi="Arial" w:cs="Arial"/>
-        </w:rPr>
-        <w:t>3.2.4. Utazástervezés</w:t>
-      </w:r>
-    </w:p>
-    <w:p>
-      <w:pPr>
-        <w:spacing w:line="360" w:lineRule="auto"/>
-        <w:jc w:val="both"/>
-        <w:rPr>
-          <w:rFonts w:ascii="Arial" w:hAnsi="Arial" w:cs="Arial"/>
-        </w:rPr>
-      </w:pPr>
-      <w:r>
-        <w:rPr>
-          <w:rFonts w:ascii="Arial" w:hAnsi="Arial" w:cs="Arial"/>
-        </w:rPr>
-        <w:t xml:space="preserve">Ez a csoport szintén 2 táblából tevődik össze, Planned_trips és Planned_trip _stops. </w:t>
-      </w:r>
-      <w:r>
-        <w:rPr>
-          <w:rFonts w:ascii="Arial" w:hAnsi="Arial" w:cs="Arial"/>
-        </w:rPr>
-        <w:t>E</w:t>
-      </w:r>
-      <w:r>
-        <w:rPr>
-          <w:rFonts w:ascii="Arial" w:hAnsi="Arial" w:cs="Arial"/>
-        </w:rPr>
-        <w:t>zek</w:t>
-      </w:r>
-      <w:r>
-        <w:rPr>
-          <w:rFonts w:ascii="Arial" w:hAnsi="Arial" w:cs="Arial"/>
-        </w:rPr>
-        <w:t xml:space="preserve"> együttesen felelősek a felhasználók által megtervezett, jövőbeli utazásokra vonatkozó adatok tárolásáért és kezeléséért, ez</w:t>
-      </w:r>
-      <w:r>
-        <w:rPr>
-          <w:rFonts w:ascii="Arial" w:hAnsi="Arial" w:cs="Arial"/>
-        </w:rPr>
-        <w:t>zel</w:t>
-      </w:r>
-      <w:r>
-        <w:rPr>
-          <w:rFonts w:ascii="Arial" w:hAnsi="Arial" w:cs="Arial"/>
-        </w:rPr>
-        <w:t xml:space="preserve"> lehetővé téve az alkalmazás számára az utazástervezési funkciók megvalósítását.</w:t>
-      </w:r>
-    </w:p>
-    <w:p>
-      <w:pPr>
-        <w:spacing w:line="360" w:lineRule="auto"/>
-        <w:jc w:val="both"/>
-        <w:rPr>
-          <w:rFonts w:ascii="Arial" w:hAnsi="Arial" w:cs="Arial"/>
-        </w:rPr>
-      </w:pPr>
-      <w:r>
-        <w:rPr>
-          <w:rFonts w:ascii="Arial" w:hAnsi="Arial" w:cs="Arial"/>
-        </w:rPr>
-        <w:t xml:space="preserve">A </w:t>
-      </w:r>
-      <w:r>
-        <w:rPr>
-          <w:rFonts w:ascii="Arial" w:hAnsi="Arial" w:cs="Arial"/>
-          <w:i/>
-          <w:iCs/>
-        </w:rPr>
-        <w:t>Planned_trips</w:t>
-      </w:r>
-      <w:r>
-        <w:rPr>
-          <w:rFonts w:ascii="Arial" w:hAnsi="Arial" w:cs="Arial"/>
-        </w:rPr>
-        <w:t xml:space="preserve"> tábla tartalmazza a tervezett utazások alapadatait, így többek között az utazás megnevezését, tervezett kezdő és záró dátumát, valamint azt a felhasználót, akihez az adott utazásterv tartozik. Ez a tábla képezi az utazástervezés „fő” egységét, amelyhez a további, részletesebb adatok kapcsolódnak.</w:t>
-      </w:r>
-    </w:p>
-    <w:p>
-      <w:pPr>
-        <w:spacing w:line="360" w:lineRule="auto"/>
-        <w:jc w:val="both"/>
-        <w:rPr>
-          <w:rFonts w:ascii="Arial" w:hAnsi="Arial" w:cs="Arial"/>
-        </w:rPr>
-      </w:pPr>
-      <w:r>
-        <w:rPr>
-          <w:rFonts w:ascii="Arial" w:hAnsi="Arial" w:cs="Arial"/>
-        </w:rPr>
-        <w:t xml:space="preserve">A </w:t>
-      </w:r>
-      <w:r>
-        <w:rPr>
-          <w:rFonts w:ascii="Arial" w:hAnsi="Arial" w:cs="Arial"/>
-          <w:i/>
-          <w:iCs/>
-        </w:rPr>
         <w:t>Planned_trip_stops</w:t>
       </w:r>
       <w:r>
@@ -3554,7 +3733,6 @@
         <w:rPr>
           <w:rFonts w:ascii="Arial" w:hAnsi="Arial" w:cs="Arial"/>
         </w:rPr>
-        <w:lastRenderedPageBreak/>
         <w:t xml:space="preserve">Ez a táblacsoport felelős a korábban megtervezett utazások megosztásának funkcionalitásáért, 2 táblából épül fel: </w:t>
       </w:r>
       <w:r>
@@ -3803,6 +3981,7 @@
         <w:rPr>
           <w:rFonts w:ascii="Arial" w:hAnsi="Arial" w:cs="Arial"/>
         </w:rPr>
+        <w:lastRenderedPageBreak/>
         <w:t>Users-Visited_places: e</w:t>
       </w:r>
       <w:r>
@@ -3953,7 +4132,6 @@
         <w:rPr>
           <w:rFonts w:ascii="Arial" w:hAnsi="Arial" w:cs="Arial"/>
         </w:rPr>
-        <w:lastRenderedPageBreak/>
         <w:t>Users</w:t>
       </w:r>
       <w:r>
@@ -4419,19 +4597,147 @@
         <w:rPr>
           <w:rFonts w:ascii="Arial" w:hAnsi="Arial" w:cs="Arial"/>
         </w:rPr>
+        <w:t>Visited_places-Images</w:t>
+      </w:r>
+      <w:r>
+        <w:rPr>
+          <w:rFonts w:ascii="Arial" w:hAnsi="Arial" w:cs="Arial"/>
+        </w:rPr>
+        <w:t xml:space="preserve">: </w:t>
+      </w:r>
+      <w:r>
+        <w:rPr>
+          <w:rFonts w:ascii="Arial" w:hAnsi="Arial" w:cs="Arial"/>
+        </w:rPr>
+        <w:t>a</w:t>
+      </w:r>
+      <w:r>
+        <w:rPr>
+          <w:rFonts w:ascii="Arial" w:hAnsi="Arial" w:cs="Arial"/>
+        </w:rPr>
+        <w:t xml:space="preserve">z </w:t>
+      </w:r>
+      <w:r>
+        <w:rPr>
+          <w:rFonts w:ascii="Arial" w:hAnsi="Arial" w:cs="Arial"/>
+          <w:i/>
+          <w:iCs/>
+        </w:rPr>
+        <w:t>Images</w:t>
+      </w:r>
+      <w:r>
+        <w:rPr>
+          <w:rFonts w:ascii="Arial" w:hAnsi="Arial" w:cs="Arial"/>
+        </w:rPr>
+        <w:t xml:space="preserve"> tábla a meglátogatott helyekhez tartozó fényképeket tárolja</w:t>
+      </w:r>
+      <w:r>
+        <w:rPr>
+          <w:rFonts w:ascii="Arial" w:hAnsi="Arial" w:cs="Arial"/>
+        </w:rPr>
+        <w:t>.</w:t>
+      </w:r>
+      <w:r>
+        <w:rPr>
+          <w:rFonts w:ascii="Arial" w:hAnsi="Arial" w:cs="Arial"/>
+        </w:rPr>
+        <w:t xml:space="preserve"> </w:t>
+      </w:r>
+      <w:r>
+        <w:rPr>
+          <w:rFonts w:ascii="Arial" w:hAnsi="Arial" w:cs="Arial"/>
+        </w:rPr>
+        <w:t>E</w:t>
+      </w:r>
+      <w:r>
+        <w:rPr>
+          <w:rFonts w:ascii="Arial" w:hAnsi="Arial" w:cs="Arial"/>
+        </w:rPr>
+        <w:t xml:space="preserve">gy adott hely tetszőleges számú képpel rendelkezhet, </w:t>
+      </w:r>
+      <w:r>
+        <w:rPr>
+          <w:rFonts w:ascii="Arial" w:hAnsi="Arial" w:cs="Arial"/>
+        </w:rPr>
+        <w:t>de</w:t>
+      </w:r>
+      <w:r>
+        <w:rPr>
+          <w:rFonts w:ascii="Arial" w:hAnsi="Arial" w:cs="Arial"/>
+        </w:rPr>
+        <w:t xml:space="preserve"> minden kép egyetlen helyhez van hozzárendelve. Ezt a hozzárendelést az </w:t>
+      </w:r>
+      <w:r>
+        <w:rPr>
+          <w:rFonts w:ascii="Arial" w:hAnsi="Arial" w:cs="Arial"/>
+          <w:i/>
+          <w:iCs/>
+        </w:rPr>
+        <w:t>Images</w:t>
+      </w:r>
+      <w:r>
+        <w:rPr>
+          <w:rFonts w:ascii="Arial" w:hAnsi="Arial" w:cs="Arial"/>
+        </w:rPr>
+        <w:t xml:space="preserve"> tábla </w:t>
+      </w:r>
+      <w:r>
+        <w:rPr>
+          <w:rFonts w:ascii="Arial" w:hAnsi="Arial" w:cs="Arial"/>
+          <w:i/>
+          <w:iCs/>
+        </w:rPr>
+        <w:lastRenderedPageBreak/>
+        <w:t>visited_place_id</w:t>
+      </w:r>
+      <w:r>
+        <w:rPr>
+          <w:rFonts w:ascii="Arial" w:hAnsi="Arial" w:cs="Arial"/>
+        </w:rPr>
+        <w:t xml:space="preserve"> idegen kulcsa biztosítja, amely a </w:t>
+      </w:r>
+      <w:r>
+        <w:rPr>
+          <w:rFonts w:ascii="Arial" w:hAnsi="Arial" w:cs="Arial"/>
+          <w:i/>
+          <w:iCs/>
+        </w:rPr>
         <w:t>Visited_places</w:t>
       </w:r>
       <w:r>
         <w:rPr>
           <w:rFonts w:ascii="Arial" w:hAnsi="Arial" w:cs="Arial"/>
         </w:rPr>
-        <w:t>-</w:t>
-      </w:r>
-      <w:r>
-        <w:rPr>
-          <w:rFonts w:ascii="Arial" w:hAnsi="Arial" w:cs="Arial"/>
-        </w:rPr>
-        <w:t>Images</w:t>
+        <w:t xml:space="preserve"> tábla </w:t>
+      </w:r>
+      <w:r>
+        <w:rPr>
+          <w:rFonts w:ascii="Arial" w:hAnsi="Arial" w:cs="Arial"/>
+          <w:i/>
+          <w:iCs/>
+        </w:rPr>
+        <w:t>id</w:t>
+      </w:r>
+      <w:r>
+        <w:rPr>
+          <w:rFonts w:ascii="Arial" w:hAnsi="Arial" w:cs="Arial"/>
+        </w:rPr>
+        <w:t xml:space="preserve"> mezőjére mutat.</w:t>
+      </w:r>
+    </w:p>
+    <w:p>
+      <w:pPr>
+        <w:spacing w:line="360" w:lineRule="auto"/>
+        <w:jc w:val="both"/>
+        <w:rPr>
+          <w:rFonts w:ascii="Arial" w:hAnsi="Arial" w:cs="Arial"/>
+        </w:rPr>
+      </w:pPr>
+      <w:r>
+        <w:rPr>
+          <w:rFonts w:ascii="Arial" w:hAnsi="Arial" w:cs="Arial"/>
+        </w:rPr>
+        <w:t>Planned_trips-Planned_trip_stops</w:t>
       </w:r>
       <w:r>
         <w:rPr>
@@ -4443,71 +4749,61 @@
         <w:rPr>
           <w:rFonts w:ascii="Arial" w:hAnsi="Arial" w:cs="Arial"/>
         </w:rPr>
-        <w:t>a</w:t>
-      </w:r>
-      <w:r>
-        <w:rPr>
-          <w:rFonts w:ascii="Arial" w:hAnsi="Arial" w:cs="Arial"/>
-        </w:rPr>
-        <w:t xml:space="preserve">z </w:t>
-      </w:r>
-      <w:r>
-        <w:rPr>
-          <w:rFonts w:ascii="Arial" w:hAnsi="Arial" w:cs="Arial"/>
-          <w:i/>
-          <w:iCs/>
-        </w:rPr>
-        <w:t>Images</w:t>
-      </w:r>
-      <w:r>
-        <w:rPr>
-          <w:rFonts w:ascii="Arial" w:hAnsi="Arial" w:cs="Arial"/>
-        </w:rPr>
-        <w:t xml:space="preserve"> tábla a meglátogatott helyekhez tartozó fényképeket tárolja</w:t>
-      </w:r>
-      <w:r>
-        <w:rPr>
-          <w:rFonts w:ascii="Arial" w:hAnsi="Arial" w:cs="Arial"/>
-        </w:rPr>
-        <w:t>.</w:t>
-      </w:r>
-      <w:r>
-        <w:rPr>
-          <w:rFonts w:ascii="Arial" w:hAnsi="Arial" w:cs="Arial"/>
-        </w:rPr>
-        <w:t xml:space="preserve"> </w:t>
-      </w:r>
-      <w:r>
-        <w:rPr>
-          <w:rFonts w:ascii="Arial" w:hAnsi="Arial" w:cs="Arial"/>
-        </w:rPr>
-        <w:t>E</w:t>
-      </w:r>
-      <w:r>
-        <w:rPr>
-          <w:rFonts w:ascii="Arial" w:hAnsi="Arial" w:cs="Arial"/>
-        </w:rPr>
-        <w:t xml:space="preserve">gy adott hely tetszőleges számú képpel rendelkezhet, </w:t>
-      </w:r>
-      <w:r>
-        <w:rPr>
-          <w:rFonts w:ascii="Arial" w:hAnsi="Arial" w:cs="Arial"/>
-        </w:rPr>
-        <w:t>de</w:t>
-      </w:r>
-      <w:r>
-        <w:rPr>
-          <w:rFonts w:ascii="Arial" w:hAnsi="Arial" w:cs="Arial"/>
-        </w:rPr>
-        <w:t xml:space="preserve"> minden kép egyetlen helyhez van hozzárendelve. Ezt a hozzárendelést az </w:t>
-      </w:r>
-      <w:r>
-        <w:rPr>
-          <w:rFonts w:ascii="Arial" w:hAnsi="Arial" w:cs="Arial"/>
-          <w:i/>
-          <w:iCs/>
-        </w:rPr>
-        <w:t>Images</w:t>
+        <w:t>e</w:t>
+      </w:r>
+      <w:r>
+        <w:rPr>
+          <w:rFonts w:ascii="Arial" w:hAnsi="Arial" w:cs="Arial"/>
+        </w:rPr>
+        <w:t>gy tervezett utazás jellemzően több állomásból épül fel, amelyek együttesen alkotják az útitervet</w:t>
+      </w:r>
+      <w:r>
+        <w:rPr>
+          <w:rFonts w:ascii="Arial" w:hAnsi="Arial" w:cs="Arial"/>
+        </w:rPr>
+        <w:t xml:space="preserve">, </w:t>
+      </w:r>
+      <w:r>
+        <w:rPr>
+          <w:rFonts w:ascii="Arial" w:hAnsi="Arial" w:cs="Arial"/>
+        </w:rPr>
+        <w:t xml:space="preserve">ezt fejezi ki a </w:t>
+      </w:r>
+      <w:r>
+        <w:rPr>
+          <w:rFonts w:ascii="Arial" w:hAnsi="Arial" w:cs="Arial"/>
+          <w:i/>
+          <w:iCs/>
+        </w:rPr>
+        <w:t>Planned_trips</w:t>
+      </w:r>
+      <w:r>
+        <w:rPr>
+          <w:rFonts w:ascii="Arial" w:hAnsi="Arial" w:cs="Arial"/>
+        </w:rPr>
+        <w:t xml:space="preserve"> és a </w:t>
+      </w:r>
+      <w:r>
+        <w:rPr>
+          <w:rFonts w:ascii="Arial" w:hAnsi="Arial" w:cs="Arial"/>
+          <w:i/>
+          <w:iCs/>
+        </w:rPr>
+        <w:t>Planned_trip_stops</w:t>
+      </w:r>
+      <w:r>
+        <w:rPr>
+          <w:rFonts w:ascii="Arial" w:hAnsi="Arial" w:cs="Arial"/>
+        </w:rPr>
+        <w:t xml:space="preserve"> táblák közötti kapcsolat, ahol egy utazáshoz tetszőlegesen sok állomás tartozhat, fordítva viszont minden állomás pontosan egyetlen utazás része. A kapcsolatot a </w:t>
+      </w:r>
+      <w:r>
+        <w:rPr>
+          <w:rFonts w:ascii="Arial" w:hAnsi="Arial" w:cs="Arial"/>
+          <w:i/>
+          <w:iCs/>
+        </w:rPr>
+        <w:t>Planned_trip_stops</w:t>
       </w:r>
       <w:r>
         <w:rPr>
@@ -4521,147 +4817,6 @@
           <w:i/>
           <w:iCs/>
         </w:rPr>
-        <w:t>visited_place_id</w:t>
-      </w:r>
-      <w:r>
-        <w:rPr>
-          <w:rFonts w:ascii="Arial" w:hAnsi="Arial" w:cs="Arial"/>
-        </w:rPr>
-        <w:t xml:space="preserve"> idegen kulcsa biztosítja, amely a </w:t>
-      </w:r>
-      <w:r>
-        <w:rPr>
-          <w:rFonts w:ascii="Arial" w:hAnsi="Arial" w:cs="Arial"/>
-          <w:i/>
-          <w:iCs/>
-        </w:rPr>
-        <w:t>Visited_places</w:t>
-      </w:r>
-      <w:r>
-        <w:rPr>
-          <w:rFonts w:ascii="Arial" w:hAnsi="Arial" w:cs="Arial"/>
-        </w:rPr>
-        <w:t xml:space="preserve"> tábla </w:t>
-      </w:r>
-      <w:r>
-        <w:rPr>
-          <w:rFonts w:ascii="Arial" w:hAnsi="Arial" w:cs="Arial"/>
-          <w:i/>
-          <w:iCs/>
-        </w:rPr>
-        <w:t>id</w:t>
-      </w:r>
-      <w:r>
-        <w:rPr>
-          <w:rFonts w:ascii="Arial" w:hAnsi="Arial" w:cs="Arial"/>
-        </w:rPr>
-        <w:t xml:space="preserve"> mezőjére mutat.</w:t>
-      </w:r>
-    </w:p>
-    <w:p>
-      <w:pPr>
-        <w:spacing w:line="360" w:lineRule="auto"/>
-        <w:jc w:val="both"/>
-        <w:rPr>
-          <w:rFonts w:ascii="Arial" w:hAnsi="Arial" w:cs="Arial"/>
-        </w:rPr>
-      </w:pPr>
-      <w:r>
-        <w:rPr>
-          <w:rFonts w:ascii="Arial" w:hAnsi="Arial" w:cs="Arial"/>
-        </w:rPr>
-        <w:t>Planned_trips</w:t>
-      </w:r>
-      <w:r>
-        <w:rPr>
-          <w:rFonts w:ascii="Arial" w:hAnsi="Arial" w:cs="Arial"/>
-        </w:rPr>
-        <w:t>-</w:t>
-      </w:r>
-      <w:r>
-        <w:rPr>
-          <w:rFonts w:ascii="Arial" w:hAnsi="Arial" w:cs="Arial"/>
-        </w:rPr>
-        <w:t>Planned_trip_stops</w:t>
-      </w:r>
-      <w:r>
-        <w:rPr>
-          <w:rFonts w:ascii="Arial" w:hAnsi="Arial" w:cs="Arial"/>
-        </w:rPr>
-        <w:t xml:space="preserve">: </w:t>
-      </w:r>
-      <w:r>
-        <w:rPr>
-          <w:rFonts w:ascii="Arial" w:hAnsi="Arial" w:cs="Arial"/>
-        </w:rPr>
-        <w:t>e</w:t>
-      </w:r>
-      <w:r>
-        <w:rPr>
-          <w:rFonts w:ascii="Arial" w:hAnsi="Arial" w:cs="Arial"/>
-        </w:rPr>
-        <w:t>gy tervezett utazás jellemzően több állomásból épül fel, amelyek együttesen alkotják az útitervet</w:t>
-      </w:r>
-      <w:r>
-        <w:rPr>
-          <w:rFonts w:ascii="Arial" w:hAnsi="Arial" w:cs="Arial"/>
-        </w:rPr>
-        <w:t xml:space="preserve">, </w:t>
-      </w:r>
-      <w:r>
-        <w:rPr>
-          <w:rFonts w:ascii="Arial" w:hAnsi="Arial" w:cs="Arial"/>
-        </w:rPr>
-        <w:t xml:space="preserve">ezt fejezi ki a </w:t>
-      </w:r>
-      <w:r>
-        <w:rPr>
-          <w:rFonts w:ascii="Arial" w:hAnsi="Arial" w:cs="Arial"/>
-          <w:i/>
-          <w:iCs/>
-        </w:rPr>
-        <w:t>Planned_trips</w:t>
-      </w:r>
-      <w:r>
-        <w:rPr>
-          <w:rFonts w:ascii="Arial" w:hAnsi="Arial" w:cs="Arial"/>
-        </w:rPr>
-        <w:t xml:space="preserve"> és a </w:t>
-      </w:r>
-      <w:r>
-        <w:rPr>
-          <w:rFonts w:ascii="Arial" w:hAnsi="Arial" w:cs="Arial"/>
-          <w:i/>
-          <w:iCs/>
-        </w:rPr>
-        <w:t>Planned_trip_stops</w:t>
-      </w:r>
-      <w:r>
-        <w:rPr>
-          <w:rFonts w:ascii="Arial" w:hAnsi="Arial" w:cs="Arial"/>
-        </w:rPr>
-        <w:t xml:space="preserve"> táblák közötti kapcsolat, ahol egy utazáshoz tetszőlegesen sok állomás tartozhat, fordítva viszont minden állomás pontosan egyetlen utazás része. A kapcsolatot a </w:t>
-      </w:r>
-      <w:r>
-        <w:rPr>
-          <w:rFonts w:ascii="Arial" w:hAnsi="Arial" w:cs="Arial"/>
-          <w:i/>
-          <w:iCs/>
-        </w:rPr>
-        <w:t>Planned_trip_stops</w:t>
-      </w:r>
-      <w:r>
-        <w:rPr>
-          <w:rFonts w:ascii="Arial" w:hAnsi="Arial" w:cs="Arial"/>
-        </w:rPr>
-        <w:t xml:space="preserve"> tábla </w:t>
-      </w:r>
-      <w:r>
-        <w:rPr>
-          <w:rFonts w:ascii="Arial" w:hAnsi="Arial" w:cs="Arial"/>
-          <w:i/>
-          <w:iCs/>
-        </w:rPr>
         <w:t>trip_id</w:t>
       </w:r>
       <w:r>
@@ -4683,20 +4838,7 @@
         <w:rPr>
           <w:rFonts w:ascii="Arial" w:hAnsi="Arial" w:cs="Arial"/>
         </w:rPr>
-        <w:lastRenderedPageBreak/>
-        <w:t>Planned_trips</w:t>
-      </w:r>
-      <w:r>
-        <w:rPr>
-          <w:rFonts w:ascii="Arial" w:hAnsi="Arial" w:cs="Arial"/>
-        </w:rPr>
-        <w:t>-</w:t>
-      </w:r>
-      <w:r>
-        <w:rPr>
-          <w:rFonts w:ascii="Arial" w:hAnsi="Arial" w:cs="Arial"/>
-        </w:rPr>
-        <w:t>Trip_share_links</w:t>
+        <w:t>Planned_trips-Trip_share_links</w:t>
       </w:r>
       <w:r>
         <w:rPr>
@@ -4723,19 +4865,7 @@
         <w:rPr>
           <w:rFonts w:ascii="Arial" w:hAnsi="Arial" w:cs="Arial"/>
         </w:rPr>
-        <w:t>Planned_trips</w:t>
-      </w:r>
-      <w:r>
-        <w:rPr>
-          <w:rFonts w:ascii="Arial" w:hAnsi="Arial" w:cs="Arial"/>
-        </w:rPr>
-        <w:t>-</w:t>
-      </w:r>
-      <w:r>
-        <w:rPr>
-          <w:rFonts w:ascii="Arial" w:hAnsi="Arial" w:cs="Arial"/>
-        </w:rPr>
-        <w:t>Trip_share_invitations</w:t>
+        <w:t>Planned_trips-Trip_share_invitations</w:t>
       </w:r>
       <w:r>
         <w:rPr>
@@ -5133,6 +5263,7 @@
         <w:rPr>
           <w:rFonts w:ascii="Arial" w:hAnsi="Arial" w:cs="Arial"/>
         </w:rPr>
+        <w:lastRenderedPageBreak/>
         <w:t xml:space="preserve">A kérések feldolgozása során a kliens először egy API végpontot hív meg, ami a megfelelő szolgáltatásnak továbbítja a kérést. </w:t>
       </w:r>
       <w:r>
@@ -5210,7 +5341,6 @@
           <w:rFonts w:ascii="Arial" w:hAnsi="Arial" w:cs="Arial"/>
           <w:noProof/>
         </w:rPr>
-        <w:lastRenderedPageBreak/>
         <w:drawing>
           <wp:inline distT="0" distB="0" distL="0" distR="0" wp14:anchorId="6CF7B5B3" wp14:editId="7AEC4B84">
             <wp:extent cx="5760720" cy="2769235"/>
@@ -5615,6 +5745,7 @@
         <w:rPr>
           <w:rFonts w:ascii="Arial" w:hAnsi="Arial" w:cs="Arial"/>
         </w:rPr>
+        <w:lastRenderedPageBreak/>
         <w:t xml:space="preserve">A térképes megjelenítéshez a </w:t>
       </w:r>
       <w:r>
@@ -5672,7 +5803,6 @@
           <w:rFonts w:ascii="Arial" w:hAnsi="Arial" w:cs="Arial"/>
           <w:noProof/>
         </w:rPr>
-        <w:lastRenderedPageBreak/>
         <w:drawing>
           <wp:inline distT="0" distB="0" distL="0" distR="0" wp14:anchorId="47B1F151" wp14:editId="17AFB8EF">
             <wp:extent cx="5760720" cy="688340"/>
@@ -6075,6 +6205,7 @@
         <w:rPr>
           <w:rFonts w:ascii="Arial" w:hAnsi="Arial" w:cs="Arial"/>
         </w:rPr>
+        <w:lastRenderedPageBreak/>
         <w:t>4.3.3. AI alapú útiterv generálás</w:t>
       </w:r>
     </w:p>
@@ -6105,7 +6236,6 @@
         <w:rPr>
           <w:rFonts w:ascii="Arial" w:hAnsi="Arial" w:cs="Arial"/>
         </w:rPr>
-        <w:lastRenderedPageBreak/>
         <w:t>A felhasználó által megadott adatok alapján a backend összeállít egy promptot, amit a kiválasztott nagy nyelvi modell (DeepSeek vagy Ollama) dolgoz fel. Az AI válasza strukturált útitervként kerül feldolgozásra, amelyet a rendszer ellenőriz, majd megjelenít a felhasználó számára.</w:t>
       </w:r>
     </w:p>
@@ -6407,6 +6537,7 @@
         <w:rPr>
           <w:rFonts w:ascii="Arial" w:hAnsi="Arial" w:cs="Arial"/>
         </w:rPr>
+        <w:lastRenderedPageBreak/>
         <w:t>4.3.6. Repülőjáratok és foglalási lehetőségek</w:t>
       </w:r>
     </w:p>
@@ -6437,7 +6568,6 @@
         <w:rPr>
           <w:rFonts w:ascii="Arial" w:hAnsi="Arial" w:cs="Arial"/>
         </w:rPr>
-        <w:lastRenderedPageBreak/>
         <w:t>4.3.7. Megtervezett utazások megosztása</w:t>
       </w:r>
     </w:p>
@@ -6643,7 +6773,7 @@
         </w:rPr>
         <w:lastRenderedPageBreak/>
         <w:drawing>
-          <wp:inline distT="0" distB="0" distL="0" distR="0" wp14:anchorId="28BD969F" wp14:editId="6D9C3B9D">
+          <wp:inline distT="0" distB="0" distL="0" distR="0" wp14:anchorId="28BD969F" wp14:editId="22054A34">
             <wp:extent cx="5760720" cy="3240405"/>
             <wp:effectExtent l="0" t="0" r="0" b="0"/>
             <wp:docPr id="1304297483" name="Picture 8"/>
@@ -6796,7 +6926,7 @@
           <w:noProof/>
         </w:rPr>
         <w:drawing>
-          <wp:inline distT="0" distB="0" distL="0" distR="0" wp14:anchorId="1B0EC6B4" wp14:editId="1F146CBC">
+          <wp:inline distT="0" distB="0" distL="0" distR="0" wp14:anchorId="1B0EC6B4" wp14:editId="06A278EA">
             <wp:extent cx="5760720" cy="3240405"/>
             <wp:effectExtent l="0" t="0" r="0" b="0"/>
             <wp:docPr id="1302079082" name="Picture 9"/>
@@ -6891,7 +7021,7 @@
         </w:rPr>
         <w:lastRenderedPageBreak/>
         <w:drawing>
-          <wp:inline distT="0" distB="0" distL="0" distR="0" wp14:anchorId="43FD0357" wp14:editId="44EEFAB3">
+          <wp:inline distT="0" distB="0" distL="0" distR="0" wp14:anchorId="43FD0357" wp14:editId="73E3D655">
             <wp:extent cx="5760720" cy="3240405"/>
             <wp:effectExtent l="0" t="0" r="0" b="0"/>
             <wp:docPr id="179788065" name="Picture 10"/>
@@ -6999,7 +7129,7 @@
           <w:noProof/>
         </w:rPr>
         <w:drawing>
-          <wp:inline distT="0" distB="0" distL="0" distR="0" wp14:anchorId="0E4634B2" wp14:editId="3C593264">
+          <wp:inline distT="0" distB="0" distL="0" distR="0" wp14:anchorId="0E4634B2" wp14:editId="3373933A">
             <wp:extent cx="5760720" cy="3240405"/>
             <wp:effectExtent l="0" t="0" r="0" b="0"/>
             <wp:docPr id="1198935811" name="Picture 11"/>
@@ -7107,7 +7237,7 @@
         </w:rPr>
         <w:lastRenderedPageBreak/>
         <w:drawing>
-          <wp:inline distT="0" distB="0" distL="0" distR="0" wp14:anchorId="415F39BF" wp14:editId="4355598C">
+          <wp:inline distT="0" distB="0" distL="0" distR="0" wp14:anchorId="415F39BF" wp14:editId="7DEE20F7">
             <wp:extent cx="5760720" cy="3237230"/>
             <wp:effectExtent l="0" t="0" r="0" b="1270"/>
             <wp:docPr id="476222351" name="Picture 12"/>
@@ -7266,7 +7396,192 @@
         <w:rPr>
           <w:rFonts w:ascii="Arial" w:hAnsi="Arial" w:cs="Arial"/>
         </w:rPr>
-        <w:t>Az alkalmazás főoldala egy áttekintő irányítópultként</w:t>
+        <w:t>Az alkalmazás főoldala egy áttekintő irányítópultként funkcionál, ami a bejelentkezett felhasználó legutóbbi utazási emlékeit, valamint egy összesítő statisztikát jelenít meg a meglátogatott európai országairól. Az oldal betöltésekor az </w:t>
+      </w:r>
+      <w:r>
+        <w:rPr>
+          <w:rFonts w:ascii="Arial" w:hAnsi="Arial" w:cs="Arial"/>
+          <w:i/>
+          <w:iCs/>
+        </w:rPr>
+        <w:t>authGuard.js</w:t>
+      </w:r>
+      <w:r>
+        <w:rPr>
+          <w:rFonts w:ascii="Arial" w:hAnsi="Arial" w:cs="Arial"/>
+        </w:rPr>
+        <w:t> ellenőrzi a localStorage-ban tárolt </w:t>
+      </w:r>
+      <w:r>
+        <w:rPr>
+          <w:rFonts w:ascii="Arial" w:hAnsi="Arial" w:cs="Arial"/>
+          <w:i/>
+          <w:iCs/>
+        </w:rPr>
+        <w:t>user_id</w:t>
+      </w:r>
+      <w:r>
+        <w:rPr>
+          <w:rFonts w:ascii="Arial" w:hAnsi="Arial" w:cs="Arial"/>
+        </w:rPr>
+        <w:t xml:space="preserve"> és </w:t>
+      </w:r>
+      <w:r>
+        <w:rPr>
+          <w:rFonts w:ascii="Arial" w:hAnsi="Arial" w:cs="Arial"/>
+          <w:i/>
+          <w:iCs/>
+        </w:rPr>
+        <w:t>JWT access_token</w:t>
+      </w:r>
+      <w:r>
+        <w:rPr>
+          <w:rFonts w:ascii="Arial" w:hAnsi="Arial" w:cs="Arial"/>
+        </w:rPr>
+        <w:t> meglétét; hiány esetén a felhasználót a bejelentkezési oldalra irányítja. Sikeres ellenőrzés után a </w:t>
+      </w:r>
+      <w:r>
+        <w:rPr>
+          <w:rFonts w:ascii="Arial" w:hAnsi="Arial" w:cs="Arial"/>
+          <w:i/>
+          <w:iCs/>
+        </w:rPr>
+        <w:t>mainPageTravelLog.js</w:t>
+      </w:r>
+      <w:r>
+        <w:rPr>
+          <w:rFonts w:ascii="Arial" w:hAnsi="Arial" w:cs="Arial"/>
+        </w:rPr>
+        <w:t> a felhasználó azonosítója alapján, Bearer tokennel ellátott fetch kéréssel lekéri a meglátogatott helyeket a </w:t>
+      </w:r>
+      <w:r>
+        <w:rPr>
+          <w:rFonts w:ascii="Arial" w:hAnsi="Arial" w:cs="Arial"/>
+          <w:i/>
+          <w:iCs/>
+        </w:rPr>
+        <w:t>/api/users/{user_id}/visited-places</w:t>
+      </w:r>
+      <w:r>
+        <w:rPr>
+          <w:rFonts w:ascii="Arial" w:hAnsi="Arial" w:cs="Arial"/>
+        </w:rPr>
+        <w:t> végpontról.</w:t>
+      </w:r>
+    </w:p>
+    <w:p>
+      <w:pPr>
+        <w:spacing w:line="360" w:lineRule="auto"/>
+        <w:jc w:val="both"/>
+        <w:rPr>
+          <w:rFonts w:ascii="Arial" w:hAnsi="Arial" w:cs="Arial"/>
+        </w:rPr>
+      </w:pPr>
+      <w:r>
+        <w:rPr>
+          <w:rFonts w:ascii="Arial" w:hAnsi="Arial" w:cs="Arial"/>
+        </w:rPr>
+        <w:t xml:space="preserve">5.1.1. </w:t>
+      </w:r>
+      <w:r>
+        <w:rPr>
+          <w:rFonts w:ascii="Arial" w:hAnsi="Arial" w:cs="Arial"/>
+        </w:rPr>
+        <w:t>Legutóbbi látogatások</w:t>
+      </w:r>
+    </w:p>
+    <w:p>
+      <w:pPr>
+        <w:spacing w:line="360" w:lineRule="auto"/>
+        <w:jc w:val="both"/>
+        <w:rPr>
+          <w:rFonts w:ascii="Arial" w:hAnsi="Arial" w:cs="Arial"/>
+        </w:rPr>
+      </w:pPr>
+      <w:r>
+        <w:rPr>
+          <w:rFonts w:ascii="Arial" w:hAnsi="Arial" w:cs="Arial"/>
+        </w:rPr>
+        <w:t>A lekérdezett helyszíneket a rendszer a látogatás dátuma szerint csökkenő sorrendbe rendezi, majd ezek közül a három legutóbbit jeleníti meg</w:t>
+      </w:r>
+      <w:r>
+        <w:rPr>
+          <w:rFonts w:ascii="Arial" w:hAnsi="Arial" w:cs="Arial"/>
+        </w:rPr>
+        <w:t xml:space="preserve"> a főoldalon</w:t>
+      </w:r>
+      <w:r>
+        <w:rPr>
+          <w:rFonts w:ascii="Arial" w:hAnsi="Arial" w:cs="Arial"/>
+        </w:rPr>
+        <w:t xml:space="preserve"> kártya formájában, rövid leírással és a látogatás dátumával együtt. Amennyiben a </w:t>
+      </w:r>
+      <w:r>
+        <w:rPr>
+          <w:rFonts w:ascii="Arial" w:hAnsi="Arial" w:cs="Arial"/>
+        </w:rPr>
+        <w:lastRenderedPageBreak/>
+        <w:t>felhasználónak még nincs rögzített helyszíne, a rendszer egy tájékoztató üzenetet jelenít meg, amely közvetlenül az új hely hozzáadásának oldalára irányít.</w:t>
+      </w:r>
+    </w:p>
+    <w:p>
+      <w:pPr>
+        <w:spacing w:line="360" w:lineRule="auto"/>
+        <w:jc w:val="both"/>
+        <w:rPr>
+          <w:rFonts w:ascii="Arial" w:hAnsi="Arial" w:cs="Arial"/>
+        </w:rPr>
+      </w:pPr>
+      <w:r>
+        <w:rPr>
+          <w:rFonts w:ascii="Arial" w:hAnsi="Arial" w:cs="Arial"/>
+        </w:rPr>
+        <w:t xml:space="preserve">5.1.2. </w:t>
+      </w:r>
+      <w:r>
+        <w:rPr>
+          <w:rFonts w:ascii="Arial" w:hAnsi="Arial" w:cs="Arial"/>
+        </w:rPr>
+        <w:t>Meglátogatott európai országok kimutatása</w:t>
+      </w:r>
+    </w:p>
+    <w:p>
+      <w:pPr>
+        <w:spacing w:line="360" w:lineRule="auto"/>
+        <w:jc w:val="both"/>
+        <w:rPr>
+          <w:rFonts w:ascii="Arial" w:hAnsi="Arial" w:cs="Arial"/>
+        </w:rPr>
+      </w:pPr>
+      <w:r>
+        <w:rPr>
+          <w:rFonts w:ascii="Arial" w:hAnsi="Arial" w:cs="Arial"/>
+        </w:rPr>
+        <w:t>Az oldal egyik érdekesebb, önállóan kidolgozott eleme egy dinamikusan generált, kördiagra</w:t>
+      </w:r>
+      <w:r>
+        <w:rPr>
+          <w:rFonts w:ascii="Arial" w:hAnsi="Arial" w:cs="Arial"/>
+        </w:rPr>
+        <w:t>m</w:t>
+      </w:r>
+      <w:r>
+        <w:rPr>
+          <w:rFonts w:ascii="Arial" w:hAnsi="Arial" w:cs="Arial"/>
+        </w:rPr>
+        <w:t xml:space="preserve">, amely azt szemlélteti, </w:t>
+      </w:r>
+      <w:r>
+        <w:rPr>
+          <w:rFonts w:ascii="Arial" w:hAnsi="Arial" w:cs="Arial"/>
+        </w:rPr>
+        <w:t xml:space="preserve">hogy </w:t>
+      </w:r>
+      <w:r>
+        <w:rPr>
+          <w:rFonts w:ascii="Arial" w:hAnsi="Arial" w:cs="Arial"/>
+        </w:rPr>
+        <w:t>a felhasználó Európa hány országát látogatta már meg. Mivel a meglátogatott helyekhez rögzített országnév szabad szövegként kerül tárolásra, a rendszer egy kétlépcsős felismerési logikát alkalmaz: elsőként megvizsgálja, hogy a megadott érték egy kétbetűs ISO</w:t>
       </w:r>
       <w:r>
         <w:rPr>
@@ -7278,164 +7593,7 @@
         <w:rPr>
           <w:rFonts w:ascii="Arial" w:hAnsi="Arial" w:cs="Arial"/>
         </w:rPr>
-        <w:t>funkcionál, am</w:t>
-      </w:r>
-      <w:r>
-        <w:rPr>
-          <w:rFonts w:ascii="Arial" w:hAnsi="Arial" w:cs="Arial"/>
-        </w:rPr>
-        <w:t>i</w:t>
-      </w:r>
-      <w:r>
-        <w:rPr>
-          <w:rFonts w:ascii="Arial" w:hAnsi="Arial" w:cs="Arial"/>
-        </w:rPr>
-        <w:t xml:space="preserve"> a bejelentkezett felhasználó legutóbbi utazási emlékeit, valamint egy összesítő statisztikát jelenít meg a meglátogatott európai országokról. Az oldal betöltésekor a </w:t>
-      </w:r>
-      <w:r>
-        <w:rPr>
-          <w:rFonts w:ascii="Arial" w:hAnsi="Arial" w:cs="Arial"/>
-          <w:i/>
-          <w:iCs/>
-        </w:rPr>
-        <w:t>mainPageTravelLog.js</w:t>
-      </w:r>
-      <w:r>
-        <w:rPr>
-          <w:rFonts w:ascii="Arial" w:hAnsi="Arial" w:cs="Arial"/>
-        </w:rPr>
-        <w:t xml:space="preserve"> s</w:t>
-      </w:r>
-      <w:r>
-        <w:rPr>
-          <w:rFonts w:ascii="Arial" w:hAnsi="Arial" w:cs="Arial"/>
-        </w:rPr>
-        <w:t>c</w:t>
-      </w:r>
-      <w:r>
-        <w:rPr>
-          <w:rFonts w:ascii="Arial" w:hAnsi="Arial" w:cs="Arial"/>
-        </w:rPr>
-        <w:t xml:space="preserve">ript a böngésző </w:t>
-      </w:r>
-      <w:r>
-        <w:rPr>
-          <w:rFonts w:ascii="Arial" w:hAnsi="Arial" w:cs="Arial"/>
-          <w:i/>
-          <w:iCs/>
-        </w:rPr>
-        <w:t>localStorage</w:t>
-      </w:r>
-      <w:r>
-        <w:rPr>
-          <w:rFonts w:ascii="Arial" w:hAnsi="Arial" w:cs="Arial"/>
-        </w:rPr>
-        <w:t xml:space="preserve"> tárolójából kiolvassa a bejelentkezett felhasználó azonosítóját, majd ennek segítségével lekéri a felhasználó meglátogatott helyeit a </w:t>
-      </w:r>
-      <w:r>
-        <w:rPr>
-          <w:rFonts w:ascii="Arial" w:hAnsi="Arial" w:cs="Arial"/>
-          <w:i/>
-          <w:iCs/>
-        </w:rPr>
-        <w:t>/api/users/{user_id}/visited-places</w:t>
-      </w:r>
-      <w:r>
-        <w:rPr>
-          <w:rFonts w:ascii="Arial" w:hAnsi="Arial" w:cs="Arial"/>
-        </w:rPr>
-        <w:t xml:space="preserve"> végpontról. Amennyiben nincs bejelentkezett felhasználó, a rendszer nem kísérli meg az adatlekérést, hanem egy, a bejelentkezési oldalra mutató felhívást jelenít meg.</w:t>
-      </w:r>
-    </w:p>
-    <w:p>
-      <w:pPr>
-        <w:spacing w:line="360" w:lineRule="auto"/>
-        <w:jc w:val="both"/>
-        <w:rPr>
-          <w:rFonts w:ascii="Arial" w:hAnsi="Arial" w:cs="Arial"/>
-        </w:rPr>
-      </w:pPr>
-      <w:r>
-        <w:rPr>
-          <w:rFonts w:ascii="Arial" w:hAnsi="Arial" w:cs="Arial"/>
-        </w:rPr>
-        <w:t xml:space="preserve">5.1.1. </w:t>
-      </w:r>
-      <w:r>
-        <w:rPr>
-          <w:rFonts w:ascii="Arial" w:hAnsi="Arial" w:cs="Arial"/>
-        </w:rPr>
-        <w:t>Legutóbbi látogatások</w:t>
-      </w:r>
-    </w:p>
-    <w:p>
-      <w:pPr>
-        <w:spacing w:line="360" w:lineRule="auto"/>
-        <w:jc w:val="both"/>
-        <w:rPr>
-          <w:rFonts w:ascii="Arial" w:hAnsi="Arial" w:cs="Arial"/>
-        </w:rPr>
-      </w:pPr>
-      <w:r>
-        <w:rPr>
-          <w:rFonts w:ascii="Arial" w:hAnsi="Arial" w:cs="Arial"/>
-        </w:rPr>
-        <w:t xml:space="preserve">A lekérdezett helyszíneket a rendszer a látogatás dátuma szerint csökkenő sorrendbe rendezi, majd ezek közül a három legutóbbit jeleníti meg kártya formájában, rövid leírással és a látogatás dátumával együtt. Amennyiben a felhasználónak még nincs </w:t>
-      </w:r>
-      <w:r>
-        <w:rPr>
-          <w:rFonts w:ascii="Arial" w:hAnsi="Arial" w:cs="Arial"/>
-        </w:rPr>
-        <w:lastRenderedPageBreak/>
-        <w:t>rögzített helyszíne, a rendszer egy tájékoztató üzenetet jelenít meg, amely közvetlenül az új hely hozzáadásának oldalára irányít.</w:t>
-      </w:r>
-    </w:p>
-    <w:p>
-      <w:pPr>
-        <w:spacing w:line="360" w:lineRule="auto"/>
-        <w:jc w:val="both"/>
-        <w:rPr>
-          <w:rFonts w:ascii="Arial" w:hAnsi="Arial" w:cs="Arial"/>
-        </w:rPr>
-      </w:pPr>
-      <w:r>
-        <w:rPr>
-          <w:rFonts w:ascii="Arial" w:hAnsi="Arial" w:cs="Arial"/>
-        </w:rPr>
-        <w:t xml:space="preserve">5.1.2. </w:t>
-      </w:r>
-      <w:r>
-        <w:rPr>
-          <w:rFonts w:ascii="Arial" w:hAnsi="Arial" w:cs="Arial"/>
-        </w:rPr>
-        <w:t>Meglátogatott európai országok kimutatása</w:t>
-      </w:r>
-    </w:p>
-    <w:p>
-      <w:pPr>
-        <w:spacing w:line="360" w:lineRule="auto"/>
-        <w:jc w:val="both"/>
-        <w:rPr>
-          <w:rFonts w:ascii="Arial" w:hAnsi="Arial" w:cs="Arial"/>
-        </w:rPr>
-      </w:pPr>
-      <w:r>
-        <w:rPr>
-          <w:rFonts w:ascii="Arial" w:hAnsi="Arial" w:cs="Arial"/>
-        </w:rPr>
-        <w:t xml:space="preserve">Az oldal egyik érdekesebb, önállóan kidolgozott eleme egy dinamikusan generált, kördiagram formájú kimutatás, amely azt szemlélteti, </w:t>
-      </w:r>
-      <w:r>
-        <w:rPr>
-          <w:rFonts w:ascii="Arial" w:hAnsi="Arial" w:cs="Arial"/>
-        </w:rPr>
-        <w:t xml:space="preserve">hogy </w:t>
-      </w:r>
-      <w:r>
-        <w:rPr>
-          <w:rFonts w:ascii="Arial" w:hAnsi="Arial" w:cs="Arial"/>
-        </w:rPr>
-        <w:t>a felhasználó Európa hány országát látogatta már meg. Mivel a meglátogatott helyekhez rögzített országnév szabad szövegként kerül tárolásra, a rendszer egy kétlépcsős felismerési logikát alkalmaz: elsőként megvizsgálja, hogy a megadott érték egy kétbetűs ISO-kód-e, majd ha nem, egy előre összeállított, több nyelvű (angol, magyar, német) országnév-szótár segítségével próbálja meg beazonosítani az országot, ékezetek és kis-nagybetűk eltéréseit is normalizálva. Amennyiben pontos egyezés nem található, a rendszer részleges illesztést is megkísérel, ezáltal növelve a felismerés megbízhatóságát a felhasználó által szabadon begépelt országnevek esetén is.</w:t>
+        <w:t>kód-e, majd ha nem, egy előre összeállított, több nyelvű (angol, magyar, német) országnév-szótár segítségével próbálja meg beazonosítani az országot, ékezetek és kis-nagybetűk eltéréseit is normalizálva. Amennyiben pontos egyezés nem található, a rendszer részleges illesztést is megkísérel, ezáltal növelve a felismerés megbízhatóságát a felhasználó által szabadon begépelt országnevek esetén is.</w:t>
       </w:r>
     </w:p>
     <w:p>
@@ -7500,7 +7658,19 @@
         <w:rPr>
           <w:rFonts w:ascii="Arial" w:hAnsi="Arial" w:cs="Arial"/>
         </w:rPr>
-        <w:t>amely egy statikus, a teljes kört reprezentáló háttérkörre kerül rá. A diagram közepén szövegesen is megjelenik a meglátogatott és összes ország aránya, a diagram alatt pedig egy jelmagyarázat segíti az értelmezést.</w:t>
+        <w:t xml:space="preserve">amely egy statikus, a teljes kört </w:t>
+      </w:r>
+      <w:r>
+        <w:rPr>
+          <w:rFonts w:ascii="Arial" w:hAnsi="Arial" w:cs="Arial"/>
+        </w:rPr>
+        <w:t>ábrázoló</w:t>
+      </w:r>
+      <w:r>
+        <w:rPr>
+          <w:rFonts w:ascii="Arial" w:hAnsi="Arial" w:cs="Arial"/>
+        </w:rPr>
+        <w:t xml:space="preserve"> háttérkörre kerül rá. A diagram közepén szövegesen is megjelenik a meglátogatott és összes ország aránya, a diagram alatt pedig egy jelmagyarázat segíti az értelmezést.</w:t>
       </w:r>
     </w:p>
     <w:p>
@@ -7685,14 +7855,32 @@
         <w:rPr>
           <w:rFonts w:ascii="Arial" w:hAnsi="Arial" w:cs="Arial"/>
         </w:rPr>
-        <w:t xml:space="preserve">A kliens oldalon a felhasználó egy egyszerű űrlapon keresztül adhatja meg a regisztrációhoz szükséges adatokat: felhasználónevet, e-mail címet, valamint jelszót, </w:t>
+        <w:t>K</w:t>
+      </w:r>
+      <w:r>
+        <w:rPr>
+          <w:rFonts w:ascii="Arial" w:hAnsi="Arial" w:cs="Arial"/>
+        </w:rPr>
+        <w:t xml:space="preserve">liens oldalon a felhasználó egy egyszerű űrlapon keresztül adhatja meg a regisztrációhoz szükséges adatokat: felhasználónevet, e-mail címet, valamint jelszót, </w:t>
       </w:r>
       <w:r>
         <w:rPr>
           <w:rFonts w:ascii="Arial" w:hAnsi="Arial" w:cs="Arial"/>
         </w:rPr>
         <w:lastRenderedPageBreak/>
-        <w:t xml:space="preserve">amelyet biztonsági okokból kétszer szükséges megadnia. A </w:t>
+        <w:t>am</w:t>
+      </w:r>
+      <w:r>
+        <w:rPr>
+          <w:rFonts w:ascii="Arial" w:hAnsi="Arial" w:cs="Arial"/>
+        </w:rPr>
+        <w:t>i</w:t>
+      </w:r>
+      <w:r>
+        <w:rPr>
+          <w:rFonts w:ascii="Arial" w:hAnsi="Arial" w:cs="Arial"/>
+        </w:rPr>
+        <w:t xml:space="preserve">t biztonsági okokból kétszer szükséges megadnia. A </w:t>
       </w:r>
       <w:r>
         <w:rPr>
@@ -7890,7 +8078,7 @@
         <w:rPr>
           <w:rFonts w:ascii="Arial" w:hAnsi="Arial" w:cs="Arial"/>
         </w:rPr>
-        <w:t>A sikeres létrehozást követően a rendszer az újonnan felvett felhasználói rekordot frissíti és visszaadja, majd a végpont egy megerősítő üzenetet tartalmazó választ küld vissza a kliensnek. Ez a kétrétegű validáció biztosítja, hogy a rendszerbe kizárólag érvényes és egyedi adatokkal rendelkező felhasználók regisztrálhassanak, ezzel is hozzájárulva az alkalmazás adatintegritásának és biztonságának megőrzéséhez.</w:t>
+        <w:t>A sikeres létrehozást követően a rendszer az újonnan felvett felhasználói rekordot frissíti és visszaadja, majd a végpont egy megerősítő üzenetet tartalmazó választ küld vissza a kliensnek. Ez a kétrétegű validáció biztosítja, hogy a rendszerbe kizárólag érvényes és egyedi adatokkal rendelkező felhasználók regisztrálhassanak, ezzel is hozzájárulva az alkalmazás biztonságának megőrzéséhez.</w:t>
       </w:r>
     </w:p>
     <w:p>
@@ -7995,7 +8183,19 @@
         <w:rPr>
           <w:rFonts w:ascii="Arial" w:hAnsi="Arial" w:cs="Arial"/>
         </w:rPr>
-        <w:t xml:space="preserve"> kérés keretében, </w:t>
+        <w:t xml:space="preserve"> kérés</w:t>
+      </w:r>
+      <w:r>
+        <w:rPr>
+          <w:rFonts w:ascii="Arial" w:hAnsi="Arial" w:cs="Arial"/>
+        </w:rPr>
+        <w:t>ben</w:t>
+      </w:r>
+      <w:r>
+        <w:rPr>
+          <w:rFonts w:ascii="Arial" w:hAnsi="Arial" w:cs="Arial"/>
+        </w:rPr>
+        <w:t xml:space="preserve">, </w:t>
       </w:r>
       <w:r>
         <w:rPr>
@@ -8077,7 +8277,27 @@
         <w:rPr>
           <w:rFonts w:ascii="Arial" w:hAnsi="Arial" w:cs="Arial"/>
         </w:rPr>
-        <w:t xml:space="preserve">jelszóval. Amennyiben a jelszó helytelen, a rendszer szintén 401-es hibaüzenettel válaszol. Fontos biztonsági szempont, hogy mindkét hibaeset – tehát a nem létező felhasználónév és a helytelen jelszó – ugyanazt az általános hibaüzenetet ("Invalid username or password") adja vissza, ezáltal megakadályozva, hogy egy esetleges támadó a hibaüzenetek alapján következtethessen arra, hogy egy adott felhasználónév létezik-e a rendszerben. Sikeres azonosítás esetén a szerver a felhasználó azonosítóját és felhasználónevét tartalmazó választ küld vissza a kliensnek, amelyet a </w:t>
+        <w:t xml:space="preserve">jelszóval. Amennyiben a jelszó helytelen, a rendszer szintén 401-es hibaüzenettel válaszol. Fontos biztonsági szempont, hogy mindkét hibaeset ugyanazt az általános hibaüzenetet ("Invalid username or password") adja vissza, ezáltal megakadályozva, hogy egy esetleges támadó a hibaüzenetek alapján következtethessen arra, hogy egy adott felhasználónév létezik-e a rendszerben. </w:t>
+      </w:r>
+      <w:r>
+        <w:rPr>
+          <w:rFonts w:ascii="Arial" w:hAnsi="Arial" w:cs="Arial"/>
+        </w:rPr>
+        <w:t>Sikeres azonosítás esetén a szerver a felhasználó azonosítóját, felhasználónevét és a JWT </w:t>
+      </w:r>
+      <w:r>
+        <w:rPr>
+          <w:rFonts w:ascii="Arial" w:hAnsi="Arial" w:cs="Arial"/>
+          <w:i/>
+          <w:iCs/>
+        </w:rPr>
+        <w:t>access_token</w:t>
+      </w:r>
+      <w:r>
+        <w:rPr>
+          <w:rFonts w:ascii="Arial" w:hAnsi="Arial" w:cs="Arial"/>
+        </w:rPr>
+        <w:t xml:space="preserve"> értékét tartalmazó választ küld vissza a kliensnek, amelyet a </w:t>
       </w:r>
       <w:r>
         <w:rPr>
@@ -8091,7 +8311,7 @@
         <w:rPr>
           <w:rFonts w:ascii="Arial" w:hAnsi="Arial" w:cs="Arial"/>
         </w:rPr>
-        <w:t xml:space="preserve"> kód a böngésző </w:t>
+        <w:t xml:space="preserve"> kód a böngésző </w:t>
       </w:r>
       <w:r>
         <w:rPr>
@@ -8105,7 +8325,7 @@
         <w:rPr>
           <w:rFonts w:ascii="Arial" w:hAnsi="Arial" w:cs="Arial"/>
         </w:rPr>
-        <w:t xml:space="preserve"> tárolójában ment el, majd a felhasználót átirányítja a főoldalra.</w:t>
+        <w:t> tárolójában ment el, majd a felhasználót átirányítja a főoldalra.</w:t>
       </w:r>
     </w:p>
     <w:p>
@@ -8225,16 +8445,20 @@
       <w:r>
         <w:rPr>
           <w:rFonts w:ascii="Arial" w:hAnsi="Arial" w:cs="Arial"/>
-          <w:i/>
-          <w:iCs/>
-        </w:rPr>
-        <w:t>Google</w:t>
-      </w:r>
-      <w:r>
-        <w:rPr>
-          <w:rFonts w:ascii="Arial" w:hAnsi="Arial" w:cs="Arial"/>
-        </w:rPr>
-        <w:t xml:space="preserve"> által generált gombra kattintva a felhasználó a saját Google-fiókjával azonosíthatja magát, amelynek eredményeként egy titkosított azonosító tokent (</w:t>
+        </w:rPr>
+        <w:t>„</w:t>
+      </w:r>
+      <w:r>
+        <w:rPr>
+          <w:rFonts w:ascii="Arial" w:hAnsi="Arial" w:cs="Arial"/>
+        </w:rPr>
+        <w:t>Login with Google”</w:t>
+      </w:r>
+      <w:r>
+        <w:rPr>
+          <w:rFonts w:ascii="Arial" w:hAnsi="Arial" w:cs="Arial"/>
+        </w:rPr>
+        <w:t xml:space="preserve"> gombra kattintva a felhasználó a saját Google-fiókjával azonosíthatja magát, amelynek eredményeként egy titkosított azonosító tokent (</w:t>
       </w:r>
       <w:r>
         <w:rPr>
@@ -8377,47 +8601,7 @@
         <w:rPr>
           <w:rFonts w:ascii="Arial" w:hAnsi="Arial" w:cs="Arial"/>
         </w:rPr>
-        <w:t>A sikeres bejelentkezés</w:t>
-      </w:r>
-      <w:r>
-        <w:rPr>
-          <w:rFonts w:ascii="Arial" w:hAnsi="Arial" w:cs="Arial"/>
-        </w:rPr>
-        <w:t xml:space="preserve"> után </w:t>
-      </w:r>
-      <w:r>
-        <w:rPr>
-          <w:rFonts w:ascii="Arial" w:hAnsi="Arial" w:cs="Arial"/>
-        </w:rPr>
-        <w:t>a szerver mindkét esetben azonos szerkezetű választ (</w:t>
-      </w:r>
-      <w:r>
-        <w:rPr>
-          <w:rFonts w:ascii="Arial" w:hAnsi="Arial" w:cs="Arial"/>
-          <w:i/>
-          <w:iCs/>
-        </w:rPr>
-        <w:t>LoginResponse</w:t>
-      </w:r>
-      <w:r>
-        <w:rPr>
-          <w:rFonts w:ascii="Arial" w:hAnsi="Arial" w:cs="Arial"/>
-        </w:rPr>
-        <w:t xml:space="preserve">) küld vissza, amely tartalmazza a felhasználó azonosítóját és felhasználónevét. Ez az egységes válaszformátum lehetővé teszi, hogy a kliens oldali munkamenet-kezelés (a </w:t>
-      </w:r>
-      <w:r>
-        <w:rPr>
-          <w:rFonts w:ascii="Arial" w:hAnsi="Arial" w:cs="Arial"/>
-          <w:i/>
-          <w:iCs/>
-        </w:rPr>
-        <w:t>saveSessionAndRedirect</w:t>
-      </w:r>
-      <w:r>
-        <w:rPr>
-          <w:rFonts w:ascii="Arial" w:hAnsi="Arial" w:cs="Arial"/>
-        </w:rPr>
-        <w:t xml:space="preserve"> függvény) mindkét bejelentkezési módnál azonos módon kezelje a sikeres azonosítást, és irányítsa át a felhasználót az alkalmazás főoldalára.</w:t>
+        <w:t>A sikeres bejelentkezés után a szerver mindkét esetben azonos szerkezetű LoginResponse választ küld vissza, amely tartalmazza a felhasználó azonosítóját, felhasználónevét, valamint az access_token értéket (és opcionálisan a Google-profilkép URL-jét). Ez az egységes válaszformátum lehetővé teszi, hogy a kliens oldali munkamenet-kezelés (saveSessionAndRedirect) mindkét bejelentkezési módnál azonos módon mentse el a tokent és a felhasználói adatokat, majd irányítsa át a felhasználót a főoldalra.</w:t>
       </w:r>
     </w:p>
     <w:p>
@@ -8507,7 +8691,14 @@
         <w:rPr>
           <w:rFonts w:ascii="Arial" w:hAnsi="Arial" w:cs="Arial"/>
         </w:rPr>
-        <w:t xml:space="preserve">A bejelentkezési oldalon elhelyezett "Elfelejtett jelszó" hivatkozásra kattintva egy felugró ablak jelenik meg, amelyben a felhasználó megadhatja a fiókjához tartozó e-mail címét. Az űrlap elküldését követően a kliens egy aszinkron </w:t>
+        <w:t>A bejelentkezési oldalon elhelyezett "Elfelejtett jelszó" hivatkozásra kattintva egy felugró ablak jelenik meg, amelyben a felhasználó megadhatja a fiókjához tartozó e-</w:t>
+      </w:r>
+      <w:r>
+        <w:rPr>
+          <w:rFonts w:ascii="Arial" w:hAnsi="Arial" w:cs="Arial"/>
+        </w:rPr>
+        <w:lastRenderedPageBreak/>
+        <w:t xml:space="preserve">mail címét. Az űrlap elküldését követően a kliens egy aszinkron </w:t>
       </w:r>
       <w:r>
         <w:rPr>
@@ -8521,247 +8712,240 @@
         <w:rPr>
           <w:rFonts w:ascii="Arial" w:hAnsi="Arial" w:cs="Arial"/>
         </w:rPr>
-        <w:t xml:space="preserve"> kérés keretében </w:t>
+        <w:t xml:space="preserve"> kérés keretében továbbítja a megadott e-mail címet a backend </w:t>
+      </w:r>
+      <w:r>
+        <w:rPr>
+          <w:rFonts w:ascii="Arial" w:hAnsi="Arial" w:cs="Arial"/>
+          <w:i/>
+          <w:iCs/>
+        </w:rPr>
+        <w:t>/api/forgot-password/request</w:t>
+      </w:r>
+      <w:r>
+        <w:rPr>
+          <w:rFonts w:ascii="Arial" w:hAnsi="Arial" w:cs="Arial"/>
+        </w:rPr>
+        <w:t xml:space="preserve"> végpontjára.</w:t>
+      </w:r>
+    </w:p>
+    <w:p>
+      <w:pPr>
+        <w:spacing w:line="360" w:lineRule="auto"/>
+        <w:jc w:val="both"/>
+        <w:rPr>
+          <w:rFonts w:ascii="Arial" w:hAnsi="Arial" w:cs="Arial"/>
+        </w:rPr>
+      </w:pPr>
+      <w:r>
+        <w:rPr>
+          <w:rFonts w:ascii="Arial" w:hAnsi="Arial" w:cs="Arial"/>
+        </w:rPr>
+        <w:t>A szerver oldalon ez a végpont megvizsgálja, hogy a megadott e-mail címhez tartozik-e regisztrált felhasználói fiók. Amennyiben igen, a rendszer létrehoz egy egyszer használatos, kriptográfiailag biztonságos visszaállítási tokent (</w:t>
+      </w:r>
+      <w:r>
+        <w:rPr>
+          <w:rFonts w:ascii="Arial" w:hAnsi="Arial" w:cs="Arial"/>
+          <w:i/>
+          <w:iCs/>
+        </w:rPr>
+        <w:t>secrets.token_urlsafe</w:t>
+      </w:r>
+      <w:r>
+        <w:rPr>
+          <w:rFonts w:ascii="Arial" w:hAnsi="Arial" w:cs="Arial"/>
+        </w:rPr>
+        <w:t xml:space="preserve">), amelyet nem nyílt formában, hanem </w:t>
+      </w:r>
+      <w:r>
+        <w:rPr>
+          <w:rFonts w:ascii="Arial" w:hAnsi="Arial" w:cs="Arial"/>
+          <w:i/>
+          <w:iCs/>
+        </w:rPr>
+        <w:t>SHA-256</w:t>
+      </w:r>
+      <w:r>
+        <w:rPr>
+          <w:rFonts w:ascii="Arial" w:hAnsi="Arial" w:cs="Arial"/>
+        </w:rPr>
+        <w:t xml:space="preserve"> algoritmussal hash-elve tárol el az adatbázisban, egy 30 perces érvényességi idővel ellátva. A generált token birtokában a rendszer egy visszaállítási hivatkozást állít össze, amelyet e-mailben megküld a felhasználó számára. Fontos megjegyezni, hogy egy adott felhasználóhoz tartozó, korábban kiadott, még fel nem használt tokenek</w:t>
+      </w:r>
+      <w:r>
+        <w:rPr>
+          <w:rFonts w:ascii="Arial" w:hAnsi="Arial" w:cs="Arial"/>
+        </w:rPr>
+        <w:t>et</w:t>
+      </w:r>
+      <w:r>
+        <w:rPr>
+          <w:rFonts w:ascii="Arial" w:hAnsi="Arial" w:cs="Arial"/>
+        </w:rPr>
+        <w:t xml:space="preserve"> a rendszer automatikusan érvényteleníti egy új kérelem esetén, ez</w:t>
+      </w:r>
+      <w:r>
+        <w:rPr>
+          <w:rFonts w:ascii="Arial" w:hAnsi="Arial" w:cs="Arial"/>
+        </w:rPr>
+        <w:t>zel</w:t>
+      </w:r>
+      <w:r>
+        <w:rPr>
+          <w:rFonts w:ascii="Arial" w:hAnsi="Arial" w:cs="Arial"/>
+        </w:rPr>
+        <w:t xml:space="preserve"> biztosítva, hogy egy időben mindig csak egy érvényes visszaállítási hivatkozás létezzen.</w:t>
+      </w:r>
+    </w:p>
+    <w:p>
+      <w:pPr>
+        <w:spacing w:line="360" w:lineRule="auto"/>
+        <w:jc w:val="both"/>
+        <w:rPr>
+          <w:rFonts w:ascii="Arial" w:hAnsi="Arial" w:cs="Arial"/>
+        </w:rPr>
+      </w:pPr>
+      <w:r>
+        <w:rPr>
+          <w:rFonts w:ascii="Arial" w:hAnsi="Arial" w:cs="Arial"/>
+        </w:rPr>
+        <w:t>Biztonsági szempontból kiemelten fontos tervezési döntés, hogy a végpont mindig ugyanazt az általános üzenetet adja vissza a felhasználónak. Ezáltal a rendszer megakadályozza, hogy egy esetleges támadó a válaszok alapján felderíthesse, mely e-mail címek rendelkeznek regisztrált fiókkal az</w:t>
+      </w:r>
+      <w:r>
+        <w:rPr>
+          <w:rFonts w:ascii="Arial" w:hAnsi="Arial" w:cs="Arial"/>
+        </w:rPr>
+        <w:t xml:space="preserve"> alkalmazásban</w:t>
+      </w:r>
+      <w:r>
+        <w:rPr>
+          <w:rFonts w:ascii="Arial" w:hAnsi="Arial" w:cs="Arial"/>
+        </w:rPr>
+        <w:t>.</w:t>
+      </w:r>
+    </w:p>
+    <w:p>
+      <w:pPr>
+        <w:spacing w:line="360" w:lineRule="auto"/>
+        <w:jc w:val="both"/>
+        <w:rPr>
+          <w:rFonts w:ascii="Arial" w:hAnsi="Arial" w:cs="Arial"/>
+        </w:rPr>
+      </w:pPr>
+      <w:r>
+        <w:rPr>
+          <w:rFonts w:ascii="Arial" w:hAnsi="Arial" w:cs="Arial"/>
+        </w:rPr>
+        <w:t>5.</w:t>
+      </w:r>
+      <w:r>
+        <w:rPr>
+          <w:rFonts w:ascii="Arial" w:hAnsi="Arial" w:cs="Arial"/>
+        </w:rPr>
+        <w:t>2</w:t>
+      </w:r>
+      <w:r>
+        <w:rPr>
+          <w:rFonts w:ascii="Arial" w:hAnsi="Arial" w:cs="Arial"/>
+        </w:rPr>
+        <w:t xml:space="preserve">.3.2. </w:t>
+      </w:r>
+      <w:r>
+        <w:rPr>
+          <w:rFonts w:ascii="Arial" w:hAnsi="Arial" w:cs="Arial"/>
+        </w:rPr>
+        <w:t>Az új jelszó megadása</w:t>
+      </w:r>
+    </w:p>
+    <w:p>
+      <w:pPr>
+        <w:spacing w:line="360" w:lineRule="auto"/>
+        <w:jc w:val="both"/>
+        <w:rPr>
+          <w:rFonts w:ascii="Arial" w:hAnsi="Arial" w:cs="Arial"/>
+        </w:rPr>
+      </w:pPr>
+      <w:r>
+        <w:rPr>
+          <w:rFonts w:ascii="Arial" w:hAnsi="Arial" w:cs="Arial"/>
+        </w:rPr>
+        <w:t>A felhasználó az e-mailben kapott hivatkozásra kattintva jut el a jelszó-visszaállító oldalra, amely az URL-ből kinyeri a hozzá tartozó visszaállítási tokent. Amennyiben a hivatkozás nem tartalmaz tokent, a rendszer egy érvénytelenségről tájékoztató üzenetet jelenít meg, és nem engedi a jelszó megváltoztatását.</w:t>
+      </w:r>
+    </w:p>
+    <w:p>
+      <w:pPr>
+        <w:spacing w:line="360" w:lineRule="auto"/>
+        <w:jc w:val="both"/>
+        <w:rPr>
+          <w:rFonts w:ascii="Arial" w:hAnsi="Arial" w:cs="Arial"/>
+        </w:rPr>
+      </w:pPr>
+      <w:r>
+        <w:rPr>
+          <w:rFonts w:ascii="Arial" w:hAnsi="Arial" w:cs="Arial"/>
+        </w:rPr>
+        <w:t xml:space="preserve">Érvényes token esetén a felhasználó megadhatja új jelszavát, </w:t>
+      </w:r>
+      <w:r>
+        <w:rPr>
+          <w:rFonts w:ascii="Arial" w:hAnsi="Arial" w:cs="Arial"/>
+        </w:rPr>
+        <w:t xml:space="preserve">amit </w:t>
+      </w:r>
+      <w:r>
+        <w:rPr>
+          <w:rFonts w:ascii="Arial" w:hAnsi="Arial" w:cs="Arial"/>
+        </w:rPr>
+        <w:t xml:space="preserve">meg is kell erősítenie. A kliens oldali </w:t>
+      </w:r>
+      <w:r>
+        <w:rPr>
+          <w:rFonts w:ascii="Arial" w:hAnsi="Arial" w:cs="Arial"/>
+          <w:i/>
+          <w:iCs/>
+        </w:rPr>
+        <w:t>JavaScript</w:t>
+      </w:r>
+      <w:r>
+        <w:rPr>
+          <w:rFonts w:ascii="Arial" w:hAnsi="Arial" w:cs="Arial"/>
+        </w:rPr>
+        <w:t xml:space="preserve"> kód ellenőrzi, hogy a két jelszómező tartalma megegyezik-e, valamint hogy az új jelszó eléri-e a minimálisan megkövetelt hosszúságot (legalább 6 karakter); ezen feltételek teljesülése esetén kerül csak sor a kérés elküldésére.</w:t>
+      </w:r>
+    </w:p>
+    <w:p>
+      <w:pPr>
+        <w:spacing w:line="360" w:lineRule="auto"/>
+        <w:jc w:val="both"/>
+        <w:rPr>
+          <w:rFonts w:ascii="Arial" w:hAnsi="Arial" w:cs="Arial"/>
+        </w:rPr>
+      </w:pPr>
+      <w:r>
+        <w:rPr>
+          <w:rFonts w:ascii="Arial" w:hAnsi="Arial" w:cs="Arial"/>
+        </w:rPr>
+        <w:t xml:space="preserve">A szerver oldalon a </w:t>
+      </w:r>
+      <w:r>
+        <w:rPr>
+          <w:rFonts w:ascii="Arial" w:hAnsi="Arial" w:cs="Arial"/>
+          <w:i/>
+          <w:iCs/>
+        </w:rPr>
+        <w:t>/api/forgot-password/reset</w:t>
+      </w:r>
+      <w:r>
+        <w:rPr>
+          <w:rFonts w:ascii="Arial" w:hAnsi="Arial" w:cs="Arial"/>
+        </w:rPr>
+        <w:t xml:space="preserve"> végpont elsőként ellenőrzi a kapott token érvényességét: megvizsgálja, hogy a token hash-elt formában szerepel-e az adatbázisban, még nem került-e felhasználásra, és nem járt-e le az érvényességi ideje. Amennyiben bármely feltétel nem teljesül, a rendszer 400-as státuszkóddal, </w:t>
       </w:r>
       <w:r>
         <w:rPr>
           <w:rFonts w:ascii="Arial" w:hAnsi="Arial" w:cs="Arial"/>
         </w:rPr>
         <w:lastRenderedPageBreak/>
-        <w:t xml:space="preserve">továbbítja a megadott e-mail címet a backend </w:t>
-      </w:r>
-      <w:r>
-        <w:rPr>
-          <w:rFonts w:ascii="Arial" w:hAnsi="Arial" w:cs="Arial"/>
-          <w:i/>
-          <w:iCs/>
-        </w:rPr>
-        <w:t>/api/forgot-password/request</w:t>
-      </w:r>
-      <w:r>
-        <w:rPr>
-          <w:rFonts w:ascii="Arial" w:hAnsi="Arial" w:cs="Arial"/>
-        </w:rPr>
-        <w:t xml:space="preserve"> végpontjára.</w:t>
-      </w:r>
-    </w:p>
-    <w:p>
-      <w:pPr>
-        <w:spacing w:line="360" w:lineRule="auto"/>
-        <w:jc w:val="both"/>
-        <w:rPr>
-          <w:rFonts w:ascii="Arial" w:hAnsi="Arial" w:cs="Arial"/>
-        </w:rPr>
-      </w:pPr>
-      <w:r>
-        <w:rPr>
-          <w:rFonts w:ascii="Arial" w:hAnsi="Arial" w:cs="Arial"/>
-        </w:rPr>
-        <w:t>A szerver oldalon ez a végpont megvizsgálja, hogy a megadott e-mail címhez tartozik-e regisztrált felhasználói fiók. Amennyiben igen, a rendszer létrehoz egy egyszer használatos, kriptográfiailag biztonságos visszaállítási tokent (</w:t>
-      </w:r>
-      <w:r>
-        <w:rPr>
-          <w:rFonts w:ascii="Arial" w:hAnsi="Arial" w:cs="Arial"/>
-          <w:i/>
-          <w:iCs/>
-        </w:rPr>
-        <w:t>secrets.token_urlsafe</w:t>
-      </w:r>
-      <w:r>
-        <w:rPr>
-          <w:rFonts w:ascii="Arial" w:hAnsi="Arial" w:cs="Arial"/>
-        </w:rPr>
-        <w:t xml:space="preserve">), amelyet nem nyílt formában, hanem </w:t>
-      </w:r>
-      <w:r>
-        <w:rPr>
-          <w:rFonts w:ascii="Arial" w:hAnsi="Arial" w:cs="Arial"/>
-          <w:i/>
-          <w:iCs/>
-        </w:rPr>
-        <w:t>SHA-256</w:t>
-      </w:r>
-      <w:r>
-        <w:rPr>
-          <w:rFonts w:ascii="Arial" w:hAnsi="Arial" w:cs="Arial"/>
-        </w:rPr>
-        <w:t xml:space="preserve"> algoritmussal hash-elve tárol el az adatbázisban, egy 30 perces érvényességi idővel ellátva. A generált token birtokában a rendszer egy visszaállítási hivatkozást állít össze, amelyet e-mailben megküld a felhasználó számára. Fontos megjegyezni, hogy egy adott felhasználóhoz tartozó, korábban kiadott, még fel nem használt tokenek</w:t>
-      </w:r>
-      <w:r>
-        <w:rPr>
-          <w:rFonts w:ascii="Arial" w:hAnsi="Arial" w:cs="Arial"/>
-        </w:rPr>
-        <w:t>et</w:t>
-      </w:r>
-      <w:r>
-        <w:rPr>
-          <w:rFonts w:ascii="Arial" w:hAnsi="Arial" w:cs="Arial"/>
-        </w:rPr>
-        <w:t xml:space="preserve"> a rendszer automatikusan érvényteleníti egy új kérelem esetén, ez</w:t>
-      </w:r>
-      <w:r>
-        <w:rPr>
-          <w:rFonts w:ascii="Arial" w:hAnsi="Arial" w:cs="Arial"/>
-        </w:rPr>
-        <w:t>zel</w:t>
-      </w:r>
-      <w:r>
-        <w:rPr>
-          <w:rFonts w:ascii="Arial" w:hAnsi="Arial" w:cs="Arial"/>
-        </w:rPr>
-        <w:t xml:space="preserve"> biztosítva, hogy egy időben mindig csak egy érvényes visszaállítási hivatkozás létezzen.</w:t>
-      </w:r>
-    </w:p>
-    <w:p>
-      <w:pPr>
-        <w:spacing w:line="360" w:lineRule="auto"/>
-        <w:jc w:val="both"/>
-        <w:rPr>
-          <w:rFonts w:ascii="Arial" w:hAnsi="Arial" w:cs="Arial"/>
-        </w:rPr>
-      </w:pPr>
-      <w:r>
-        <w:rPr>
-          <w:rFonts w:ascii="Arial" w:hAnsi="Arial" w:cs="Arial"/>
-        </w:rPr>
-        <w:t>Biztonsági szempontból kiemelten fontos tervezési döntés, hogy a végpont mindig ugyanazt az általános üzenetet adja vissza a felhasználónak. Ezáltal a rendszer megakadályozza, hogy egy esetleges támadó a válaszok alapján felderíthesse, mely e-mail címek rendelkeznek regisztrált fiókkal az</w:t>
-      </w:r>
-      <w:r>
-        <w:rPr>
-          <w:rFonts w:ascii="Arial" w:hAnsi="Arial" w:cs="Arial"/>
-        </w:rPr>
-        <w:t xml:space="preserve"> alkalmazásban</w:t>
-      </w:r>
-      <w:r>
-        <w:rPr>
-          <w:rFonts w:ascii="Arial" w:hAnsi="Arial" w:cs="Arial"/>
-        </w:rPr>
-        <w:t>.</w:t>
-      </w:r>
-    </w:p>
-    <w:p>
-      <w:pPr>
-        <w:spacing w:line="360" w:lineRule="auto"/>
-        <w:jc w:val="both"/>
-        <w:rPr>
-          <w:rFonts w:ascii="Arial" w:hAnsi="Arial" w:cs="Arial"/>
-        </w:rPr>
-      </w:pPr>
-      <w:r>
-        <w:rPr>
-          <w:rFonts w:ascii="Arial" w:hAnsi="Arial" w:cs="Arial"/>
-        </w:rPr>
-        <w:t>5.</w:t>
-      </w:r>
-      <w:r>
-        <w:rPr>
-          <w:rFonts w:ascii="Arial" w:hAnsi="Arial" w:cs="Arial"/>
-        </w:rPr>
-        <w:t>2</w:t>
-      </w:r>
-      <w:r>
-        <w:rPr>
-          <w:rFonts w:ascii="Arial" w:hAnsi="Arial" w:cs="Arial"/>
-        </w:rPr>
-        <w:t xml:space="preserve">.3.2. </w:t>
-      </w:r>
-      <w:r>
-        <w:rPr>
-          <w:rFonts w:ascii="Arial" w:hAnsi="Arial" w:cs="Arial"/>
-        </w:rPr>
-        <w:t>Az új jelszó megadása</w:t>
-      </w:r>
-    </w:p>
-    <w:p>
-      <w:pPr>
-        <w:spacing w:line="360" w:lineRule="auto"/>
-        <w:jc w:val="both"/>
-        <w:rPr>
-          <w:rFonts w:ascii="Arial" w:hAnsi="Arial" w:cs="Arial"/>
-        </w:rPr>
-      </w:pPr>
-      <w:r>
-        <w:rPr>
-          <w:rFonts w:ascii="Arial" w:hAnsi="Arial" w:cs="Arial"/>
-        </w:rPr>
-        <w:t>A felhasználó az e-mailben kapott hivatkozásra kattintva jut el a jelszó-visszaállító oldalra, amely az URL-ből kinyeri a hozzá tartozó visszaállítási tokent. Amennyiben a hivatkozás nem tartalmaz tokent, a rendszer egy érvénytelenségről tájékoztató üzenetet jelenít meg, és nem engedi a jelszó megváltoztatását.</w:t>
-      </w:r>
-    </w:p>
-    <w:p>
-      <w:pPr>
-        <w:spacing w:line="360" w:lineRule="auto"/>
-        <w:jc w:val="both"/>
-        <w:rPr>
-          <w:rFonts w:ascii="Arial" w:hAnsi="Arial" w:cs="Arial"/>
-        </w:rPr>
-      </w:pPr>
-      <w:r>
-        <w:rPr>
-          <w:rFonts w:ascii="Arial" w:hAnsi="Arial" w:cs="Arial"/>
-        </w:rPr>
-        <w:t xml:space="preserve">Érvényes token esetén a felhasználó megadhatja új jelszavát, </w:t>
-      </w:r>
-      <w:r>
-        <w:rPr>
-          <w:rFonts w:ascii="Arial" w:hAnsi="Arial" w:cs="Arial"/>
-        </w:rPr>
-        <w:t xml:space="preserve">amit </w:t>
-      </w:r>
-      <w:r>
-        <w:rPr>
-          <w:rFonts w:ascii="Arial" w:hAnsi="Arial" w:cs="Arial"/>
-        </w:rPr>
-        <w:t xml:space="preserve">meg is kell erősítenie. A kliens oldali </w:t>
-      </w:r>
-      <w:r>
-        <w:rPr>
-          <w:rFonts w:ascii="Arial" w:hAnsi="Arial" w:cs="Arial"/>
-          <w:i/>
-          <w:iCs/>
-        </w:rPr>
-        <w:t>JavaScript</w:t>
-      </w:r>
-      <w:r>
-        <w:rPr>
-          <w:rFonts w:ascii="Arial" w:hAnsi="Arial" w:cs="Arial"/>
-        </w:rPr>
-        <w:t xml:space="preserve"> kód ellenőrzi, hogy a két jelszómező tartalma megegyezik-e, valamint hogy az új jelszó eléri-e a minimálisan megkövetelt hosszúságot (legalább 6 karakter); ezen feltételek teljesülése esetén kerül csak sor a kérés elküldésére.</w:t>
-      </w:r>
-    </w:p>
-    <w:p>
-      <w:pPr>
-        <w:spacing w:line="360" w:lineRule="auto"/>
-        <w:jc w:val="both"/>
-        <w:rPr>
-          <w:rFonts w:ascii="Arial" w:hAnsi="Arial" w:cs="Arial"/>
-        </w:rPr>
-      </w:pPr>
-      <w:r>
-        <w:rPr>
-          <w:rFonts w:ascii="Arial" w:hAnsi="Arial" w:cs="Arial"/>
-        </w:rPr>
-        <w:t xml:space="preserve">A szerver oldalon a </w:t>
-      </w:r>
-      <w:r>
-        <w:rPr>
-          <w:rFonts w:ascii="Arial" w:hAnsi="Arial" w:cs="Arial"/>
-          <w:i/>
-          <w:iCs/>
-        </w:rPr>
-        <w:t>/api/forgot-password/reset</w:t>
-      </w:r>
-      <w:r>
-        <w:rPr>
-          <w:rFonts w:ascii="Arial" w:hAnsi="Arial" w:cs="Arial"/>
-        </w:rPr>
-        <w:t xml:space="preserve"> végpont elsőként ellenőrzi a kapott token érvényességét: megvizsgálja, hogy a token hash-elt formában szerepel-e az adatbázisban, még nem került-e felhasználásra, és nem járt-e le az érvényességi ideje. Amennyiben bármely feltétel nem teljesül, a rendszer 400-as státuszkóddal, érvénytelen vagy lejárt hivatkozásra utaló hibaüzenettel utasítja el a kérést. Sikeres </w:t>
-      </w:r>
-      <w:r>
-        <w:rPr>
-          <w:rFonts w:ascii="Arial" w:hAnsi="Arial" w:cs="Arial"/>
-        </w:rPr>
-        <w:lastRenderedPageBreak/>
-        <w:t xml:space="preserve">ellenőrzés esetén a rendszer a </w:t>
+        <w:t xml:space="preserve">érvénytelen vagy lejárt hivatkozásra utaló hibaüzenettel utasítja el a kérést. Sikeres ellenőrzés esetén a rendszer a </w:t>
       </w:r>
       <w:r>
         <w:rPr>
@@ -8803,6 +8987,156 @@
           <w:rFonts w:ascii="Arial" w:hAnsi="Arial" w:cs="Arial"/>
         </w:rPr>
         <w:t>Ez a megoldás biztosítja, hogy a jelszó-visszaállítási folyamat mind a felhasználó, mind a rendszer szempontjából biztonságos és megbízható legyen.</w:t>
+      </w:r>
+    </w:p>
+    <w:p>
+      <w:pPr>
+        <w:spacing w:line="360" w:lineRule="auto"/>
+        <w:jc w:val="both"/>
+        <w:rPr>
+          <w:rFonts w:ascii="Arial" w:hAnsi="Arial" w:cs="Arial"/>
+        </w:rPr>
+      </w:pPr>
+      <w:r>
+        <w:rPr>
+          <w:rFonts w:ascii="Arial" w:hAnsi="Arial" w:cs="Arial"/>
+        </w:rPr>
+        <w:t>5.2.4. Token alapú munkamenet és védett végpontok</w:t>
+      </w:r>
+    </w:p>
+    <w:p>
+      <w:pPr>
+        <w:spacing w:line="360" w:lineRule="auto"/>
+        <w:jc w:val="both"/>
+        <w:rPr>
+          <w:rFonts w:ascii="Arial" w:hAnsi="Arial" w:cs="Arial"/>
+        </w:rPr>
+      </w:pPr>
+      <w:r>
+        <w:rPr>
+          <w:rFonts w:ascii="Arial" w:hAnsi="Arial" w:cs="Arial"/>
+        </w:rPr>
+        <w:t xml:space="preserve">Bejelentkezés után a kliens automatikusan csatolja a tárolt JWT-t minden </w:t>
+      </w:r>
+      <w:r>
+        <w:rPr>
+          <w:rFonts w:ascii="Arial" w:hAnsi="Arial" w:cs="Arial"/>
+          <w:i/>
+          <w:iCs/>
+        </w:rPr>
+        <w:t>/api</w:t>
+      </w:r>
+      <w:r>
+        <w:rPr>
+          <w:rFonts w:ascii="Arial" w:hAnsi="Arial" w:cs="Arial"/>
+        </w:rPr>
+        <w:t xml:space="preserve"> és </w:t>
+      </w:r>
+      <w:r>
+        <w:rPr>
+          <w:rFonts w:ascii="Arial" w:hAnsi="Arial" w:cs="Arial"/>
+          <w:i/>
+          <w:iCs/>
+        </w:rPr>
+        <w:t>/generate_travel_plans típusú</w:t>
+      </w:r>
+      <w:r>
+        <w:rPr>
+          <w:rFonts w:ascii="Arial" w:hAnsi="Arial" w:cs="Arial"/>
+        </w:rPr>
+        <w:t xml:space="preserve"> kéréshez. A szerver oldalon a FastAPI </w:t>
+      </w:r>
+      <w:r>
+        <w:rPr>
+          <w:rFonts w:ascii="Arial" w:hAnsi="Arial" w:cs="Arial"/>
+          <w:i/>
+          <w:iCs/>
+        </w:rPr>
+        <w:t>get_current_user</w:t>
+      </w:r>
+      <w:r>
+        <w:rPr>
+          <w:rFonts w:ascii="Arial" w:hAnsi="Arial" w:cs="Arial"/>
+        </w:rPr>
+        <w:t xml:space="preserve"> függősége ellenőrzi a Bearer tokent: kiszűri a lejárt vagy érvénytelen aláírású tokeneket, majd betölti a hozzá tartozó felhasználót az adatbázisból. A védett erőforrásokhoz</w:t>
+      </w:r>
+      <w:r>
+        <w:rPr>
+          <w:rFonts w:ascii="Arial" w:hAnsi="Arial" w:cs="Arial"/>
+        </w:rPr>
+        <w:t xml:space="preserve"> (</w:t>
+      </w:r>
+      <w:r>
+        <w:rPr>
+          <w:rFonts w:ascii="Arial" w:hAnsi="Arial" w:cs="Arial"/>
+        </w:rPr>
+        <w:t>tervezett utak, meglátogatott helyek, profil, utazástervező</w:t>
+      </w:r>
+      <w:r>
+        <w:rPr>
+          <w:rFonts w:ascii="Arial" w:hAnsi="Arial" w:cs="Arial"/>
+        </w:rPr>
+        <w:t xml:space="preserve">) </w:t>
+      </w:r>
+      <w:r>
+        <w:rPr>
+          <w:rFonts w:ascii="Arial" w:hAnsi="Arial" w:cs="Arial"/>
+        </w:rPr>
+        <w:t xml:space="preserve">csak hitelesített felhasználó férhet hozzá, a tulajdonosi jogosultságot pedig a tokenben szereplő felhasználó-azonosító alapján ellenőrzi a rendszer. A nyilvános végpontok (regisztráció, bejelentkezés, jelszó-visszaállítás, illetve a megosztott út token alapú megtekintése) </w:t>
+      </w:r>
+      <w:r>
+        <w:rPr>
+          <w:rFonts w:ascii="Arial" w:hAnsi="Arial" w:cs="Arial"/>
+        </w:rPr>
+        <w:t>nem</w:t>
+      </w:r>
+      <w:r>
+        <w:rPr>
+          <w:rFonts w:ascii="Arial" w:hAnsi="Arial" w:cs="Arial"/>
+        </w:rPr>
+        <w:t xml:space="preserve"> igényelnek autentikációt. Az oldal betöltésekor az </w:t>
+      </w:r>
+      <w:r>
+        <w:rPr>
+          <w:rFonts w:ascii="Arial" w:hAnsi="Arial" w:cs="Arial"/>
+          <w:i/>
+          <w:iCs/>
+        </w:rPr>
+        <w:t>authGuard</w:t>
+      </w:r>
+      <w:r>
+        <w:rPr>
+          <w:rFonts w:ascii="Arial" w:hAnsi="Arial" w:cs="Arial"/>
+        </w:rPr>
+        <w:t xml:space="preserve"> leellenőrzi, hogy megvan-e egyszerre a </w:t>
+      </w:r>
+      <w:r>
+        <w:rPr>
+          <w:rFonts w:ascii="Arial" w:hAnsi="Arial" w:cs="Arial"/>
+          <w:i/>
+          <w:iCs/>
+        </w:rPr>
+        <w:t>user_id</w:t>
+      </w:r>
+      <w:r>
+        <w:rPr>
+          <w:rFonts w:ascii="Arial" w:hAnsi="Arial" w:cs="Arial"/>
+        </w:rPr>
+        <w:t xml:space="preserve"> és az </w:t>
+      </w:r>
+      <w:r>
+        <w:rPr>
+          <w:rFonts w:ascii="Arial" w:hAnsi="Arial" w:cs="Arial"/>
+          <w:i/>
+          <w:iCs/>
+        </w:rPr>
+        <w:t>access_token</w:t>
+      </w:r>
+      <w:r>
+        <w:rPr>
+          <w:rFonts w:ascii="Arial" w:hAnsi="Arial" w:cs="Arial"/>
+        </w:rPr>
+        <w:t>; ha bármelyik hiányzik, a felhasználót átirányítja a bejelentkezési oldalra.</w:t>
       </w:r>
     </w:p>
     <w:p>
@@ -8940,6 +9274,7 @@
           <w:i/>
           <w:iCs/>
         </w:rPr>
+        <w:lastRenderedPageBreak/>
         <w:t>fetch</w:t>
       </w:r>
       <w:r>
@@ -9044,20 +9379,278 @@
         <w:rPr>
           <w:rFonts w:ascii="Arial" w:hAnsi="Arial" w:cs="Arial"/>
         </w:rPr>
-        <w:t xml:space="preserve"> függvény végzi, amely a felhasználó által megadott szöveges adatokat </w:t>
-      </w:r>
+        <w:t xml:space="preserve"> függvény végzi, amely a felhasználó által megadott szöveges adatokat a</w:t>
+      </w:r>
+      <w:r>
+        <w:rPr>
+          <w:rFonts w:ascii="Arial" w:hAnsi="Arial" w:cs="Arial"/>
+        </w:rPr>
+        <w:t>z</w:t>
+      </w:r>
+      <w:r>
+        <w:rPr>
+          <w:rFonts w:ascii="Arial" w:hAnsi="Arial" w:cs="Arial"/>
+        </w:rPr>
+        <w:t xml:space="preserve"> </w:t>
+      </w:r>
+      <w:r>
+        <w:rPr>
+          <w:rFonts w:ascii="Arial" w:hAnsi="Arial" w:cs="Arial"/>
+          <w:i/>
+          <w:iCs/>
+        </w:rPr>
+        <w:t>escapeHtml</w:t>
+      </w:r>
+      <w:r>
+        <w:rPr>
+          <w:rFonts w:ascii="Arial" w:hAnsi="Arial" w:cs="Arial"/>
+        </w:rPr>
+        <w:t xml:space="preserve"> segédfüggvényen vezeti át, ezáltal megelőzve a rosszindulatú HTML- vagy s</w:t>
+      </w:r>
+      <w:r>
+        <w:rPr>
+          <w:rFonts w:ascii="Arial" w:hAnsi="Arial" w:cs="Arial"/>
+        </w:rPr>
+        <w:t>criptkód</w:t>
+      </w:r>
+      <w:r>
+        <w:rPr>
+          <w:rFonts w:ascii="Arial" w:hAnsi="Arial" w:cs="Arial"/>
+        </w:rPr>
+        <w:t xml:space="preserve"> beágyazásából eredő biztonsági problémákat</w:t>
+      </w:r>
+      <w:r>
+        <w:rPr>
+          <w:rFonts w:ascii="Arial" w:hAnsi="Arial" w:cs="Arial"/>
+        </w:rPr>
+        <w:t xml:space="preserve">. </w:t>
+      </w:r>
+      <w:r>
+        <w:rPr>
+          <w:rFonts w:ascii="Arial" w:hAnsi="Arial" w:cs="Arial"/>
+        </w:rPr>
+        <w:t>Minden kártyán megjelenik egy interaktív, ötcsillagos értékelőelem is, am</w:t>
+      </w:r>
+      <w:r>
+        <w:rPr>
+          <w:rFonts w:ascii="Arial" w:hAnsi="Arial" w:cs="Arial"/>
+        </w:rPr>
+        <w:t>i</w:t>
+      </w:r>
+      <w:r>
+        <w:rPr>
+          <w:rFonts w:ascii="Arial" w:hAnsi="Arial" w:cs="Arial"/>
+        </w:rPr>
+        <w:t xml:space="preserve">nek valamelyik csillagára kattintva a kliens azonnal egy </w:t>
+      </w:r>
+      <w:r>
+        <w:rPr>
+          <w:rFonts w:ascii="Arial" w:hAnsi="Arial" w:cs="Arial"/>
+          <w:i/>
+          <w:iCs/>
+        </w:rPr>
+        <w:t>PUT</w:t>
+      </w:r>
+      <w:r>
+        <w:rPr>
+          <w:rFonts w:ascii="Arial" w:hAnsi="Arial" w:cs="Arial"/>
+        </w:rPr>
+        <w:t xml:space="preserve"> kérést küld a backend felé az adott helyszín azonosítójával és az új értékeléssel, majd a lista frissítésre kerül.</w:t>
+      </w:r>
+    </w:p>
+    <w:p>
+      <w:pPr>
+        <w:spacing w:line="360" w:lineRule="auto"/>
+        <w:jc w:val="both"/>
+        <w:rPr>
+          <w:rFonts w:ascii="Arial" w:hAnsi="Arial" w:cs="Arial"/>
+        </w:rPr>
+      </w:pPr>
+      <w:r>
+        <w:rPr>
+          <w:rFonts w:ascii="Arial" w:hAnsi="Arial" w:cs="Arial"/>
+        </w:rPr>
+        <w:t xml:space="preserve">Egy adott kártyára kattintva egy részletes nézet nyílik meg, amely egy HTML &lt;template&gt; elem klónozásával dinamikusan felépítve megjeleníti a helyszín összes adatát, beleértve a hozzá tartozó összes fényképet egy galéria formájában. Amennyiben a helyszínhez tartoznak koordináták, a rendszer egy, az </w:t>
+      </w:r>
+      <w:r>
+        <w:rPr>
+          <w:rFonts w:ascii="Arial" w:hAnsi="Arial" w:cs="Arial"/>
+          <w:i/>
+          <w:iCs/>
+        </w:rPr>
+        <w:t xml:space="preserve">OpenStreetMap </w:t>
+      </w:r>
+      <w:r>
+        <w:rPr>
+          <w:rFonts w:ascii="Arial" w:hAnsi="Arial" w:cs="Arial"/>
+        </w:rPr>
+        <w:t>szolgáltatásra mutató hivatkozást is megjelenít, amelyen keresztül a helyszín térképen is megtekinthető.</w:t>
+      </w:r>
+    </w:p>
+    <w:p>
+      <w:pPr>
+        <w:spacing w:line="360" w:lineRule="auto"/>
+        <w:jc w:val="both"/>
+        <w:rPr>
+          <w:rFonts w:ascii="Arial" w:hAnsi="Arial" w:cs="Arial"/>
+        </w:rPr>
+      </w:pPr>
+      <w:r>
+        <w:rPr>
+          <w:rFonts w:ascii="Arial" w:hAnsi="Arial" w:cs="Arial"/>
+        </w:rPr>
+        <w:t>5.</w:t>
+      </w:r>
+      <w:r>
+        <w:rPr>
+          <w:rFonts w:ascii="Arial" w:hAnsi="Arial" w:cs="Arial"/>
+        </w:rPr>
+        <w:t>3</w:t>
+      </w:r>
+      <w:r>
+        <w:rPr>
+          <w:rFonts w:ascii="Arial" w:hAnsi="Arial" w:cs="Arial"/>
+        </w:rPr>
+        <w:t>.2. Térképnézet</w:t>
+      </w:r>
+    </w:p>
+    <w:p>
+      <w:pPr>
+        <w:spacing w:line="360" w:lineRule="auto"/>
+        <w:jc w:val="both"/>
+        <w:rPr>
+          <w:rFonts w:ascii="Arial" w:hAnsi="Arial" w:cs="Arial"/>
+        </w:rPr>
+      </w:pPr>
+      <w:r>
+        <w:rPr>
+          <w:rFonts w:ascii="Arial" w:hAnsi="Arial" w:cs="Arial"/>
+        </w:rPr>
+        <w:t xml:space="preserve">A térképnézet a nyílt forráskódú </w:t>
+      </w:r>
+      <w:r>
+        <w:rPr>
+          <w:rFonts w:ascii="Arial" w:hAnsi="Arial" w:cs="Arial"/>
+          <w:i/>
+          <w:iCs/>
+        </w:rPr>
+        <w:t>Leaflet JavaScript</w:t>
+      </w:r>
+      <w:r>
+        <w:rPr>
+          <w:rFonts w:ascii="Arial" w:hAnsi="Arial" w:cs="Arial"/>
+        </w:rPr>
+        <w:t xml:space="preserve"> könyvtár és az </w:t>
+      </w:r>
+      <w:r>
+        <w:rPr>
+          <w:rFonts w:ascii="Arial" w:hAnsi="Arial" w:cs="Arial"/>
+          <w:i/>
+          <w:iCs/>
+        </w:rPr>
+        <w:t>OpenStreetMap</w:t>
+      </w:r>
+      <w:r>
+        <w:rPr>
+          <w:rFonts w:ascii="Arial" w:hAnsi="Arial" w:cs="Arial"/>
+        </w:rPr>
+        <w:t xml:space="preserve"> térképcsempe-szolgáltatás segítségével jeleníti meg a felhasználó meglátogatott helyeit egy interaktív világtérképen. Az oldal betöltésekor a rendszer létrehoz egy </w:t>
+      </w:r>
+      <w:r>
+        <w:rPr>
+          <w:rFonts w:ascii="Arial" w:hAnsi="Arial" w:cs="Arial"/>
+          <w:i/>
+          <w:iCs/>
+        </w:rPr>
+        <w:t>Leaflet</w:t>
+      </w:r>
+      <w:r>
+        <w:rPr>
+          <w:rFonts w:ascii="Arial" w:hAnsi="Arial" w:cs="Arial"/>
+        </w:rPr>
+        <w:t xml:space="preserve"> térképobjektumot, amelyre az </w:t>
+      </w:r>
+      <w:r>
+        <w:rPr>
+          <w:rFonts w:ascii="Arial" w:hAnsi="Arial" w:cs="Arial"/>
+          <w:i/>
+          <w:iCs/>
+        </w:rPr>
+        <w:t>OpenStreetMap</w:t>
+      </w:r>
+      <w:r>
+        <w:rPr>
+          <w:rFonts w:ascii="Arial" w:hAnsi="Arial" w:cs="Arial"/>
+        </w:rPr>
+        <w:t xml:space="preserve"> csempéit tölti be, majd a bejelentkezett felhasználó azonosítója alapján lekérdezi a </w:t>
+      </w:r>
+      <w:r>
+        <w:rPr>
+          <w:rFonts w:ascii="Arial" w:hAnsi="Arial" w:cs="Arial"/>
+          <w:i/>
+          <w:iCs/>
+        </w:rPr>
+        <w:t>/api/users/{user_id}/visited-places</w:t>
+      </w:r>
+      <w:r>
+        <w:rPr>
+          <w:rFonts w:ascii="Arial" w:hAnsi="Arial" w:cs="Arial"/>
+        </w:rPr>
+        <w:t xml:space="preserve"> végpontról a helyszínadatokat.</w:t>
+      </w:r>
+    </w:p>
+    <w:p>
+      <w:pPr>
+        <w:spacing w:line="360" w:lineRule="auto"/>
+        <w:jc w:val="both"/>
+        <w:rPr>
+          <w:rFonts w:ascii="Arial" w:hAnsi="Arial" w:cs="Arial"/>
+        </w:rPr>
+      </w:pPr>
       <w:r>
         <w:rPr>
           <w:rFonts w:ascii="Arial" w:hAnsi="Arial" w:cs="Arial"/>
         </w:rPr>
         <w:lastRenderedPageBreak/>
-        <w:t>a</w:t>
-      </w:r>
-      <w:r>
-        <w:rPr>
-          <w:rFonts w:ascii="Arial" w:hAnsi="Arial" w:cs="Arial"/>
-        </w:rPr>
-        <w:t>z</w:t>
+        <w:t>A visszakapott adatokat ugyan</w:t>
+      </w:r>
+      <w:r>
+        <w:rPr>
+          <w:rFonts w:ascii="Arial" w:hAnsi="Arial" w:cs="Arial"/>
+        </w:rPr>
+        <w:t>úgy</w:t>
+      </w:r>
+      <w:r>
+        <w:rPr>
+          <w:rFonts w:ascii="Arial" w:hAnsi="Arial" w:cs="Arial"/>
+        </w:rPr>
+        <w:t xml:space="preserve"> a </w:t>
+      </w:r>
+      <w:r>
+        <w:rPr>
+          <w:rFonts w:ascii="Arial" w:hAnsi="Arial" w:cs="Arial"/>
+          <w:i/>
+          <w:iCs/>
+        </w:rPr>
+        <w:t>normalizePlace</w:t>
+      </w:r>
+      <w:r>
+        <w:rPr>
+          <w:rFonts w:ascii="Arial" w:hAnsi="Arial" w:cs="Arial"/>
+        </w:rPr>
+        <w:t xml:space="preserve"> függvény alakítja át</w:t>
+      </w:r>
+      <w:r>
+        <w:rPr>
+          <w:rFonts w:ascii="Arial" w:hAnsi="Arial" w:cs="Arial"/>
+        </w:rPr>
+        <w:t>, mint a listanézetnél</w:t>
+      </w:r>
+      <w:r>
+        <w:rPr>
+          <w:rFonts w:ascii="Arial" w:hAnsi="Arial" w:cs="Arial"/>
+        </w:rPr>
+        <w:t>, amely ezúttal a helyszínek szélességi és hosszúsági koordinátáit is kinyeri és numerikus formátumra alakítja.</w:t>
       </w:r>
       <w:r>
         <w:rPr>
@@ -9068,6 +9661,65 @@
       <w:r>
         <w:rPr>
           <w:rFonts w:ascii="Arial" w:hAnsi="Arial" w:cs="Arial"/>
+        </w:rPr>
+        <w:t>Azok a helyszínek, amelyekhez a rögzítéskor nem sikerült koordinátát rendelni</w:t>
+      </w:r>
+      <w:r>
+        <w:rPr>
+          <w:rFonts w:ascii="Arial" w:hAnsi="Arial" w:cs="Arial"/>
+        </w:rPr>
+        <w:t xml:space="preserve">, </w:t>
+      </w:r>
+      <w:r>
+        <w:rPr>
+          <w:rFonts w:ascii="Arial" w:hAnsi="Arial" w:cs="Arial"/>
+        </w:rPr>
+        <w:t>figyelmeztető üzenet mellett kimaradnak a térképi megjelenítésből, mivel</w:t>
+      </w:r>
+      <w:r>
+        <w:rPr>
+          <w:rFonts w:ascii="Arial" w:hAnsi="Arial" w:cs="Arial"/>
+        </w:rPr>
+        <w:t xml:space="preserve"> koordináták hiányában</w:t>
+      </w:r>
+      <w:r>
+        <w:rPr>
+          <w:rFonts w:ascii="Arial" w:hAnsi="Arial" w:cs="Arial"/>
+        </w:rPr>
+        <w:t xml:space="preserve"> elhelyezésükre nincs mód.</w:t>
+      </w:r>
+    </w:p>
+    <w:p>
+      <w:pPr>
+        <w:spacing w:line="360" w:lineRule="auto"/>
+        <w:jc w:val="both"/>
+        <w:rPr>
+          <w:rFonts w:ascii="Arial" w:hAnsi="Arial" w:cs="Arial"/>
+        </w:rPr>
+      </w:pPr>
+      <w:r>
+        <w:rPr>
+          <w:rFonts w:ascii="Arial" w:hAnsi="Arial" w:cs="Arial"/>
+        </w:rPr>
+        <w:t xml:space="preserve">A megjeleníthető helyszínekhez a rendszer egy-egy jelölőt helyez el a térképen, amelyeket egy közös </w:t>
+      </w:r>
+      <w:r>
+        <w:rPr>
+          <w:rFonts w:ascii="Arial" w:hAnsi="Arial" w:cs="Arial"/>
+          <w:i/>
+          <w:iCs/>
+        </w:rPr>
+        <w:t>L.featureGroup</w:t>
+      </w:r>
+      <w:r>
+        <w:rPr>
+          <w:rFonts w:ascii="Arial" w:hAnsi="Arial" w:cs="Arial"/>
+        </w:rPr>
+        <w:t xml:space="preserve"> objektumban gyűjt össze; az egyes jelölőkre kattintva egy felugró popup jeleníti meg a helyszín nevét, a látogatás dátumát és a hozzá fűzött leírást, ez esetben is az </w:t>
+      </w:r>
+      <w:r>
+        <w:rPr>
+          <w:rFonts w:ascii="Arial" w:hAnsi="Arial" w:cs="Arial"/>
           <w:i/>
           <w:iCs/>
         </w:rPr>
@@ -9077,329 +9729,6 @@
         <w:rPr>
           <w:rFonts w:ascii="Arial" w:hAnsi="Arial" w:cs="Arial"/>
         </w:rPr>
-        <w:t xml:space="preserve"> segédfüggvényen vezeti át, ezáltal megelőzve a rosszindulatú HTML- vagy s</w:t>
-      </w:r>
-      <w:r>
-        <w:rPr>
-          <w:rFonts w:ascii="Arial" w:hAnsi="Arial" w:cs="Arial"/>
-        </w:rPr>
-        <w:t>criptkód</w:t>
-      </w:r>
-      <w:r>
-        <w:rPr>
-          <w:rFonts w:ascii="Arial" w:hAnsi="Arial" w:cs="Arial"/>
-        </w:rPr>
-        <w:t xml:space="preserve"> beágyazásából eredő biztonsági problémákat</w:t>
-      </w:r>
-      <w:r>
-        <w:rPr>
-          <w:rFonts w:ascii="Arial" w:hAnsi="Arial" w:cs="Arial"/>
-        </w:rPr>
-        <w:t xml:space="preserve">. </w:t>
-      </w:r>
-      <w:r>
-        <w:rPr>
-          <w:rFonts w:ascii="Arial" w:hAnsi="Arial" w:cs="Arial"/>
-        </w:rPr>
-        <w:t>Minden kártyán megjelenik egy interaktív, ötcsillagos értékelőelem is, am</w:t>
-      </w:r>
-      <w:r>
-        <w:rPr>
-          <w:rFonts w:ascii="Arial" w:hAnsi="Arial" w:cs="Arial"/>
-        </w:rPr>
-        <w:t>i</w:t>
-      </w:r>
-      <w:r>
-        <w:rPr>
-          <w:rFonts w:ascii="Arial" w:hAnsi="Arial" w:cs="Arial"/>
-        </w:rPr>
-        <w:t xml:space="preserve">nek valamelyik csillagára kattintva a kliens azonnal egy </w:t>
-      </w:r>
-      <w:r>
-        <w:rPr>
-          <w:rFonts w:ascii="Arial" w:hAnsi="Arial" w:cs="Arial"/>
-          <w:i/>
-          <w:iCs/>
-        </w:rPr>
-        <w:t>PUT</w:t>
-      </w:r>
-      <w:r>
-        <w:rPr>
-          <w:rFonts w:ascii="Arial" w:hAnsi="Arial" w:cs="Arial"/>
-        </w:rPr>
-        <w:t xml:space="preserve"> kérést küld a backend felé az adott helyszín azonosítójával és az új értékeléssel, majd a lista frissítésre kerül.</w:t>
-      </w:r>
-    </w:p>
-    <w:p>
-      <w:pPr>
-        <w:spacing w:line="360" w:lineRule="auto"/>
-        <w:jc w:val="both"/>
-        <w:rPr>
-          <w:rFonts w:ascii="Arial" w:hAnsi="Arial" w:cs="Arial"/>
-        </w:rPr>
-      </w:pPr>
-      <w:r>
-        <w:rPr>
-          <w:rFonts w:ascii="Arial" w:hAnsi="Arial" w:cs="Arial"/>
-        </w:rPr>
-        <w:t xml:space="preserve">Egy adott kártyára kattintva egy részletes nézet nyílik meg, amely egy HTML &lt;template&gt; elem klónozásával dinamikusan felépítve megjeleníti a helyszín összes adatát, beleértve a hozzá tartozó összes fényképet egy galéria formájában. Amennyiben a helyszínhez tartoznak koordináták, a rendszer egy, az </w:t>
-      </w:r>
-      <w:r>
-        <w:rPr>
-          <w:rFonts w:ascii="Arial" w:hAnsi="Arial" w:cs="Arial"/>
-          <w:i/>
-          <w:iCs/>
-        </w:rPr>
-        <w:t xml:space="preserve">OpenStreetMap </w:t>
-      </w:r>
-      <w:r>
-        <w:rPr>
-          <w:rFonts w:ascii="Arial" w:hAnsi="Arial" w:cs="Arial"/>
-        </w:rPr>
-        <w:t>szolgáltatásra mutató hivatkozást is megjelenít, amelyen keresztül a helyszín térképen is megtekinthető.</w:t>
-      </w:r>
-    </w:p>
-    <w:p>
-      <w:pPr>
-        <w:spacing w:line="360" w:lineRule="auto"/>
-        <w:jc w:val="both"/>
-        <w:rPr>
-          <w:rFonts w:ascii="Arial" w:hAnsi="Arial" w:cs="Arial"/>
-        </w:rPr>
-      </w:pPr>
-      <w:r>
-        <w:rPr>
-          <w:rFonts w:ascii="Arial" w:hAnsi="Arial" w:cs="Arial"/>
-        </w:rPr>
-        <w:t>5.</w:t>
-      </w:r>
-      <w:r>
-        <w:rPr>
-          <w:rFonts w:ascii="Arial" w:hAnsi="Arial" w:cs="Arial"/>
-        </w:rPr>
-        <w:t>3</w:t>
-      </w:r>
-      <w:r>
-        <w:rPr>
-          <w:rFonts w:ascii="Arial" w:hAnsi="Arial" w:cs="Arial"/>
-        </w:rPr>
-        <w:t>.2. Térképnézet</w:t>
-      </w:r>
-    </w:p>
-    <w:p>
-      <w:pPr>
-        <w:spacing w:line="360" w:lineRule="auto"/>
-        <w:jc w:val="both"/>
-        <w:rPr>
-          <w:rFonts w:ascii="Arial" w:hAnsi="Arial" w:cs="Arial"/>
-        </w:rPr>
-      </w:pPr>
-      <w:r>
-        <w:rPr>
-          <w:rFonts w:ascii="Arial" w:hAnsi="Arial" w:cs="Arial"/>
-        </w:rPr>
-        <w:t xml:space="preserve">A térképnézet a nyílt forráskódú </w:t>
-      </w:r>
-      <w:r>
-        <w:rPr>
-          <w:rFonts w:ascii="Arial" w:hAnsi="Arial" w:cs="Arial"/>
-          <w:i/>
-          <w:iCs/>
-        </w:rPr>
-        <w:t>Leaflet JavaScript</w:t>
-      </w:r>
-      <w:r>
-        <w:rPr>
-          <w:rFonts w:ascii="Arial" w:hAnsi="Arial" w:cs="Arial"/>
-        </w:rPr>
-        <w:t xml:space="preserve"> könyvtár és az </w:t>
-      </w:r>
-      <w:r>
-        <w:rPr>
-          <w:rFonts w:ascii="Arial" w:hAnsi="Arial" w:cs="Arial"/>
-          <w:i/>
-          <w:iCs/>
-        </w:rPr>
-        <w:t>OpenStreetMap</w:t>
-      </w:r>
-      <w:r>
-        <w:rPr>
-          <w:rFonts w:ascii="Arial" w:hAnsi="Arial" w:cs="Arial"/>
-        </w:rPr>
-        <w:t xml:space="preserve"> térképcsempe-szolgáltatás segítségével jeleníti meg a felhasználó meglátogatott helyeit egy interaktív világtérképen. Az oldal betöltésekor a rendszer létrehoz egy </w:t>
-      </w:r>
-      <w:r>
-        <w:rPr>
-          <w:rFonts w:ascii="Arial" w:hAnsi="Arial" w:cs="Arial"/>
-          <w:i/>
-          <w:iCs/>
-        </w:rPr>
-        <w:t>Leaflet</w:t>
-      </w:r>
-      <w:r>
-        <w:rPr>
-          <w:rFonts w:ascii="Arial" w:hAnsi="Arial" w:cs="Arial"/>
-        </w:rPr>
-        <w:t xml:space="preserve"> térképobjektumot, amelyre az </w:t>
-      </w:r>
-      <w:r>
-        <w:rPr>
-          <w:rFonts w:ascii="Arial" w:hAnsi="Arial" w:cs="Arial"/>
-          <w:i/>
-          <w:iCs/>
-        </w:rPr>
-        <w:t>OpenStreetMap</w:t>
-      </w:r>
-      <w:r>
-        <w:rPr>
-          <w:rFonts w:ascii="Arial" w:hAnsi="Arial" w:cs="Arial"/>
-        </w:rPr>
-        <w:t xml:space="preserve"> csempéit tölti be, majd a bejelentkezett felhasználó azonosítója alapján lekérdezi a </w:t>
-      </w:r>
-      <w:r>
-        <w:rPr>
-          <w:rFonts w:ascii="Arial" w:hAnsi="Arial" w:cs="Arial"/>
-          <w:i/>
-          <w:iCs/>
-        </w:rPr>
-        <w:t>/api/users/{user_id}/visited-places</w:t>
-      </w:r>
-      <w:r>
-        <w:rPr>
-          <w:rFonts w:ascii="Arial" w:hAnsi="Arial" w:cs="Arial"/>
-        </w:rPr>
-        <w:t xml:space="preserve"> végpontról a helyszínadatokat.</w:t>
-      </w:r>
-    </w:p>
-    <w:p>
-      <w:pPr>
-        <w:spacing w:line="360" w:lineRule="auto"/>
-        <w:jc w:val="both"/>
-        <w:rPr>
-          <w:rFonts w:ascii="Arial" w:hAnsi="Arial" w:cs="Arial"/>
-        </w:rPr>
-      </w:pPr>
-      <w:r>
-        <w:rPr>
-          <w:rFonts w:ascii="Arial" w:hAnsi="Arial" w:cs="Arial"/>
-        </w:rPr>
-        <w:t>A visszakapott adatokat ugyan</w:t>
-      </w:r>
-      <w:r>
-        <w:rPr>
-          <w:rFonts w:ascii="Arial" w:hAnsi="Arial" w:cs="Arial"/>
-        </w:rPr>
-        <w:t>úgy</w:t>
-      </w:r>
-      <w:r>
-        <w:rPr>
-          <w:rFonts w:ascii="Arial" w:hAnsi="Arial" w:cs="Arial"/>
-        </w:rPr>
-        <w:t xml:space="preserve"> a </w:t>
-      </w:r>
-      <w:r>
-        <w:rPr>
-          <w:rFonts w:ascii="Arial" w:hAnsi="Arial" w:cs="Arial"/>
-          <w:i/>
-          <w:iCs/>
-        </w:rPr>
-        <w:t>normalizePlace</w:t>
-      </w:r>
-      <w:r>
-        <w:rPr>
-          <w:rFonts w:ascii="Arial" w:hAnsi="Arial" w:cs="Arial"/>
-        </w:rPr>
-        <w:t xml:space="preserve"> függvény alakítja át</w:t>
-      </w:r>
-      <w:r>
-        <w:rPr>
-          <w:rFonts w:ascii="Arial" w:hAnsi="Arial" w:cs="Arial"/>
-        </w:rPr>
-        <w:t>, mint a listanézetnél</w:t>
-      </w:r>
-      <w:r>
-        <w:rPr>
-          <w:rFonts w:ascii="Arial" w:hAnsi="Arial" w:cs="Arial"/>
-        </w:rPr>
-        <w:t>, amely ezúttal a helyszínek szélességi és hosszúsági koordinátáit is kinyeri és numerikus formátumra alakítja.</w:t>
-      </w:r>
-      <w:r>
-        <w:rPr>
-          <w:rFonts w:ascii="Arial" w:hAnsi="Arial" w:cs="Arial"/>
-        </w:rPr>
-        <w:t xml:space="preserve"> </w:t>
-      </w:r>
-      <w:r>
-        <w:rPr>
-          <w:rFonts w:ascii="Arial" w:hAnsi="Arial" w:cs="Arial"/>
-        </w:rPr>
-        <w:t>Azok a helyszínek, amelyekhez a rögzítéskor nem sikerült koordinátát rendelni</w:t>
-      </w:r>
-      <w:r>
-        <w:rPr>
-          <w:rFonts w:ascii="Arial" w:hAnsi="Arial" w:cs="Arial"/>
-        </w:rPr>
-        <w:t xml:space="preserve">, </w:t>
-      </w:r>
-      <w:r>
-        <w:rPr>
-          <w:rFonts w:ascii="Arial" w:hAnsi="Arial" w:cs="Arial"/>
-        </w:rPr>
-        <w:t>figyelmeztető üzenet mellett kimaradnak a térképi megjelenítésből, mivel</w:t>
-      </w:r>
-      <w:r>
-        <w:rPr>
-          <w:rFonts w:ascii="Arial" w:hAnsi="Arial" w:cs="Arial"/>
-        </w:rPr>
-        <w:t xml:space="preserve"> koordináták hiányában</w:t>
-      </w:r>
-      <w:r>
-        <w:rPr>
-          <w:rFonts w:ascii="Arial" w:hAnsi="Arial" w:cs="Arial"/>
-        </w:rPr>
-        <w:t xml:space="preserve"> elhelyezésükre nincs mód.</w:t>
-      </w:r>
-    </w:p>
-    <w:p>
-      <w:pPr>
-        <w:spacing w:line="360" w:lineRule="auto"/>
-        <w:jc w:val="both"/>
-        <w:rPr>
-          <w:rFonts w:ascii="Arial" w:hAnsi="Arial" w:cs="Arial"/>
-        </w:rPr>
-      </w:pPr>
-      <w:r>
-        <w:rPr>
-          <w:rFonts w:ascii="Arial" w:hAnsi="Arial" w:cs="Arial"/>
-        </w:rPr>
-        <w:t xml:space="preserve">A megjeleníthető helyszínekhez a rendszer egy-egy jelölőt helyez el a térképen, amelyeket egy közös </w:t>
-      </w:r>
-      <w:r>
-        <w:rPr>
-          <w:rFonts w:ascii="Arial" w:hAnsi="Arial" w:cs="Arial"/>
-          <w:i/>
-          <w:iCs/>
-        </w:rPr>
-        <w:t>L.featureGroup</w:t>
-      </w:r>
-      <w:r>
-        <w:rPr>
-          <w:rFonts w:ascii="Arial" w:hAnsi="Arial" w:cs="Arial"/>
-        </w:rPr>
-        <w:t xml:space="preserve"> objektumban gyűjt össze; az egyes jelölőkre kattintva egy felugró popup jeleníti meg a helyszín nevét, a látogatás dátumát és a hozzá fűzött leírást, ez esetben is az </w:t>
-      </w:r>
-      <w:r>
-        <w:rPr>
-          <w:rFonts w:ascii="Arial" w:hAnsi="Arial" w:cs="Arial"/>
-          <w:i/>
-          <w:iCs/>
-        </w:rPr>
-        <w:t>escapeHtml</w:t>
-      </w:r>
-      <w:r>
-        <w:rPr>
-          <w:rFonts w:ascii="Arial" w:hAnsi="Arial" w:cs="Arial"/>
-        </w:rPr>
         <w:t xml:space="preserve"> függvényen átvezetve a szöveges tartalmat a biztonságos megjelenítés érdekében. Miután az összes jelölő elhelyezésre került, a rendszer a </w:t>
       </w:r>
       <w:r>
@@ -9441,7 +9770,6 @@
         <w:rPr>
           <w:rFonts w:ascii="Arial" w:hAnsi="Arial" w:cs="Arial"/>
         </w:rPr>
-        <w:lastRenderedPageBreak/>
         <w:t>A lista- és a térképnézet között a felhasználó egy erre szolgáló gombbal bármikor válthat, így a két megjelenítési mód kiegészíti egymást: a listanézet a részletes adatkezelésre, a térképnézet pedig az utazások földrajzi áttekintésére nyújt lehetőséget.</w:t>
       </w:r>
     </w:p>
@@ -9600,6 +9928,7 @@
         <w:rPr>
           <w:rFonts w:ascii="Arial" w:hAnsi="Arial" w:cs="Arial"/>
         </w:rPr>
+        <w:lastRenderedPageBreak/>
         <w:t>A fényképfeltöltés</w:t>
       </w:r>
       <w:r>
@@ -9712,7 +10041,6 @@
         <w:rPr>
           <w:rFonts w:ascii="Arial" w:hAnsi="Arial" w:cs="Arial"/>
         </w:rPr>
-        <w:lastRenderedPageBreak/>
         <w:t>A helyszín sikeres létrehozását követően</w:t>
       </w:r>
       <w:r>
@@ -9984,6 +10312,7 @@
         <w:rPr>
           <w:rFonts w:ascii="Arial" w:hAnsi="Arial" w:cs="Arial"/>
         </w:rPr>
+        <w:lastRenderedPageBreak/>
         <w:t>5.</w:t>
       </w:r>
       <w:r>
@@ -10067,6 +10396,272 @@
         <w:jc w:val="both"/>
         <w:rPr>
           <w:rFonts w:ascii="Arial" w:hAnsi="Arial" w:cs="Arial"/>
+        </w:rPr>
+      </w:pPr>
+      <w:r>
+        <w:rPr>
+          <w:rFonts w:ascii="Arial" w:hAnsi="Arial" w:cs="Arial"/>
+        </w:rPr>
+        <w:t>A rendszer</w:t>
+      </w:r>
+      <w:r>
+        <w:rPr>
+          <w:rFonts w:ascii="Arial" w:hAnsi="Arial" w:cs="Arial"/>
+        </w:rPr>
+        <w:t>nek van egy dedikált beállítások oldala</w:t>
+      </w:r>
+      <w:r>
+        <w:rPr>
+          <w:rFonts w:ascii="Arial" w:hAnsi="Arial" w:cs="Arial"/>
+        </w:rPr>
+        <w:t>, amelyen keresztül a felhasználó testreszabhatja az alkalmazás megjelenését és az AI-alapú útiterv-generáláshoz használt nyelvi modell szolgáltatóját. A funkció három, egymástól független beállítási csoportból áll: téma, nyelv, valamint az AI szolgáltató kiválasztása.</w:t>
+      </w:r>
+    </w:p>
+    <w:p>
+      <w:pPr>
+        <w:spacing w:line="360" w:lineRule="auto"/>
+        <w:jc w:val="both"/>
+        <w:rPr>
+          <w:rFonts w:ascii="Arial" w:hAnsi="Arial" w:cs="Arial"/>
+        </w:rPr>
+      </w:pPr>
+      <w:r>
+        <w:rPr>
+          <w:rFonts w:ascii="Arial" w:hAnsi="Arial" w:cs="Arial"/>
+        </w:rPr>
+        <w:t xml:space="preserve">5.7.1. </w:t>
+      </w:r>
+      <w:r>
+        <w:rPr>
+          <w:rFonts w:ascii="Arial" w:hAnsi="Arial" w:cs="Arial"/>
+        </w:rPr>
+        <w:t>Téma és nyelv kiválasztása</w:t>
+      </w:r>
+    </w:p>
+    <w:p>
+      <w:pPr>
+        <w:spacing w:line="360" w:lineRule="auto"/>
+        <w:jc w:val="both"/>
+        <w:rPr>
+          <w:rFonts w:ascii="Arial" w:hAnsi="Arial" w:cs="Arial"/>
+        </w:rPr>
+      </w:pPr>
+      <w:r>
+        <w:rPr>
+          <w:rFonts w:ascii="Arial" w:hAnsi="Arial" w:cs="Arial"/>
+        </w:rPr>
+        <w:t xml:space="preserve">Az oldal betöltésekor a kliens oldali script a böngésző </w:t>
+      </w:r>
+      <w:r>
+        <w:rPr>
+          <w:rFonts w:ascii="Arial" w:hAnsi="Arial" w:cs="Arial"/>
+          <w:i/>
+          <w:iCs/>
+        </w:rPr>
+        <w:t>localStorage</w:t>
+      </w:r>
+      <w:r>
+        <w:rPr>
+          <w:rFonts w:ascii="Arial" w:hAnsi="Arial" w:cs="Arial"/>
+        </w:rPr>
+        <w:t xml:space="preserve"> tárolójából olvassa ki a korábban elmentett téma- és nyelvbeállítást</w:t>
+      </w:r>
+      <w:r>
+        <w:rPr>
+          <w:rFonts w:ascii="Arial" w:hAnsi="Arial" w:cs="Arial"/>
+        </w:rPr>
+        <w:t xml:space="preserve">, </w:t>
+      </w:r>
+      <w:r>
+        <w:rPr>
+          <w:rFonts w:ascii="Arial" w:hAnsi="Arial" w:cs="Arial"/>
+        </w:rPr>
+        <w:t xml:space="preserve">alapértelmezett értékként sötét témát és angol nyelvet feltételezve, amennyiben még nem történt korábbi mentés. A kiolvasott értékeket a rendszer egyrészt a legördülő menük aktuális állapotaként jeleníti meg, másrészt azonnal alkalmazza is: a témát az </w:t>
+      </w:r>
+      <w:r>
+        <w:rPr>
+          <w:rFonts w:ascii="Arial" w:hAnsi="Arial" w:cs="Arial"/>
+          <w:i/>
+          <w:iCs/>
+        </w:rPr>
+        <w:t>applyAppTheme</w:t>
+      </w:r>
+      <w:r>
+        <w:rPr>
+          <w:rFonts w:ascii="Arial" w:hAnsi="Arial" w:cs="Arial"/>
+        </w:rPr>
+        <w:t xml:space="preserve"> globális függvény állítja be, míg a nyelvet az i18n modul </w:t>
+      </w:r>
+      <w:r>
+        <w:rPr>
+          <w:rFonts w:ascii="Arial" w:hAnsi="Arial" w:cs="Arial"/>
+          <w:i/>
+          <w:iCs/>
+        </w:rPr>
+        <w:t>setLanguage</w:t>
+      </w:r>
+      <w:r>
+        <w:rPr>
+          <w:rFonts w:ascii="Arial" w:hAnsi="Arial" w:cs="Arial"/>
+        </w:rPr>
+        <w:t xml:space="preserve"> és </w:t>
+      </w:r>
+      <w:r>
+        <w:rPr>
+          <w:rFonts w:ascii="Arial" w:hAnsi="Arial" w:cs="Arial"/>
+          <w:i/>
+          <w:iCs/>
+        </w:rPr>
+        <w:t>applyToPage</w:t>
+      </w:r>
+      <w:r>
+        <w:rPr>
+          <w:rFonts w:ascii="Arial" w:hAnsi="Arial" w:cs="Arial"/>
+        </w:rPr>
+        <w:t xml:space="preserve"> metódusai vezetik át a felületen. Amennyiben a felhasználó az "Auto (System)" témaopciót választja, a rendszer egy külön eseményfigyelőt is regisztrál, amely az operációs rendszer téma-beállításának változását követi.</w:t>
+      </w:r>
+    </w:p>
+    <w:p>
+      <w:pPr>
+        <w:spacing w:line="360" w:lineRule="auto"/>
+        <w:jc w:val="both"/>
+        <w:rPr>
+          <w:rFonts w:ascii="Arial" w:hAnsi="Arial" w:cs="Arial"/>
+        </w:rPr>
+      </w:pPr>
+      <w:r>
+        <w:rPr>
+          <w:rFonts w:ascii="Arial" w:hAnsi="Arial" w:cs="Arial"/>
+        </w:rPr>
+        <w:t xml:space="preserve">Az űrlap elküldésekor a rendszer a kiválasztott téma- és nyelvi értékeket elmenti a </w:t>
+      </w:r>
+      <w:r>
+        <w:rPr>
+          <w:rFonts w:ascii="Arial" w:hAnsi="Arial" w:cs="Arial"/>
+          <w:i/>
+          <w:iCs/>
+        </w:rPr>
+        <w:t>localStorage</w:t>
+      </w:r>
+      <w:r>
+        <w:rPr>
+          <w:rFonts w:ascii="Arial" w:hAnsi="Arial" w:cs="Arial"/>
+        </w:rPr>
+        <w:t>-ba, majd újra alkalmazza azokat a felületen. A sikeres mentésről a felhasználó egy rövid, néhány másodperc után automatikusan eltűnő visszajelző üzenetet kap.</w:t>
+      </w:r>
+    </w:p>
+    <w:p>
+      <w:pPr>
+        <w:spacing w:line="360" w:lineRule="auto"/>
+        <w:jc w:val="both"/>
+        <w:rPr>
+          <w:rFonts w:ascii="Arial" w:hAnsi="Arial" w:cs="Arial"/>
+        </w:rPr>
+      </w:pPr>
+      <w:r>
+        <w:rPr>
+          <w:rFonts w:ascii="Arial" w:hAnsi="Arial" w:cs="Arial"/>
+        </w:rPr>
+        <w:t xml:space="preserve">5.7.2. </w:t>
+      </w:r>
+      <w:r>
+        <w:rPr>
+          <w:rFonts w:ascii="Arial" w:hAnsi="Arial" w:cs="Arial"/>
+        </w:rPr>
+        <w:t>AI szolgáltató kiválasztása</w:t>
+      </w:r>
+    </w:p>
+    <w:p>
+      <w:pPr>
+        <w:spacing w:line="360" w:lineRule="auto"/>
+        <w:jc w:val="both"/>
+        <w:rPr>
+          <w:rFonts w:ascii="Arial" w:hAnsi="Arial" w:cs="Arial"/>
+        </w:rPr>
+      </w:pPr>
+      <w:r>
+        <w:rPr>
+          <w:rFonts w:ascii="Arial" w:hAnsi="Arial" w:cs="Arial"/>
+        </w:rPr>
+        <w:t>A beállítások oldal emellett lehetőséget biztosít arra is, hogy a felhasználó kiválassza, mely mesterséges intelligencia szolgáltatót kívánja használni az útitervek generálásához: a felhő alapú DeepSeek API-t, vagy a helyben futtatott Ollama modellt</w:t>
+      </w:r>
+      <w:r>
+        <w:rPr>
+          <w:rFonts w:ascii="Arial" w:hAnsi="Arial" w:cs="Arial"/>
+        </w:rPr>
+        <w:t xml:space="preserve"> (ez jelenleg a hosztolt verzióban nem elérhető)</w:t>
+      </w:r>
+      <w:r>
+        <w:rPr>
+          <w:rFonts w:ascii="Arial" w:hAnsi="Arial" w:cs="Arial"/>
+        </w:rPr>
+        <w:t>. Mivel ez a beállítás a felhasználói fiókhoz kötött, kizárólag bejelentkezett felhasználók számára érhető el; amennyiben a rendszer nem talál bejelentkezett felhasználót, a választási lehetőség elrejtésre kerül, és helyette egy, a bejelentkezés szükségességére figyelmeztető üzenet jelenik meg.</w:t>
+      </w:r>
+    </w:p>
+    <w:p>
+      <w:pPr>
+        <w:spacing w:line="360" w:lineRule="auto"/>
+        <w:jc w:val="both"/>
+        <w:rPr>
+          <w:rFonts w:ascii="Arial" w:hAnsi="Arial" w:cs="Arial"/>
+        </w:rPr>
+      </w:pPr>
+      <w:r>
+        <w:rPr>
+          <w:rFonts w:ascii="Arial" w:hAnsi="Arial" w:cs="Arial"/>
+        </w:rPr>
+        <w:lastRenderedPageBreak/>
+        <w:t xml:space="preserve">Bejelentkezett felhasználó esetén az oldal betöltésekor a kliens egy GET kéréssel lekérdezi a felhasználó adatait a </w:t>
+      </w:r>
+      <w:r>
+        <w:rPr>
+          <w:rFonts w:ascii="Arial" w:hAnsi="Arial" w:cs="Arial"/>
+          <w:i/>
+          <w:iCs/>
+        </w:rPr>
+        <w:t>/api/users/{user_id}</w:t>
+      </w:r>
+      <w:r>
+        <w:rPr>
+          <w:rFonts w:ascii="Arial" w:hAnsi="Arial" w:cs="Arial"/>
+        </w:rPr>
+        <w:t xml:space="preserve"> végpontról, és az abban szereplő </w:t>
+      </w:r>
+      <w:r>
+        <w:rPr>
+          <w:rFonts w:ascii="Arial" w:hAnsi="Arial" w:cs="Arial"/>
+          <w:i/>
+          <w:iCs/>
+        </w:rPr>
+        <w:t>preferred_llm_provider</w:t>
+      </w:r>
+      <w:r>
+        <w:rPr>
+          <w:rFonts w:ascii="Arial" w:hAnsi="Arial" w:cs="Arial"/>
+        </w:rPr>
+        <w:t xml:space="preserve"> mező alapján jelöli ki az aktuálisan kiválasztott szolgáltatót (alapértelmezésként a DeepSeek-et használva, amennyiben a mező nem Ollama-t jelöl, vagy a lekérdezés sikertelen). Amikor a felhasználó a két opció közül választ, a kliens azonnal, egy PUT kéréssel frissíti a </w:t>
+      </w:r>
+      <w:r>
+        <w:rPr>
+          <w:rFonts w:ascii="Arial" w:hAnsi="Arial" w:cs="Arial"/>
+          <w:i/>
+          <w:iCs/>
+        </w:rPr>
+        <w:t>preferred_llm_provider</w:t>
+      </w:r>
+      <w:r>
+        <w:rPr>
+          <w:rFonts w:ascii="Arial" w:hAnsi="Arial" w:cs="Arial"/>
+        </w:rPr>
+        <w:t xml:space="preserve"> mezőt a szerveren, majd a kérés kimenetelétől függően sikeres mentésről vagy hibáról tájékoztató, néhány másodperc után automatikusan eltűnő státuszüzenetet jelenít meg.</w:t>
+      </w:r>
+    </w:p>
+    <w:p>
+      <w:pPr>
+        <w:spacing w:line="360" w:lineRule="auto"/>
+        <w:jc w:val="both"/>
+        <w:rPr>
+          <w:rFonts w:ascii="Arial" w:hAnsi="Arial" w:cs="Arial"/>
           <w:sz w:val="28"/>
           <w:szCs w:val="28"/>
         </w:rPr>
@@ -10102,6 +10697,411 @@
         <w:jc w:val="both"/>
         <w:rPr>
           <w:rFonts w:ascii="Arial" w:hAnsi="Arial" w:cs="Arial"/>
+        </w:rPr>
+      </w:pPr>
+      <w:r>
+        <w:rPr>
+          <w:rFonts w:ascii="Arial" w:hAnsi="Arial" w:cs="Arial"/>
+        </w:rPr>
+        <w:t>A profil oldal a bejelentkezett felhasználó fiókjának áttekintő nézeteként funkcionál: megjeleníti az alapvető fiókadatokat, néhány összesítő statisztikát, valamint innen érhetők el a fiókkezeléssel kapcsolatos műveletek (profilszerkesztés, kijelentkezés).</w:t>
+      </w:r>
+    </w:p>
+    <w:p>
+      <w:pPr>
+        <w:spacing w:line="360" w:lineRule="auto"/>
+        <w:jc w:val="both"/>
+        <w:rPr>
+          <w:rFonts w:ascii="Arial" w:hAnsi="Arial" w:cs="Arial"/>
+        </w:rPr>
+      </w:pPr>
+      <w:r>
+        <w:rPr>
+          <w:rFonts w:ascii="Arial" w:hAnsi="Arial" w:cs="Arial"/>
+        </w:rPr>
+        <w:t xml:space="preserve">5.8.1. </w:t>
+      </w:r>
+      <w:r>
+        <w:rPr>
+          <w:rFonts w:ascii="Arial" w:hAnsi="Arial" w:cs="Arial"/>
+        </w:rPr>
+        <w:t>Autentikáció ellenőrzése és alapadatok betöltése</w:t>
+      </w:r>
+    </w:p>
+    <w:p>
+      <w:pPr>
+        <w:spacing w:line="360" w:lineRule="auto"/>
+        <w:jc w:val="both"/>
+        <w:rPr>
+          <w:rFonts w:ascii="Arial" w:hAnsi="Arial" w:cs="Arial"/>
+        </w:rPr>
+      </w:pPr>
+      <w:r>
+        <w:rPr>
+          <w:rFonts w:ascii="Arial" w:hAnsi="Arial" w:cs="Arial"/>
+        </w:rPr>
+        <w:t xml:space="preserve">Az oldal betöltésekor a kliens oldali script először a </w:t>
+      </w:r>
+      <w:r>
+        <w:rPr>
+          <w:rFonts w:ascii="Arial" w:hAnsi="Arial" w:cs="Arial"/>
+          <w:i/>
+          <w:iCs/>
+        </w:rPr>
+        <w:t>localStorage</w:t>
+      </w:r>
+      <w:r>
+        <w:rPr>
+          <w:rFonts w:ascii="Arial" w:hAnsi="Arial" w:cs="Arial"/>
+        </w:rPr>
+        <w:t xml:space="preserve"> tárolóból olvassa ki a bejelentkezett felhasználó azonosítóját és felhasználónevét. Amennyiben ezek egyike hiányzik, a rendszer nem kísérli meg az adatlekérdezést, hanem egy "Guest" feliratú, be nem jelentkezett állapotot jelenít meg, ahol a fiókműveletek helyén egy bejelentkezésre és regisztrációra felszólító üzenet, valamint a megfelelő oldalakra mutató gombok jelennek meg.</w:t>
+      </w:r>
+    </w:p>
+    <w:p>
+      <w:pPr>
+        <w:spacing w:line="360" w:lineRule="auto"/>
+        <w:jc w:val="both"/>
+        <w:rPr>
+          <w:rFonts w:ascii="Arial" w:hAnsi="Arial" w:cs="Arial"/>
+        </w:rPr>
+      </w:pPr>
+      <w:r>
+        <w:rPr>
+          <w:rFonts w:ascii="Arial" w:hAnsi="Arial" w:cs="Arial"/>
+        </w:rPr>
+        <w:t xml:space="preserve">Bejelentkezett felhasználó esetén az oldal a </w:t>
+      </w:r>
+      <w:r>
+        <w:rPr>
+          <w:rFonts w:ascii="Arial" w:hAnsi="Arial" w:cs="Arial"/>
+          <w:i/>
+          <w:iCs/>
+        </w:rPr>
+        <w:t>localStorage</w:t>
+      </w:r>
+      <w:r>
+        <w:rPr>
+          <w:rFonts w:ascii="Arial" w:hAnsi="Arial" w:cs="Arial"/>
+        </w:rPr>
+        <w:t xml:space="preserve">-ban tárolt felhasználónevet azonnal, ideiglenesen megjeleníti, majd egy GET kéréssel lekérdezi a felhasználó friss adatait a </w:t>
+      </w:r>
+      <w:r>
+        <w:rPr>
+          <w:rFonts w:ascii="Arial" w:hAnsi="Arial" w:cs="Arial"/>
+          <w:i/>
+          <w:iCs/>
+        </w:rPr>
+        <w:t>/api/users/{user_id}</w:t>
+      </w:r>
+      <w:r>
+        <w:rPr>
+          <w:rFonts w:ascii="Arial" w:hAnsi="Arial" w:cs="Arial"/>
+        </w:rPr>
+        <w:t xml:space="preserve"> végpontról, és ezekkel (felhasználónév, email cím) frissíti a felületet. Ezzel párhuzamosan két további lekérdezés is történik: a </w:t>
+      </w:r>
+      <w:r>
+        <w:rPr>
+          <w:rFonts w:ascii="Arial" w:hAnsi="Arial" w:cs="Arial"/>
+          <w:i/>
+          <w:iCs/>
+        </w:rPr>
+        <w:t>/api/users/{user_id}/visited-places</w:t>
+      </w:r>
+      <w:r>
+        <w:rPr>
+          <w:rFonts w:ascii="Arial" w:hAnsi="Arial" w:cs="Arial"/>
+        </w:rPr>
+        <w:t xml:space="preserve"> végpont a meglátogatott helyek számát, a </w:t>
+      </w:r>
+      <w:r>
+        <w:rPr>
+          <w:rFonts w:ascii="Arial" w:hAnsi="Arial" w:cs="Arial"/>
+          <w:i/>
+          <w:iCs/>
+        </w:rPr>
+        <w:t>/api/users/{user_id}/planned-trips</w:t>
+      </w:r>
+      <w:r>
+        <w:rPr>
+          <w:rFonts w:ascii="Arial" w:hAnsi="Arial" w:cs="Arial"/>
+        </w:rPr>
+        <w:t xml:space="preserve"> végpont pedig a megtervezett utazások számát adja vissza, amelyek a "Statisztikák" szekcióban jelennek meg.</w:t>
+      </w:r>
+    </w:p>
+    <w:p>
+      <w:pPr>
+        <w:spacing w:line="360" w:lineRule="auto"/>
+        <w:jc w:val="both"/>
+        <w:rPr>
+          <w:rFonts w:ascii="Arial" w:hAnsi="Arial" w:cs="Arial"/>
+        </w:rPr>
+      </w:pPr>
+      <w:r>
+        <w:rPr>
+          <w:rFonts w:ascii="Arial" w:hAnsi="Arial" w:cs="Arial"/>
+        </w:rPr>
+        <w:t xml:space="preserve">5.8.2. </w:t>
+      </w:r>
+      <w:r>
+        <w:rPr>
+          <w:rFonts w:ascii="Arial" w:hAnsi="Arial" w:cs="Arial"/>
+        </w:rPr>
+        <w:t>Avatar megjelenítés</w:t>
+      </w:r>
+    </w:p>
+    <w:p>
+      <w:pPr>
+        <w:spacing w:line="360" w:lineRule="auto"/>
+        <w:jc w:val="both"/>
+        <w:rPr>
+          <w:rFonts w:ascii="Arial" w:hAnsi="Arial" w:cs="Arial"/>
+        </w:rPr>
+      </w:pPr>
+      <w:r>
+        <w:rPr>
+          <w:rFonts w:ascii="Arial" w:hAnsi="Arial" w:cs="Arial"/>
+        </w:rPr>
+        <w:t xml:space="preserve">A felhasználó profilképeként a rendszer kétféle megoldást alkalmaz. Amennyiben a felhasználó Google-fiókkal jelentkezett be és a hozzá tartozó profilkép URL-je elérhető a </w:t>
+      </w:r>
+      <w:r>
+        <w:rPr>
+          <w:rFonts w:ascii="Arial" w:hAnsi="Arial" w:cs="Arial"/>
+          <w:i/>
+          <w:iCs/>
+        </w:rPr>
+        <w:t>localStorage</w:t>
+      </w:r>
+      <w:r>
+        <w:rPr>
+          <w:rFonts w:ascii="Arial" w:hAnsi="Arial" w:cs="Arial"/>
+        </w:rPr>
+        <w:t xml:space="preserve">-ban, a rendszer ezt a képet tölti be és jeleníti meg; a kép sikertelen betöltése esetén automatikusan visszaáll az alapértelmezett megjelenítésre. </w:t>
+      </w:r>
+      <w:r>
+        <w:rPr>
+          <w:rFonts w:ascii="Arial" w:hAnsi="Arial" w:cs="Arial"/>
+        </w:rPr>
+        <w:lastRenderedPageBreak/>
+        <w:t>Amennyiben nincs elérhető Google-profilkép, a rendszer a felhasználónévből  generál egy monogramot: két szóközzel, ponttal, aláhúzásjellel vagy kötőjellel elválasztott névrész esetén azok kezdőbetűit, egyéb esetben a név első egy-két karakterét használva.</w:t>
+      </w:r>
+    </w:p>
+    <w:p>
+      <w:pPr>
+        <w:spacing w:line="360" w:lineRule="auto"/>
+        <w:jc w:val="both"/>
+        <w:rPr>
+          <w:rFonts w:ascii="Arial" w:hAnsi="Arial" w:cs="Arial"/>
+        </w:rPr>
+      </w:pPr>
+      <w:r>
+        <w:rPr>
+          <w:rFonts w:ascii="Arial" w:hAnsi="Arial" w:cs="Arial"/>
+        </w:rPr>
+        <w:t xml:space="preserve">5.8.3. </w:t>
+      </w:r>
+      <w:r>
+        <w:rPr>
+          <w:rFonts w:ascii="Arial" w:hAnsi="Arial" w:cs="Arial"/>
+        </w:rPr>
+        <w:t>Fiókműveletek</w:t>
+      </w:r>
+    </w:p>
+    <w:p>
+      <w:pPr>
+        <w:spacing w:line="360" w:lineRule="auto"/>
+        <w:jc w:val="both"/>
+        <w:rPr>
+          <w:rFonts w:ascii="Arial" w:hAnsi="Arial" w:cs="Arial"/>
+        </w:rPr>
+      </w:pPr>
+      <w:r>
+        <w:rPr>
+          <w:rFonts w:ascii="Arial" w:hAnsi="Arial" w:cs="Arial"/>
+        </w:rPr>
+        <w:t xml:space="preserve">A sikeres adatbetöltést követően a "Fiók" szekció dinamikusan felépül, és két lehetőséget kínál a felhasználó számára: a profil szerkesztésére mutató hivatkozást, valamint egy kijelentkezés gombot. A kijelentkezés gomb megnyomására a rendszer egy megerősítő párbeszédablakot jelenít meg; jóváhagyás esetén a kliens eltávolítja a </w:t>
+      </w:r>
+      <w:r>
+        <w:rPr>
+          <w:rFonts w:ascii="Arial" w:hAnsi="Arial" w:cs="Arial"/>
+          <w:i/>
+          <w:iCs/>
+        </w:rPr>
+        <w:t>localStorage</w:t>
+      </w:r>
+      <w:r>
+        <w:rPr>
+          <w:rFonts w:ascii="Arial" w:hAnsi="Arial" w:cs="Arial"/>
+        </w:rPr>
+        <w:t>-ból a bejelentkezéshez tartozó összes adatot, majd a felhasználót a bejelentkezési oldalra irányítja át.</w:t>
+      </w:r>
+    </w:p>
+    <w:p>
+      <w:pPr>
+        <w:spacing w:line="360" w:lineRule="auto"/>
+        <w:jc w:val="both"/>
+        <w:rPr>
+          <w:rFonts w:ascii="Arial" w:hAnsi="Arial" w:cs="Arial"/>
+        </w:rPr>
+      </w:pPr>
+      <w:r>
+        <w:rPr>
+          <w:rFonts w:ascii="Arial" w:hAnsi="Arial" w:cs="Arial"/>
+        </w:rPr>
+        <w:t>5.8.</w:t>
+      </w:r>
+      <w:r>
+        <w:rPr>
+          <w:rFonts w:ascii="Arial" w:hAnsi="Arial" w:cs="Arial"/>
+        </w:rPr>
+        <w:t>4</w:t>
+      </w:r>
+      <w:r>
+        <w:rPr>
+          <w:rFonts w:ascii="Arial" w:hAnsi="Arial" w:cs="Arial"/>
+        </w:rPr>
+        <w:t>. Profil szerkesztése</w:t>
+      </w:r>
+    </w:p>
+    <w:p>
+      <w:pPr>
+        <w:spacing w:line="360" w:lineRule="auto"/>
+        <w:jc w:val="both"/>
+        <w:rPr>
+          <w:rFonts w:ascii="Arial" w:hAnsi="Arial" w:cs="Arial"/>
+        </w:rPr>
+      </w:pPr>
+      <w:r>
+        <w:rPr>
+          <w:rFonts w:ascii="Arial" w:hAnsi="Arial" w:cs="Arial"/>
+        </w:rPr>
+        <w:t>A profil szerkesztésére szolgáló oldalon a felhasználó módosíthatja felhasználónevét, email címét, lakóhelyét (home city), valamint opcionálisan jelszavát is megváltoztathatja.</w:t>
+      </w:r>
+    </w:p>
+    <w:p>
+      <w:pPr>
+        <w:spacing w:line="360" w:lineRule="auto"/>
+        <w:jc w:val="both"/>
+        <w:rPr>
+          <w:rFonts w:ascii="Arial" w:hAnsi="Arial" w:cs="Arial"/>
+        </w:rPr>
+      </w:pPr>
+      <w:r>
+        <w:rPr>
+          <w:rFonts w:ascii="Arial" w:hAnsi="Arial" w:cs="Arial"/>
+        </w:rPr>
+        <w:t xml:space="preserve">Az oldal betöltésekor a kliens lekérdezi a felhasználó aktuális adatait a </w:t>
+      </w:r>
+      <w:r>
+        <w:rPr>
+          <w:rFonts w:ascii="Arial" w:hAnsi="Arial" w:cs="Arial"/>
+          <w:i/>
+          <w:iCs/>
+        </w:rPr>
+        <w:t>/api/users/{user_id}</w:t>
+      </w:r>
+      <w:r>
+        <w:rPr>
+          <w:rFonts w:ascii="Arial" w:hAnsi="Arial" w:cs="Arial"/>
+        </w:rPr>
+        <w:t xml:space="preserve"> végpontról, és ezek</w:t>
+      </w:r>
+      <w:r>
+        <w:rPr>
+          <w:rFonts w:ascii="Arial" w:hAnsi="Arial" w:cs="Arial"/>
+        </w:rPr>
+        <w:t>et betölti az űrlap mezőibe</w:t>
+      </w:r>
+      <w:r>
+        <w:rPr>
+          <w:rFonts w:ascii="Arial" w:hAnsi="Arial" w:cs="Arial"/>
+        </w:rPr>
+        <w:t>. A jelszó mezők üresen maradnak, és az oldal jelzi is a felhasználónak, hogy azok kitöltetlenül hagyása esetén a jelenlegi jelszó változatlan marad.</w:t>
+      </w:r>
+    </w:p>
+    <w:p>
+      <w:pPr>
+        <w:spacing w:line="360" w:lineRule="auto"/>
+        <w:jc w:val="both"/>
+        <w:rPr>
+          <w:rFonts w:ascii="Arial" w:hAnsi="Arial" w:cs="Arial"/>
+        </w:rPr>
+      </w:pPr>
+      <w:r>
+        <w:rPr>
+          <w:rFonts w:ascii="Arial" w:hAnsi="Arial" w:cs="Arial"/>
+        </w:rPr>
+        <w:t>Az űrlap elküldése előtt a kliens oldali validáció ellenőrzi, hogy a felhasználónév és az email cím mező ki van-e töltve, valamint hogy amennyiben a felhasználó jelszót kíván módosítani, mindkét jelszómező (új jelszó, megerősítés) ki legyen töltve, a jelszó elérje a hatkarakteres minimális hosszúságot, és a két mező tartalma megegyezzen. A jelszó mezők üresen hagyása esetén a rendszer nem küldi el a password mezőt a szerver felé, ezáltal biztosítva, hogy a meglévő jelszó ne változzon.</w:t>
+      </w:r>
+    </w:p>
+    <w:p>
+      <w:pPr>
+        <w:spacing w:line="360" w:lineRule="auto"/>
+        <w:jc w:val="both"/>
+        <w:rPr>
+          <w:rFonts w:ascii="Arial" w:hAnsi="Arial" w:cs="Arial"/>
+        </w:rPr>
+      </w:pPr>
+      <w:r>
+        <w:rPr>
+          <w:rFonts w:ascii="Arial" w:hAnsi="Arial" w:cs="Arial"/>
+        </w:rPr>
+        <w:t xml:space="preserve">A validált adatok egy PUT kéréssel kerülnek elküldésre a </w:t>
+      </w:r>
+      <w:r>
+        <w:rPr>
+          <w:rFonts w:ascii="Arial" w:hAnsi="Arial" w:cs="Arial"/>
+          <w:i/>
+          <w:iCs/>
+        </w:rPr>
+        <w:t>/api/users/{user_id}</w:t>
+      </w:r>
+      <w:r>
+        <w:rPr>
+          <w:rFonts w:ascii="Arial" w:hAnsi="Arial" w:cs="Arial"/>
+        </w:rPr>
+        <w:t xml:space="preserve"> végpontra. A szerver oldalon a végpont ellenőrzi, hogy a módosítani kívánt felhasználónév vagy email cím nem ütközik-e egy már létező, más felhasználóhoz tartozó rekorddal; ütközés esetén 400-as státuszkóddal utasítja el a kérést. A tulajdonosi jogosultságot a </w:t>
+      </w:r>
+      <w:r>
+        <w:rPr>
+          <w:rFonts w:ascii="Arial" w:hAnsi="Arial" w:cs="Arial"/>
+          <w:i/>
+          <w:iCs/>
+        </w:rPr>
+        <w:t>require_self</w:t>
+      </w:r>
+      <w:r>
+        <w:rPr>
+          <w:rFonts w:ascii="Arial" w:hAnsi="Arial" w:cs="Arial"/>
+        </w:rPr>
+        <w:t xml:space="preserve"> függvény ellenőrzi, amely biztosítja, hogy egy felhasználó kizárólag a saját adatait módosíthassa. Sikeres mentés esetén a kliens </w:t>
+      </w:r>
+      <w:r>
+        <w:rPr>
+          <w:rFonts w:ascii="Arial" w:hAnsi="Arial" w:cs="Arial"/>
+        </w:rPr>
+        <w:lastRenderedPageBreak/>
+        <w:t xml:space="preserve">frissíti a </w:t>
+      </w:r>
+      <w:r>
+        <w:rPr>
+          <w:rFonts w:ascii="Arial" w:hAnsi="Arial" w:cs="Arial"/>
+          <w:i/>
+          <w:iCs/>
+        </w:rPr>
+        <w:t>localStorage</w:t>
+      </w:r>
+      <w:r>
+        <w:rPr>
+          <w:rFonts w:ascii="Arial" w:hAnsi="Arial" w:cs="Arial"/>
+        </w:rPr>
+        <w:t>-ban tárolt felhasználónevet, kiüríti a jelszómezőket, és egy néhány másodperc után automatikusan eltűnő visszajelző üzenetet jelenít meg; hiba esetén a szerver által visszaadott hibaüzenet (vagy annak hiányában egy általános hibaszöveg) kerül megjelenítésre.</w:t>
+      </w:r>
+    </w:p>
+    <w:p>
+      <w:pPr>
+        <w:spacing w:line="360" w:lineRule="auto"/>
+        <w:jc w:val="both"/>
+        <w:rPr>
+          <w:rFonts w:ascii="Arial" w:hAnsi="Arial" w:cs="Arial"/>
           <w:sz w:val="28"/>
           <w:szCs w:val="28"/>
         </w:rPr>
@@ -10235,7 +11235,6 @@
           <w:i/>
           <w:iCs/>
         </w:rPr>
-        <w:lastRenderedPageBreak/>
         <w:t>i18n.js</w:t>
       </w:r>
       <w:r>
@@ -10543,6 +11542,7 @@
         <w:rPr>
           <w:rFonts w:ascii="Arial" w:hAnsi="Arial" w:cs="Arial"/>
         </w:rPr>
+        <w:lastRenderedPageBreak/>
         <w:t>A fejlesztés során kiemelt figyelmet fordítottam arra, hogy a kódban előforduló hibákat a lehető legnagyobb mértékben feltárjam és kijavítsam. Ennek érdekében a szoftverfejlesztés több szintjén is különböző tesztelési módszereket alkalmaztam, amelyek együttesen biztosították az alkalmazás megbízható és stabil működését.</w:t>
       </w:r>
     </w:p>
@@ -10605,14 +11605,7 @@
         <w:rPr>
           <w:rFonts w:ascii="Arial" w:hAnsi="Arial" w:cs="Arial"/>
         </w:rPr>
-        <w:t xml:space="preserve"> egyszerű, olvasható szintaxisa és a fixture-ök (pl. teszteléshez szükséges előre definiált objektumok vagy adatok) rugalmas kezelése lehetővé tette, hogy a tesztesetek jól strukturáltan, könnyen bővíthető formában készüljenek el. A unit tesztek célja, hogy a vizsgált kódrészletet </w:t>
-      </w:r>
-      <w:r>
-        <w:rPr>
-          <w:rFonts w:ascii="Arial" w:hAnsi="Arial" w:cs="Arial"/>
-        </w:rPr>
-        <w:lastRenderedPageBreak/>
-        <w:t>elszigetelten, a külső függőségektől függetlenül teszteljék, ezáltal már a fejlesztés korai szakaszában kiszűrhetők legyenek a logikai hibák.</w:t>
+        <w:t xml:space="preserve"> egyszerű, olvasható szintaxisa és a fixture-ök (pl. teszteléshez szükséges előre definiált objektumok vagy adatok) rugalmas kezelése lehetővé tette, hogy a tesztesetek jól strukturáltan, könnyen bővíthető formában készüljenek el. A unit tesztek célja, hogy a vizsgált kódrészletet elszigetelten, a külső függőségektől függetlenül teszteljék, ezáltal már a fejlesztés korai szakaszában kiszűrhetők legyenek a logikai hibák.</w:t>
       </w:r>
     </w:p>
     <w:p>
@@ -10800,6 +11793,7 @@
         <w:rPr>
           <w:rFonts w:ascii="Arial" w:hAnsi="Arial" w:cs="Arial"/>
         </w:rPr>
+        <w:lastRenderedPageBreak/>
         <w:t xml:space="preserve">A technikai, automatizált tesztelési módszerek mellett fontosnak tartottam, hogy az alkalmazás használhatóságát valós felhasználók bevonásával is megvizsgáljam. Ennek keretében 5 tesztfelhasználó számára biztosítottam hozzáférést az alkalmazáshoz, akiket arra kértem, hogy szabadon </w:t>
       </w:r>
       <w:r>
@@ -10858,7 +11852,6 @@
           <w:sz w:val="32"/>
           <w:szCs w:val="32"/>
         </w:rPr>
-        <w:lastRenderedPageBreak/>
         <w:t>8</w:t>
       </w:r>
       <w:r>
@@ -11176,6 +12169,7 @@
         <w:rPr>
           <w:rFonts w:ascii="Arial" w:hAnsi="Arial" w:cs="Arial"/>
         </w:rPr>
+        <w:lastRenderedPageBreak/>
         <w:t xml:space="preserve">[2] </w:t>
       </w:r>
       <w:r>
@@ -11408,222 +12402,389 @@
         <w:rPr>
           <w:rFonts w:ascii="Arial" w:hAnsi="Arial" w:cs="Arial"/>
         </w:rPr>
+        <w:t xml:space="preserve">[7] </w:t>
+      </w:r>
+      <w:r>
+        <w:rPr>
+          <w:rFonts w:ascii="Arial" w:hAnsi="Arial" w:cs="Arial"/>
+        </w:rPr>
+        <w:t>python.org: Python docs-</w:t>
+      </w:r>
+      <w:r>
+        <w:rPr>
+          <w:rFonts w:ascii="Arial" w:hAnsi="Arial" w:cs="Arial"/>
+        </w:rPr>
+        <w:t>https://docs.python.org/3/</w:t>
+      </w:r>
+      <w:r>
+        <w:rPr>
+          <w:rFonts w:ascii="Arial" w:hAnsi="Arial" w:cs="Arial"/>
+        </w:rPr>
+        <w:t xml:space="preserve"> (2026. 07. 16)</w:t>
+      </w:r>
+    </w:p>
+    <w:p>
+      <w:pPr>
+        <w:spacing w:line="360" w:lineRule="auto"/>
+        <w:rPr>
+          <w:rFonts w:ascii="Arial" w:hAnsi="Arial" w:cs="Arial"/>
+        </w:rPr>
+      </w:pPr>
+      <w:r>
+        <w:rPr>
+          <w:rFonts w:ascii="Arial" w:hAnsi="Arial" w:cs="Arial"/>
+        </w:rPr>
+        <w:t>[8] fastapi.tiangolo.com: FastAPI-</w:t>
+      </w:r>
+      <w:r>
+        <w:rPr>
+          <w:rFonts w:ascii="Arial" w:hAnsi="Arial" w:cs="Arial"/>
+        </w:rPr>
+        <w:t>https://fastapi.tiangolo.com/</w:t>
+      </w:r>
+    </w:p>
+    <w:p>
+      <w:pPr>
+        <w:spacing w:line="360" w:lineRule="auto"/>
+        <w:rPr>
+          <w:rFonts w:ascii="Arial" w:hAnsi="Arial" w:cs="Arial"/>
+        </w:rPr>
+      </w:pPr>
+      <w:r>
+        <w:rPr>
+          <w:rFonts w:ascii="Arial" w:hAnsi="Arial" w:cs="Arial"/>
+        </w:rPr>
+        <w:t xml:space="preserve">[9] </w:t>
+      </w:r>
+      <w:r>
+        <w:rPr>
+          <w:rFonts w:ascii="Arial" w:hAnsi="Arial" w:cs="Arial"/>
+        </w:rPr>
+        <w:t>postgresql.org: Documentation-</w:t>
+      </w:r>
+      <w:r>
+        <w:rPr>
+          <w:rFonts w:ascii="Arial" w:hAnsi="Arial" w:cs="Arial"/>
+        </w:rPr>
+        <w:t>https://www.postgresql.org/docs/</w:t>
+      </w:r>
+      <w:r>
+        <w:rPr>
+          <w:rFonts w:ascii="Arial" w:hAnsi="Arial" w:cs="Arial"/>
+        </w:rPr>
+        <w:t xml:space="preserve"> (2026. 06. 04.)</w:t>
+      </w:r>
+    </w:p>
+    <w:p>
+      <w:pPr>
+        <w:spacing w:line="360" w:lineRule="auto"/>
+        <w:rPr>
+          <w:rFonts w:ascii="Arial" w:hAnsi="Arial" w:cs="Arial"/>
+        </w:rPr>
+      </w:pPr>
+      <w:r>
+        <w:rPr>
+          <w:rFonts w:ascii="Arial" w:hAnsi="Arial" w:cs="Arial"/>
+        </w:rPr>
+        <w:t xml:space="preserve">[10] sqlalchemy.org: </w:t>
+      </w:r>
+      <w:r>
+        <w:rPr>
+          <w:rFonts w:ascii="Arial" w:hAnsi="Arial" w:cs="Arial"/>
+        </w:rPr>
+        <w:t>The Python SQL Toolkit and Object Relational Mapper-https://www.sqlalchemy.org/</w:t>
+      </w:r>
+      <w:r>
+        <w:rPr>
+          <w:rFonts w:ascii="Arial" w:hAnsi="Arial" w:cs="Arial"/>
+        </w:rPr>
+        <w:t xml:space="preserve"> (2026. 06. 27.)</w:t>
+      </w:r>
+    </w:p>
+    <w:p>
+      <w:pPr>
+        <w:spacing w:line="360" w:lineRule="auto"/>
+        <w:rPr>
+          <w:rFonts w:ascii="Arial" w:hAnsi="Arial" w:cs="Arial"/>
+        </w:rPr>
+      </w:pPr>
+      <w:r>
+        <w:rPr>
+          <w:rFonts w:ascii="Arial" w:hAnsi="Arial" w:cs="Arial"/>
+        </w:rPr>
+        <w:t>[11] api-docs.deepseek.com: Your First API Call-</w:t>
+      </w:r>
+      <w:r>
+        <w:rPr>
+          <w:rFonts w:ascii="Arial" w:hAnsi="Arial" w:cs="Arial"/>
+        </w:rPr>
+        <w:t>https://api-docs.deepseek.com/</w:t>
+      </w:r>
+    </w:p>
+    <w:p>
+      <w:pPr>
+        <w:spacing w:line="360" w:lineRule="auto"/>
+        <w:rPr>
+          <w:rFonts w:ascii="Arial" w:hAnsi="Arial" w:cs="Arial"/>
+        </w:rPr>
+      </w:pPr>
+      <w:r>
+        <w:rPr>
+          <w:rFonts w:ascii="Arial" w:hAnsi="Arial" w:cs="Arial"/>
+        </w:rPr>
+        <w:t>[12] api-docs.deepseek.com: JSON output-</w:t>
+      </w:r>
+      <w:r>
+        <w:rPr>
+          <w:rFonts w:ascii="Arial" w:hAnsi="Arial" w:cs="Arial"/>
+        </w:rPr>
+        <w:t>https://api-docs.deepseek.com/guides/json_mode</w:t>
+      </w:r>
+    </w:p>
+    <w:p>
+      <w:pPr>
+        <w:spacing w:line="360" w:lineRule="auto"/>
+        <w:rPr>
+          <w:rFonts w:ascii="Arial" w:hAnsi="Arial" w:cs="Arial"/>
+        </w:rPr>
+      </w:pPr>
+      <w:r>
+        <w:rPr>
+          <w:rFonts w:ascii="Arial" w:hAnsi="Arial" w:cs="Arial"/>
+        </w:rPr>
+        <w:t>[13] ollama.com: Ollama documentation-</w:t>
+      </w:r>
+      <w:r>
+        <w:rPr>
+          <w:rFonts w:ascii="Arial" w:hAnsi="Arial" w:cs="Arial"/>
+        </w:rPr>
+        <w:t>https://docs.ollama.com/</w:t>
+      </w:r>
+    </w:p>
+    <w:p>
+      <w:pPr>
+        <w:spacing w:line="360" w:lineRule="auto"/>
+        <w:rPr>
+          <w:rFonts w:ascii="Arial" w:hAnsi="Arial" w:cs="Arial"/>
+        </w:rPr>
+      </w:pPr>
+      <w:r>
+        <w:rPr>
+          <w:rFonts w:ascii="Arial" w:hAnsi="Arial" w:cs="Arial"/>
+        </w:rPr>
+        <w:t xml:space="preserve">[14] </w:t>
+      </w:r>
+      <w:r>
+        <w:rPr>
+          <w:rFonts w:ascii="Arial" w:hAnsi="Arial" w:cs="Arial"/>
+        </w:rPr>
+        <w:t>nominatim.org: Nominatim 5.3.2 manual-</w:t>
+      </w:r>
+      <w:r>
+        <w:rPr>
+          <w:rFonts w:ascii="Arial" w:hAnsi="Arial" w:cs="Arial"/>
+        </w:rPr>
+        <w:t>https://nominatim.org/release-docs/latest/</w:t>
+      </w:r>
+      <w:r>
+        <w:rPr>
+          <w:rFonts w:ascii="Arial" w:hAnsi="Arial" w:cs="Arial"/>
+        </w:rPr>
+        <w:t xml:space="preserve"> </w:t>
+      </w:r>
+    </w:p>
+    <w:p>
+      <w:pPr>
+        <w:spacing w:line="360" w:lineRule="auto"/>
+        <w:rPr>
+          <w:rFonts w:ascii="Arial" w:hAnsi="Arial" w:cs="Arial"/>
+        </w:rPr>
+      </w:pPr>
+      <w:r>
+        <w:rPr>
+          <w:rFonts w:ascii="Arial" w:hAnsi="Arial" w:cs="Arial"/>
+        </w:rPr>
+        <w:t xml:space="preserve">[15] </w:t>
+      </w:r>
+      <w:r>
+        <w:rPr>
+          <w:rFonts w:ascii="Arial" w:hAnsi="Arial" w:cs="Arial"/>
+        </w:rPr>
+        <w:t xml:space="preserve">developers.google.com: </w:t>
+      </w:r>
+      <w:r>
+        <w:rPr>
+          <w:rFonts w:ascii="Arial" w:hAnsi="Arial" w:cs="Arial"/>
+        </w:rPr>
+        <w:t>Using OAuth 2.0 to Access Google APIs</w:t>
+      </w:r>
+      <w:r>
+        <w:rPr>
+          <w:rFonts w:ascii="Arial" w:hAnsi="Arial" w:cs="Arial"/>
+        </w:rPr>
+        <w:t>-</w:t>
+      </w:r>
+      <w:r>
+        <w:rPr>
+          <w:rFonts w:ascii="Arial" w:hAnsi="Arial" w:cs="Arial"/>
+        </w:rPr>
+        <w:t>https://developers.google.com/identity/protocols/oauth2</w:t>
+      </w:r>
+    </w:p>
+    <w:p>
+      <w:pPr>
+        <w:spacing w:line="360" w:lineRule="auto"/>
+        <w:rPr>
+          <w:rFonts w:ascii="Arial" w:hAnsi="Arial" w:cs="Arial"/>
+        </w:rPr>
+      </w:pPr>
+      <w:r>
+        <w:rPr>
+          <w:rFonts w:ascii="Arial" w:hAnsi="Arial" w:cs="Arial"/>
+        </w:rPr>
+        <w:t xml:space="preserve">[16] docs.pytest.org: </w:t>
+      </w:r>
+      <w:r>
+        <w:rPr>
+          <w:rFonts w:ascii="Arial" w:hAnsi="Arial" w:cs="Arial"/>
+        </w:rPr>
+        <w:t>pytest: helps you write better programs</w:t>
+      </w:r>
+      <w:r>
+        <w:rPr>
+          <w:rFonts w:ascii="Arial" w:hAnsi="Arial" w:cs="Arial"/>
+        </w:rPr>
+        <w:t>-</w:t>
+      </w:r>
+      <w:r>
+        <w:rPr>
+          <w:rFonts w:ascii="Arial" w:hAnsi="Arial" w:cs="Arial"/>
+        </w:rPr>
+        <w:t>https://docs.pytest.org/en/stable/index.html</w:t>
+      </w:r>
+    </w:p>
+    <w:p>
+      <w:pPr>
+        <w:spacing w:line="360" w:lineRule="auto"/>
+        <w:rPr>
+          <w:rFonts w:ascii="Arial" w:hAnsi="Arial" w:cs="Arial"/>
+        </w:rPr>
+      </w:pPr>
+      <w:r>
+        <w:rPr>
+          <w:rFonts w:ascii="Arial" w:hAnsi="Arial" w:cs="Arial"/>
+        </w:rPr>
+        <w:t xml:space="preserve">[17] </w:t>
+      </w:r>
+      <w:r>
+        <w:rPr>
+          <w:rFonts w:ascii="Arial" w:hAnsi="Arial" w:cs="Arial"/>
+        </w:rPr>
+        <w:t>docs.github.com: GitHub Actions documentation-</w:t>
+      </w:r>
+      <w:r>
+        <w:rPr>
+          <w:rFonts w:ascii="Arial" w:hAnsi="Arial" w:cs="Arial"/>
+        </w:rPr>
+        <w:t>https://docs.github.com/en/actions</w:t>
+      </w:r>
+    </w:p>
+    <w:p>
+      <w:pPr>
+        <w:spacing w:line="360" w:lineRule="auto"/>
+        <w:rPr>
+          <w:rFonts w:ascii="Arial" w:hAnsi="Arial" w:cs="Arial"/>
+        </w:rPr>
+      </w:pPr>
+      <w:r>
+        <w:rPr>
+          <w:rFonts w:ascii="Arial" w:hAnsi="Arial" w:cs="Arial"/>
+        </w:rPr>
+        <w:t>[18] code.visualstudio.com: Visual Studio Code documentation-</w:t>
+      </w:r>
+      <w:r>
+        <w:rPr>
+          <w:rFonts w:ascii="Arial" w:hAnsi="Arial" w:cs="Arial"/>
+        </w:rPr>
+        <w:t>https://code.visualstudio.com/docs</w:t>
+      </w:r>
+    </w:p>
+    <w:p>
+      <w:pPr>
+        <w:spacing w:line="360" w:lineRule="auto"/>
+        <w:rPr>
+          <w:rFonts w:ascii="Arial" w:hAnsi="Arial" w:cs="Arial"/>
+        </w:rPr>
+      </w:pPr>
+      <w:r>
+        <w:rPr>
+          <w:rFonts w:ascii="Arial" w:hAnsi="Arial" w:cs="Arial"/>
+        </w:rPr>
         <w:lastRenderedPageBreak/>
-        <w:t xml:space="preserve">[7] </w:t>
-      </w:r>
-      <w:r>
-        <w:rPr>
-          <w:rFonts w:ascii="Arial" w:hAnsi="Arial" w:cs="Arial"/>
-        </w:rPr>
-        <w:t>python.org: Python docs-</w:t>
-      </w:r>
-      <w:r>
-        <w:rPr>
-          <w:rFonts w:ascii="Arial" w:hAnsi="Arial" w:cs="Arial"/>
-        </w:rPr>
-        <w:t>https://docs.python.org/3/</w:t>
-      </w:r>
-      <w:r>
-        <w:rPr>
-          <w:rFonts w:ascii="Arial" w:hAnsi="Arial" w:cs="Arial"/>
-        </w:rPr>
-        <w:t xml:space="preserve"> (2026. 07. 16)</w:t>
-      </w:r>
-    </w:p>
-    <w:p>
-      <w:pPr>
-        <w:spacing w:line="360" w:lineRule="auto"/>
-        <w:rPr>
-          <w:rFonts w:ascii="Arial" w:hAnsi="Arial" w:cs="Arial"/>
-        </w:rPr>
-      </w:pPr>
-      <w:r>
-        <w:rPr>
-          <w:rFonts w:ascii="Arial" w:hAnsi="Arial" w:cs="Arial"/>
-        </w:rPr>
-        <w:t>[8] fastapi.tiangolo.com: FastAPI-</w:t>
-      </w:r>
-      <w:r>
-        <w:rPr>
-          <w:rFonts w:ascii="Arial" w:hAnsi="Arial" w:cs="Arial"/>
-        </w:rPr>
-        <w:t>https://fastapi.tiangolo.com/</w:t>
-      </w:r>
-    </w:p>
-    <w:p>
-      <w:pPr>
-        <w:spacing w:line="360" w:lineRule="auto"/>
-        <w:rPr>
-          <w:rFonts w:ascii="Arial" w:hAnsi="Arial" w:cs="Arial"/>
-        </w:rPr>
-      </w:pPr>
-      <w:r>
-        <w:rPr>
-          <w:rFonts w:ascii="Arial" w:hAnsi="Arial" w:cs="Arial"/>
-        </w:rPr>
-        <w:t xml:space="preserve">[9] </w:t>
-      </w:r>
-      <w:r>
-        <w:rPr>
-          <w:rFonts w:ascii="Arial" w:hAnsi="Arial" w:cs="Arial"/>
-        </w:rPr>
-        <w:t>postgresql.org: Documentation-</w:t>
-      </w:r>
-      <w:r>
-        <w:rPr>
-          <w:rFonts w:ascii="Arial" w:hAnsi="Arial" w:cs="Arial"/>
-        </w:rPr>
-        <w:t>https://www.postgresql.org/docs/</w:t>
-      </w:r>
-      <w:r>
-        <w:rPr>
-          <w:rFonts w:ascii="Arial" w:hAnsi="Arial" w:cs="Arial"/>
-        </w:rPr>
-        <w:t xml:space="preserve"> (2026. 06. 04.)</w:t>
-      </w:r>
-    </w:p>
-    <w:p>
-      <w:pPr>
-        <w:spacing w:line="360" w:lineRule="auto"/>
-        <w:rPr>
-          <w:rFonts w:ascii="Arial" w:hAnsi="Arial" w:cs="Arial"/>
-        </w:rPr>
-      </w:pPr>
-      <w:r>
-        <w:rPr>
-          <w:rFonts w:ascii="Arial" w:hAnsi="Arial" w:cs="Arial"/>
-        </w:rPr>
-        <w:t xml:space="preserve">[10] sqlalchemy.org: </w:t>
-      </w:r>
-      <w:r>
-        <w:rPr>
-          <w:rFonts w:ascii="Arial" w:hAnsi="Arial" w:cs="Arial"/>
-        </w:rPr>
-        <w:t>The Python SQL Toolkit and Object Relational Mapper-https://www.sqlalchemy.org/</w:t>
-      </w:r>
-      <w:r>
-        <w:rPr>
-          <w:rFonts w:ascii="Arial" w:hAnsi="Arial" w:cs="Arial"/>
-        </w:rPr>
-        <w:t xml:space="preserve"> (2026. 06. 27.)</w:t>
-      </w:r>
-    </w:p>
-    <w:p>
-      <w:pPr>
-        <w:spacing w:line="360" w:lineRule="auto"/>
-        <w:rPr>
-          <w:rFonts w:ascii="Arial" w:hAnsi="Arial" w:cs="Arial"/>
-        </w:rPr>
-      </w:pPr>
-      <w:r>
-        <w:rPr>
-          <w:rFonts w:ascii="Arial" w:hAnsi="Arial" w:cs="Arial"/>
-        </w:rPr>
-        <w:t>[11] api-docs.deepseek.com: Your First API Call-</w:t>
-      </w:r>
-      <w:r>
-        <w:rPr>
-          <w:rFonts w:ascii="Arial" w:hAnsi="Arial" w:cs="Arial"/>
-        </w:rPr>
-        <w:t>https://api-docs.deepseek.com/</w:t>
-      </w:r>
-    </w:p>
-    <w:p>
-      <w:pPr>
-        <w:spacing w:line="360" w:lineRule="auto"/>
-        <w:rPr>
-          <w:rFonts w:ascii="Arial" w:hAnsi="Arial" w:cs="Arial"/>
-        </w:rPr>
-      </w:pPr>
-      <w:r>
-        <w:rPr>
-          <w:rFonts w:ascii="Arial" w:hAnsi="Arial" w:cs="Arial"/>
-        </w:rPr>
-        <w:t>[12] api-docs.deepseek.com: JSON output-</w:t>
-      </w:r>
-      <w:r>
-        <w:rPr>
-          <w:rFonts w:ascii="Arial" w:hAnsi="Arial" w:cs="Arial"/>
-        </w:rPr>
-        <w:t>https://api-docs.deepseek.com/guides/json_mode</w:t>
-      </w:r>
-    </w:p>
-    <w:p>
-      <w:pPr>
-        <w:spacing w:line="360" w:lineRule="auto"/>
-        <w:rPr>
-          <w:rFonts w:ascii="Arial" w:hAnsi="Arial" w:cs="Arial"/>
-        </w:rPr>
-      </w:pPr>
-      <w:r>
-        <w:rPr>
-          <w:rFonts w:ascii="Arial" w:hAnsi="Arial" w:cs="Arial"/>
-        </w:rPr>
-        <w:t>[13] ollama.com: Ollama documentation-</w:t>
-      </w:r>
-      <w:r>
-        <w:rPr>
-          <w:rFonts w:ascii="Arial" w:hAnsi="Arial" w:cs="Arial"/>
-        </w:rPr>
-        <w:t>https://docs.ollama.com/</w:t>
-      </w:r>
-    </w:p>
-    <w:p>
-      <w:pPr>
-        <w:spacing w:line="360" w:lineRule="auto"/>
-        <w:rPr>
-          <w:rFonts w:ascii="Arial" w:hAnsi="Arial" w:cs="Arial"/>
-        </w:rPr>
-      </w:pPr>
-      <w:r>
-        <w:rPr>
-          <w:rFonts w:ascii="Arial" w:hAnsi="Arial" w:cs="Arial"/>
-        </w:rPr>
-        <w:t xml:space="preserve">[14] </w:t>
-      </w:r>
-      <w:r>
-        <w:rPr>
-          <w:rFonts w:ascii="Arial" w:hAnsi="Arial" w:cs="Arial"/>
-        </w:rPr>
-        <w:t>nominatim.org: Nominatim 5.3.2 manual-</w:t>
-      </w:r>
-      <w:r>
-        <w:rPr>
-          <w:rFonts w:ascii="Arial" w:hAnsi="Arial" w:cs="Arial"/>
-        </w:rPr>
-        <w:t>https://nominatim.org/release-docs/latest/</w:t>
-      </w:r>
-      <w:r>
-        <w:rPr>
-          <w:rFonts w:ascii="Arial" w:hAnsi="Arial" w:cs="Arial"/>
-        </w:rPr>
-        <w:t xml:space="preserve"> </w:t>
-      </w:r>
-    </w:p>
-    <w:p>
-      <w:pPr>
-        <w:spacing w:line="360" w:lineRule="auto"/>
-        <w:rPr>
-          <w:rFonts w:ascii="Arial" w:hAnsi="Arial" w:cs="Arial"/>
-        </w:rPr>
-      </w:pPr>
-      <w:r>
-        <w:rPr>
-          <w:rFonts w:ascii="Arial" w:hAnsi="Arial" w:cs="Arial"/>
-        </w:rPr>
-        <w:t xml:space="preserve">[15] </w:t>
-      </w:r>
-      <w:r>
-        <w:rPr>
-          <w:rFonts w:ascii="Arial" w:hAnsi="Arial" w:cs="Arial"/>
-        </w:rPr>
-        <w:t xml:space="preserve">developers.google.com: </w:t>
-      </w:r>
-      <w:r>
-        <w:rPr>
-          <w:rFonts w:ascii="Arial" w:hAnsi="Arial" w:cs="Arial"/>
-        </w:rPr>
-        <w:t>Using OAuth 2.0 to Access Google APIs</w:t>
+        <w:t xml:space="preserve">[19] </w:t>
+      </w:r>
+      <w:r>
+        <w:rPr>
+          <w:rFonts w:ascii="Arial" w:hAnsi="Arial" w:cs="Arial"/>
+        </w:rPr>
+        <w:t>coolify.io: Coolify-</w:t>
+      </w:r>
+      <w:r>
+        <w:rPr>
+          <w:rFonts w:ascii="Arial" w:hAnsi="Arial" w:cs="Arial"/>
+        </w:rPr>
+        <w:t>https://coolify.io/docs</w:t>
+      </w:r>
+    </w:p>
+    <w:p>
+      <w:pPr>
+        <w:spacing w:line="360" w:lineRule="auto"/>
+        <w:rPr>
+          <w:rFonts w:ascii="Arial" w:hAnsi="Arial" w:cs="Arial"/>
+        </w:rPr>
+      </w:pPr>
+      <w:r>
+        <w:rPr>
+          <w:rFonts w:ascii="Arial" w:hAnsi="Arial" w:cs="Arial"/>
+        </w:rPr>
+        <w:t>[20] docs.docker.com: Docker Compose-</w:t>
+      </w:r>
+      <w:r>
+        <w:rPr>
+          <w:rFonts w:ascii="Arial" w:hAnsi="Arial" w:cs="Arial"/>
+        </w:rPr>
+        <w:t>https://docs.docker.com/compose/</w:t>
+      </w:r>
+    </w:p>
+    <w:p>
+      <w:pPr>
+        <w:spacing w:line="360" w:lineRule="auto"/>
+        <w:rPr>
+          <w:rFonts w:ascii="Arial" w:hAnsi="Arial" w:cs="Arial"/>
+        </w:rPr>
+      </w:pPr>
+      <w:r>
+        <w:rPr>
+          <w:rFonts w:ascii="Arial" w:hAnsi="Arial" w:cs="Arial"/>
+        </w:rPr>
+        <w:t xml:space="preserve">[21] </w:t>
+      </w:r>
+      <w:hyperlink r:id="rId13" w:history="1">
+        <w:r>
+          <w:t>www.jwt.io</w:t>
+        </w:r>
+      </w:hyperlink>
+      <w:r>
+        <w:rPr>
+          <w:rFonts w:ascii="Arial" w:hAnsi="Arial" w:cs="Arial"/>
+        </w:rPr>
+        <w:t xml:space="preserve">: </w:t>
+      </w:r>
+      <w:r>
+        <w:rPr>
+          <w:rFonts w:ascii="Arial" w:hAnsi="Arial" w:cs="Arial"/>
+        </w:rPr>
+        <w:t>Introduction to JSON Web Tokens</w:t>
       </w:r>
       <w:r>
         <w:rPr>
@@ -11635,27 +12796,27 @@
         <w:rPr>
           <w:rFonts w:ascii="Arial" w:hAnsi="Arial" w:cs="Arial"/>
         </w:rPr>
-        <w:t>https://developers.google.com/identity/protocols/oauth2</w:t>
-      </w:r>
-    </w:p>
-    <w:p>
-      <w:pPr>
-        <w:spacing w:line="360" w:lineRule="auto"/>
-        <w:rPr>
-          <w:rFonts w:ascii="Arial" w:hAnsi="Arial" w:cs="Arial"/>
-        </w:rPr>
-      </w:pPr>
-      <w:r>
-        <w:rPr>
-          <w:rFonts w:ascii="Arial" w:hAnsi="Arial" w:cs="Arial"/>
-        </w:rPr>
-        <w:t xml:space="preserve">[16] docs.pytest.org: </w:t>
-      </w:r>
-      <w:r>
-        <w:rPr>
-          <w:rFonts w:ascii="Arial" w:hAnsi="Arial" w:cs="Arial"/>
-        </w:rPr>
-        <w:t>pytest: helps you write better programs</w:t>
+        <w:t>https://www.jwt.io/introduction#what-is-json-web-token</w:t>
+      </w:r>
+    </w:p>
+    <w:p>
+      <w:pPr>
+        <w:spacing w:line="360" w:lineRule="auto"/>
+        <w:rPr>
+          <w:rFonts w:ascii="Arial" w:hAnsi="Arial" w:cs="Arial"/>
+        </w:rPr>
+      </w:pPr>
+      <w:r>
+        <w:rPr>
+          <w:rFonts w:ascii="Arial" w:hAnsi="Arial" w:cs="Arial"/>
+        </w:rPr>
+        <w:t xml:space="preserve">[22] docs.github.com: </w:t>
+      </w:r>
+      <w:r>
+        <w:rPr>
+          <w:rFonts w:ascii="Arial" w:hAnsi="Arial" w:cs="Arial"/>
+        </w:rPr>
+        <w:t>Get started with GitHub documentation</w:t>
       </w:r>
       <w:r>
         <w:rPr>
@@ -11667,99 +12828,7 @@
         <w:rPr>
           <w:rFonts w:ascii="Arial" w:hAnsi="Arial" w:cs="Arial"/>
         </w:rPr>
-        <w:t>https://docs.pytest.org/en/stable/index.html</w:t>
-      </w:r>
-    </w:p>
-    <w:p>
-      <w:pPr>
-        <w:spacing w:line="360" w:lineRule="auto"/>
-        <w:rPr>
-          <w:rFonts w:ascii="Arial" w:hAnsi="Arial" w:cs="Arial"/>
-        </w:rPr>
-      </w:pPr>
-      <w:r>
-        <w:rPr>
-          <w:rFonts w:ascii="Arial" w:hAnsi="Arial" w:cs="Arial"/>
-        </w:rPr>
-        <w:t xml:space="preserve">[17] </w:t>
-      </w:r>
-      <w:r>
-        <w:rPr>
-          <w:rFonts w:ascii="Arial" w:hAnsi="Arial" w:cs="Arial"/>
-        </w:rPr>
-        <w:t>docs.github.com: GitHub Actions documentation-</w:t>
-      </w:r>
-      <w:r>
-        <w:rPr>
-          <w:rFonts w:ascii="Arial" w:hAnsi="Arial" w:cs="Arial"/>
-        </w:rPr>
-        <w:t>https://docs.github.com/en/actions</w:t>
-      </w:r>
-    </w:p>
-    <w:p>
-      <w:pPr>
-        <w:spacing w:line="360" w:lineRule="auto"/>
-        <w:rPr>
-          <w:rFonts w:ascii="Arial" w:hAnsi="Arial" w:cs="Arial"/>
-        </w:rPr>
-      </w:pPr>
-      <w:r>
-        <w:rPr>
-          <w:rFonts w:ascii="Arial" w:hAnsi="Arial" w:cs="Arial"/>
-        </w:rPr>
-        <w:t>[18] code.visualstudio.com: Visual Studio Code documentation-</w:t>
-      </w:r>
-      <w:r>
-        <w:rPr>
-          <w:rFonts w:ascii="Arial" w:hAnsi="Arial" w:cs="Arial"/>
-        </w:rPr>
-        <w:t>https://code.visualstudio.com/docs</w:t>
-      </w:r>
-    </w:p>
-    <w:p>
-      <w:pPr>
-        <w:spacing w:line="360" w:lineRule="auto"/>
-        <w:rPr>
-          <w:rFonts w:ascii="Arial" w:hAnsi="Arial" w:cs="Arial"/>
-        </w:rPr>
-      </w:pPr>
-      <w:r>
-        <w:rPr>
-          <w:rFonts w:ascii="Arial" w:hAnsi="Arial" w:cs="Arial"/>
-        </w:rPr>
-        <w:t xml:space="preserve">[19] </w:t>
-      </w:r>
-      <w:r>
-        <w:rPr>
-          <w:rFonts w:ascii="Arial" w:hAnsi="Arial" w:cs="Arial"/>
-        </w:rPr>
-        <w:t>coolify.io: Coolify-</w:t>
-      </w:r>
-      <w:r>
-        <w:rPr>
-          <w:rFonts w:ascii="Arial" w:hAnsi="Arial" w:cs="Arial"/>
-        </w:rPr>
-        <w:t>https://coolify.io/docs</w:t>
-      </w:r>
-    </w:p>
-    <w:p>
-      <w:pPr>
-        <w:spacing w:line="360" w:lineRule="auto"/>
-        <w:rPr>
-          <w:rFonts w:ascii="Arial" w:hAnsi="Arial" w:cs="Arial"/>
-        </w:rPr>
-      </w:pPr>
-      <w:r>
-        <w:rPr>
-          <w:rFonts w:ascii="Arial" w:hAnsi="Arial" w:cs="Arial"/>
-        </w:rPr>
-        <w:t>[20] docs.docker.com: Docker Compose-</w:t>
-      </w:r>
-      <w:r>
-        <w:rPr>
-          <w:rFonts w:ascii="Arial" w:hAnsi="Arial" w:cs="Arial"/>
-        </w:rPr>
-        <w:t>https://docs.docker.com/compose/</w:t>
+        <w:t>https://docs.github.com/en/get-started</w:t>
       </w:r>
     </w:p>
     <w:p>
@@ -11816,7 +12885,7 @@
 </file>
 
 <file path=word/numbering.xml><?xml version="1.0" encoding="utf-8"?>
-<w:numbering xmlns:wpc="http://schemas.microsoft.com/office/word/2010/wordprocessingCanvas" xmlns:cx="http://schemas.microsoft.com/office/drawing/2014/chartex" xmlns:cx1="http://schemas.microsoft.com/office/drawing/2015/9/8/chartex" xmlns:cx2="http://schemas.microsoft.com/office/drawing/2015/10/21/chartex" xmlns:cx3="http://schemas.microsoft.com/office/drawing/2016/5/9/chartex" xmlns:cx4="http://schemas.microsoft.com/office/drawing/2016/5/10/chartex" xmlns:cx5="http://schemas.microsoft.com/office/drawing/2016/5/11/chartex" xmlns:cx6="http://schemas.microsoft.com/office/drawing/2016/5/12/chartex" xmlns:cx7="http://schemas.microsoft.com/office/drawing/2016/5/13/chartex" xmlns:cx8="http://schemas.microsoft.com/office/drawing/2016/5/14/chartex" xmlns:mc="http://schemas.openxmlformats.org/markup-compatibility/2006" xmlns:aink="http://schemas.microsoft.com/office/drawing/2016/ink" xmlns:am3d="http://schemas.microsoft.com/office/drawing/2017/model3d" xmlns:o="urn:schemas-microsoft-com:office:office" xmlns:oel="http://schemas.microsoft.com/office/2019/extlst" xmlns:r="http://schemas.openxmlformats.org/officeDocument/2006/relationships" xmlns:m="http://schemas.openxmlformats.org/officeDocument/2006/math" xmlns:v="urn:schemas-microsoft-com:vml" xmlns:wp14="http://schemas.microsoft.com/office/word/2010/wordprocessingDrawing" xmlns:wp="http://schemas.openxmlformats.org/drawingml/2006/wordprocessingDrawing" xmlns:w10="urn:schemas-microsoft-com:office:word" xmlns:w="http://schemas.openxmlformats.org/wordprocessingml/2006/main" xmlns:w14="http://schemas.microsoft.com/office/word/2010/wordml" xmlns:w15="http://schemas.microsoft.com/office/word/2012/wordml" xmlns:w16cex="http://schemas.microsoft.com/office/word/2018/wordml/cex" xmlns:w16cid="http://schemas.microsoft.com/office/word/2016/wordml/cid" xmlns:w16="http://schemas.microsoft.com/office/word/2018/wordml" xmlns:w16du="http://schemas.microsoft.com/office/word/2023/wordml/word16du" xmlns:w16sdtdh="http://schemas.microsoft.com/office/word/2020/wordml/sdtdatahash" xmlns:w16sdtfl="http://schemas.microsoft.com/office/word/2024/wordml/sdtformatlock" xmlns:w16se="http://schemas.microsoft.com/office/word/2015/wordml/symex" xmlns:wpg="http://schemas.microsoft.com/office/word/2010/wordprocessingGroup" xmlns:wpi="http://schemas.microsoft.com/office/word/2010/wordprocessingInk" xmlns:wne="http://schemas.microsoft.com/office/word/2006/wordml" xmlns:wps="http://schemas.microsoft.com/office/word/2010/wordprocessingShape" mc:Ignorable="w14 w15 w16se w16cid w16 w16cex w16sdtdh w16sdtfl w16du wp14">
+<w:numbering xmlns:wpc="http://schemas.microsoft.com/office/word/2010/wordprocessingCanvas" xmlns:cx="http://schemas.microsoft.com/office/drawing/2014/chartex" xmlns:cx1="http://schemas.microsoft.com/office/drawing/2015/9/8/chartex" xmlns:cx2="http://schemas.microsoft.com/office/drawing/2015/10/21/chartex" xmlns:cx3="http://schemas.microsoft.com/office/drawing/2016/5/9/chartex" xmlns:cx4="http://schemas.microsoft.com/office/drawing/2016/5/10/chartex" xmlns:cx5="http://schemas.microsoft.com/office/drawing/2016/5/11/chartex" xmlns:cx6="http://schemas.microsoft.com/office/drawing/2016/5/12/chartex" xmlns:cx7="http://schemas.microsoft.com/office/drawing/2016/5/13/chartex" xmlns:cx8="http://schemas.microsoft.com/office/drawing/2016/5/14/chartex" xmlns:mc="http://schemas.openxmlformats.org/markup-compatibility/2006" xmlns:aink="http://schemas.microsoft.com/office/drawing/2016/ink" xmlns:am3d="http://schemas.microsoft.com/office/drawing/2017/model3d" xmlns:o="urn:schemas-microsoft-com:office:office" xmlns:oel="http://schemas.microsoft.com/office/2019/extlst" xmlns:r="http://schemas.openxmlformats.org/officeDocument/2006/relationships" xmlns:m="http://schemas.openxmlformats.org/officeDocument/2006/math" xmlns:v="urn:schemas-microsoft-com:vml" xmlns:wp14="http://schemas.microsoft.com/office/word/2010/wordprocessingDrawing" xmlns:wp="http://schemas.openxmlformats.org/drawingml/2006/wordprocessingDrawing" xmlns:w10="urn:schemas-microsoft-com:office:word" xmlns:w="http://schemas.openxmlformats.org/wordprocessingml/2006/main" xmlns:w14="http://schemas.microsoft.com/office/word/2010/wordml" xmlns:w15="http://schemas.microsoft.com/office/word/2012/wordml" xmlns:w16cei="http://schemas.microsoft.com/office/word/2026/wordml/cei" xmlns:w16cex="http://schemas.microsoft.com/office/word/2018/wordml/cex" xmlns:w16cid="http://schemas.microsoft.com/office/word/2016/wordml/cid" xmlns:w16="http://schemas.microsoft.com/office/word/2018/wordml" xmlns:w16du="http://schemas.microsoft.com/office/word/2023/wordml/word16du" xmlns:w16sdtdh="http://schemas.microsoft.com/office/word/2020/wordml/sdtdatahash" xmlns:w16sdtfl="http://schemas.microsoft.com/office/word/2024/wordml/sdtformatlock" xmlns:w16se="http://schemas.microsoft.com/office/word/2015/wordml/symex" xmlns:wpg="http://schemas.microsoft.com/office/word/2010/wordprocessingGroup" xmlns:wpi="http://schemas.microsoft.com/office/word/2010/wordprocessingInk" xmlns:wne="http://schemas.microsoft.com/office/word/2006/wordml" xmlns:wps="http://schemas.microsoft.com/office/word/2010/wordprocessingShape" mc:Ignorable="w14 w15 w16se w16cid w16 w16cex w16sdtdh w16sdtfl w16du wp14">
   <w:abstractNum w:abstractNumId="0" w15:restartNumberingAfterBreak="0">
     <w:nsid w:val="057A4E51"/>
     <w:multiLevelType w:val="multilevel"/>
@@ -15431,6 +16500,29 @@
       <w:szCs w:val="18"/>
     </w:rPr>
   </w:style>
+  <w:style w:type="character" w:styleId="Hyperlink">
+    <w:name w:val="Hyperlink"/>
+    <w:basedOn w:val="DefaultParagraphFont"/>
+    <w:uiPriority w:val="99"/>
+    <w:unhideWhenUsed/>
+    <w:rsid w:val="0083354F"/>
+    <w:rPr>
+      <w:color w:val="467886" w:themeColor="hyperlink"/>
+      <w:u w:val="single"/>
+    </w:rPr>
+  </w:style>
+  <w:style w:type="character" w:styleId="UnresolvedMention">
+    <w:name w:val="Unresolved Mention"/>
+    <w:basedOn w:val="DefaultParagraphFont"/>
+    <w:uiPriority w:val="99"/>
+    <w:semiHidden/>
+    <w:unhideWhenUsed/>
+    <w:rsid w:val="0083354F"/>
+    <w:rPr>
+      <w:color w:val="605E5C"/>
+      <w:shd w:val="clear" w:color="auto" w:fill="E1DFDD"/>
+    </w:rPr>
+  </w:style>
 </w:styles>
 </file>
 

</xml_diff>

<commit_message>
polishing the settings page
</commit_message>
<xml_diff>
--- a/szakdolgozat.docx
+++ b/szakdolgozat.docx
@@ -11462,7 +11462,25 @@
         <w:rPr>
           <w:rFonts w:ascii="Arial" w:hAnsi="Arial" w:cs="Arial"/>
         </w:rPr>
-        <w:t xml:space="preserve">, amelyen keresztül a felhasználó testreszabhatja az alkalmazás megjelenését és az AI-alapú útiterv-generáláshoz használt nyelvi modell szolgáltatóját. A funkció </w:t>
+        <w:t xml:space="preserve"> (settings.html)</w:t>
+      </w:r>
+      <w:r>
+        <w:rPr>
+          <w:rFonts w:ascii="Arial" w:hAnsi="Arial" w:cs="Arial"/>
+        </w:rPr>
+        <w:t>, amelyen keresztül a felhasználó testreszabhatja az alkalmazás</w:t>
+      </w:r>
+      <w:r>
+        <w:rPr>
+          <w:rFonts w:ascii="Arial" w:hAnsi="Arial" w:cs="Arial"/>
+        </w:rPr>
+        <w:t>t</w:t>
+      </w:r>
+      <w:r>
+        <w:rPr>
+          <w:rFonts w:ascii="Arial" w:hAnsi="Arial" w:cs="Arial"/>
+        </w:rPr>
+        <w:t xml:space="preserve">. A funkció </w:t>
       </w:r>
       <w:r>
         <w:rPr>
@@ -11500,26 +11518,11 @@
         </w:rPr>
         <w:t>.</w:t>
       </w:r>
-    </w:p>
-    <w:p>
-      <w:pPr>
-        <w:spacing w:line="360" w:lineRule="auto"/>
-        <w:jc w:val="both"/>
-        <w:rPr>
-          <w:rFonts w:ascii="Arial" w:hAnsi="Arial" w:cs="Arial"/>
-        </w:rPr>
-      </w:pPr>
-      <w:r>
-        <w:rPr>
-          <w:rFonts w:ascii="Arial" w:hAnsi="Arial" w:cs="Arial"/>
-        </w:rPr>
-        <w:t xml:space="preserve">5.7.1. </w:t>
-      </w:r>
-      <w:r>
-        <w:rPr>
-          <w:rFonts w:ascii="Arial" w:hAnsi="Arial" w:cs="Arial"/>
-        </w:rPr>
-        <w:t>Téma és nyelv kiválasztása</w:t>
+      <w:r>
+        <w:rPr>
+          <w:rFonts w:ascii="Arial" w:hAnsi="Arial" w:cs="Arial"/>
+        </w:rPr>
+        <w:t xml:space="preserve"> A kliens oldali logikát a settings.js valósítja meg.</w:t>
       </w:r>
     </w:p>
     <w:p>
@@ -11560,7 +11563,19 @@
         <w:rPr>
           <w:rFonts w:ascii="Arial" w:hAnsi="Arial" w:cs="Arial"/>
         </w:rPr>
-        <w:t xml:space="preserve">alapértelmezett értékként sötét témát és angol nyelvet feltételezve, amennyiben még nem történt korábbi mentés. A kiolvasott értékeket a rendszer egyrészt a legördülő menük aktuális állapotaként jeleníti meg, másrészt azonnal alkalmazza is: a témát az </w:t>
+        <w:t>alapértelmezett értékként sötét témát és angol nyelvet feltételezve, amennyiben még nem történt korább</w:t>
+      </w:r>
+      <w:r>
+        <w:rPr>
+          <w:rFonts w:ascii="Arial" w:hAnsi="Arial" w:cs="Arial"/>
+        </w:rPr>
+        <w:t>an változtatás</w:t>
+      </w:r>
+      <w:r>
+        <w:rPr>
+          <w:rFonts w:ascii="Arial" w:hAnsi="Arial" w:cs="Arial"/>
+        </w:rPr>
+        <w:t xml:space="preserve">. A kiolvasott értékeket a rendszer egyrészt a legördülő menük aktuális állapotaként jeleníti meg, másrészt azonnal alkalmazza is: a témát az </w:t>
       </w:r>
       <w:r>
         <w:rPr>
@@ -11574,7 +11589,7 @@
         <w:rPr>
           <w:rFonts w:ascii="Arial" w:hAnsi="Arial" w:cs="Arial"/>
         </w:rPr>
-        <w:t xml:space="preserve"> globális függvény állítja be, míg a nyelvet az i18n modul </w:t>
+        <w:t xml:space="preserve"> függvény állítja be, míg a nyelvet az i18n modul </w:t>
       </w:r>
       <w:r>
         <w:rPr>
@@ -11602,22 +11617,145 @@
         <w:rPr>
           <w:rFonts w:ascii="Arial" w:hAnsi="Arial" w:cs="Arial"/>
         </w:rPr>
-        <w:t xml:space="preserve"> metódusai vezetik át a felületen. Amennyiben a felhasználó az "Auto (System)" témaopciót választja, a rendszer egy külön eseményfigyelőt is regisztrál, amely az operációs rendszer téma-beállításának változását követi.</w:t>
-      </w:r>
-    </w:p>
-    <w:p>
-      <w:pPr>
-        <w:spacing w:line="360" w:lineRule="auto"/>
-        <w:jc w:val="both"/>
-        <w:rPr>
-          <w:rFonts w:ascii="Arial" w:hAnsi="Arial" w:cs="Arial"/>
-        </w:rPr>
-      </w:pPr>
-      <w:r>
-        <w:rPr>
-          <w:rFonts w:ascii="Arial" w:hAnsi="Arial" w:cs="Arial"/>
-        </w:rPr>
-        <w:t xml:space="preserve">Az űrlap elküldésekor a rendszer a kiválasztott téma- és nyelvi értékeket elmenti a </w:t>
+        <w:t xml:space="preserve"> metódusai </w:t>
+      </w:r>
+      <w:r>
+        <w:rPr>
+          <w:rFonts w:ascii="Arial" w:hAnsi="Arial" w:cs="Arial"/>
+        </w:rPr>
+        <w:t>kezelik</w:t>
+      </w:r>
+      <w:r>
+        <w:rPr>
+          <w:rFonts w:ascii="Arial" w:hAnsi="Arial" w:cs="Arial"/>
+        </w:rPr>
+        <w:t>. Amennyiben a felhasználó az "Auto (System)" tém</w:t>
+      </w:r>
+      <w:r>
+        <w:rPr>
+          <w:rFonts w:ascii="Arial" w:hAnsi="Arial" w:cs="Arial"/>
+        </w:rPr>
+        <w:t>át</w:t>
+      </w:r>
+      <w:r>
+        <w:rPr>
+          <w:rFonts w:ascii="Arial" w:hAnsi="Arial" w:cs="Arial"/>
+        </w:rPr>
+        <w:t xml:space="preserve"> választja, a rendszer egy külön eseményfigyelőt is regisztrál, amely az operációs rendszer téma-beállításának változását követi.</w:t>
+      </w:r>
+    </w:p>
+    <w:p>
+      <w:pPr>
+        <w:spacing w:line="360" w:lineRule="auto"/>
+        <w:jc w:val="both"/>
+        <w:rPr>
+          <w:rFonts w:ascii="Arial" w:hAnsi="Arial" w:cs="Arial"/>
+        </w:rPr>
+      </w:pPr>
+      <w:r>
+        <w:rPr>
+          <w:rFonts w:ascii="Arial" w:hAnsi="Arial" w:cs="Arial"/>
+        </w:rPr>
+        <w:t>A téma- és nyelvváltás már a választómezők módosításakor élőben érvényesül a felületen</w:t>
+      </w:r>
+      <w:r>
+        <w:rPr>
+          <w:rFonts w:ascii="Arial" w:hAnsi="Arial" w:cs="Arial"/>
+        </w:rPr>
+        <w:t>. Amennyiben a felhasználó a Cancel gombra kattint, a módosításai nem mentődnek el, és</w:t>
+      </w:r>
+      <w:r>
+        <w:rPr>
+          <w:rFonts w:ascii="Arial" w:hAnsi="Arial" w:cs="Arial"/>
+        </w:rPr>
+        <w:t xml:space="preserve"> a rendszer</w:t>
+      </w:r>
+      <w:r>
+        <w:rPr>
+          <w:rFonts w:ascii="Arial" w:hAnsi="Arial" w:cs="Arial"/>
+        </w:rPr>
+        <w:t xml:space="preserve"> visszanavigál</w:t>
+      </w:r>
+      <w:r>
+        <w:rPr>
+          <w:rFonts w:ascii="Arial" w:hAnsi="Arial" w:cs="Arial"/>
+        </w:rPr>
+        <w:t>ja</w:t>
+      </w:r>
+      <w:r>
+        <w:rPr>
+          <w:rFonts w:ascii="Arial" w:hAnsi="Arial" w:cs="Arial"/>
+        </w:rPr>
+        <w:t xml:space="preserve"> az al</w:t>
+      </w:r>
+      <w:r>
+        <w:rPr>
+          <w:rFonts w:ascii="Arial" w:hAnsi="Arial" w:cs="Arial"/>
+        </w:rPr>
+        <w:t>k</w:t>
+      </w:r>
+      <w:r>
+        <w:rPr>
+          <w:rFonts w:ascii="Arial" w:hAnsi="Arial" w:cs="Arial"/>
+        </w:rPr>
+        <w:t>almazás főoldalára</w:t>
+      </w:r>
+      <w:r>
+        <w:rPr>
+          <w:rFonts w:ascii="Arial" w:hAnsi="Arial" w:cs="Arial"/>
+        </w:rPr>
+        <w:t>.</w:t>
+      </w:r>
+    </w:p>
+    <w:p>
+      <w:pPr>
+        <w:spacing w:line="360" w:lineRule="auto"/>
+        <w:jc w:val="both"/>
+        <w:rPr>
+          <w:rFonts w:ascii="Arial" w:hAnsi="Arial" w:cs="Arial"/>
+        </w:rPr>
+      </w:pPr>
+      <w:r>
+        <w:rPr>
+          <w:rFonts w:ascii="Arial" w:hAnsi="Arial" w:cs="Arial"/>
+        </w:rPr>
+        <w:t>A</w:t>
+      </w:r>
+      <w:r>
+        <w:rPr>
+          <w:rFonts w:ascii="Arial" w:hAnsi="Arial" w:cs="Arial"/>
+        </w:rPr>
+        <w:t xml:space="preserve"> mentés gomb megnyomásakor </w:t>
+      </w:r>
+      <w:r>
+        <w:rPr>
+          <w:rFonts w:ascii="Arial" w:hAnsi="Arial" w:cs="Arial"/>
+        </w:rPr>
+        <w:t xml:space="preserve">a rendszer a kiválasztott </w:t>
+      </w:r>
+      <w:r>
+        <w:rPr>
+          <w:rFonts w:ascii="Arial" w:hAnsi="Arial" w:cs="Arial"/>
+        </w:rPr>
+        <w:t>témát és nyelvet</w:t>
+      </w:r>
+      <w:r>
+        <w:rPr>
+          <w:rFonts w:ascii="Arial" w:hAnsi="Arial" w:cs="Arial"/>
+        </w:rPr>
+        <w:t xml:space="preserve"> </w:t>
+      </w:r>
+      <w:r>
+        <w:rPr>
+          <w:rFonts w:ascii="Arial" w:hAnsi="Arial" w:cs="Arial"/>
+        </w:rPr>
+        <w:t>eltárolja</w:t>
+      </w:r>
+      <w:r>
+        <w:rPr>
+          <w:rFonts w:ascii="Arial" w:hAnsi="Arial" w:cs="Arial"/>
+        </w:rPr>
+        <w:t xml:space="preserve"> a </w:t>
       </w:r>
       <w:r>
         <w:rPr>
@@ -11631,7 +11769,7 @@
         <w:rPr>
           <w:rFonts w:ascii="Arial" w:hAnsi="Arial" w:cs="Arial"/>
         </w:rPr>
-        <w:t>-ba, majd újra alkalmazza azokat a felületen. A sikeres mentésről a felhasználó egy rövid, néhány másodperc után automatikusan eltűnő visszajelző üzenetet kap.</w:t>
+        <w:t>-ba. A sikeres mentésről a felhasználó egy rövid, néhány másodperc után automatikusan eltűnő visszajelző üzenetet kap.</w:t>
       </w:r>
     </w:p>
     <w:p>
@@ -11650,6 +11788,7 @@
           <w:sz w:val="28"/>
           <w:szCs w:val="28"/>
         </w:rPr>
+        <w:lastRenderedPageBreak/>
         <w:t>5.</w:t>
       </w:r>
       <w:r>
@@ -11681,222 +11820,221 @@
         <w:rPr>
           <w:rFonts w:ascii="Arial" w:hAnsi="Arial" w:cs="Arial"/>
         </w:rPr>
+        <w:t>A profil oldal a bejelentkezett felhasználó fiókjának áttekintő nézeteként funkcionál: megjeleníti az alapvető fiókadatokat, néhány összesítő statisztikát, valamint innen érhetők el a fiókkezeléssel kapcsolatos műveletek (profilszerkesztés, kijelentkezés).</w:t>
+      </w:r>
+    </w:p>
+    <w:p>
+      <w:pPr>
+        <w:spacing w:line="360" w:lineRule="auto"/>
+        <w:jc w:val="both"/>
+        <w:rPr>
+          <w:rFonts w:ascii="Arial" w:hAnsi="Arial" w:cs="Arial"/>
+        </w:rPr>
+      </w:pPr>
+      <w:r>
+        <w:rPr>
+          <w:rFonts w:ascii="Arial" w:hAnsi="Arial" w:cs="Arial"/>
+        </w:rPr>
+        <w:t xml:space="preserve">5.8.1. </w:t>
+      </w:r>
+      <w:r>
+        <w:rPr>
+          <w:rFonts w:ascii="Arial" w:hAnsi="Arial" w:cs="Arial"/>
+        </w:rPr>
+        <w:t>Autentikáció ellenőrzése és alapadatok betöltése</w:t>
+      </w:r>
+    </w:p>
+    <w:p>
+      <w:pPr>
+        <w:spacing w:line="360" w:lineRule="auto"/>
+        <w:jc w:val="both"/>
+        <w:rPr>
+          <w:rFonts w:ascii="Arial" w:hAnsi="Arial" w:cs="Arial"/>
+        </w:rPr>
+      </w:pPr>
+      <w:r>
+        <w:rPr>
+          <w:rFonts w:ascii="Arial" w:hAnsi="Arial" w:cs="Arial"/>
+        </w:rPr>
+        <w:t xml:space="preserve">Az oldal betöltésekor a kliens oldali script először a </w:t>
+      </w:r>
+      <w:r>
+        <w:rPr>
+          <w:rFonts w:ascii="Arial" w:hAnsi="Arial" w:cs="Arial"/>
+          <w:i/>
+          <w:iCs/>
+        </w:rPr>
+        <w:t>localStorage</w:t>
+      </w:r>
+      <w:r>
+        <w:rPr>
+          <w:rFonts w:ascii="Arial" w:hAnsi="Arial" w:cs="Arial"/>
+        </w:rPr>
+        <w:t xml:space="preserve"> tárolóból olvassa ki a bejelentkezett felhasználó azonosítóját és felhasználónevét. Amennyiben ezek egyike hiányzik, a rendszer nem kísérli meg az adatlekérdezést, hanem egy "Guest" feliratú, be nem jelentkezett állapotot jelenít meg, ahol a fiókműveletek helyén egy bejelentkezésre és regisztrációra felszólító üzenet, valamint a megfelelő oldalakra mutató gombok jelennek meg.</w:t>
+      </w:r>
+    </w:p>
+    <w:p>
+      <w:pPr>
+        <w:spacing w:line="360" w:lineRule="auto"/>
+        <w:jc w:val="both"/>
+        <w:rPr>
+          <w:rFonts w:ascii="Arial" w:hAnsi="Arial" w:cs="Arial"/>
+        </w:rPr>
+      </w:pPr>
+      <w:r>
+        <w:rPr>
+          <w:rFonts w:ascii="Arial" w:hAnsi="Arial" w:cs="Arial"/>
+        </w:rPr>
+        <w:t xml:space="preserve">Bejelentkezett felhasználó esetén az oldal a </w:t>
+      </w:r>
+      <w:r>
+        <w:rPr>
+          <w:rFonts w:ascii="Arial" w:hAnsi="Arial" w:cs="Arial"/>
+          <w:i/>
+          <w:iCs/>
+        </w:rPr>
+        <w:t>localStorage</w:t>
+      </w:r>
+      <w:r>
+        <w:rPr>
+          <w:rFonts w:ascii="Arial" w:hAnsi="Arial" w:cs="Arial"/>
+        </w:rPr>
+        <w:t xml:space="preserve">-ban tárolt felhasználónevet azonnal, ideiglenesen megjeleníti, majd egy GET kéréssel lekérdezi a felhasználó friss adatait a </w:t>
+      </w:r>
+      <w:r>
+        <w:rPr>
+          <w:rFonts w:ascii="Arial" w:hAnsi="Arial" w:cs="Arial"/>
+          <w:i/>
+          <w:iCs/>
+        </w:rPr>
+        <w:t>/api/users/{user_id}</w:t>
+      </w:r>
+      <w:r>
+        <w:rPr>
+          <w:rFonts w:ascii="Arial" w:hAnsi="Arial" w:cs="Arial"/>
+        </w:rPr>
+        <w:t xml:space="preserve"> végpontról, és ezekkel (felhasználónév, email cím) frissíti a felületet. Ezzel párhuzamosan két további lekérdezés is történik: a </w:t>
+      </w:r>
+      <w:r>
+        <w:rPr>
+          <w:rFonts w:ascii="Arial" w:hAnsi="Arial" w:cs="Arial"/>
+          <w:i/>
+          <w:iCs/>
+        </w:rPr>
+        <w:t>/api/users/{user_id}/visited-places</w:t>
+      </w:r>
+      <w:r>
+        <w:rPr>
+          <w:rFonts w:ascii="Arial" w:hAnsi="Arial" w:cs="Arial"/>
+        </w:rPr>
+        <w:t xml:space="preserve"> végpont a meglátogatott helyek számát, a </w:t>
+      </w:r>
+      <w:r>
+        <w:rPr>
+          <w:rFonts w:ascii="Arial" w:hAnsi="Arial" w:cs="Arial"/>
+          <w:i/>
+          <w:iCs/>
+        </w:rPr>
+        <w:t>/api/users/{user_id}/planned-trips</w:t>
+      </w:r>
+      <w:r>
+        <w:rPr>
+          <w:rFonts w:ascii="Arial" w:hAnsi="Arial" w:cs="Arial"/>
+        </w:rPr>
+        <w:t xml:space="preserve"> végpont pedig a megtervezett utazások számát adja vissza, amelyek a "Statisztikák" szekcióban jelennek meg.</w:t>
+      </w:r>
+    </w:p>
+    <w:p>
+      <w:pPr>
+        <w:spacing w:line="360" w:lineRule="auto"/>
+        <w:jc w:val="both"/>
+        <w:rPr>
+          <w:rFonts w:ascii="Arial" w:hAnsi="Arial" w:cs="Arial"/>
+        </w:rPr>
+      </w:pPr>
+      <w:r>
+        <w:rPr>
+          <w:rFonts w:ascii="Arial" w:hAnsi="Arial" w:cs="Arial"/>
+        </w:rPr>
+        <w:t xml:space="preserve">5.8.2. </w:t>
+      </w:r>
+      <w:r>
+        <w:rPr>
+          <w:rFonts w:ascii="Arial" w:hAnsi="Arial" w:cs="Arial"/>
+        </w:rPr>
+        <w:t>Avatar megjelenítés</w:t>
+      </w:r>
+    </w:p>
+    <w:p>
+      <w:pPr>
+        <w:spacing w:line="360" w:lineRule="auto"/>
+        <w:jc w:val="both"/>
+        <w:rPr>
+          <w:rFonts w:ascii="Arial" w:hAnsi="Arial" w:cs="Arial"/>
+        </w:rPr>
+      </w:pPr>
+      <w:r>
+        <w:rPr>
+          <w:rFonts w:ascii="Arial" w:hAnsi="Arial" w:cs="Arial"/>
+        </w:rPr>
+        <w:t xml:space="preserve">A felhasználó profilképeként a rendszer kétféle megoldást alkalmaz. Amennyiben a felhasználó Google-fiókkal jelentkezett be és a hozzá tartozó profilkép URL-je elérhető a </w:t>
+      </w:r>
+      <w:r>
+        <w:rPr>
+          <w:rFonts w:ascii="Arial" w:hAnsi="Arial" w:cs="Arial"/>
+          <w:i/>
+          <w:iCs/>
+        </w:rPr>
+        <w:t>localStorage</w:t>
+      </w:r>
+      <w:r>
+        <w:rPr>
+          <w:rFonts w:ascii="Arial" w:hAnsi="Arial" w:cs="Arial"/>
+        </w:rPr>
+        <w:t>-ban, a rendszer ezt a képet tölti be és jeleníti meg; a kép sikertelen betöltése esetén automatikusan visszaáll az alapértelmezett megjelenítésre. Amennyiben nincs elérhető Google-profilkép, a rendszer a felhasználónévből  generál egy monogramot: két szóközzel, ponttal, aláhúzásjellel vagy kötőjellel elválasztott névrész esetén azok kezdőbetűit, egyéb esetben a név első egy-két karakterét használva.</w:t>
+      </w:r>
+    </w:p>
+    <w:p>
+      <w:pPr>
+        <w:spacing w:line="360" w:lineRule="auto"/>
+        <w:jc w:val="both"/>
+        <w:rPr>
+          <w:rFonts w:ascii="Arial" w:hAnsi="Arial" w:cs="Arial"/>
+        </w:rPr>
+      </w:pPr>
+      <w:r>
+        <w:rPr>
+          <w:rFonts w:ascii="Arial" w:hAnsi="Arial" w:cs="Arial"/>
+        </w:rPr>
+        <w:t xml:space="preserve">5.8.3. </w:t>
+      </w:r>
+      <w:r>
+        <w:rPr>
+          <w:rFonts w:ascii="Arial" w:hAnsi="Arial" w:cs="Arial"/>
+        </w:rPr>
+        <w:t>Fiókműveletek</w:t>
+      </w:r>
+    </w:p>
+    <w:p>
+      <w:pPr>
+        <w:spacing w:line="360" w:lineRule="auto"/>
+        <w:jc w:val="both"/>
+        <w:rPr>
+          <w:rFonts w:ascii="Arial" w:hAnsi="Arial" w:cs="Arial"/>
+        </w:rPr>
+      </w:pPr>
+      <w:r>
+        <w:rPr>
+          <w:rFonts w:ascii="Arial" w:hAnsi="Arial" w:cs="Arial"/>
+        </w:rPr>
+        <w:t xml:space="preserve">A sikeres adatbetöltést követően a "Fiók" szekció dinamikusan felépül, és két lehetőséget kínál a felhasználó számára: a profil szerkesztésére mutató hivatkozást, </w:t>
+      </w:r>
+      <w:r>
+        <w:rPr>
+          <w:rFonts w:ascii="Arial" w:hAnsi="Arial" w:cs="Arial"/>
+        </w:rPr>
         <w:lastRenderedPageBreak/>
-        <w:t>A profil oldal a bejelentkezett felhasználó fiókjának áttekintő nézeteként funkcionál: megjeleníti az alapvető fiókadatokat, néhány összesítő statisztikát, valamint innen érhetők el a fiókkezeléssel kapcsolatos műveletek (profilszerkesztés, kijelentkezés).</w:t>
-      </w:r>
-    </w:p>
-    <w:p>
-      <w:pPr>
-        <w:spacing w:line="360" w:lineRule="auto"/>
-        <w:jc w:val="both"/>
-        <w:rPr>
-          <w:rFonts w:ascii="Arial" w:hAnsi="Arial" w:cs="Arial"/>
-        </w:rPr>
-      </w:pPr>
-      <w:r>
-        <w:rPr>
-          <w:rFonts w:ascii="Arial" w:hAnsi="Arial" w:cs="Arial"/>
-        </w:rPr>
-        <w:t xml:space="preserve">5.8.1. </w:t>
-      </w:r>
-      <w:r>
-        <w:rPr>
-          <w:rFonts w:ascii="Arial" w:hAnsi="Arial" w:cs="Arial"/>
-        </w:rPr>
-        <w:t>Autentikáció ellenőrzése és alapadatok betöltése</w:t>
-      </w:r>
-    </w:p>
-    <w:p>
-      <w:pPr>
-        <w:spacing w:line="360" w:lineRule="auto"/>
-        <w:jc w:val="both"/>
-        <w:rPr>
-          <w:rFonts w:ascii="Arial" w:hAnsi="Arial" w:cs="Arial"/>
-        </w:rPr>
-      </w:pPr>
-      <w:r>
-        <w:rPr>
-          <w:rFonts w:ascii="Arial" w:hAnsi="Arial" w:cs="Arial"/>
-        </w:rPr>
-        <w:t xml:space="preserve">Az oldal betöltésekor a kliens oldali script először a </w:t>
-      </w:r>
-      <w:r>
-        <w:rPr>
-          <w:rFonts w:ascii="Arial" w:hAnsi="Arial" w:cs="Arial"/>
-          <w:i/>
-          <w:iCs/>
-        </w:rPr>
-        <w:t>localStorage</w:t>
-      </w:r>
-      <w:r>
-        <w:rPr>
-          <w:rFonts w:ascii="Arial" w:hAnsi="Arial" w:cs="Arial"/>
-        </w:rPr>
-        <w:t xml:space="preserve"> tárolóból olvassa ki a bejelentkezett felhasználó azonosítóját és felhasználónevét. Amennyiben ezek egyike hiányzik, a rendszer nem kísérli meg az adatlekérdezést, hanem egy "Guest" feliratú, be nem jelentkezett állapotot jelenít meg, ahol a fiókműveletek helyén egy bejelentkezésre és regisztrációra felszólító üzenet, valamint a megfelelő oldalakra mutató gombok jelennek meg.</w:t>
-      </w:r>
-    </w:p>
-    <w:p>
-      <w:pPr>
-        <w:spacing w:line="360" w:lineRule="auto"/>
-        <w:jc w:val="both"/>
-        <w:rPr>
-          <w:rFonts w:ascii="Arial" w:hAnsi="Arial" w:cs="Arial"/>
-        </w:rPr>
-      </w:pPr>
-      <w:r>
-        <w:rPr>
-          <w:rFonts w:ascii="Arial" w:hAnsi="Arial" w:cs="Arial"/>
-        </w:rPr>
-        <w:t xml:space="preserve">Bejelentkezett felhasználó esetén az oldal a </w:t>
-      </w:r>
-      <w:r>
-        <w:rPr>
-          <w:rFonts w:ascii="Arial" w:hAnsi="Arial" w:cs="Arial"/>
-          <w:i/>
-          <w:iCs/>
-        </w:rPr>
-        <w:t>localStorage</w:t>
-      </w:r>
-      <w:r>
-        <w:rPr>
-          <w:rFonts w:ascii="Arial" w:hAnsi="Arial" w:cs="Arial"/>
-        </w:rPr>
-        <w:t xml:space="preserve">-ban tárolt felhasználónevet azonnal, ideiglenesen megjeleníti, majd egy GET kéréssel lekérdezi a felhasználó friss adatait a </w:t>
-      </w:r>
-      <w:r>
-        <w:rPr>
-          <w:rFonts w:ascii="Arial" w:hAnsi="Arial" w:cs="Arial"/>
-          <w:i/>
-          <w:iCs/>
-        </w:rPr>
-        <w:t>/api/users/{user_id}</w:t>
-      </w:r>
-      <w:r>
-        <w:rPr>
-          <w:rFonts w:ascii="Arial" w:hAnsi="Arial" w:cs="Arial"/>
-        </w:rPr>
-        <w:t xml:space="preserve"> végpontról, és ezekkel (felhasználónév, email cím) frissíti a felületet. Ezzel párhuzamosan két további lekérdezés is történik: a </w:t>
-      </w:r>
-      <w:r>
-        <w:rPr>
-          <w:rFonts w:ascii="Arial" w:hAnsi="Arial" w:cs="Arial"/>
-          <w:i/>
-          <w:iCs/>
-        </w:rPr>
-        <w:t>/api/users/{user_id}/visited-places</w:t>
-      </w:r>
-      <w:r>
-        <w:rPr>
-          <w:rFonts w:ascii="Arial" w:hAnsi="Arial" w:cs="Arial"/>
-        </w:rPr>
-        <w:t xml:space="preserve"> végpont a meglátogatott helyek számát, a </w:t>
-      </w:r>
-      <w:r>
-        <w:rPr>
-          <w:rFonts w:ascii="Arial" w:hAnsi="Arial" w:cs="Arial"/>
-          <w:i/>
-          <w:iCs/>
-        </w:rPr>
-        <w:t>/api/users/{user_id}/planned-trips</w:t>
-      </w:r>
-      <w:r>
-        <w:rPr>
-          <w:rFonts w:ascii="Arial" w:hAnsi="Arial" w:cs="Arial"/>
-        </w:rPr>
-        <w:t xml:space="preserve"> végpont pedig a megtervezett utazások számát adja vissza, amelyek a "Statisztikák" szekcióban jelennek meg.</w:t>
-      </w:r>
-    </w:p>
-    <w:p>
-      <w:pPr>
-        <w:spacing w:line="360" w:lineRule="auto"/>
-        <w:jc w:val="both"/>
-        <w:rPr>
-          <w:rFonts w:ascii="Arial" w:hAnsi="Arial" w:cs="Arial"/>
-        </w:rPr>
-      </w:pPr>
-      <w:r>
-        <w:rPr>
-          <w:rFonts w:ascii="Arial" w:hAnsi="Arial" w:cs="Arial"/>
-        </w:rPr>
-        <w:t xml:space="preserve">5.8.2. </w:t>
-      </w:r>
-      <w:r>
-        <w:rPr>
-          <w:rFonts w:ascii="Arial" w:hAnsi="Arial" w:cs="Arial"/>
-        </w:rPr>
-        <w:t>Avatar megjelenítés</w:t>
-      </w:r>
-    </w:p>
-    <w:p>
-      <w:pPr>
-        <w:spacing w:line="360" w:lineRule="auto"/>
-        <w:jc w:val="both"/>
-        <w:rPr>
-          <w:rFonts w:ascii="Arial" w:hAnsi="Arial" w:cs="Arial"/>
-        </w:rPr>
-      </w:pPr>
-      <w:r>
-        <w:rPr>
-          <w:rFonts w:ascii="Arial" w:hAnsi="Arial" w:cs="Arial"/>
-        </w:rPr>
-        <w:t xml:space="preserve">A felhasználó profilképeként a rendszer kétféle megoldást alkalmaz. Amennyiben a felhasználó Google-fiókkal jelentkezett be és a hozzá tartozó profilkép URL-je elérhető a </w:t>
-      </w:r>
-      <w:r>
-        <w:rPr>
-          <w:rFonts w:ascii="Arial" w:hAnsi="Arial" w:cs="Arial"/>
-          <w:i/>
-          <w:iCs/>
-        </w:rPr>
-        <w:t>localStorage</w:t>
-      </w:r>
-      <w:r>
-        <w:rPr>
-          <w:rFonts w:ascii="Arial" w:hAnsi="Arial" w:cs="Arial"/>
-        </w:rPr>
-        <w:t>-ban, a rendszer ezt a képet tölti be és jeleníti meg; a kép sikertelen betöltése esetén automatikusan visszaáll az alapértelmezett megjelenítésre. Amennyiben nincs elérhető Google-profilkép, a rendszer a felhasználónévből  generál egy monogramot: két szóközzel, ponttal, aláhúzásjellel vagy kötőjellel elválasztott névrész esetén azok kezdőbetűit, egyéb esetben a név első egy-két karakterét használva.</w:t>
-      </w:r>
-    </w:p>
-    <w:p>
-      <w:pPr>
-        <w:spacing w:line="360" w:lineRule="auto"/>
-        <w:jc w:val="both"/>
-        <w:rPr>
-          <w:rFonts w:ascii="Arial" w:hAnsi="Arial" w:cs="Arial"/>
-        </w:rPr>
-      </w:pPr>
-      <w:r>
-        <w:rPr>
-          <w:rFonts w:ascii="Arial" w:hAnsi="Arial" w:cs="Arial"/>
-        </w:rPr>
-        <w:t xml:space="preserve">5.8.3. </w:t>
-      </w:r>
-      <w:r>
-        <w:rPr>
-          <w:rFonts w:ascii="Arial" w:hAnsi="Arial" w:cs="Arial"/>
-        </w:rPr>
-        <w:t>Fiókműveletek</w:t>
-      </w:r>
-    </w:p>
-    <w:p>
-      <w:pPr>
-        <w:spacing w:line="360" w:lineRule="auto"/>
-        <w:jc w:val="both"/>
-        <w:rPr>
-          <w:rFonts w:ascii="Arial" w:hAnsi="Arial" w:cs="Arial"/>
-        </w:rPr>
-      </w:pPr>
-      <w:r>
-        <w:rPr>
-          <w:rFonts w:ascii="Arial" w:hAnsi="Arial" w:cs="Arial"/>
-        </w:rPr>
-        <w:t xml:space="preserve">A sikeres adatbetöltést követően a "Fiók" szekció dinamikusan felépül, és két lehetőséget kínál a felhasználó számára: a profil szerkesztésére mutató hivatkozást, valamint egy kijelentkezés gombot. A kijelentkezés gomb megnyomására a rendszer egy megerősítő párbeszédablakot jelenít meg; jóváhagyás esetén a kliens eltávolítja </w:t>
-      </w:r>
-      <w:r>
-        <w:rPr>
-          <w:rFonts w:ascii="Arial" w:hAnsi="Arial" w:cs="Arial"/>
-        </w:rPr>
-        <w:lastRenderedPageBreak/>
-        <w:t xml:space="preserve">a </w:t>
+        <w:t xml:space="preserve">valamint egy kijelentkezés gombot. A kijelentkezés gomb megnyomására a rendszer egy megerősítő párbeszédablakot jelenít meg; jóváhagyás esetén a kliens eltávolítja a </w:t>
       </w:r>
       <w:r>
         <w:rPr>
@@ -12115,7 +12253,14 @@
         <w:rPr>
           <w:rFonts w:ascii="Arial" w:hAnsi="Arial" w:cs="Arial"/>
         </w:rPr>
-        <w:t xml:space="preserve">Az alkalmazás rendelkezik egy elkülönített, jelszóval védett admin felülettel, amelynek elsődleges célja az adatbázis tartalmának környezetek közötti migrálása (például a lokális fejlesztői környezetből a Coolify rendszeren hosztolt, éles környezetbe), mivel az éles adatbázis közvetlen elérése szándékosan nincs biztosítva. A felület egy </w:t>
+        <w:t xml:space="preserve">Az alkalmazás rendelkezik egy elkülönített, jelszóval védett admin felülettel, amelynek elsődleges célja az adatbázis tartalmának környezetek közötti migrálása (például a </w:t>
+      </w:r>
+      <w:r>
+        <w:rPr>
+          <w:rFonts w:ascii="Arial" w:hAnsi="Arial" w:cs="Arial"/>
+        </w:rPr>
+        <w:lastRenderedPageBreak/>
+        <w:t xml:space="preserve">lokális fejlesztői környezetből a Coolify rendszeren hosztolt, éles környezetbe), mivel az éles adatbázis közvetlen elérése szándékosan nincs biztosítva. A felület egy </w:t>
       </w:r>
       <w:r>
         <w:rPr>
@@ -12129,400 +12274,406 @@
         <w:rPr>
           <w:rFonts w:ascii="Arial" w:hAnsi="Arial" w:cs="Arial"/>
         </w:rPr>
+        <w:t>formátumú export/import mechanizmuson keresztül teszi lehetővé a teljes adatbázis-tartalom, valamint a feltöltött fényképfájlok átvitelét.</w:t>
+      </w:r>
+    </w:p>
+    <w:p>
+      <w:pPr>
+        <w:spacing w:line="360" w:lineRule="auto"/>
+        <w:jc w:val="both"/>
+        <w:rPr>
+          <w:rFonts w:ascii="Arial" w:hAnsi="Arial" w:cs="Arial"/>
+        </w:rPr>
+      </w:pPr>
+      <w:r>
+        <w:rPr>
+          <w:rFonts w:ascii="Arial" w:hAnsi="Arial" w:cs="Arial"/>
+        </w:rPr>
+        <w:t>5.9.1. Hozzáférés és hitelesítés</w:t>
+      </w:r>
+    </w:p>
+    <w:p>
+      <w:pPr>
+        <w:spacing w:line="360" w:lineRule="auto"/>
+        <w:jc w:val="both"/>
+        <w:rPr>
+          <w:rFonts w:ascii="Arial" w:hAnsi="Arial" w:cs="Arial"/>
+        </w:rPr>
+      </w:pPr>
+      <w:r>
+        <w:rPr>
+          <w:rFonts w:ascii="Arial" w:hAnsi="Arial" w:cs="Arial"/>
+        </w:rPr>
+        <w:t>Az admin oldal (</w:t>
+      </w:r>
+      <w:r>
+        <w:rPr>
+          <w:rFonts w:ascii="Arial" w:hAnsi="Arial" w:cs="Arial"/>
+          <w:i/>
+          <w:iCs/>
+        </w:rPr>
+        <w:t>admin.html</w:t>
+      </w:r>
+      <w:r>
+        <w:rPr>
+          <w:rFonts w:ascii="Arial" w:hAnsi="Arial" w:cs="Arial"/>
+        </w:rPr>
+        <w:t xml:space="preserve">) betöltésekor a rendszer alapértelmezetten a jelszómezőt tartalmazó belépő nézetet jeleníti meg, a tényleges admin panelt pedig elrejti. A hitelesítés nem a felhasználói fiókokhoz kötött JWT-alapú mechanizmuson keresztül történik, hanem egy külön, szerver oldalon konfigurált </w:t>
+      </w:r>
+      <w:r>
+        <w:rPr>
+          <w:rFonts w:ascii="Arial" w:hAnsi="Arial" w:cs="Arial"/>
+        </w:rPr>
+        <w:t xml:space="preserve">titkos </w:t>
+      </w:r>
+      <w:r>
+        <w:rPr>
+          <w:rFonts w:ascii="Arial" w:hAnsi="Arial" w:cs="Arial"/>
+        </w:rPr>
+        <w:t>admin kulcs (</w:t>
+      </w:r>
+      <w:r>
+        <w:rPr>
+          <w:rFonts w:ascii="Arial" w:hAnsi="Arial" w:cs="Arial"/>
+          <w:i/>
+          <w:iCs/>
+        </w:rPr>
+        <w:t>ADMIN_SECRET</w:t>
+      </w:r>
+      <w:r>
+        <w:rPr>
+          <w:rFonts w:ascii="Arial" w:hAnsi="Arial" w:cs="Arial"/>
+        </w:rPr>
+        <w:t>)</w:t>
+      </w:r>
+      <w:r>
+        <w:rPr>
+          <w:rFonts w:ascii="Arial" w:hAnsi="Arial" w:cs="Arial"/>
+        </w:rPr>
+        <w:t xml:space="preserve"> környezeti változó segítségével.</w:t>
+      </w:r>
+    </w:p>
+    <w:p>
+      <w:pPr>
+        <w:spacing w:line="360" w:lineRule="auto"/>
+        <w:jc w:val="both"/>
+        <w:rPr>
+          <w:rFonts w:ascii="Arial" w:hAnsi="Arial" w:cs="Arial"/>
+        </w:rPr>
+      </w:pPr>
+      <w:r>
+        <w:rPr>
+          <w:rFonts w:ascii="Arial" w:hAnsi="Arial" w:cs="Arial"/>
+        </w:rPr>
+        <w:t xml:space="preserve">A kliens oldalon az </w:t>
+      </w:r>
+      <w:r>
+        <w:rPr>
+          <w:rFonts w:ascii="Arial" w:hAnsi="Arial" w:cs="Arial"/>
+          <w:i/>
+          <w:iCs/>
+        </w:rPr>
+        <w:t>admin.js</w:t>
+      </w:r>
+      <w:r>
+        <w:rPr>
+          <w:rFonts w:ascii="Arial" w:hAnsi="Arial" w:cs="Arial"/>
+        </w:rPr>
+        <w:t xml:space="preserve"> fájl felelős a hitelesítési folyamat kezeléséért. A megadott titkos kulcsot a rendszer az </w:t>
+      </w:r>
+      <w:r>
+        <w:rPr>
+          <w:rFonts w:ascii="Arial" w:hAnsi="Arial" w:cs="Arial"/>
+          <w:i/>
+          <w:iCs/>
+        </w:rPr>
+        <w:t>X-Admin-Secret</w:t>
+      </w:r>
+      <w:r>
+        <w:rPr>
+          <w:rFonts w:ascii="Arial" w:hAnsi="Arial" w:cs="Arial"/>
+        </w:rPr>
+        <w:t xml:space="preserve"> HTTP fejlécben csatolva küldi el a </w:t>
+      </w:r>
+      <w:r>
+        <w:rPr>
+          <w:rFonts w:ascii="Arial" w:hAnsi="Arial" w:cs="Arial"/>
+          <w:i/>
+          <w:iCs/>
+        </w:rPr>
+        <w:t>/api/admin/ping</w:t>
+      </w:r>
+      <w:r>
+        <w:rPr>
+          <w:rFonts w:ascii="Arial" w:hAnsi="Arial" w:cs="Arial"/>
+        </w:rPr>
+        <w:t xml:space="preserve"> végpontra ellenőrzés céljából; sikeres válasz esetén a kulcs a böngésző </w:t>
+      </w:r>
+      <w:r>
+        <w:rPr>
+          <w:rFonts w:ascii="Arial" w:hAnsi="Arial" w:cs="Arial"/>
+          <w:i/>
+          <w:iCs/>
+        </w:rPr>
+        <w:t>sessionStorage</w:t>
+      </w:r>
+      <w:r>
+        <w:rPr>
+          <w:rFonts w:ascii="Arial" w:hAnsi="Arial" w:cs="Arial"/>
+        </w:rPr>
+        <w:t xml:space="preserve"> tárolójában kerül elmentésre, ezáltal az oldal újratöltésekor</w:t>
+      </w:r>
+      <w:r>
+        <w:rPr>
+          <w:rFonts w:ascii="Arial" w:hAnsi="Arial" w:cs="Arial"/>
+        </w:rPr>
+        <w:t xml:space="preserve">, </w:t>
+      </w:r>
+      <w:r>
+        <w:rPr>
+          <w:rFonts w:ascii="Arial" w:hAnsi="Arial" w:cs="Arial"/>
+        </w:rPr>
+        <w:t>amíg a böngészőlap nyitva marad</w:t>
+      </w:r>
+      <w:r>
+        <w:rPr>
+          <w:rFonts w:ascii="Arial" w:hAnsi="Arial" w:cs="Arial"/>
+        </w:rPr>
+        <w:t>,</w:t>
+      </w:r>
+      <w:r>
+        <w:rPr>
+          <w:rFonts w:ascii="Arial" w:hAnsi="Arial" w:cs="Arial"/>
+        </w:rPr>
+        <w:t xml:space="preserve"> nincs szükség ismételt bejelentkezésre. A szerver oldalon (</w:t>
+      </w:r>
+      <w:r>
+        <w:rPr>
+          <w:rFonts w:ascii="Arial" w:hAnsi="Arial" w:cs="Arial"/>
+          <w:i/>
+          <w:iCs/>
+        </w:rPr>
+        <w:t>admin.py</w:t>
+      </w:r>
+      <w:r>
+        <w:rPr>
+          <w:rFonts w:ascii="Arial" w:hAnsi="Arial" w:cs="Arial"/>
+        </w:rPr>
+        <w:t xml:space="preserve">) a </w:t>
+      </w:r>
+      <w:r>
+        <w:rPr>
+          <w:rFonts w:ascii="Arial" w:hAnsi="Arial" w:cs="Arial"/>
+          <w:i/>
+          <w:iCs/>
+        </w:rPr>
+        <w:t>require_admin</w:t>
+      </w:r>
+      <w:r>
+        <w:rPr>
+          <w:rFonts w:ascii="Arial" w:hAnsi="Arial" w:cs="Arial"/>
+        </w:rPr>
+        <w:t xml:space="preserve"> függőség minden admin végpont esetén ellenőrzi a beérkező titkos kulcs helyességét egy időzítéstámadás elleni védelmet biztosító összehasonlítási függvény (</w:t>
+      </w:r>
+      <w:r>
+        <w:rPr>
+          <w:rFonts w:ascii="Arial" w:hAnsi="Arial" w:cs="Arial"/>
+          <w:i/>
+          <w:iCs/>
+        </w:rPr>
+        <w:t>secrets.compare_digest</w:t>
+      </w:r>
+      <w:r>
+        <w:rPr>
+          <w:rFonts w:ascii="Arial" w:hAnsi="Arial" w:cs="Arial"/>
+        </w:rPr>
+        <w:t>) segítségével; amennyiben a szerveren nincs beállítva admin titkos kulcs, a rendszer 503-as státuszkóddal jelzi, hogy az admin funkció nem elérhető, helytelen kulcs esetén pedig 401-es hibaüzenettel utasítja el a kérést.</w:t>
+      </w:r>
+    </w:p>
+    <w:p>
+      <w:pPr>
+        <w:spacing w:line="360" w:lineRule="auto"/>
+        <w:jc w:val="both"/>
+        <w:rPr>
+          <w:rFonts w:ascii="Arial" w:hAnsi="Arial" w:cs="Arial"/>
+        </w:rPr>
+      </w:pPr>
+      <w:r>
+        <w:rPr>
+          <w:rFonts w:ascii="Arial" w:hAnsi="Arial" w:cs="Arial"/>
+        </w:rPr>
+        <w:t>5.9.2. Adatexportálás</w:t>
+      </w:r>
+    </w:p>
+    <w:p>
+      <w:pPr>
+        <w:spacing w:line="360" w:lineRule="auto"/>
+        <w:jc w:val="both"/>
+        <w:rPr>
+          <w:rFonts w:ascii="Arial" w:hAnsi="Arial" w:cs="Arial"/>
+        </w:rPr>
+      </w:pPr>
+      <w:r>
+        <w:rPr>
+          <w:rFonts w:ascii="Arial" w:hAnsi="Arial" w:cs="Arial"/>
+        </w:rPr>
+        <w:t xml:space="preserve">A sikeres hitelesítést követően megjelenő admin panelen az „Export” gomb megnyomására a kliens egy </w:t>
+      </w:r>
+      <w:r>
+        <w:rPr>
+          <w:rFonts w:ascii="Arial" w:hAnsi="Arial" w:cs="Arial"/>
+          <w:i/>
+          <w:iCs/>
+        </w:rPr>
+        <w:t>GET</w:t>
+      </w:r>
+      <w:r>
+        <w:rPr>
+          <w:rFonts w:ascii="Arial" w:hAnsi="Arial" w:cs="Arial"/>
+        </w:rPr>
+        <w:t xml:space="preserve"> kérést küld a </w:t>
+      </w:r>
+      <w:r>
+        <w:rPr>
+          <w:rFonts w:ascii="Arial" w:hAnsi="Arial" w:cs="Arial"/>
+          <w:i/>
+          <w:iCs/>
+        </w:rPr>
+        <w:t>/api/admin/export</w:t>
+      </w:r>
+      <w:r>
+        <w:rPr>
+          <w:rFonts w:ascii="Arial" w:hAnsi="Arial" w:cs="Arial"/>
+        </w:rPr>
+        <w:t xml:space="preserve"> végpontra. A szerver oldalon ez a végpont</w:t>
+      </w:r>
+      <w:r>
+        <w:rPr>
+          <w:rFonts w:ascii="Arial" w:hAnsi="Arial" w:cs="Arial"/>
+        </w:rPr>
+        <w:t xml:space="preserve">, </w:t>
+      </w:r>
+      <w:r>
+        <w:rPr>
+          <w:rFonts w:ascii="Arial" w:hAnsi="Arial" w:cs="Arial"/>
+        </w:rPr>
+        <w:t xml:space="preserve">az </w:t>
+      </w:r>
+      <w:r>
+        <w:rPr>
+          <w:rFonts w:ascii="Arial" w:hAnsi="Arial" w:cs="Arial"/>
+          <w:i/>
+          <w:iCs/>
+        </w:rPr>
+        <w:t>admin.py</w:t>
+      </w:r>
+      <w:r>
+        <w:rPr>
+          <w:rFonts w:ascii="Arial" w:hAnsi="Arial" w:cs="Arial"/>
+        </w:rPr>
+        <w:t xml:space="preserve"> fájlban definiált </w:t>
+      </w:r>
+      <w:r>
+        <w:rPr>
+          <w:rFonts w:ascii="Arial" w:hAnsi="Arial" w:cs="Arial"/>
+          <w:i/>
+          <w:iCs/>
+        </w:rPr>
+        <w:t>_EXPORT_MODELS</w:t>
+      </w:r>
+      <w:r>
+        <w:rPr>
+          <w:rFonts w:ascii="Arial" w:hAnsi="Arial" w:cs="Arial"/>
+        </w:rPr>
+        <w:t xml:space="preserve"> listában rögzített sorrendben</w:t>
+      </w:r>
+      <w:r>
+        <w:rPr>
+          <w:rFonts w:ascii="Arial" w:hAnsi="Arial" w:cs="Arial"/>
+        </w:rPr>
+        <w:t xml:space="preserve"> </w:t>
+      </w:r>
+      <w:r>
+        <w:rPr>
+          <w:rFonts w:ascii="Arial" w:hAnsi="Arial" w:cs="Arial"/>
+        </w:rPr>
+        <w:t>végigiterál az alkalmazás mind a tíz adatbázis-tábláján</w:t>
+      </w:r>
+      <w:r>
+        <w:rPr>
+          <w:rFonts w:ascii="Arial" w:hAnsi="Arial" w:cs="Arial"/>
+        </w:rPr>
+        <w:t xml:space="preserve">, </w:t>
+      </w:r>
+      <w:r>
+        <w:rPr>
+          <w:rFonts w:ascii="Arial" w:hAnsi="Arial" w:cs="Arial"/>
+        </w:rPr>
+        <w:t xml:space="preserve">és minden sorát szótár formátumúra alakítja, a dátum- és decimális típusú mezőket </w:t>
+      </w:r>
+      <w:r>
+        <w:rPr>
+          <w:rFonts w:ascii="Arial" w:hAnsi="Arial" w:cs="Arial"/>
+          <w:i/>
+          <w:iCs/>
+        </w:rPr>
+        <w:t>JSON</w:t>
+      </w:r>
+      <w:r>
+        <w:rPr>
+          <w:rFonts w:ascii="Arial" w:hAnsi="Arial" w:cs="Arial"/>
+        </w:rPr>
+        <w:t>-kompatibilis formára konvertálva.</w:t>
+      </w:r>
+    </w:p>
+    <w:p>
+      <w:pPr>
+        <w:spacing w:line="360" w:lineRule="auto"/>
+        <w:jc w:val="both"/>
+        <w:rPr>
+          <w:rFonts w:ascii="Arial" w:hAnsi="Arial" w:cs="Arial"/>
+        </w:rPr>
+      </w:pPr>
+      <w:r>
+        <w:rPr>
+          <w:rFonts w:ascii="Arial" w:hAnsi="Arial" w:cs="Arial"/>
+        </w:rPr>
+        <w:t xml:space="preserve">Az adattáblák tartalma mellett a rendszer a helyszínekhez feltöltött fényképfájlokat is beemeli az exportba: a képekhez tartozó fájlokat a szerver a lemezről beolvassa, és </w:t>
+      </w:r>
+      <w:r>
+        <w:rPr>
+          <w:rFonts w:ascii="Arial" w:hAnsi="Arial" w:cs="Arial"/>
+          <w:i/>
+          <w:iCs/>
+        </w:rPr>
+        <w:t>Base64</w:t>
+      </w:r>
+      <w:r>
+        <w:rPr>
+          <w:rFonts w:ascii="Arial" w:hAnsi="Arial" w:cs="Arial"/>
+        </w:rPr>
+        <w:t xml:space="preserve"> kódolással szövegessé alakítva csatolja a </w:t>
+      </w:r>
+      <w:r>
+        <w:rPr>
+          <w:rFonts w:ascii="Arial" w:hAnsi="Arial" w:cs="Arial"/>
+          <w:i/>
+          <w:iCs/>
+        </w:rPr>
+        <w:t>JSON</w:t>
+      </w:r>
+      <w:r>
+        <w:rPr>
+          <w:rFonts w:ascii="Arial" w:hAnsi="Arial" w:cs="Arial"/>
+        </w:rPr>
+        <w:t xml:space="preserve"> válaszhoz. Ennek </w:t>
+      </w:r>
+      <w:r>
+        <w:rPr>
+          <w:rFonts w:ascii="Arial" w:hAnsi="Arial" w:cs="Arial"/>
+        </w:rPr>
         <w:lastRenderedPageBreak/>
-        <w:t>formátumú export/import mechanizmuson keresztül teszi lehetővé a teljes adatbázis-tartalom, valamint a feltöltött fényképfájlok átvitelét.</w:t>
-      </w:r>
-    </w:p>
-    <w:p>
-      <w:pPr>
-        <w:spacing w:line="360" w:lineRule="auto"/>
-        <w:jc w:val="both"/>
-        <w:rPr>
-          <w:rFonts w:ascii="Arial" w:hAnsi="Arial" w:cs="Arial"/>
-        </w:rPr>
-      </w:pPr>
-      <w:r>
-        <w:rPr>
-          <w:rFonts w:ascii="Arial" w:hAnsi="Arial" w:cs="Arial"/>
-        </w:rPr>
-        <w:t>5.9.1. Hozzáférés és hitelesítés</w:t>
-      </w:r>
-    </w:p>
-    <w:p>
-      <w:pPr>
-        <w:spacing w:line="360" w:lineRule="auto"/>
-        <w:jc w:val="both"/>
-        <w:rPr>
-          <w:rFonts w:ascii="Arial" w:hAnsi="Arial" w:cs="Arial"/>
-        </w:rPr>
-      </w:pPr>
-      <w:r>
-        <w:rPr>
-          <w:rFonts w:ascii="Arial" w:hAnsi="Arial" w:cs="Arial"/>
-        </w:rPr>
-        <w:t>Az admin oldal (</w:t>
-      </w:r>
-      <w:r>
-        <w:rPr>
-          <w:rFonts w:ascii="Arial" w:hAnsi="Arial" w:cs="Arial"/>
-          <w:i/>
-          <w:iCs/>
-        </w:rPr>
-        <w:t>admin.html</w:t>
-      </w:r>
-      <w:r>
-        <w:rPr>
-          <w:rFonts w:ascii="Arial" w:hAnsi="Arial" w:cs="Arial"/>
-        </w:rPr>
-        <w:t xml:space="preserve">) betöltésekor a rendszer alapértelmezetten a jelszómezőt tartalmazó belépő nézetet jeleníti meg, a tényleges admin panelt pedig elrejti. A hitelesítés nem a felhasználói fiókokhoz kötött JWT-alapú mechanizmuson keresztül történik, hanem egy külön, szerver oldalon konfigurált </w:t>
-      </w:r>
-      <w:r>
-        <w:rPr>
-          <w:rFonts w:ascii="Arial" w:hAnsi="Arial" w:cs="Arial"/>
-        </w:rPr>
-        <w:t xml:space="preserve">titkos </w:t>
-      </w:r>
-      <w:r>
-        <w:rPr>
-          <w:rFonts w:ascii="Arial" w:hAnsi="Arial" w:cs="Arial"/>
-        </w:rPr>
-        <w:t>admin kulcs (</w:t>
-      </w:r>
-      <w:r>
-        <w:rPr>
-          <w:rFonts w:ascii="Arial" w:hAnsi="Arial" w:cs="Arial"/>
-          <w:i/>
-          <w:iCs/>
-        </w:rPr>
-        <w:t>ADMIN_SECRET</w:t>
-      </w:r>
-      <w:r>
-        <w:rPr>
-          <w:rFonts w:ascii="Arial" w:hAnsi="Arial" w:cs="Arial"/>
-        </w:rPr>
-        <w:t>)</w:t>
-      </w:r>
-      <w:r>
-        <w:rPr>
-          <w:rFonts w:ascii="Arial" w:hAnsi="Arial" w:cs="Arial"/>
-        </w:rPr>
-        <w:t xml:space="preserve"> környezeti változó segítségével.</w:t>
-      </w:r>
-    </w:p>
-    <w:p>
-      <w:pPr>
-        <w:spacing w:line="360" w:lineRule="auto"/>
-        <w:jc w:val="both"/>
-        <w:rPr>
-          <w:rFonts w:ascii="Arial" w:hAnsi="Arial" w:cs="Arial"/>
-        </w:rPr>
-      </w:pPr>
-      <w:r>
-        <w:rPr>
-          <w:rFonts w:ascii="Arial" w:hAnsi="Arial" w:cs="Arial"/>
-        </w:rPr>
-        <w:t xml:space="preserve">A kliens oldalon az </w:t>
-      </w:r>
-      <w:r>
-        <w:rPr>
-          <w:rFonts w:ascii="Arial" w:hAnsi="Arial" w:cs="Arial"/>
-          <w:i/>
-          <w:iCs/>
-        </w:rPr>
-        <w:t>admin.js</w:t>
-      </w:r>
-      <w:r>
-        <w:rPr>
-          <w:rFonts w:ascii="Arial" w:hAnsi="Arial" w:cs="Arial"/>
-        </w:rPr>
-        <w:t xml:space="preserve"> fájl felelős a hitelesítési folyamat kezeléséért. A megadott titkos kulcsot a rendszer az </w:t>
-      </w:r>
-      <w:r>
-        <w:rPr>
-          <w:rFonts w:ascii="Arial" w:hAnsi="Arial" w:cs="Arial"/>
-          <w:i/>
-          <w:iCs/>
-        </w:rPr>
-        <w:t>X-Admin-Secret</w:t>
-      </w:r>
-      <w:r>
-        <w:rPr>
-          <w:rFonts w:ascii="Arial" w:hAnsi="Arial" w:cs="Arial"/>
-        </w:rPr>
-        <w:t xml:space="preserve"> HTTP fejlécben csatolva küldi el a </w:t>
-      </w:r>
-      <w:r>
-        <w:rPr>
-          <w:rFonts w:ascii="Arial" w:hAnsi="Arial" w:cs="Arial"/>
-          <w:i/>
-          <w:iCs/>
-        </w:rPr>
-        <w:t>/api/admin/ping</w:t>
-      </w:r>
-      <w:r>
-        <w:rPr>
-          <w:rFonts w:ascii="Arial" w:hAnsi="Arial" w:cs="Arial"/>
-        </w:rPr>
-        <w:t xml:space="preserve"> végpontra ellenőrzés céljából; sikeres válasz esetén a kulcs a böngésző </w:t>
-      </w:r>
-      <w:r>
-        <w:rPr>
-          <w:rFonts w:ascii="Arial" w:hAnsi="Arial" w:cs="Arial"/>
-          <w:i/>
-          <w:iCs/>
-        </w:rPr>
-        <w:t>sessionStorage</w:t>
-      </w:r>
-      <w:r>
-        <w:rPr>
-          <w:rFonts w:ascii="Arial" w:hAnsi="Arial" w:cs="Arial"/>
-        </w:rPr>
-        <w:t xml:space="preserve"> tárolójában kerül elmentésre, ezáltal az oldal újratöltésekor</w:t>
-      </w:r>
-      <w:r>
-        <w:rPr>
-          <w:rFonts w:ascii="Arial" w:hAnsi="Arial" w:cs="Arial"/>
-        </w:rPr>
-        <w:t xml:space="preserve">, </w:t>
-      </w:r>
-      <w:r>
-        <w:rPr>
-          <w:rFonts w:ascii="Arial" w:hAnsi="Arial" w:cs="Arial"/>
-        </w:rPr>
-        <w:t>amíg a böngészőlap nyitva marad</w:t>
-      </w:r>
-      <w:r>
-        <w:rPr>
-          <w:rFonts w:ascii="Arial" w:hAnsi="Arial" w:cs="Arial"/>
-        </w:rPr>
-        <w:t>,</w:t>
-      </w:r>
-      <w:r>
-        <w:rPr>
-          <w:rFonts w:ascii="Arial" w:hAnsi="Arial" w:cs="Arial"/>
-        </w:rPr>
-        <w:t xml:space="preserve"> nincs szükség ismételt bejelentkezésre. A szerver oldalon (</w:t>
-      </w:r>
-      <w:r>
-        <w:rPr>
-          <w:rFonts w:ascii="Arial" w:hAnsi="Arial" w:cs="Arial"/>
-          <w:i/>
-          <w:iCs/>
-        </w:rPr>
-        <w:t>admin.py</w:t>
-      </w:r>
-      <w:r>
-        <w:rPr>
-          <w:rFonts w:ascii="Arial" w:hAnsi="Arial" w:cs="Arial"/>
-        </w:rPr>
-        <w:t xml:space="preserve">) a </w:t>
-      </w:r>
-      <w:r>
-        <w:rPr>
-          <w:rFonts w:ascii="Arial" w:hAnsi="Arial" w:cs="Arial"/>
-          <w:i/>
-          <w:iCs/>
-        </w:rPr>
-        <w:t>require_admin</w:t>
-      </w:r>
-      <w:r>
-        <w:rPr>
-          <w:rFonts w:ascii="Arial" w:hAnsi="Arial" w:cs="Arial"/>
-        </w:rPr>
-        <w:t xml:space="preserve"> függőség minden admin végpont esetén ellenőrzi a beérkező titkos kulcs helyességét egy időzítéstámadás elleni védelmet biztosító összehasonlítási függvény (</w:t>
-      </w:r>
-      <w:r>
-        <w:rPr>
-          <w:rFonts w:ascii="Arial" w:hAnsi="Arial" w:cs="Arial"/>
-          <w:i/>
-          <w:iCs/>
-        </w:rPr>
-        <w:t>secrets.compare_digest</w:t>
-      </w:r>
-      <w:r>
-        <w:rPr>
-          <w:rFonts w:ascii="Arial" w:hAnsi="Arial" w:cs="Arial"/>
-        </w:rPr>
-        <w:t>) segítségével; amennyiben a szerveren nincs beállítva admin titkos kulcs, a rendszer 503-as státuszkóddal jelzi, hogy az admin funkció nem elérhető, helytelen kulcs esetén pedig 401-es hibaüzenettel utasítja el a kérést.</w:t>
-      </w:r>
-    </w:p>
-    <w:p>
-      <w:pPr>
-        <w:spacing w:line="360" w:lineRule="auto"/>
-        <w:jc w:val="both"/>
-        <w:rPr>
-          <w:rFonts w:ascii="Arial" w:hAnsi="Arial" w:cs="Arial"/>
-        </w:rPr>
-      </w:pPr>
-      <w:r>
-        <w:rPr>
-          <w:rFonts w:ascii="Arial" w:hAnsi="Arial" w:cs="Arial"/>
-        </w:rPr>
-        <w:t>5.9.2. Adatexportálás</w:t>
-      </w:r>
-    </w:p>
-    <w:p>
-      <w:pPr>
-        <w:spacing w:line="360" w:lineRule="auto"/>
-        <w:jc w:val="both"/>
-        <w:rPr>
-          <w:rFonts w:ascii="Arial" w:hAnsi="Arial" w:cs="Arial"/>
-        </w:rPr>
-      </w:pPr>
-      <w:r>
-        <w:rPr>
-          <w:rFonts w:ascii="Arial" w:hAnsi="Arial" w:cs="Arial"/>
-        </w:rPr>
-        <w:t xml:space="preserve">A sikeres hitelesítést követően megjelenő admin panelen az „Export” gomb megnyomására a kliens egy </w:t>
-      </w:r>
-      <w:r>
-        <w:rPr>
-          <w:rFonts w:ascii="Arial" w:hAnsi="Arial" w:cs="Arial"/>
-          <w:i/>
-          <w:iCs/>
-        </w:rPr>
-        <w:t>GET</w:t>
-      </w:r>
-      <w:r>
-        <w:rPr>
-          <w:rFonts w:ascii="Arial" w:hAnsi="Arial" w:cs="Arial"/>
-        </w:rPr>
-        <w:t xml:space="preserve"> kérést küld a </w:t>
-      </w:r>
-      <w:r>
-        <w:rPr>
-          <w:rFonts w:ascii="Arial" w:hAnsi="Arial" w:cs="Arial"/>
-          <w:i/>
-          <w:iCs/>
-        </w:rPr>
-        <w:t>/api/admin/export</w:t>
-      </w:r>
-      <w:r>
-        <w:rPr>
-          <w:rFonts w:ascii="Arial" w:hAnsi="Arial" w:cs="Arial"/>
-        </w:rPr>
-        <w:t xml:space="preserve"> végpontra. A szerver oldalon ez a végpont</w:t>
-      </w:r>
-      <w:r>
-        <w:rPr>
-          <w:rFonts w:ascii="Arial" w:hAnsi="Arial" w:cs="Arial"/>
-        </w:rPr>
-        <w:t xml:space="preserve">, </w:t>
-      </w:r>
-      <w:r>
-        <w:rPr>
-          <w:rFonts w:ascii="Arial" w:hAnsi="Arial" w:cs="Arial"/>
-        </w:rPr>
-        <w:t xml:space="preserve">az </w:t>
-      </w:r>
-      <w:r>
-        <w:rPr>
-          <w:rFonts w:ascii="Arial" w:hAnsi="Arial" w:cs="Arial"/>
-          <w:i/>
-          <w:iCs/>
-        </w:rPr>
-        <w:t>admin.py</w:t>
-      </w:r>
-      <w:r>
-        <w:rPr>
-          <w:rFonts w:ascii="Arial" w:hAnsi="Arial" w:cs="Arial"/>
-        </w:rPr>
-        <w:t xml:space="preserve"> fájlban definiált </w:t>
-      </w:r>
-      <w:r>
-        <w:rPr>
-          <w:rFonts w:ascii="Arial" w:hAnsi="Arial" w:cs="Arial"/>
-          <w:i/>
-          <w:iCs/>
-        </w:rPr>
-        <w:t>_EXPORT_MODELS</w:t>
-      </w:r>
-      <w:r>
-        <w:rPr>
-          <w:rFonts w:ascii="Arial" w:hAnsi="Arial" w:cs="Arial"/>
-        </w:rPr>
-        <w:t xml:space="preserve"> listában rögzített sorrendben</w:t>
-      </w:r>
-      <w:r>
-        <w:rPr>
-          <w:rFonts w:ascii="Arial" w:hAnsi="Arial" w:cs="Arial"/>
-        </w:rPr>
-        <w:t xml:space="preserve"> </w:t>
-      </w:r>
-      <w:r>
-        <w:rPr>
-          <w:rFonts w:ascii="Arial" w:hAnsi="Arial" w:cs="Arial"/>
-        </w:rPr>
-        <w:t>végigiterál az alkalmazás mind a tíz adatbázis-tábláján</w:t>
-      </w:r>
-      <w:r>
-        <w:rPr>
-          <w:rFonts w:ascii="Arial" w:hAnsi="Arial" w:cs="Arial"/>
-        </w:rPr>
-        <w:t xml:space="preserve">, </w:t>
-      </w:r>
-      <w:r>
-        <w:rPr>
-          <w:rFonts w:ascii="Arial" w:hAnsi="Arial" w:cs="Arial"/>
-        </w:rPr>
-        <w:t xml:space="preserve">és minden sorát szótár formátumúra alakítja, a dátum- és decimális típusú mezőket </w:t>
-      </w:r>
-      <w:r>
-        <w:rPr>
-          <w:rFonts w:ascii="Arial" w:hAnsi="Arial" w:cs="Arial"/>
-          <w:i/>
-          <w:iCs/>
-        </w:rPr>
-        <w:t>JSON</w:t>
-      </w:r>
-      <w:r>
-        <w:rPr>
-          <w:rFonts w:ascii="Arial" w:hAnsi="Arial" w:cs="Arial"/>
-        </w:rPr>
-        <w:t>-kompatibilis formára konvertálva.</w:t>
-      </w:r>
-    </w:p>
-    <w:p>
-      <w:pPr>
-        <w:spacing w:line="360" w:lineRule="auto"/>
-        <w:jc w:val="both"/>
-        <w:rPr>
-          <w:rFonts w:ascii="Arial" w:hAnsi="Arial" w:cs="Arial"/>
-        </w:rPr>
-      </w:pPr>
-      <w:r>
-        <w:rPr>
-          <w:rFonts w:ascii="Arial" w:hAnsi="Arial" w:cs="Arial"/>
-        </w:rPr>
-        <w:t xml:space="preserve">Az adattáblák tartalma mellett a rendszer a helyszínekhez feltöltött fényképfájlokat is beemeli az exportba: a képekhez tartozó fájlokat a szerver a lemezről beolvassa, és </w:t>
-      </w:r>
-      <w:r>
-        <w:rPr>
-          <w:rFonts w:ascii="Arial" w:hAnsi="Arial" w:cs="Arial"/>
-          <w:i/>
-          <w:iCs/>
-        </w:rPr>
-        <w:t>Base64</w:t>
-      </w:r>
-      <w:r>
-        <w:rPr>
-          <w:rFonts w:ascii="Arial" w:hAnsi="Arial" w:cs="Arial"/>
-        </w:rPr>
-        <w:t xml:space="preserve"> kódolással szövegessé alakítva csatolja a </w:t>
-      </w:r>
-      <w:r>
-        <w:rPr>
-          <w:rFonts w:ascii="Arial" w:hAnsi="Arial" w:cs="Arial"/>
-          <w:i/>
-          <w:iCs/>
-        </w:rPr>
-        <w:t>JSON</w:t>
-      </w:r>
-      <w:r>
-        <w:rPr>
-          <w:rFonts w:ascii="Arial" w:hAnsi="Arial" w:cs="Arial"/>
-        </w:rPr>
-        <w:t xml:space="preserve"> válaszhoz. Ennek köszönhetően egyetlen fájl (</w:t>
+        <w:t>köszönhetően egyetlen fájl (</w:t>
       </w:r>
       <w:r>
         <w:rPr>
@@ -12536,14 +12687,7 @@
         <w:rPr>
           <w:rFonts w:ascii="Arial" w:hAnsi="Arial" w:cs="Arial"/>
         </w:rPr>
-        <w:t xml:space="preserve">) tartalmazza a teljes </w:t>
-      </w:r>
-      <w:r>
-        <w:rPr>
-          <w:rFonts w:ascii="Arial" w:hAnsi="Arial" w:cs="Arial"/>
-        </w:rPr>
-        <w:lastRenderedPageBreak/>
-        <w:t>adatbázis</w:t>
+        <w:t>) tartalmazza a teljes adatbázis</w:t>
       </w:r>
       <w:r>
         <w:rPr>
@@ -12883,14 +13027,14 @@
         <w:rPr>
           <w:rFonts w:ascii="Arial" w:hAnsi="Arial" w:cs="Arial"/>
         </w:rPr>
-        <w:t xml:space="preserve"> célpontok, valamint a foglalási lehetőségek megjelenítéséhez ismernie kell, hogy mely repülőterek között léteznek közvetlen légi járatok. Mivel ehhez nem áll rendelkezésre egyetlen egységes, ingyenesen elérhető </w:t>
+        <w:t xml:space="preserve"> célpontok, valamint a foglalási lehetőségek megjelenítéséhez ismernie kell, hogy mely repülőterek között léteznek közvetlen légi </w:t>
       </w:r>
       <w:r>
         <w:rPr>
           <w:rFonts w:ascii="Arial" w:hAnsi="Arial" w:cs="Arial"/>
         </w:rPr>
         <w:lastRenderedPageBreak/>
-        <w:t>és megbízható API</w:t>
+        <w:t>járatok. Mivel ehhez nem áll rendelkezésre egyetlen egységes, ingyenesen elérhető és megbízható API</w:t>
       </w:r>
       <w:r>
         <w:rPr>

</xml_diff>

<commit_message>
polishing add new place page
</commit_message>
<xml_diff>
--- a/szakdolgozat.docx
+++ b/szakdolgozat.docx
@@ -1,6 +1,6 @@
 
 <file path=word/document.xml><?xml version="1.0" encoding="utf-8"?>
-<w:document xmlns:wpc="http://schemas.microsoft.com/office/word/2010/wordprocessingCanvas" xmlns:cx="http://schemas.microsoft.com/office/drawing/2014/chartex" xmlns:cx1="http://schemas.microsoft.com/office/drawing/2015/9/8/chartex" xmlns:cx2="http://schemas.microsoft.com/office/drawing/2015/10/21/chartex" xmlns:cx3="http://schemas.microsoft.com/office/drawing/2016/5/9/chartex" xmlns:cx4="http://schemas.microsoft.com/office/drawing/2016/5/10/chartex" xmlns:cx5="http://schemas.microsoft.com/office/drawing/2016/5/11/chartex" xmlns:cx6="http://schemas.microsoft.com/office/drawing/2016/5/12/chartex" xmlns:cx7="http://schemas.microsoft.com/office/drawing/2016/5/13/chartex" xmlns:cx8="http://schemas.microsoft.com/office/drawing/2016/5/14/chartex" xmlns:mc="http://schemas.openxmlformats.org/markup-compatibility/2006" xmlns:aink="http://schemas.microsoft.com/office/drawing/2016/ink" xmlns:am3d="http://schemas.microsoft.com/office/drawing/2017/model3d" xmlns:o="urn:schemas-microsoft-com:office:office" xmlns:oel="http://schemas.microsoft.com/office/2019/extlst" xmlns:r="http://schemas.openxmlformats.org/officeDocument/2006/relationships" xmlns:m="http://schemas.openxmlformats.org/officeDocument/2006/math" xmlns:v="urn:schemas-microsoft-com:vml" xmlns:wp14="http://schemas.microsoft.com/office/word/2010/wordprocessingDrawing" xmlns:wp="http://schemas.openxmlformats.org/drawingml/2006/wordprocessingDrawing" xmlns:w10="urn:schemas-microsoft-com:office:word" xmlns:w="http://schemas.openxmlformats.org/wordprocessingml/2006/main" xmlns:w14="http://schemas.microsoft.com/office/word/2010/wordml" xmlns:w15="http://schemas.microsoft.com/office/word/2012/wordml" xmlns:w16cei="http://schemas.microsoft.com/office/word/2026/wordml/cei" xmlns:w16cex="http://schemas.microsoft.com/office/word/2018/wordml/cex" xmlns:w16cid="http://schemas.microsoft.com/office/word/2016/wordml/cid" xmlns:w16="http://schemas.microsoft.com/office/word/2018/wordml" xmlns:w16du="http://schemas.microsoft.com/office/word/2023/wordml/word16du" xmlns:w16sdtdh="http://schemas.microsoft.com/office/word/2020/wordml/sdtdatahash" xmlns:w16sdtfl="http://schemas.microsoft.com/office/word/2024/wordml/sdtformatlock" xmlns:w16se="http://schemas.microsoft.com/office/word/2015/wordml/symex" xmlns:wpg="http://schemas.microsoft.com/office/word/2010/wordprocessingGroup" xmlns:wpi="http://schemas.microsoft.com/office/word/2010/wordprocessingInk" xmlns:wne="http://schemas.microsoft.com/office/word/2006/wordml" xmlns:wps="http://schemas.microsoft.com/office/word/2010/wordprocessingShape" mc:Ignorable="w14 w15 w16se w16cid w16 w16cex w16sdtdh w16sdtfl w16du wp14">
+<w:document xmlns:wpc="http://schemas.microsoft.com/office/word/2010/wordprocessingCanvas" xmlns:cx="http://schemas.microsoft.com/office/drawing/2014/chartex" xmlns:cx1="http://schemas.microsoft.com/office/drawing/2015/9/8/chartex" xmlns:cx2="http://schemas.microsoft.com/office/drawing/2015/10/21/chartex" xmlns:cx3="http://schemas.microsoft.com/office/drawing/2016/5/9/chartex" xmlns:cx4="http://schemas.microsoft.com/office/drawing/2016/5/10/chartex" xmlns:cx5="http://schemas.microsoft.com/office/drawing/2016/5/11/chartex" xmlns:cx6="http://schemas.microsoft.com/office/drawing/2016/5/12/chartex" xmlns:cx7="http://schemas.microsoft.com/office/drawing/2016/5/13/chartex" xmlns:cx8="http://schemas.microsoft.com/office/drawing/2016/5/14/chartex" xmlns:mc="http://schemas.openxmlformats.org/markup-compatibility/2006" xmlns:aink="http://schemas.microsoft.com/office/drawing/2016/ink" xmlns:am3d="http://schemas.microsoft.com/office/drawing/2017/model3d" xmlns:o="urn:schemas-microsoft-com:office:office" xmlns:oel="http://schemas.microsoft.com/office/2019/extlst" xmlns:r="http://schemas.openxmlformats.org/officeDocument/2006/relationships" xmlns:m="http://schemas.openxmlformats.org/officeDocument/2006/math" xmlns:v="urn:schemas-microsoft-com:vml" xmlns:wp14="http://schemas.microsoft.com/office/word/2010/wordprocessingDrawing" xmlns:wp="http://schemas.openxmlformats.org/drawingml/2006/wordprocessingDrawing" xmlns:w10="urn:schemas-microsoft-com:office:word" xmlns:w="http://schemas.openxmlformats.org/wordprocessingml/2006/main" xmlns:w14="http://schemas.microsoft.com/office/word/2010/wordml" xmlns:w15="http://schemas.microsoft.com/office/word/2012/wordml" xmlns:w16cex="http://schemas.microsoft.com/office/word/2018/wordml/cex" xmlns:w16cid="http://schemas.microsoft.com/office/word/2016/wordml/cid" xmlns:w16="http://schemas.microsoft.com/office/word/2018/wordml" xmlns:w16du="http://schemas.microsoft.com/office/word/2023/wordml/word16du" xmlns:w16sdtdh="http://schemas.microsoft.com/office/word/2020/wordml/sdtdatahash" xmlns:w16sdtfl="http://schemas.microsoft.com/office/word/2024/wordml/sdtformatlock" xmlns:w16se="http://schemas.microsoft.com/office/word/2015/wordml/symex" xmlns:wpg="http://schemas.microsoft.com/office/word/2010/wordprocessingGroup" xmlns:wpi="http://schemas.microsoft.com/office/word/2010/wordprocessingInk" xmlns:wne="http://schemas.microsoft.com/office/word/2006/wordml" xmlns:wps="http://schemas.microsoft.com/office/word/2010/wordprocessingShape" mc:Ignorable="w14 w15 w16se w16cid w16 w16cex w16sdtdh w16sdtfl w16du wp14">
   <w:body>
     <w:p>
       <w:pPr>
@@ -7027,7 +7027,7 @@
         </w:rPr>
         <w:lastRenderedPageBreak/>
         <w:drawing>
-          <wp:inline distT="0" distB="0" distL="0" distR="0" wp14:anchorId="28BD969F" wp14:editId="34C3CC6A">
+          <wp:inline distT="0" distB="0" distL="0" distR="0" wp14:anchorId="28BD969F" wp14:editId="4232E88B">
             <wp:extent cx="5760720" cy="3240405"/>
             <wp:effectExtent l="0" t="0" r="0" b="0"/>
             <wp:docPr id="1304297483" name="Picture 8"/>
@@ -7180,7 +7180,7 @@
           <w:noProof/>
         </w:rPr>
         <w:drawing>
-          <wp:inline distT="0" distB="0" distL="0" distR="0" wp14:anchorId="1B0EC6B4" wp14:editId="5DA8EE1E">
+          <wp:inline distT="0" distB="0" distL="0" distR="0" wp14:anchorId="1B0EC6B4" wp14:editId="41750AFA">
             <wp:extent cx="5760720" cy="3240405"/>
             <wp:effectExtent l="0" t="0" r="0" b="0"/>
             <wp:docPr id="1302079082" name="Picture 9"/>
@@ -7275,7 +7275,7 @@
         </w:rPr>
         <w:lastRenderedPageBreak/>
         <w:drawing>
-          <wp:inline distT="0" distB="0" distL="0" distR="0" wp14:anchorId="43FD0357" wp14:editId="0B0F1BC4">
+          <wp:inline distT="0" distB="0" distL="0" distR="0" wp14:anchorId="43FD0357" wp14:editId="2AA2C53A">
             <wp:extent cx="5760720" cy="3240405"/>
             <wp:effectExtent l="0" t="0" r="0" b="0"/>
             <wp:docPr id="179788065" name="Picture 10"/>
@@ -7383,7 +7383,7 @@
           <w:noProof/>
         </w:rPr>
         <w:drawing>
-          <wp:inline distT="0" distB="0" distL="0" distR="0" wp14:anchorId="0E4634B2" wp14:editId="5F8BA393">
+          <wp:inline distT="0" distB="0" distL="0" distR="0" wp14:anchorId="0E4634B2" wp14:editId="3F869F87">
             <wp:extent cx="5760720" cy="3240405"/>
             <wp:effectExtent l="0" t="0" r="0" b="0"/>
             <wp:docPr id="1198935811" name="Picture 11"/>
@@ -7491,7 +7491,7 @@
         </w:rPr>
         <w:lastRenderedPageBreak/>
         <w:drawing>
-          <wp:inline distT="0" distB="0" distL="0" distR="0" wp14:anchorId="415F39BF" wp14:editId="31492E8D">
+          <wp:inline distT="0" distB="0" distL="0" distR="0" wp14:anchorId="415F39BF" wp14:editId="1CF35EC0">
             <wp:extent cx="5760720" cy="3237230"/>
             <wp:effectExtent l="0" t="0" r="0" b="1270"/>
             <wp:docPr id="476222351" name="Picture 12"/>
@@ -11067,22 +11067,91 @@
         <w:rPr>
           <w:rFonts w:ascii="Arial" w:hAnsi="Arial" w:cs="Arial"/>
         </w:rPr>
-        <w:t>Ez a fejezet azt a funkciót mutatja be, amellyel a felhasználó új helyszínt rögzíthet az utazási naplójában, fényképekkel és részletes leírással kiegészítve.</w:t>
-      </w:r>
-    </w:p>
-    <w:p>
-      <w:pPr>
-        <w:spacing w:line="360" w:lineRule="auto"/>
-        <w:jc w:val="both"/>
-        <w:rPr>
-          <w:rFonts w:ascii="Arial" w:hAnsi="Arial" w:cs="Arial"/>
-        </w:rPr>
-      </w:pPr>
-      <w:r>
-        <w:rPr>
-          <w:rFonts w:ascii="Arial" w:hAnsi="Arial" w:cs="Arial"/>
-        </w:rPr>
-        <w:t xml:space="preserve">Az alkalmazás egy dedikált, </w:t>
+        <w:t>Az alkalmazás egy űrlapon keresztül teszi lehetővé új helyek rögzítését. A felhasználó megadhatja a helyszín nevét, országát, a látogatás kezdő- és záródátumát, opcionálisan egy 1–5 csillagos értékelést, egy szabad szöveges leírást, valamint tetszőleges számú fényképet</w:t>
+      </w:r>
+      <w:r>
+        <w:rPr>
+          <w:rFonts w:ascii="Arial" w:hAnsi="Arial" w:cs="Arial"/>
+        </w:rPr>
+        <w:t xml:space="preserve"> is</w:t>
+      </w:r>
+      <w:r>
+        <w:rPr>
+          <w:rFonts w:ascii="Arial" w:hAnsi="Arial" w:cs="Arial"/>
+        </w:rPr>
+        <w:t xml:space="preserve"> csatolhat. Az országmező automatikus kiegészítéssel működik</w:t>
+      </w:r>
+      <w:r>
+        <w:rPr>
+          <w:rFonts w:ascii="Arial" w:hAnsi="Arial" w:cs="Arial"/>
+        </w:rPr>
+        <w:t xml:space="preserve"> (</w:t>
+      </w:r>
+      <w:r>
+        <w:rPr>
+          <w:rFonts w:ascii="Arial" w:hAnsi="Arial" w:cs="Arial"/>
+        </w:rPr>
+        <w:t>Countries.mountAutocomplete()</w:t>
+      </w:r>
+      <w:r>
+        <w:rPr>
+          <w:rFonts w:ascii="Arial" w:hAnsi="Arial" w:cs="Arial"/>
+        </w:rPr>
+        <w:t>)</w:t>
+      </w:r>
+      <w:r>
+        <w:rPr>
+          <w:rFonts w:ascii="Arial" w:hAnsi="Arial" w:cs="Arial"/>
+        </w:rPr>
+        <w:t xml:space="preserve">: a felhasználó lokalizált országnevet lát, a szerver azonban a nemzetközi szabvány szerinti, kétbetűs országkódot (pl. HU) kapja, amelyet a </w:t>
+      </w:r>
+      <w:r>
+        <w:rPr>
+          <w:rFonts w:ascii="Arial" w:hAnsi="Arial" w:cs="Arial"/>
+          <w:i/>
+          <w:iCs/>
+        </w:rPr>
+        <w:t>Countries.getCode()</w:t>
+      </w:r>
+      <w:r>
+        <w:rPr>
+          <w:rFonts w:ascii="Arial" w:hAnsi="Arial" w:cs="Arial"/>
+        </w:rPr>
+        <w:t xml:space="preserve"> a küldés előtt olvas ki a beviteli mezőből.</w:t>
+      </w:r>
+    </w:p>
+    <w:p>
+      <w:pPr>
+        <w:spacing w:line="360" w:lineRule="auto"/>
+        <w:jc w:val="both"/>
+        <w:rPr>
+          <w:rFonts w:ascii="Arial" w:hAnsi="Arial" w:cs="Arial"/>
+        </w:rPr>
+      </w:pPr>
+      <w:r>
+        <w:rPr>
+          <w:rFonts w:ascii="Arial" w:hAnsi="Arial" w:cs="Arial"/>
+        </w:rPr>
+        <w:lastRenderedPageBreak/>
+        <w:t xml:space="preserve">A kliens oldali validáció több szinten is </w:t>
+      </w:r>
+      <w:r>
+        <w:rPr>
+          <w:rFonts w:ascii="Arial" w:hAnsi="Arial" w:cs="Arial"/>
+        </w:rPr>
+        <w:t>ellenőrzi</w:t>
+      </w:r>
+      <w:r>
+        <w:rPr>
+          <w:rFonts w:ascii="Arial" w:hAnsi="Arial" w:cs="Arial"/>
+        </w:rPr>
+        <w:t xml:space="preserve"> az adatok helyességét, mielőtt azok elküldésre kerülnek. A</w:t>
+      </w:r>
+      <w:r>
+        <w:rPr>
+          <w:rFonts w:ascii="Arial" w:hAnsi="Arial" w:cs="Arial"/>
+        </w:rPr>
+        <w:t xml:space="preserve"> </w:t>
       </w:r>
       <w:r>
         <w:rPr>
@@ -11096,81 +11165,404 @@
         <w:rPr>
           <w:rFonts w:ascii="Arial" w:hAnsi="Arial" w:cs="Arial"/>
         </w:rPr>
-        <w:t xml:space="preserve"> dátumválasztóval és interaktív csillagos értékelővel ellátott űrlapon keresztül teszi lehetővé új meglátogatott helyek rögzítését. A felhasználó megadhatja a helyszín nevét, országát, a látogatás kezdő- és </w:t>
+        <w:t xml:space="preserve"> dátumválasztó mezők a felhasználó nyelvi beállításához igazodó lokalizációval jelennek meg, és a jövőbeli dátum kiválasztása le van tiltva. A kezdő dátum módosításakor a záró dátum minimuma automatikusan frissül, és amíg a felhasználó kézzel nem választ ettől eltérő záró dátumot</w:t>
+      </w:r>
+      <w:r>
+        <w:rPr>
+          <w:rFonts w:ascii="Arial" w:hAnsi="Arial" w:cs="Arial"/>
+        </w:rPr>
+        <w:t>,</w:t>
+      </w:r>
+      <w:r>
+        <w:rPr>
+          <w:rFonts w:ascii="Arial" w:hAnsi="Arial" w:cs="Arial"/>
+        </w:rPr>
+        <w:t xml:space="preserve"> az értéke is szinkronban marad a kezdő dátummal. Az űrlap elküldése előtt a rendszer ellenőrzi a kötelező mezők kitöltöttségét, valamint azt, hogy a záró dátum ne előzze meg a kezdő dátumot</w:t>
+      </w:r>
+      <w:r>
+        <w:rPr>
+          <w:rFonts w:ascii="Arial" w:hAnsi="Arial" w:cs="Arial"/>
+        </w:rPr>
+        <w:t>.</w:t>
+      </w:r>
+      <w:r>
+        <w:rPr>
+          <w:rFonts w:ascii="Arial" w:hAnsi="Arial" w:cs="Arial"/>
+        </w:rPr>
+        <w:t xml:space="preserve"> </w:t>
+      </w:r>
+      <w:r>
+        <w:rPr>
+          <w:rFonts w:ascii="Arial" w:hAnsi="Arial" w:cs="Arial"/>
+        </w:rPr>
+        <w:t>A</w:t>
+      </w:r>
+      <w:r>
+        <w:rPr>
+          <w:rFonts w:ascii="Arial" w:hAnsi="Arial" w:cs="Arial"/>
+        </w:rPr>
+        <w:t xml:space="preserve"> hibaüzenetek egy </w:t>
+      </w:r>
+      <w:r>
+        <w:rPr>
+          <w:rFonts w:ascii="Arial" w:hAnsi="Arial" w:cs="Arial"/>
+        </w:rPr>
+        <w:t>felugró</w:t>
+      </w:r>
+      <w:r>
+        <w:rPr>
+          <w:rFonts w:ascii="Arial" w:hAnsi="Arial" w:cs="Arial"/>
+        </w:rPr>
+        <w:t xml:space="preserve"> ablakban, a felhasználó nyelvén jelennek meg.</w:t>
+      </w:r>
+    </w:p>
+    <w:p>
+      <w:pPr>
+        <w:spacing w:line="360" w:lineRule="auto"/>
+        <w:jc w:val="both"/>
+        <w:rPr>
+          <w:rFonts w:ascii="Arial" w:hAnsi="Arial" w:cs="Arial"/>
+        </w:rPr>
+      </w:pPr>
+      <w:r>
+        <w:rPr>
+          <w:rFonts w:ascii="Arial" w:hAnsi="Arial" w:cs="Arial"/>
+        </w:rPr>
+        <w:t xml:space="preserve">Az űrlap szöveges mezői </w:t>
+      </w:r>
+      <w:r>
+        <w:rPr>
+          <w:rFonts w:ascii="Arial" w:hAnsi="Arial" w:cs="Arial"/>
+        </w:rPr>
+        <w:t>az oldal frissítése</w:t>
+      </w:r>
+      <w:r>
+        <w:rPr>
+          <w:rFonts w:ascii="Arial" w:hAnsi="Arial" w:cs="Arial"/>
+        </w:rPr>
+        <w:t xml:space="preserve"> után is megmaradnak</w:t>
+      </w:r>
+      <w:r>
+        <w:rPr>
+          <w:rFonts w:ascii="Arial" w:hAnsi="Arial" w:cs="Arial"/>
+        </w:rPr>
+        <w:t>, ezzel elkerülve, hogy a felhasználónak mindent újra</w:t>
+      </w:r>
+      <w:r>
+        <w:rPr>
+          <w:rFonts w:ascii="Arial" w:hAnsi="Arial" w:cs="Arial"/>
+        </w:rPr>
+        <w:t xml:space="preserve"> ki kelljen tölteni</w:t>
+      </w:r>
+      <w:r>
+        <w:rPr>
+          <w:rFonts w:ascii="Arial" w:hAnsi="Arial" w:cs="Arial"/>
+        </w:rPr>
+        <w:t xml:space="preserve">, mivel a </w:t>
+      </w:r>
+      <w:r>
+        <w:rPr>
+          <w:rFonts w:ascii="Arial" w:hAnsi="Arial" w:cs="Arial"/>
+          <w:i/>
+          <w:iCs/>
+        </w:rPr>
+        <w:t>saveDraft()</w:t>
+      </w:r>
+      <w:r>
+        <w:rPr>
+          <w:rFonts w:ascii="Arial" w:hAnsi="Arial" w:cs="Arial"/>
+        </w:rPr>
+        <w:t xml:space="preserve"> függvény</w:t>
+      </w:r>
+      <w:r>
+        <w:rPr>
+          <w:rFonts w:ascii="Arial" w:hAnsi="Arial" w:cs="Arial"/>
+        </w:rPr>
+        <w:t xml:space="preserve"> a beírt adatokat piszkozatként ideiglenesen elmenti a böngésző</w:t>
+      </w:r>
+      <w:r>
+        <w:rPr>
+          <w:rFonts w:ascii="Arial" w:hAnsi="Arial" w:cs="Arial"/>
+        </w:rPr>
+        <w:t xml:space="preserve"> </w:t>
+      </w:r>
+      <w:r>
+        <w:rPr>
+          <w:rFonts w:ascii="Arial" w:hAnsi="Arial" w:cs="Arial"/>
+          <w:i/>
+          <w:iCs/>
+        </w:rPr>
+        <w:t>sessionStorage</w:t>
+      </w:r>
+      <w:r>
+        <w:rPr>
+          <w:rFonts w:ascii="Arial" w:hAnsi="Arial" w:cs="Arial"/>
+        </w:rPr>
+        <w:t>-ába</w:t>
+      </w:r>
+      <w:r>
+        <w:rPr>
+          <w:rFonts w:ascii="Arial" w:hAnsi="Arial" w:cs="Arial"/>
+        </w:rPr>
+        <w:t xml:space="preserve">, betöltéskor pedig a </w:t>
+      </w:r>
+      <w:r>
+        <w:rPr>
+          <w:rFonts w:ascii="Arial" w:hAnsi="Arial" w:cs="Arial"/>
+          <w:i/>
+          <w:iCs/>
+        </w:rPr>
+        <w:t>restoreDraft()</w:t>
+      </w:r>
+      <w:r>
+        <w:rPr>
+          <w:rFonts w:ascii="Arial" w:hAnsi="Arial" w:cs="Arial"/>
+        </w:rPr>
+        <w:t xml:space="preserve"> visszaállítja</w:t>
+      </w:r>
+      <w:r>
+        <w:rPr>
+          <w:rFonts w:ascii="Arial" w:hAnsi="Arial" w:cs="Arial"/>
+        </w:rPr>
+        <w:t>. A kiválasztott fényképek ugyanakkor nem menthetők ilyen módon, mivel a böngésző biztonsági okokból nem teszi lehetővé a fájlok tartós tárolását.</w:t>
+      </w:r>
+    </w:p>
+    <w:p>
+      <w:pPr>
+        <w:spacing w:line="360" w:lineRule="auto"/>
+        <w:jc w:val="both"/>
+        <w:rPr>
+          <w:rFonts w:ascii="Arial" w:hAnsi="Arial" w:cs="Arial"/>
+        </w:rPr>
+      </w:pPr>
+      <w:r>
+        <w:rPr>
+          <w:rFonts w:ascii="Arial" w:hAnsi="Arial" w:cs="Arial"/>
+        </w:rPr>
+        <w:t>A fényképfeltöltés a kliens oldalon egy közös, más funkciók által is használt segédmodulon keresztül valósul meg</w:t>
+      </w:r>
+      <w:r>
+        <w:rPr>
+          <w:rFonts w:ascii="Arial" w:hAnsi="Arial" w:cs="Arial"/>
+        </w:rPr>
+        <w:t xml:space="preserve"> (imageUpload.js)</w:t>
+      </w:r>
+      <w:r>
+        <w:rPr>
+          <w:rFonts w:ascii="Arial" w:hAnsi="Arial" w:cs="Arial"/>
+        </w:rPr>
+        <w:t>. A kiválasztott fájlok formátumát (kizárólag PNG és JPEG engedélyezett) és méretét (legfeljebb 10 MB fájlonként) a rendszer már a feltöltés előtt ellenőrzi, a nem megfelelő fájlokról pedig részletes hibaüzenetet jelenít meg.</w:t>
+      </w:r>
+      <w:r>
+        <w:rPr>
+          <w:rFonts w:ascii="Arial" w:hAnsi="Arial" w:cs="Arial"/>
+        </w:rPr>
+        <w:t xml:space="preserve"> </w:t>
+      </w:r>
+      <w:r>
+        <w:rPr>
+          <w:rFonts w:ascii="Arial" w:hAnsi="Arial" w:cs="Arial"/>
+        </w:rPr>
+        <w:t>A formátumkorlátozás (PNG, JPEG) a széles körű eszköz- és böngészőkompatibilitást biztosítja, míg a 10 MB-os méretkorlát egyensúlyt teremt a felhasználói kényelem és a szerver tárhelyének védelme között.</w:t>
+      </w:r>
+      <w:r>
+        <w:rPr>
+          <w:rFonts w:ascii="Arial" w:hAnsi="Arial" w:cs="Arial"/>
+        </w:rPr>
+        <w:t xml:space="preserve"> A képekről a böngésző</w:t>
+      </w:r>
+      <w:r>
+        <w:rPr>
+          <w:rFonts w:ascii="Arial" w:hAnsi="Arial" w:cs="Arial"/>
+        </w:rPr>
+        <w:t xml:space="preserve"> </w:t>
+      </w:r>
+      <w:r>
+        <w:rPr>
+          <w:rFonts w:ascii="Arial" w:hAnsi="Arial" w:cs="Arial"/>
+          <w:i/>
+          <w:iCs/>
+        </w:rPr>
+        <w:t>URL.createObjectURL()</w:t>
+      </w:r>
+      <w:r>
+        <w:rPr>
+          <w:rFonts w:ascii="Arial" w:hAnsi="Arial" w:cs="Arial"/>
+        </w:rPr>
+        <w:t xml:space="preserve"> metódusával</w:t>
+      </w:r>
+      <w:r>
+        <w:rPr>
+          <w:rFonts w:ascii="Arial" w:hAnsi="Arial" w:cs="Arial"/>
+        </w:rPr>
+        <w:t xml:space="preserve"> helyi előnézetet </w:t>
+      </w:r>
+      <w:r>
+        <w:rPr>
+          <w:rFonts w:ascii="Arial" w:hAnsi="Arial" w:cs="Arial"/>
+        </w:rPr>
+        <w:t>jelenít meg</w:t>
+      </w:r>
+      <w:r>
+        <w:rPr>
+          <w:rFonts w:ascii="Arial" w:hAnsi="Arial" w:cs="Arial"/>
+        </w:rPr>
+        <w:t>,</w:t>
+      </w:r>
+      <w:r>
+        <w:rPr>
+          <w:rFonts w:ascii="Arial" w:hAnsi="Arial" w:cs="Arial"/>
+        </w:rPr>
+        <w:t xml:space="preserve"> hogy a felhasználó </w:t>
+      </w:r>
+      <w:r>
+        <w:rPr>
+          <w:rFonts w:ascii="Arial" w:hAnsi="Arial" w:cs="Arial"/>
+        </w:rPr>
+        <w:t>ellenőrizhesse a feltöltött képeit mentés előtt</w:t>
+      </w:r>
+      <w:r>
+        <w:rPr>
+          <w:rFonts w:ascii="Arial" w:hAnsi="Arial" w:cs="Arial"/>
+        </w:rPr>
+        <w:t>.</w:t>
+      </w:r>
+    </w:p>
+    <w:p>
+      <w:pPr>
+        <w:spacing w:line="360" w:lineRule="auto"/>
+        <w:jc w:val="both"/>
+        <w:rPr>
+          <w:rFonts w:ascii="Arial" w:hAnsi="Arial" w:cs="Arial"/>
+        </w:rPr>
+      </w:pPr>
+      <w:r>
+        <w:rPr>
+          <w:rFonts w:ascii="Arial" w:hAnsi="Arial" w:cs="Arial"/>
+        </w:rPr>
+        <w:t xml:space="preserve">Az adatok mentése két, egymásra épülő lépésben történik. Elsőként a helyszín szöveges adatai kerülnek elküldésre egy POST kéréssel a </w:t>
+      </w:r>
+      <w:r>
+        <w:rPr>
+          <w:rFonts w:ascii="Arial" w:hAnsi="Arial" w:cs="Arial"/>
+          <w:i/>
+          <w:iCs/>
+        </w:rPr>
+        <w:t>/api/visited-places</w:t>
+      </w:r>
+      <w:r>
+        <w:rPr>
+          <w:rFonts w:ascii="Arial" w:hAnsi="Arial" w:cs="Arial"/>
+        </w:rPr>
+        <w:t xml:space="preserve"> </w:t>
+      </w:r>
+      <w:r>
+        <w:rPr>
+          <w:rFonts w:ascii="Arial" w:hAnsi="Arial" w:cs="Arial"/>
+        </w:rPr>
+        <w:t>végpontra. A</w:t>
+      </w:r>
+      <w:r>
+        <w:rPr>
+          <w:rFonts w:ascii="Arial" w:hAnsi="Arial" w:cs="Arial"/>
+        </w:rPr>
+        <w:t xml:space="preserve"> szerver oldalon a </w:t>
+      </w:r>
+      <w:r>
+        <w:rPr>
+          <w:rFonts w:ascii="Arial" w:hAnsi="Arial" w:cs="Arial"/>
+          <w:i/>
+          <w:iCs/>
+        </w:rPr>
+        <w:t>create_visited_place</w:t>
+      </w:r>
+      <w:r>
+        <w:rPr>
+          <w:rFonts w:ascii="Arial" w:hAnsi="Arial" w:cs="Arial"/>
+        </w:rPr>
+        <w:t xml:space="preserve"> végpont JWT-alapú hitelesítéshez kötött: a rendszer azonosítja a bejelentkezett felhasználót, és a rekordot hozzárendeli. A kliens oldalon az oldal betöltését hitelesítés-ellenőrző mechanizmus védi</w:t>
+      </w:r>
+      <w:r>
+        <w:rPr>
+          <w:rFonts w:ascii="Arial" w:hAnsi="Arial" w:cs="Arial"/>
+        </w:rPr>
+        <w:t xml:space="preserve"> (authGuard.js)</w:t>
+      </w:r>
+      <w:r>
+        <w:rPr>
+          <w:rFonts w:ascii="Arial" w:hAnsi="Arial" w:cs="Arial"/>
+        </w:rPr>
+        <w:t>, az API-hívásokhoz pedig egy közös segédmodul automatikusan csatolja a hitelesítéshez szükséges tokent</w:t>
+      </w:r>
+      <w:r>
+        <w:rPr>
+          <w:rFonts w:ascii="Arial" w:hAnsi="Arial" w:cs="Arial"/>
+        </w:rPr>
+        <w:t xml:space="preserve"> (apiConfig.js)</w:t>
+      </w:r>
+      <w:r>
+        <w:rPr>
+          <w:rFonts w:ascii="Arial" w:hAnsi="Arial" w:cs="Arial"/>
+        </w:rPr>
+        <w:t xml:space="preserve">. Ezután a szerver a megadott helynév és ország alapján megpróbálja meghatározni a helyszín földrajzi koordinátáit </w:t>
+      </w:r>
+      <w:r>
+        <w:rPr>
+          <w:rFonts w:ascii="Arial" w:hAnsi="Arial" w:cs="Arial"/>
+        </w:rPr>
+        <w:t>a Nominatim</w:t>
+      </w:r>
+      <w:r>
+        <w:rPr>
+          <w:rFonts w:ascii="Arial" w:hAnsi="Arial" w:cs="Arial"/>
+        </w:rPr>
+        <w:t xml:space="preserve"> geokódoló szolgáltatáson keresztül. A </w:t>
+      </w:r>
+      <w:r>
+        <w:rPr>
+          <w:rFonts w:ascii="Arial" w:hAnsi="Arial" w:cs="Arial"/>
+        </w:rPr>
+        <w:t>geokódolás</w:t>
+      </w:r>
+      <w:r>
+        <w:rPr>
+          <w:rFonts w:ascii="Arial" w:hAnsi="Arial" w:cs="Arial"/>
+        </w:rPr>
+        <w:t xml:space="preserve"> hibatűrő módon van </w:t>
       </w:r>
       <w:r>
         <w:rPr>
           <w:rFonts w:ascii="Arial" w:hAnsi="Arial" w:cs="Arial"/>
         </w:rPr>
         <w:lastRenderedPageBreak/>
-        <w:t>záródátumát, egy 1–5 csillagos értékelést, egy rövid leírást, hosszabb megjegyzéseket, valamint tetszőleges számú fényképet csatolhat a bejegyzéshez.</w:t>
-      </w:r>
-    </w:p>
-    <w:p>
-      <w:pPr>
-        <w:spacing w:line="360" w:lineRule="auto"/>
-        <w:jc w:val="both"/>
-        <w:rPr>
-          <w:rFonts w:ascii="Arial" w:hAnsi="Arial" w:cs="Arial"/>
-        </w:rPr>
-      </w:pPr>
-      <w:r>
-        <w:rPr>
-          <w:rFonts w:ascii="Arial" w:hAnsi="Arial" w:cs="Arial"/>
-        </w:rPr>
-        <w:t>A kliens oldali validáció több szinten is biztosítja az adatok helyességét, mielőtt azok elküldésre kerül</w:t>
-      </w:r>
-      <w:r>
-        <w:rPr>
-          <w:rFonts w:ascii="Arial" w:hAnsi="Arial" w:cs="Arial"/>
-        </w:rPr>
-        <w:t>nek</w:t>
-      </w:r>
-      <w:r>
-        <w:rPr>
-          <w:rFonts w:ascii="Arial" w:hAnsi="Arial" w:cs="Arial"/>
-        </w:rPr>
-        <w:t xml:space="preserve">. A dátumválasztó mezők a </w:t>
-      </w:r>
-      <w:r>
-        <w:rPr>
-          <w:rFonts w:ascii="Arial" w:hAnsi="Arial" w:cs="Arial"/>
-          <w:i/>
-          <w:iCs/>
-        </w:rPr>
-        <w:t>flatpickr</w:t>
-      </w:r>
-      <w:r>
-        <w:rPr>
-          <w:rFonts w:ascii="Arial" w:hAnsi="Arial" w:cs="Arial"/>
-        </w:rPr>
-        <w:t xml:space="preserve"> könyvtár segítségével </w:t>
-      </w:r>
-      <w:r>
-        <w:rPr>
-          <w:rFonts w:ascii="Arial" w:hAnsi="Arial" w:cs="Arial"/>
-        </w:rPr>
-        <w:t>működnek</w:t>
-      </w:r>
-      <w:r>
-        <w:rPr>
-          <w:rFonts w:ascii="Arial" w:hAnsi="Arial" w:cs="Arial"/>
-        </w:rPr>
-        <w:t xml:space="preserve">, a felhasználó nyelvi beállításához igazodó lokalizációval jelennek meg, és a </w:t>
-      </w:r>
-      <w:r>
-        <w:rPr>
-          <w:rFonts w:ascii="Arial" w:hAnsi="Arial" w:cs="Arial"/>
-          <w:i/>
-          <w:iCs/>
-        </w:rPr>
-        <w:t>maxDate: 'today'</w:t>
-      </w:r>
-      <w:r>
-        <w:rPr>
-          <w:rFonts w:ascii="Arial" w:hAnsi="Arial" w:cs="Arial"/>
-        </w:rPr>
-        <w:t xml:space="preserve"> beállítás megakadályozza jövőbeli dátum kiválasztását. Az űrlap elküldése előtt a rendszer ellenőrzi a kötelező mezők (helynév, ország, kezdő dátum) kitöltöttségét, valamint azt, hogy a záró</w:t>
+        <w:t xml:space="preserve">kialakítva: </w:t>
+      </w:r>
+      <w:r>
+        <w:rPr>
+          <w:rFonts w:ascii="Arial" w:hAnsi="Arial" w:cs="Arial"/>
+        </w:rPr>
+        <w:t>ha</w:t>
+      </w:r>
+      <w:r>
+        <w:rPr>
+          <w:rFonts w:ascii="Arial" w:hAnsi="Arial" w:cs="Arial"/>
+        </w:rPr>
+        <w:t xml:space="preserve"> bármilyen okból sikertelen, a rendszer ekkor is elmenti a helyszínt koordináták nélkül, így egy külső szolgáltatás átmeneti elérhetetlensége nem akadályozza meg az adat rögzítését.</w:t>
+      </w:r>
+    </w:p>
+    <w:p>
+      <w:pPr>
+        <w:spacing w:line="360" w:lineRule="auto"/>
+        <w:jc w:val="both"/>
+        <w:rPr>
+          <w:rFonts w:ascii="Arial" w:hAnsi="Arial" w:cs="Arial"/>
+        </w:rPr>
+      </w:pPr>
+      <w:r>
+        <w:rPr>
+          <w:rFonts w:ascii="Arial" w:hAnsi="Arial" w:cs="Arial"/>
+        </w:rPr>
+        <w:t>A helyszín sikeres létrehozását követően, amennyiben a felhasználó fényképeket is csatolt, a kliens egyenként, sorban továbbítja ezeket a képfeltöltő</w:t>
       </w:r>
       <w:r>
         <w:rPr>
@@ -11181,23 +11573,100 @@
       <w:r>
         <w:rPr>
           <w:rFonts w:ascii="Arial" w:hAnsi="Arial" w:cs="Arial"/>
-        </w:rPr>
-        <w:t>dátum ne előzze meg a kezdő dátumot.</w:t>
-      </w:r>
-    </w:p>
-    <w:p>
-      <w:pPr>
-        <w:spacing w:line="360" w:lineRule="auto"/>
-        <w:jc w:val="both"/>
-        <w:rPr>
-          <w:rFonts w:ascii="Arial" w:hAnsi="Arial" w:cs="Arial"/>
-        </w:rPr>
-      </w:pPr>
-      <w:r>
-        <w:rPr>
-          <w:rFonts w:ascii="Arial" w:hAnsi="Arial" w:cs="Arial"/>
-        </w:rPr>
-        <w:t>A fényképfeltöltés</w:t>
+          <w:i/>
+          <w:iCs/>
+        </w:rPr>
+        <w:t>/api/visited-places/{place_id}/images/upload</w:t>
+      </w:r>
+      <w:r>
+        <w:rPr>
+          <w:rFonts w:ascii="Arial" w:hAnsi="Arial" w:cs="Arial"/>
+        </w:rPr>
+        <w:t xml:space="preserve"> végpontra. A folyamat során a felhasználó valós idejű visszajelzést kap a feltöltés állapotáról, például „Fénykép feltöltése… (2/5)” formában. Amennyiben egy adott fénykép feltöltése </w:t>
+      </w:r>
+      <w:r>
+        <w:rPr>
+          <w:rFonts w:ascii="Arial" w:hAnsi="Arial" w:cs="Arial"/>
+        </w:rPr>
+        <w:t>sikertelen</w:t>
+      </w:r>
+      <w:r>
+        <w:rPr>
+          <w:rFonts w:ascii="Arial" w:hAnsi="Arial" w:cs="Arial"/>
+        </w:rPr>
+        <w:t>, a rendszer nem vonja vissza a már sikeresen létrehozott helyszínt, hanem tájékoztatja a felhasználót a részleges sikerről, elkerülve ezzel az addig elvégzett munka elvesztését</w:t>
+      </w:r>
+      <w:r>
+        <w:rPr>
+          <w:rFonts w:ascii="Arial" w:hAnsi="Arial" w:cs="Arial"/>
+        </w:rPr>
+        <w:t>,</w:t>
+      </w:r>
+      <w:r>
+        <w:rPr>
+          <w:rFonts w:ascii="Arial" w:hAnsi="Arial" w:cs="Arial"/>
+        </w:rPr>
+        <w:t xml:space="preserve"> ekkor a</w:t>
+      </w:r>
+      <w:r>
+        <w:rPr>
+          <w:rFonts w:ascii="Arial" w:hAnsi="Arial" w:cs="Arial"/>
+        </w:rPr>
+        <w:t xml:space="preserve"> </w:t>
+      </w:r>
+      <w:r>
+        <w:rPr>
+          <w:rFonts w:ascii="Arial" w:hAnsi="Arial" w:cs="Arial"/>
+          <w:i/>
+          <w:iCs/>
+        </w:rPr>
+        <w:t>clearDraft()</w:t>
+      </w:r>
+      <w:r>
+        <w:rPr>
+          <w:rFonts w:ascii="Arial" w:hAnsi="Arial" w:cs="Arial"/>
+        </w:rPr>
+        <w:t xml:space="preserve"> metódus segítségével a</w:t>
+      </w:r>
+      <w:r>
+        <w:rPr>
+          <w:rFonts w:ascii="Arial" w:hAnsi="Arial" w:cs="Arial"/>
+        </w:rPr>
+        <w:t xml:space="preserve"> piszkozat törlődik, hogy lapfrissítéskor ne jöhessen létre duplikált hely. A szerver oldalon a</w:t>
+      </w:r>
+      <w:r>
+        <w:rPr>
+          <w:rFonts w:ascii="Arial" w:hAnsi="Arial" w:cs="Arial"/>
+        </w:rPr>
+        <w:t xml:space="preserve">z </w:t>
+      </w:r>
+      <w:r>
+        <w:rPr>
+          <w:rFonts w:ascii="Arial" w:hAnsi="Arial" w:cs="Arial"/>
+          <w:i/>
+          <w:iCs/>
+        </w:rPr>
+        <w:t>upload_place_image</w:t>
+      </w:r>
+      <w:r>
+        <w:rPr>
+          <w:rFonts w:ascii="Arial" w:hAnsi="Arial" w:cs="Arial"/>
+          <w:i/>
+          <w:iCs/>
+        </w:rPr>
+        <w:t>()</w:t>
+      </w:r>
+      <w:r>
+        <w:rPr>
+          <w:rFonts w:ascii="Arial" w:hAnsi="Arial" w:cs="Arial"/>
+        </w:rPr>
+        <w:t xml:space="preserve"> </w:t>
+      </w:r>
+      <w:r>
+        <w:rPr>
+          <w:rFonts w:ascii="Arial" w:hAnsi="Arial" w:cs="Arial"/>
+        </w:rPr>
+        <w:t>végpont ellenőrzi a helyszín létezését és tulajdonosát, majd</w:t>
       </w:r>
       <w:r>
         <w:rPr>
@@ -11209,185 +11678,55 @@
         <w:rPr>
           <w:rFonts w:ascii="Arial" w:hAnsi="Arial" w:cs="Arial"/>
         </w:rPr>
-        <w:t xml:space="preserve"> kliens</w:t>
-      </w:r>
-      <w:r>
-        <w:rPr>
-          <w:rFonts w:ascii="Arial" w:hAnsi="Arial" w:cs="Arial"/>
-        </w:rPr>
         <w:t xml:space="preserve"> </w:t>
       </w:r>
       <w:r>
         <w:rPr>
           <w:rFonts w:ascii="Arial" w:hAnsi="Arial" w:cs="Arial"/>
-        </w:rPr>
-        <w:t xml:space="preserve">oldalon </w:t>
-      </w:r>
-      <w:r>
-        <w:rPr>
-          <w:rFonts w:ascii="Arial" w:hAnsi="Arial" w:cs="Arial"/>
-        </w:rPr>
-        <w:t>a következőképpen</w:t>
-      </w:r>
-      <w:r>
-        <w:rPr>
-          <w:rFonts w:ascii="Arial" w:hAnsi="Arial" w:cs="Arial"/>
-        </w:rPr>
-        <w:t xml:space="preserve"> valósul meg: a kiválasztott fájlok formátumát (kizárólag PNG és JPEG engedélyezett) és méretét (legfeljebb 10 MB fájlonként) a rendszer már a feltöltés előtt ellenőrzi, a nem megfelelő fájlokról pedig részletes hibaüzenetet jelenít meg. A kiválasztott képekről a böngésző </w:t>
-      </w:r>
-      <w:r>
-        <w:rPr>
-          <w:rFonts w:ascii="Arial" w:hAnsi="Arial" w:cs="Arial"/>
-          <w:i/>
-          <w:iCs/>
-        </w:rPr>
-        <w:t>URL.createObjectURL</w:t>
-      </w:r>
-      <w:r>
-        <w:rPr>
-          <w:rFonts w:ascii="Arial" w:hAnsi="Arial" w:cs="Arial"/>
-        </w:rPr>
-        <w:t xml:space="preserve"> metódusával azonnali, helyi előnézet készül, amelyet a felhasználó egyenként el is távolíthat a feltöltés előtt</w:t>
+          <w:i/>
+          <w:iCs/>
+        </w:rPr>
+        <w:t>save_place_image</w:t>
+      </w:r>
+      <w:r>
+        <w:rPr>
+          <w:rFonts w:ascii="Arial" w:hAnsi="Arial" w:cs="Arial"/>
+          <w:i/>
+          <w:iCs/>
+        </w:rPr>
+        <w:t>()</w:t>
+      </w:r>
+      <w:r>
+        <w:rPr>
+          <w:rFonts w:ascii="Arial" w:hAnsi="Arial" w:cs="Arial"/>
+        </w:rPr>
+        <w:t xml:space="preserve"> menti el a bináris fájlt a szerver feltöltési könyvtárába, és létrehoz hozzá egy megfelelő adatbázis-rekordot. Sikeres mentés után a kliens a meglátogatott helyek listaoldalára irányítja át a felhasználót</w:t>
+      </w:r>
+      <w:r>
+        <w:rPr>
+          <w:rFonts w:ascii="Arial" w:hAnsi="Arial" w:cs="Arial"/>
+        </w:rPr>
+        <w:t xml:space="preserve"> a </w:t>
+      </w:r>
+      <w:r>
+        <w:rPr>
+          <w:rFonts w:ascii="Arial" w:hAnsi="Arial" w:cs="Arial"/>
+          <w:i/>
+          <w:iCs/>
+        </w:rPr>
+        <w:t>goToVisitedPlaces()</w:t>
+      </w:r>
+      <w:r>
+        <w:rPr>
+          <w:rFonts w:ascii="Arial" w:hAnsi="Arial" w:cs="Arial"/>
+        </w:rPr>
+        <w:t xml:space="preserve"> függvény használatával</w:t>
       </w:r>
       <w:r>
         <w:rPr>
           <w:rFonts w:ascii="Arial" w:hAnsi="Arial" w:cs="Arial"/>
         </w:rPr>
         <w:t>.</w:t>
-      </w:r>
-    </w:p>
-    <w:p>
-      <w:pPr>
-        <w:spacing w:line="360" w:lineRule="auto"/>
-        <w:jc w:val="both"/>
-        <w:rPr>
-          <w:rFonts w:ascii="Arial" w:hAnsi="Arial" w:cs="Arial"/>
-        </w:rPr>
-      </w:pPr>
-      <w:r>
-        <w:rPr>
-          <w:rFonts w:ascii="Arial" w:hAnsi="Arial" w:cs="Arial"/>
-        </w:rPr>
-        <w:t xml:space="preserve">Az adatok mentése két, egymásra épülő lépésben történik. Elsőként a helyszín szöveges adatai kerülnek elküldésre egy POST kéréssel a </w:t>
-      </w:r>
-      <w:r>
-        <w:rPr>
-          <w:rFonts w:ascii="Arial" w:hAnsi="Arial" w:cs="Arial"/>
-          <w:i/>
-          <w:iCs/>
-        </w:rPr>
-        <w:t>/api/visited-places</w:t>
-      </w:r>
-      <w:r>
-        <w:rPr>
-          <w:rFonts w:ascii="Arial" w:hAnsi="Arial" w:cs="Arial"/>
-        </w:rPr>
-        <w:t xml:space="preserve"> végpontra. A szerver oldalon ez a végpont ellenőrzi a felhasználó létezését, majd a megadott helynév és ország alapján meg</w:t>
-      </w:r>
-      <w:r>
-        <w:rPr>
-          <w:rFonts w:ascii="Arial" w:hAnsi="Arial" w:cs="Arial"/>
-        </w:rPr>
-        <w:t>próbálja</w:t>
-      </w:r>
-      <w:r>
-        <w:rPr>
-          <w:rFonts w:ascii="Arial" w:hAnsi="Arial" w:cs="Arial"/>
-        </w:rPr>
-        <w:t xml:space="preserve"> meghatározni a helyszín földrajzi koordinátáit egy geokódoló szolgáltatáson keresztül. A megoldás hibatűrő módon van kialakítva: amennyiben a geokódolás bármilyen okból sikertelen, a rendszer ekkor is elmenti a helyszínt, koordináták nélkül, így egy külső szolgáltatás átmeneti elérhetetlensége nem akadályozza meg az adat rögzítését.</w:t>
-      </w:r>
-    </w:p>
-    <w:p>
-      <w:pPr>
-        <w:spacing w:line="360" w:lineRule="auto"/>
-        <w:jc w:val="both"/>
-        <w:rPr>
-          <w:rFonts w:ascii="Arial" w:hAnsi="Arial" w:cs="Arial"/>
-        </w:rPr>
-      </w:pPr>
-      <w:r>
-        <w:rPr>
-          <w:rFonts w:ascii="Arial" w:hAnsi="Arial" w:cs="Arial"/>
-        </w:rPr>
-        <w:t>A helyszín sikeres létrehozását követően</w:t>
-      </w:r>
-      <w:r>
-        <w:rPr>
-          <w:rFonts w:ascii="Arial" w:hAnsi="Arial" w:cs="Arial"/>
-        </w:rPr>
-        <w:t xml:space="preserve">, </w:t>
-      </w:r>
-      <w:r>
-        <w:rPr>
-          <w:rFonts w:ascii="Arial" w:hAnsi="Arial" w:cs="Arial"/>
-        </w:rPr>
-        <w:t>amennyiben a felhasználó fényképeket is csatol</w:t>
-      </w:r>
-      <w:r>
-        <w:rPr>
-          <w:rFonts w:ascii="Arial" w:hAnsi="Arial" w:cs="Arial"/>
-        </w:rPr>
-        <w:t xml:space="preserve">t, </w:t>
-      </w:r>
-      <w:r>
-        <w:rPr>
-          <w:rFonts w:ascii="Arial" w:hAnsi="Arial" w:cs="Arial"/>
-        </w:rPr>
-        <w:t xml:space="preserve">a kliens egyenként továbbítja ezeket a </w:t>
-      </w:r>
-      <w:r>
-        <w:rPr>
-          <w:rFonts w:ascii="Arial" w:hAnsi="Arial" w:cs="Arial"/>
-          <w:i/>
-          <w:iCs/>
-        </w:rPr>
-        <w:t>/api/visited-places/{place_id}/images/upload</w:t>
-      </w:r>
-      <w:r>
-        <w:rPr>
-          <w:rFonts w:ascii="Arial" w:hAnsi="Arial" w:cs="Arial"/>
-        </w:rPr>
-        <w:t xml:space="preserve"> végpontra, </w:t>
-      </w:r>
-      <w:r>
-        <w:rPr>
-          <w:rFonts w:ascii="Arial" w:hAnsi="Arial" w:cs="Arial"/>
-          <w:i/>
-          <w:iCs/>
-        </w:rPr>
-        <w:t>multipart/form-data</w:t>
-      </w:r>
-      <w:r>
-        <w:rPr>
-          <w:rFonts w:ascii="Arial" w:hAnsi="Arial" w:cs="Arial"/>
-        </w:rPr>
-        <w:t xml:space="preserve"> formátumban. A folyamat során a felhasználó valós idejű visszajelzést kap a feltöltés állapotáról (pl. "2/5 fénykép feltöltve"). Amennyiben egy adott fénykép feltöltése meghiúsul, a rendszer nem vonja vissza a már sikeresen létrehozott helyszínt, hanem tájékoztatja a felhasználót a részleges sikerről, elkerülve ez</w:t>
-      </w:r>
-      <w:r>
-        <w:rPr>
-          <w:rFonts w:ascii="Arial" w:hAnsi="Arial" w:cs="Arial"/>
-        </w:rPr>
-        <w:t>zel</w:t>
-      </w:r>
-      <w:r>
-        <w:rPr>
-          <w:rFonts w:ascii="Arial" w:hAnsi="Arial" w:cs="Arial"/>
-        </w:rPr>
-        <w:t xml:space="preserve"> az addig elvégzett munka elvesztését. A szerver oldalon a képfeltöltő végpont ellenőrzi a célhelyszín létezését, majd a </w:t>
-      </w:r>
-      <w:r>
-        <w:rPr>
-          <w:rFonts w:ascii="Arial" w:hAnsi="Arial" w:cs="Arial"/>
-          <w:i/>
-          <w:iCs/>
-        </w:rPr>
-        <w:t>save_place_image</w:t>
-      </w:r>
-      <w:r>
-        <w:rPr>
-          <w:rFonts w:ascii="Arial" w:hAnsi="Arial" w:cs="Arial"/>
-        </w:rPr>
-        <w:t xml:space="preserve"> segédfüggvény segítségével menti el a bináris fájlt a szerver feltöltési könyvtárába, és hoz létre hozzá egy megfelelő adatbázis-rekordot.</w:t>
       </w:r>
     </w:p>
     <w:p>
@@ -11406,7 +11745,6 @@
           <w:sz w:val="28"/>
           <w:szCs w:val="28"/>
         </w:rPr>
-        <w:lastRenderedPageBreak/>
         <w:t>5.</w:t>
       </w:r>
       <w:r>
@@ -11757,6 +12095,7 @@
         <w:rPr>
           <w:rFonts w:ascii="Arial" w:hAnsi="Arial" w:cs="Arial"/>
         </w:rPr>
+        <w:lastRenderedPageBreak/>
         <w:t xml:space="preserve">Az oldal betöltésekor a kliens oldali script a böngésző </w:t>
       </w:r>
       <w:r>
@@ -12008,7 +12347,6 @@
           <w:sz w:val="28"/>
           <w:szCs w:val="28"/>
         </w:rPr>
-        <w:lastRenderedPageBreak/>
         <w:t>5.</w:t>
       </w:r>
       <w:r>
@@ -12173,7 +12511,14 @@
         <w:rPr>
           <w:rFonts w:ascii="Arial" w:hAnsi="Arial" w:cs="Arial"/>
         </w:rPr>
-        <w:t> végpontról, és ezekkel (felhasználónév, e-mail cím) frissíti a nézetet. A kéréshez szükséges JWT-t a globális API-segédmodul (apiConfig.js) automatikusan csatolja. Sikertelen lekérdezés esetén a felület lokalizált hibaszöveget jelenít meg az e-mail mező helyén, elkerülve, hogy a betöltés jelzése véglegesen fennmaradjon.</w:t>
+        <w:t xml:space="preserve"> végpontról, és ezekkel (felhasználónév, e-mail cím) frissíti a nézetet. A kéréshez szükséges JWT-t a globális API-segédmodul (apiConfig.js) automatikusan csatolja. Sikertelen lekérdezés esetén a felület lokalizált hibaszöveget </w:t>
+      </w:r>
+      <w:r>
+        <w:rPr>
+          <w:rFonts w:ascii="Arial" w:hAnsi="Arial" w:cs="Arial"/>
+        </w:rPr>
+        <w:lastRenderedPageBreak/>
+        <w:t>jelenít meg az e-mail mező helyén, elkerülve, hogy a betöltés jelzése véglegesen fennmaradjon.</w:t>
       </w:r>
     </w:p>
     <w:p>
@@ -12348,20 +12693,221 @@
         <w:rPr>
           <w:rFonts w:ascii="Arial" w:hAnsi="Arial" w:cs="Arial"/>
         </w:rPr>
+        <w:t xml:space="preserve">A sikeres adatbetöltést követően a „Fiók” szekció dinamikusan </w:t>
+      </w:r>
+      <w:r>
+        <w:rPr>
+          <w:rFonts w:ascii="Arial" w:hAnsi="Arial" w:cs="Arial"/>
+        </w:rPr>
+        <w:t>épül fel</w:t>
+      </w:r>
+      <w:r>
+        <w:rPr>
+          <w:rFonts w:ascii="Arial" w:hAnsi="Arial" w:cs="Arial"/>
+        </w:rPr>
+        <w:t>, és két lehetőséget kínál: a profil szerkesztésére mutató hivatkozást, valamint egy kijelentkezés gombot. A kijelentkezés megnyomására a rendszer megerősítő párbeszédablakot jelenít meg</w:t>
+      </w:r>
+      <w:r>
+        <w:rPr>
+          <w:rFonts w:ascii="Arial" w:hAnsi="Arial" w:cs="Arial"/>
+        </w:rPr>
+        <w:t>,</w:t>
+      </w:r>
+      <w:r>
+        <w:rPr>
+          <w:rFonts w:ascii="Arial" w:hAnsi="Arial" w:cs="Arial"/>
+        </w:rPr>
+        <w:t xml:space="preserve"> jóváhagyás esetén a kliens a </w:t>
+      </w:r>
+      <w:r>
+        <w:rPr>
+          <w:rFonts w:ascii="Arial" w:hAnsi="Arial" w:cs="Arial"/>
+          <w:i/>
+          <w:iCs/>
+        </w:rPr>
+        <w:t>clearAuthSession()</w:t>
+      </w:r>
+      <w:r>
+        <w:rPr>
+          <w:rFonts w:ascii="Arial" w:hAnsi="Arial" w:cs="Arial"/>
+        </w:rPr>
+        <w:t> segédfüggvénnyel eltávolítja a bejelentkezéshez tartozó adatokat a </w:t>
+      </w:r>
+      <w:r>
+        <w:rPr>
+          <w:rFonts w:ascii="Arial" w:hAnsi="Arial" w:cs="Arial"/>
+          <w:i/>
+          <w:iCs/>
+        </w:rPr>
+        <w:t>localStorage</w:t>
+      </w:r>
+      <w:r>
+        <w:rPr>
+          <w:rFonts w:ascii="Arial" w:hAnsi="Arial" w:cs="Arial"/>
+        </w:rPr>
+        <w:t>-ból, majd a felhasználót a bejelentkezési oldalra irányítja.</w:t>
+      </w:r>
+    </w:p>
+    <w:p>
+      <w:pPr>
+        <w:spacing w:line="360" w:lineRule="auto"/>
+        <w:jc w:val="both"/>
+        <w:rPr>
+          <w:rFonts w:ascii="Arial" w:hAnsi="Arial" w:cs="Arial"/>
+        </w:rPr>
+      </w:pPr>
+      <w:r>
+        <w:rPr>
+          <w:rFonts w:ascii="Arial" w:hAnsi="Arial" w:cs="Arial"/>
+        </w:rPr>
+        <w:t>5.8.</w:t>
+      </w:r>
+      <w:r>
+        <w:rPr>
+          <w:rFonts w:ascii="Arial" w:hAnsi="Arial" w:cs="Arial"/>
+        </w:rPr>
+        <w:t>4</w:t>
+      </w:r>
+      <w:r>
+        <w:rPr>
+          <w:rFonts w:ascii="Arial" w:hAnsi="Arial" w:cs="Arial"/>
+        </w:rPr>
+        <w:t>. Profil szerkesztése</w:t>
+      </w:r>
+    </w:p>
+    <w:p>
+      <w:pPr>
+        <w:spacing w:line="360" w:lineRule="auto"/>
+        <w:jc w:val="both"/>
+        <w:rPr>
+          <w:rFonts w:ascii="Arial" w:hAnsi="Arial" w:cs="Arial"/>
+        </w:rPr>
+      </w:pPr>
+      <w:r>
+        <w:rPr>
+          <w:rFonts w:ascii="Arial" w:hAnsi="Arial" w:cs="Arial"/>
+        </w:rPr>
+        <w:t>A profil szerkesztésére szolgáló oldalon a felhasználó módosíthatja felhasználónevét, e-mail címét, lakóhelyét (home city), valamint jelszavát is.</w:t>
+      </w:r>
+    </w:p>
+    <w:p>
+      <w:pPr>
+        <w:spacing w:line="360" w:lineRule="auto"/>
+        <w:jc w:val="both"/>
+        <w:rPr>
+          <w:rFonts w:ascii="Arial" w:hAnsi="Arial" w:cs="Arial"/>
+        </w:rPr>
+      </w:pPr>
+      <w:r>
+        <w:rPr>
+          <w:rFonts w:ascii="Arial" w:hAnsi="Arial" w:cs="Arial"/>
+        </w:rPr>
+        <w:t>Az oldal betöltésekor a kliens lekérdezi a felhasználó aktuális adatait a </w:t>
+      </w:r>
+      <w:r>
+        <w:rPr>
+          <w:rFonts w:ascii="Arial" w:hAnsi="Arial" w:cs="Arial"/>
+          <w:i/>
+          <w:iCs/>
+        </w:rPr>
+        <w:t>/api/users/{user_id}</w:t>
+      </w:r>
+      <w:r>
+        <w:rPr>
+          <w:rFonts w:ascii="Arial" w:hAnsi="Arial" w:cs="Arial"/>
+        </w:rPr>
+        <w:t> végpontról, és ezeket betölti az űrlap mezőibe. A jelszó mezők üresen maradnak; az oldal jelzi, hogy kitöltetlenül hagyásuk esetén a jelenlegi jelszó változatlan marad.</w:t>
+      </w:r>
+    </w:p>
+    <w:p>
+      <w:pPr>
+        <w:spacing w:line="360" w:lineRule="auto"/>
+        <w:jc w:val="both"/>
+        <w:rPr>
+          <w:rFonts w:ascii="Arial" w:hAnsi="Arial" w:cs="Arial"/>
+        </w:rPr>
+      </w:pPr>
+      <w:r>
+        <w:rPr>
+          <w:rFonts w:ascii="Arial" w:hAnsi="Arial" w:cs="Arial"/>
+        </w:rPr>
+        <w:t xml:space="preserve">Az űrlap elküldése előtt a kliens oldali validáció ellenőrzi, hogy a felhasználónév és az e-mail mező ki van-e töltve, valamint hogy jelszóváltás esetén mindkét jelszómező (új </w:t>
+      </w:r>
+      <w:r>
+        <w:rPr>
+          <w:rFonts w:ascii="Arial" w:hAnsi="Arial" w:cs="Arial"/>
+        </w:rPr>
         <w:lastRenderedPageBreak/>
-        <w:t xml:space="preserve">A sikeres adatbetöltést követően a „Fiók” szekció dinamikusan </w:t>
-      </w:r>
-      <w:r>
-        <w:rPr>
-          <w:rFonts w:ascii="Arial" w:hAnsi="Arial" w:cs="Arial"/>
-        </w:rPr>
-        <w:t>épül fel</w:t>
-      </w:r>
-      <w:r>
-        <w:rPr>
-          <w:rFonts w:ascii="Arial" w:hAnsi="Arial" w:cs="Arial"/>
-        </w:rPr>
-        <w:t>, és két lehetőséget kínál: a profil szerkesztésére mutató hivatkozást, valamint egy kijelentkezés gombot. A kijelentkezés megnyomására a rendszer megerősítő párbeszédablakot jelenít meg</w:t>
+        <w:t>jelszó, megerősítés) ki legyen töltve, a jelszó elérje a hatkarakteres minimális hosszt, és a két mező tartalma megegyezzen. Üres jelszómezők esetén a rendszer nem küldi el a password mezőt a szerver felé, így a meglévő jelszó nem változik.</w:t>
+      </w:r>
+    </w:p>
+    <w:p>
+      <w:pPr>
+        <w:spacing w:line="360" w:lineRule="auto"/>
+        <w:jc w:val="both"/>
+        <w:rPr>
+          <w:rFonts w:ascii="Arial" w:hAnsi="Arial" w:cs="Arial"/>
+        </w:rPr>
+      </w:pPr>
+      <w:r>
+        <w:rPr>
+          <w:rFonts w:ascii="Arial" w:hAnsi="Arial" w:cs="Arial"/>
+        </w:rPr>
+        <w:t>A validált adatok egy PUT kéréssel kerülnek a </w:t>
+      </w:r>
+      <w:r>
+        <w:rPr>
+          <w:rFonts w:ascii="Arial" w:hAnsi="Arial" w:cs="Arial"/>
+          <w:i/>
+          <w:iCs/>
+        </w:rPr>
+        <w:t>/api/users/{user_id}</w:t>
+      </w:r>
+      <w:r>
+        <w:rPr>
+          <w:rFonts w:ascii="Arial" w:hAnsi="Arial" w:cs="Arial"/>
+        </w:rPr>
+        <w:t> végpontra. A szerver ellenőrzi, hogy a módosítani kívánt felhasználónév vagy e-mail nem ütközik-e más felhasználó rekordjával</w:t>
+      </w:r>
+      <w:r>
+        <w:rPr>
+          <w:rFonts w:ascii="Arial" w:hAnsi="Arial" w:cs="Arial"/>
+        </w:rPr>
+        <w:t>. Ü</w:t>
+      </w:r>
+      <w:r>
+        <w:rPr>
+          <w:rFonts w:ascii="Arial" w:hAnsi="Arial" w:cs="Arial"/>
+        </w:rPr>
+        <w:t>tközés esetén 400-as státuszkóddal elutasítja a kérést. A tulajdonosi jogosultságot a </w:t>
+      </w:r>
+      <w:r>
+        <w:rPr>
+          <w:rFonts w:ascii="Arial" w:hAnsi="Arial" w:cs="Arial"/>
+          <w:i/>
+          <w:iCs/>
+        </w:rPr>
+        <w:t>require_self</w:t>
+      </w:r>
+      <w:r>
+        <w:rPr>
+          <w:rFonts w:ascii="Arial" w:hAnsi="Arial" w:cs="Arial"/>
+        </w:rPr>
+        <w:t> függvény biztosítja. Sikeres mentés esetén a kliens frissíti a </w:t>
+      </w:r>
+      <w:r>
+        <w:rPr>
+          <w:rFonts w:ascii="Arial" w:hAnsi="Arial" w:cs="Arial"/>
+          <w:i/>
+          <w:iCs/>
+        </w:rPr>
+        <w:t>localStorage</w:t>
+      </w:r>
+      <w:r>
+        <w:rPr>
+          <w:rFonts w:ascii="Arial" w:hAnsi="Arial" w:cs="Arial"/>
+        </w:rPr>
+        <w:t>-ban tárolt felhasználónevet, kiüríti a jelszómezőket, frissíti a fejléc avatarját, és rövid ideig látható, lokalizált visszajelző üzenetet jelenít meg. Hiba esetén a szerver válaszát a kliens ismert esetekre (foglalt felhasználónév, foglalt e-mail stb.) lokalizált üzenetre képezi le</w:t>
       </w:r>
       <w:r>
         <w:rPr>
@@ -12373,201 +12919,6 @@
         <w:rPr>
           <w:rFonts w:ascii="Arial" w:hAnsi="Arial" w:cs="Arial"/>
         </w:rPr>
-        <w:t xml:space="preserve"> jóváhagyás esetén a kliens a </w:t>
-      </w:r>
-      <w:r>
-        <w:rPr>
-          <w:rFonts w:ascii="Arial" w:hAnsi="Arial" w:cs="Arial"/>
-          <w:i/>
-          <w:iCs/>
-        </w:rPr>
-        <w:t>clearAuthSession()</w:t>
-      </w:r>
-      <w:r>
-        <w:rPr>
-          <w:rFonts w:ascii="Arial" w:hAnsi="Arial" w:cs="Arial"/>
-        </w:rPr>
-        <w:t> segédfüggvénnyel eltávolítja a bejelentkezéshez tartozó adatokat a </w:t>
-      </w:r>
-      <w:r>
-        <w:rPr>
-          <w:rFonts w:ascii="Arial" w:hAnsi="Arial" w:cs="Arial"/>
-          <w:i/>
-          <w:iCs/>
-        </w:rPr>
-        <w:t>localStorage</w:t>
-      </w:r>
-      <w:r>
-        <w:rPr>
-          <w:rFonts w:ascii="Arial" w:hAnsi="Arial" w:cs="Arial"/>
-        </w:rPr>
-        <w:t>-ból, majd a felhasználót a bejelentkezési oldalra irányítja.</w:t>
-      </w:r>
-    </w:p>
-    <w:p>
-      <w:pPr>
-        <w:spacing w:line="360" w:lineRule="auto"/>
-        <w:jc w:val="both"/>
-        <w:rPr>
-          <w:rFonts w:ascii="Arial" w:hAnsi="Arial" w:cs="Arial"/>
-        </w:rPr>
-      </w:pPr>
-      <w:r>
-        <w:rPr>
-          <w:rFonts w:ascii="Arial" w:hAnsi="Arial" w:cs="Arial"/>
-        </w:rPr>
-        <w:t>5.8.</w:t>
-      </w:r>
-      <w:r>
-        <w:rPr>
-          <w:rFonts w:ascii="Arial" w:hAnsi="Arial" w:cs="Arial"/>
-        </w:rPr>
-        <w:t>4</w:t>
-      </w:r>
-      <w:r>
-        <w:rPr>
-          <w:rFonts w:ascii="Arial" w:hAnsi="Arial" w:cs="Arial"/>
-        </w:rPr>
-        <w:t>. Profil szerkesztése</w:t>
-      </w:r>
-    </w:p>
-    <w:p>
-      <w:pPr>
-        <w:spacing w:line="360" w:lineRule="auto"/>
-        <w:jc w:val="both"/>
-        <w:rPr>
-          <w:rFonts w:ascii="Arial" w:hAnsi="Arial" w:cs="Arial"/>
-        </w:rPr>
-      </w:pPr>
-      <w:r>
-        <w:rPr>
-          <w:rFonts w:ascii="Arial" w:hAnsi="Arial" w:cs="Arial"/>
-        </w:rPr>
-        <w:t>A profil szerkesztésére szolgáló oldalon a felhasználó módosíthatja felhasználónevét, e-mail címét, lakóhelyét (home city), valamint jelszavát is.</w:t>
-      </w:r>
-    </w:p>
-    <w:p>
-      <w:pPr>
-        <w:spacing w:line="360" w:lineRule="auto"/>
-        <w:jc w:val="both"/>
-        <w:rPr>
-          <w:rFonts w:ascii="Arial" w:hAnsi="Arial" w:cs="Arial"/>
-        </w:rPr>
-      </w:pPr>
-      <w:r>
-        <w:rPr>
-          <w:rFonts w:ascii="Arial" w:hAnsi="Arial" w:cs="Arial"/>
-        </w:rPr>
-        <w:t>Az oldal betöltésekor a kliens lekérdezi a felhasználó aktuális adatait a </w:t>
-      </w:r>
-      <w:r>
-        <w:rPr>
-          <w:rFonts w:ascii="Arial" w:hAnsi="Arial" w:cs="Arial"/>
-          <w:i/>
-          <w:iCs/>
-        </w:rPr>
-        <w:t>/api/users/{user_id}</w:t>
-      </w:r>
-      <w:r>
-        <w:rPr>
-          <w:rFonts w:ascii="Arial" w:hAnsi="Arial" w:cs="Arial"/>
-        </w:rPr>
-        <w:t> végpontról, és ezeket betölti az űrlap mezőibe. A jelszó mezők üresen maradnak; az oldal jelzi, hogy kitöltetlenül hagyásuk esetén a jelenlegi jelszó változatlan marad.</w:t>
-      </w:r>
-    </w:p>
-    <w:p>
-      <w:pPr>
-        <w:spacing w:line="360" w:lineRule="auto"/>
-        <w:jc w:val="both"/>
-        <w:rPr>
-          <w:rFonts w:ascii="Arial" w:hAnsi="Arial" w:cs="Arial"/>
-        </w:rPr>
-      </w:pPr>
-      <w:r>
-        <w:rPr>
-          <w:rFonts w:ascii="Arial" w:hAnsi="Arial" w:cs="Arial"/>
-        </w:rPr>
-        <w:t>Az űrlap elküldése előtt a kliens oldali validáció ellenőrzi, hogy a felhasználónév és az e-mail mező ki van-e töltve, valamint hogy jelszóváltás esetén mindkét jelszómező (új jelszó, megerősítés) ki legyen töltve, a jelszó elérje a hatkarakteres minimális hosszt, és a két mező tartalma megegyezzen. Üres jelszómezők esetén a rendszer nem küldi el a password mezőt a szerver felé, így a meglévő jelszó nem változik.</w:t>
-      </w:r>
-    </w:p>
-    <w:p>
-      <w:pPr>
-        <w:spacing w:line="360" w:lineRule="auto"/>
-        <w:jc w:val="both"/>
-        <w:rPr>
-          <w:rFonts w:ascii="Arial" w:hAnsi="Arial" w:cs="Arial"/>
-        </w:rPr>
-      </w:pPr>
-      <w:r>
-        <w:rPr>
-          <w:rFonts w:ascii="Arial" w:hAnsi="Arial" w:cs="Arial"/>
-        </w:rPr>
-        <w:t>A validált adatok egy PUT kéréssel kerülnek a </w:t>
-      </w:r>
-      <w:r>
-        <w:rPr>
-          <w:rFonts w:ascii="Arial" w:hAnsi="Arial" w:cs="Arial"/>
-          <w:i/>
-          <w:iCs/>
-        </w:rPr>
-        <w:t>/api/users/{user_id}</w:t>
-      </w:r>
-      <w:r>
-        <w:rPr>
-          <w:rFonts w:ascii="Arial" w:hAnsi="Arial" w:cs="Arial"/>
-        </w:rPr>
-        <w:t> végpontra. A szerver ellenőrzi, hogy a módosítani kívánt felhasználónév vagy e-mail nem ütközik-e más felhasználó rekordjával</w:t>
-      </w:r>
-      <w:r>
-        <w:rPr>
-          <w:rFonts w:ascii="Arial" w:hAnsi="Arial" w:cs="Arial"/>
-        </w:rPr>
-        <w:t>. Ü</w:t>
-      </w:r>
-      <w:r>
-        <w:rPr>
-          <w:rFonts w:ascii="Arial" w:hAnsi="Arial" w:cs="Arial"/>
-        </w:rPr>
-        <w:t>tközés esetén 400-as státuszkóddal elutasítja a kérést. A tulajdonosi jogosultságot a </w:t>
-      </w:r>
-      <w:r>
-        <w:rPr>
-          <w:rFonts w:ascii="Arial" w:hAnsi="Arial" w:cs="Arial"/>
-          <w:i/>
-          <w:iCs/>
-        </w:rPr>
-        <w:t>require_self</w:t>
-      </w:r>
-      <w:r>
-        <w:rPr>
-          <w:rFonts w:ascii="Arial" w:hAnsi="Arial" w:cs="Arial"/>
-        </w:rPr>
-        <w:t> függvény biztosítja. Sikeres mentés esetén a kliens frissíti a </w:t>
-      </w:r>
-      <w:r>
-        <w:rPr>
-          <w:rFonts w:ascii="Arial" w:hAnsi="Arial" w:cs="Arial"/>
-          <w:i/>
-          <w:iCs/>
-        </w:rPr>
-        <w:t>localStorage</w:t>
-      </w:r>
-      <w:r>
-        <w:rPr>
-          <w:rFonts w:ascii="Arial" w:hAnsi="Arial" w:cs="Arial"/>
-        </w:rPr>
-        <w:t>-ban tárolt felhasználónevet, kiüríti a jelszómezőket, frissíti a fejléc avatarját, és rövid ideig látható, lokalizált visszajelző üzenetet jelenít meg. Hiba esetén a szerver válaszát a kliens ismert esetekre (foglalt felhasználónév, foglalt e-mail stb.) lokalizált üzenetre képezi le</w:t>
-      </w:r>
-      <w:r>
-        <w:rPr>
-          <w:rFonts w:ascii="Arial" w:hAnsi="Arial" w:cs="Arial"/>
-        </w:rPr>
-        <w:t>,</w:t>
-      </w:r>
-      <w:r>
-        <w:rPr>
-          <w:rFonts w:ascii="Arial" w:hAnsi="Arial" w:cs="Arial"/>
-        </w:rPr>
         <w:t xml:space="preserve"> egyébként általános hibaszöveget mutat.</w:t>
       </w:r>
     </w:p>
@@ -12598,14 +12949,7 @@
         <w:rPr>
           <w:rFonts w:ascii="Arial" w:hAnsi="Arial" w:cs="Arial"/>
         </w:rPr>
-        <w:t xml:space="preserve">A bejelentkezett felhasználó visszajelzést is küldhet az alkalmazással kapcsolatban. Az űrlap két mezőt tartalmaz: egy kötelező, legfeljebb 2000 karakteres szöveges üzenetet, valamint egy opcionális, legfeljebb 10 MB méretű JPEG vagy PNG képet. A </w:t>
-      </w:r>
-      <w:r>
-        <w:rPr>
-          <w:rFonts w:ascii="Arial" w:hAnsi="Arial" w:cs="Arial"/>
-        </w:rPr>
-        <w:lastRenderedPageBreak/>
-        <w:t>képfeltöltő a meglátogatott helyeknél is használt közös segédmodulra (frontend/scripts/utils/imageUpload.js) épül, amely kliens oldalon ellenőrzi a fájl típusát és méretét,</w:t>
+        <w:t>A bejelentkezett felhasználó visszajelzést is küldhet az alkalmazással kapcsolatban. Az űrlap két mezőt tartalmaz: egy kötelező, legfeljebb 2000 karakteres szöveges üzenetet, valamint egy opcionális, legfeljebb 10 MB méretű JPEG vagy PNG képet. A képfeltöltő a meglátogatott helyeknél is használt közös segédmodulra (frontend/scripts/utils/imageUpload.js) épül, amely kliens oldalon ellenőrzi a fájl típusát és méretét,</w:t>
       </w:r>
       <w:r>
         <w:rPr>
@@ -12751,7 +13095,14 @@
         <w:rPr>
           <w:rFonts w:ascii="Arial" w:hAnsi="Arial" w:cs="Arial"/>
         </w:rPr>
-        <w:t>Az alkalmazás rendelkezik egy elkülönített, jelszóval védett admin felülettel, amelynek elsődleges célja az adatbázis tartalmának környezetek közötti migrálása (például a lokális fejlesztői környezetből a Coolify rendszeren hosztolt, éles környezetbe), mivel az éles adatbázis közvetlen elérése szándékosan nincs biztosítva</w:t>
+        <w:t xml:space="preserve">Az alkalmazás rendelkezik egy elkülönített, jelszóval védett admin felülettel, amelynek elsődleges célja az adatbázis tartalmának környezetek közötti migrálása (például a </w:t>
+      </w:r>
+      <w:r>
+        <w:rPr>
+          <w:rFonts w:ascii="Arial" w:hAnsi="Arial" w:cs="Arial"/>
+        </w:rPr>
+        <w:lastRenderedPageBreak/>
+        <w:t>lokális fejlesztői környezetből a Coolify rendszeren hosztolt, éles környezetbe), mivel az éles adatbázis közvetlen elérése szándékosan nincs biztosítva</w:t>
       </w:r>
       <w:r>
         <w:rPr>
@@ -12914,48 +13265,489 @@
         <w:rPr>
           <w:rFonts w:ascii="Arial" w:hAnsi="Arial" w:cs="Arial"/>
         </w:rPr>
-        <w:t xml:space="preserve"> végpontra ellenőrzés céljából; sikeres válasz esetén a kulcs a </w:t>
-      </w:r>
+        <w:t> végpontra ellenőrzés céljából; sikeres válasz esetén a kulcs a böngésző </w:t>
+      </w:r>
+      <w:r>
+        <w:rPr>
+          <w:rFonts w:ascii="Arial" w:hAnsi="Arial" w:cs="Arial"/>
+          <w:i/>
+          <w:iCs/>
+        </w:rPr>
+        <w:t>sessionStorage</w:t>
+      </w:r>
+      <w:r>
+        <w:rPr>
+          <w:rFonts w:ascii="Arial" w:hAnsi="Arial" w:cs="Arial"/>
+        </w:rPr>
+        <w:t> tárolójában kerül elmentésre, ezáltal az oldal újratöltésekor, amíg a böngészőlap nyitva marad, nincs szükség ismételt bejelentkezésre. A szerver oldalon (admin.py) a </w:t>
+      </w:r>
+      <w:r>
+        <w:rPr>
+          <w:rFonts w:ascii="Arial" w:hAnsi="Arial" w:cs="Arial"/>
+          <w:i/>
+          <w:iCs/>
+        </w:rPr>
+        <w:t>require_admin</w:t>
+      </w:r>
+      <w:r>
+        <w:rPr>
+          <w:rFonts w:ascii="Arial" w:hAnsi="Arial" w:cs="Arial"/>
+        </w:rPr>
+        <w:t> függőség minden admin végpont esetén ellenőrzi a beérkező titkos kulcs helyességét egy függvény (secrets.compare_digest) segítségével</w:t>
+      </w:r>
+      <w:r>
+        <w:rPr>
+          <w:rFonts w:ascii="Arial" w:hAnsi="Arial" w:cs="Arial"/>
+        </w:rPr>
+        <w:t>.</w:t>
+      </w:r>
+      <w:r>
+        <w:rPr>
+          <w:rFonts w:ascii="Arial" w:hAnsi="Arial" w:cs="Arial"/>
+        </w:rPr>
+        <w:t xml:space="preserve"> </w:t>
+      </w:r>
+      <w:r>
+        <w:rPr>
+          <w:rFonts w:ascii="Arial" w:hAnsi="Arial" w:cs="Arial"/>
+        </w:rPr>
+        <w:t>A</w:t>
+      </w:r>
+      <w:r>
+        <w:rPr>
+          <w:rFonts w:ascii="Arial" w:hAnsi="Arial" w:cs="Arial"/>
+        </w:rPr>
+        <w:t xml:space="preserve">mennyiben a szerveren nincs beállítva </w:t>
+      </w:r>
+      <w:r>
+        <w:rPr>
+          <w:rFonts w:ascii="Arial" w:hAnsi="Arial" w:cs="Arial"/>
+        </w:rPr>
+        <w:t xml:space="preserve">titkos </w:t>
+      </w:r>
+      <w:r>
+        <w:rPr>
+          <w:rFonts w:ascii="Arial" w:hAnsi="Arial" w:cs="Arial"/>
+        </w:rPr>
+        <w:t>admin kulcs, a rendszer 503-as státuszkóddal jelzi, hogy az admin funkció nem elérhető, helytelen kulcs esetén pedig 401-es hibaüzenettel utasítja el a kérést.</w:t>
+      </w:r>
+    </w:p>
+    <w:p>
+      <w:pPr>
+        <w:spacing w:line="360" w:lineRule="auto"/>
+        <w:jc w:val="both"/>
+        <w:rPr>
+          <w:rFonts w:ascii="Arial" w:hAnsi="Arial" w:cs="Arial"/>
+        </w:rPr>
+      </w:pPr>
+      <w:r>
+        <w:rPr>
+          <w:rFonts w:ascii="Arial" w:hAnsi="Arial" w:cs="Arial"/>
+        </w:rPr>
+        <w:t>5.9.2. Adatexportálás</w:t>
+      </w:r>
+    </w:p>
+    <w:p>
+      <w:pPr>
+        <w:spacing w:line="360" w:lineRule="auto"/>
+        <w:jc w:val="both"/>
+        <w:rPr>
+          <w:rFonts w:ascii="Arial" w:hAnsi="Arial" w:cs="Arial"/>
+        </w:rPr>
+      </w:pPr>
+      <w:r>
+        <w:rPr>
+          <w:rFonts w:ascii="Arial" w:hAnsi="Arial" w:cs="Arial"/>
+        </w:rPr>
+        <w:t>A sikeres hitelesítést követően megjelenő admin panelen az „Export” gomb megnyomására a kliens egy GET kérést küld a </w:t>
+      </w:r>
+      <w:r>
+        <w:rPr>
+          <w:rFonts w:ascii="Arial" w:hAnsi="Arial" w:cs="Arial"/>
+          <w:i/>
+          <w:iCs/>
+        </w:rPr>
+        <w:t>/api/admin/export</w:t>
+      </w:r>
+      <w:r>
+        <w:rPr>
+          <w:rFonts w:ascii="Arial" w:hAnsi="Arial" w:cs="Arial"/>
+        </w:rPr>
+        <w:t> végpontra. A szerver oldalon ez a végpont, az </w:t>
+      </w:r>
+      <w:r>
+        <w:rPr>
+          <w:rFonts w:ascii="Arial" w:hAnsi="Arial" w:cs="Arial"/>
+          <w:i/>
+          <w:iCs/>
+        </w:rPr>
+        <w:t>admin.py</w:t>
+      </w:r>
+      <w:r>
+        <w:rPr>
+          <w:rFonts w:ascii="Arial" w:hAnsi="Arial" w:cs="Arial"/>
+        </w:rPr>
+        <w:t> fájlban definiált </w:t>
+      </w:r>
+      <w:r>
+        <w:rPr>
+          <w:rFonts w:ascii="Arial" w:hAnsi="Arial" w:cs="Arial"/>
+          <w:i/>
+          <w:iCs/>
+        </w:rPr>
+        <w:t>_EXPORT_MODELS</w:t>
+      </w:r>
+      <w:r>
+        <w:rPr>
+          <w:rFonts w:ascii="Arial" w:hAnsi="Arial" w:cs="Arial"/>
+        </w:rPr>
+        <w:t> listában rögzített sorrendben végigiterál az alkalmazás mind a 12 adatbázis-tábláján, és minden sorát szótár formátumúra alakítja, a dátum- és decimális típusú mezőket JSON-kompatibilis formára konvertálva.</w:t>
+      </w:r>
+    </w:p>
+    <w:p>
+      <w:pPr>
+        <w:spacing w:line="360" w:lineRule="auto"/>
+        <w:jc w:val="both"/>
+        <w:rPr>
+          <w:rFonts w:ascii="Arial" w:hAnsi="Arial" w:cs="Arial"/>
+        </w:rPr>
+      </w:pPr>
       <w:r>
         <w:rPr>
           <w:rFonts w:ascii="Arial" w:hAnsi="Arial" w:cs="Arial"/>
         </w:rPr>
         <w:lastRenderedPageBreak/>
-        <w:t>böngésző </w:t>
-      </w:r>
-      <w:r>
-        <w:rPr>
-          <w:rFonts w:ascii="Arial" w:hAnsi="Arial" w:cs="Arial"/>
-          <w:i/>
-          <w:iCs/>
-        </w:rPr>
-        <w:t>sessionStorage</w:t>
-      </w:r>
-      <w:r>
-        <w:rPr>
-          <w:rFonts w:ascii="Arial" w:hAnsi="Arial" w:cs="Arial"/>
-        </w:rPr>
-        <w:t> tárolójában kerül elmentésre, ezáltal az oldal újratöltésekor, amíg a böngészőlap nyitva marad, nincs szükség ismételt bejelentkezésre. A szerver oldalon (admin.py) a </w:t>
-      </w:r>
-      <w:r>
-        <w:rPr>
-          <w:rFonts w:ascii="Arial" w:hAnsi="Arial" w:cs="Arial"/>
-          <w:i/>
-          <w:iCs/>
-        </w:rPr>
-        <w:t>require_admin</w:t>
-      </w:r>
-      <w:r>
-        <w:rPr>
-          <w:rFonts w:ascii="Arial" w:hAnsi="Arial" w:cs="Arial"/>
-        </w:rPr>
-        <w:t> függőség minden admin végpont esetén ellenőrzi a beérkező titkos kulcs helyességét egy függvény (secrets.compare_digest) segítségével</w:t>
-      </w:r>
-      <w:r>
-        <w:rPr>
-          <w:rFonts w:ascii="Arial" w:hAnsi="Arial" w:cs="Arial"/>
-        </w:rPr>
-        <w:t>.</w:t>
+        <w:t>Az adattáblák tartalma mellett a rendszer a feltöltött fényképfájlokat is beemeli az exportba: a helyszínekhez tartozó képeket (image_files), valamint a visszajelzésekhez csatolt képeket (feedback_image_files) a szerver a lemezről beolvassa, és Base64 kódolással szövegessé alakítva csatolja a JSON válaszhoz. Ennek köszönhetően egyetlen fájl (travelapp-export-&lt;időbélyeg&gt;.json) tartalmazza a teljes adatbázis tartalmát és a hozzá tartozó képi állományokat is, amely a böngésző oldalán egy automatikusan generált, letölthető fájlként jelenik meg a felhasználó számára.</w:t>
+      </w:r>
+    </w:p>
+    <w:p>
+      <w:pPr>
+        <w:spacing w:line="360" w:lineRule="auto"/>
+        <w:jc w:val="both"/>
+        <w:rPr>
+          <w:rFonts w:ascii="Arial" w:hAnsi="Arial" w:cs="Arial"/>
+        </w:rPr>
+      </w:pPr>
+      <w:r>
+        <w:rPr>
+          <w:rFonts w:ascii="Arial" w:hAnsi="Arial" w:cs="Arial"/>
+        </w:rPr>
+        <w:t>5.9.3. Adatimportálás</w:t>
+      </w:r>
+    </w:p>
+    <w:p>
+      <w:pPr>
+        <w:spacing w:line="360" w:lineRule="auto"/>
+        <w:jc w:val="both"/>
+        <w:rPr>
+          <w:rFonts w:ascii="Arial" w:hAnsi="Arial" w:cs="Arial"/>
+        </w:rPr>
+      </w:pPr>
+      <w:r>
+        <w:rPr>
+          <w:rFonts w:ascii="Arial" w:hAnsi="Arial" w:cs="Arial"/>
+        </w:rPr>
+        <w:t xml:space="preserve">Az importálás a rendszer legkockázatosabb, visszafordíthatatlan műveletét jelenti, ezért ehhez a felület több védelmi réteget is </w:t>
+      </w:r>
+      <w:r>
+        <w:rPr>
+          <w:rFonts w:ascii="Arial" w:hAnsi="Arial" w:cs="Arial"/>
+        </w:rPr>
+        <w:t>tartalmaz</w:t>
+      </w:r>
+      <w:r>
+        <w:rPr>
+          <w:rFonts w:ascii="Arial" w:hAnsi="Arial" w:cs="Arial"/>
+        </w:rPr>
+        <w:t xml:space="preserve">. A felhasználónak egyrészt ki kell választania a korábban exportált </w:t>
+      </w:r>
+      <w:r>
+        <w:rPr>
+          <w:rFonts w:ascii="Arial" w:hAnsi="Arial" w:cs="Arial"/>
+          <w:i/>
+          <w:iCs/>
+        </w:rPr>
+        <w:t>JSON</w:t>
+      </w:r>
+      <w:r>
+        <w:rPr>
+          <w:rFonts w:ascii="Arial" w:hAnsi="Arial" w:cs="Arial"/>
+        </w:rPr>
+        <w:t xml:space="preserve"> fájlt, másrészt egy megerősítő mezőben pontosan be kell gépelnie a DELETE EVERYTHING szöveget</w:t>
+      </w:r>
+      <w:r>
+        <w:rPr>
+          <w:rFonts w:ascii="Arial" w:hAnsi="Arial" w:cs="Arial"/>
+        </w:rPr>
+        <w:t>,</w:t>
+      </w:r>
+      <w:r>
+        <w:rPr>
+          <w:rFonts w:ascii="Arial" w:hAnsi="Arial" w:cs="Arial"/>
+        </w:rPr>
+        <w:t xml:space="preserve"> az import gomb (az </w:t>
+      </w:r>
+      <w:r>
+        <w:rPr>
+          <w:rFonts w:ascii="Arial" w:hAnsi="Arial" w:cs="Arial"/>
+          <w:i/>
+          <w:iCs/>
+        </w:rPr>
+        <w:t>admin.js</w:t>
+      </w:r>
+      <w:r>
+        <w:rPr>
+          <w:rFonts w:ascii="Arial" w:hAnsi="Arial" w:cs="Arial"/>
+        </w:rPr>
+        <w:t xml:space="preserve"> fájlban megvalósított </w:t>
+      </w:r>
+      <w:r>
+        <w:rPr>
+          <w:rFonts w:ascii="Arial" w:hAnsi="Arial" w:cs="Arial"/>
+          <w:i/>
+          <w:iCs/>
+        </w:rPr>
+        <w:t>updateImportButtonState</w:t>
+      </w:r>
+      <w:r>
+        <w:rPr>
+          <w:rFonts w:ascii="Arial" w:hAnsi="Arial" w:cs="Arial"/>
+        </w:rPr>
+        <w:t xml:space="preserve"> függvény révén) mindaddig inaktív marad, amíg mindkét feltétel nem teljesül. A gomb megnyomására a rendszer egy további, </w:t>
+      </w:r>
+      <w:r>
+        <w:rPr>
+          <w:rFonts w:ascii="Arial" w:hAnsi="Arial" w:cs="Arial"/>
+          <w:i/>
+          <w:iCs/>
+        </w:rPr>
+        <w:t>JavaScript</w:t>
+      </w:r>
+      <w:r>
+        <w:rPr>
+          <w:rFonts w:ascii="Arial" w:hAnsi="Arial" w:cs="Arial"/>
+        </w:rPr>
+        <w:t xml:space="preserve"> alapú megerősítő párbeszédablakot is megjelenít, mielőtt a tényleges importálási kérést elküldené.</w:t>
+      </w:r>
+    </w:p>
+    <w:p>
+      <w:pPr>
+        <w:spacing w:line="360" w:lineRule="auto"/>
+        <w:jc w:val="both"/>
+        <w:rPr>
+          <w:rFonts w:ascii="Arial" w:hAnsi="Arial" w:cs="Arial"/>
+        </w:rPr>
+      </w:pPr>
+      <w:r>
+        <w:rPr>
+          <w:rFonts w:ascii="Arial" w:hAnsi="Arial" w:cs="Arial"/>
+        </w:rPr>
+        <w:t xml:space="preserve">A jóváhagyást követően a kliens beolvassa és </w:t>
+      </w:r>
+      <w:r>
+        <w:rPr>
+          <w:rFonts w:ascii="Arial" w:hAnsi="Arial" w:cs="Arial"/>
+          <w:i/>
+          <w:iCs/>
+        </w:rPr>
+        <w:t>JSON</w:t>
+      </w:r>
+      <w:r>
+        <w:rPr>
+          <w:rFonts w:ascii="Arial" w:hAnsi="Arial" w:cs="Arial"/>
+        </w:rPr>
+        <w:t xml:space="preserve"> formátumúra elemzi a kiválasztott fájlt, majd egy </w:t>
+      </w:r>
+      <w:r>
+        <w:rPr>
+          <w:rFonts w:ascii="Arial" w:hAnsi="Arial" w:cs="Arial"/>
+          <w:i/>
+          <w:iCs/>
+        </w:rPr>
+        <w:t>POST</w:t>
+      </w:r>
+      <w:r>
+        <w:rPr>
+          <w:rFonts w:ascii="Arial" w:hAnsi="Arial" w:cs="Arial"/>
+        </w:rPr>
+        <w:t xml:space="preserve"> kérésben továbbítja a </w:t>
+      </w:r>
+      <w:r>
+        <w:rPr>
+          <w:rFonts w:ascii="Arial" w:hAnsi="Arial" w:cs="Arial"/>
+          <w:i/>
+          <w:iCs/>
+        </w:rPr>
+        <w:t>/api/admin/import</w:t>
+      </w:r>
+      <w:r>
+        <w:rPr>
+          <w:rFonts w:ascii="Arial" w:hAnsi="Arial" w:cs="Arial"/>
+        </w:rPr>
+        <w:t xml:space="preserve"> végpontra. A szerver oldalon (</w:t>
+      </w:r>
+      <w:r>
+        <w:rPr>
+          <w:rFonts w:ascii="Arial" w:hAnsi="Arial" w:cs="Arial"/>
+          <w:i/>
+          <w:iCs/>
+        </w:rPr>
+        <w:t>admin.py</w:t>
+      </w:r>
+      <w:r>
+        <w:rPr>
+          <w:rFonts w:ascii="Arial" w:hAnsi="Arial" w:cs="Arial"/>
+        </w:rPr>
+        <w:t>) a végpont első lépésben minden érintett táblát kiürít (</w:t>
+      </w:r>
+      <w:r>
+        <w:rPr>
+          <w:rFonts w:ascii="Arial" w:hAnsi="Arial" w:cs="Arial"/>
+          <w:i/>
+          <w:iCs/>
+        </w:rPr>
+        <w:t xml:space="preserve">TRUNCATE </w:t>
+      </w:r>
+      <w:r>
+        <w:rPr>
+          <w:rFonts w:ascii="Arial" w:hAnsi="Arial" w:cs="Arial"/>
+        </w:rPr>
+        <w:t xml:space="preserve">... </w:t>
+      </w:r>
+      <w:r>
+        <w:rPr>
+          <w:rFonts w:ascii="Arial" w:hAnsi="Arial" w:cs="Arial"/>
+          <w:i/>
+          <w:iCs/>
+        </w:rPr>
+        <w:t>CASCADE</w:t>
+      </w:r>
+      <w:r>
+        <w:rPr>
+          <w:rFonts w:ascii="Arial" w:hAnsi="Arial" w:cs="Arial"/>
+        </w:rPr>
+        <w:t xml:space="preserve"> paranccsal), majd a beérkezett adatok alapján, táblánként újra feltölti azokat, ügyelve arra, hogy a dátum- és decimális típusú mezők a megfelelő </w:t>
+      </w:r>
+      <w:r>
+        <w:rPr>
+          <w:rFonts w:ascii="Arial" w:hAnsi="Arial" w:cs="Arial"/>
+          <w:i/>
+          <w:iCs/>
+        </w:rPr>
+        <w:t>Python</w:t>
+      </w:r>
+      <w:r>
+        <w:rPr>
+          <w:rFonts w:ascii="Arial" w:hAnsi="Arial" w:cs="Arial"/>
+        </w:rPr>
+        <w:t xml:space="preserve">-típusra legyenek visszaalakítva a </w:t>
+      </w:r>
+      <w:r>
+        <w:rPr>
+          <w:rFonts w:ascii="Arial" w:hAnsi="Arial" w:cs="Arial"/>
+          <w:i/>
+          <w:iCs/>
+        </w:rPr>
+        <w:t>_parse_value</w:t>
+      </w:r>
+      <w:r>
+        <w:rPr>
+          <w:rFonts w:ascii="Arial" w:hAnsi="Arial" w:cs="Arial"/>
+        </w:rPr>
+        <w:t xml:space="preserve"> segédfüggvény segítségével. A rekordok visszaírását követően a rendszer minden, egész szám típusú azonosítóval rendelkező tábla esetén helyreállítja az adatbázis automatikus sorszámgenerálását (szekvenciáját) a legnagyobb beimportált azonosító alapján, elkerülve ezáltal a jövőbeli új rekordok létrehozásakor fellépő azonosító-ütközéseket. Végül a rendszer az exportált </w:t>
+      </w:r>
+      <w:r>
+        <w:rPr>
+          <w:rFonts w:ascii="Arial" w:hAnsi="Arial" w:cs="Arial"/>
+          <w:i/>
+          <w:iCs/>
+        </w:rPr>
+        <w:t>Base64</w:t>
+      </w:r>
+      <w:r>
+        <w:rPr>
+          <w:rFonts w:ascii="Arial" w:hAnsi="Arial" w:cs="Arial"/>
+        </w:rPr>
+        <w:t>-kódolt képfájlokat visszaalakítja és elmenti a szerver megfelelő könyvtárába. A művelet hibája esetén a rendszer az összes elvégzett adatbázis-módosítást visszavonja (rollback), így egy sikertelen import nem hagyhatja az adatbázist részlegesen, inkonzisztens állapotban.</w:t>
+      </w:r>
+    </w:p>
+    <w:p>
+      <w:pPr>
+        <w:spacing w:line="360" w:lineRule="auto"/>
+        <w:jc w:val="both"/>
+        <w:rPr>
+          <w:rFonts w:ascii="Arial" w:hAnsi="Arial" w:cs="Arial"/>
+        </w:rPr>
+      </w:pPr>
+      <w:r>
+        <w:rPr>
+          <w:rFonts w:ascii="Arial" w:hAnsi="Arial" w:cs="Arial"/>
+        </w:rPr>
+        <w:t>A sikeres importálás után a felület táblánkénti bontásban visszajelzi a beimportált rekordok számát, ezzel is megerősítve a felhasználó számára a művelet eredményét.</w:t>
+      </w:r>
+    </w:p>
+    <w:p>
+      <w:pPr>
+        <w:spacing w:line="360" w:lineRule="auto"/>
+        <w:jc w:val="both"/>
+        <w:rPr>
+          <w:rFonts w:ascii="Arial" w:hAnsi="Arial" w:cs="Arial"/>
+        </w:rPr>
+      </w:pPr>
+      <w:r>
+        <w:rPr>
+          <w:rFonts w:ascii="Arial" w:hAnsi="Arial" w:cs="Arial"/>
+        </w:rPr>
+        <w:lastRenderedPageBreak/>
+        <w:t>5.9.4. Visszajelzések kezelése</w:t>
+      </w:r>
+    </w:p>
+    <w:p>
+      <w:pPr>
+        <w:spacing w:line="360" w:lineRule="auto"/>
+        <w:jc w:val="both"/>
+        <w:rPr>
+          <w:rFonts w:ascii="Arial" w:hAnsi="Arial" w:cs="Arial"/>
+        </w:rPr>
+      </w:pPr>
+      <w:r>
+        <w:rPr>
+          <w:rFonts w:ascii="Arial" w:hAnsi="Arial" w:cs="Arial"/>
+        </w:rPr>
+        <w:t>Egy</w:t>
+      </w:r>
+      <w:r>
+        <w:rPr>
+          <w:rFonts w:ascii="Arial" w:hAnsi="Arial" w:cs="Arial"/>
+        </w:rPr>
+        <w:t xml:space="preserve"> külön oldalon (frontend/pages/admin/admin_feedback.html) </w:t>
+      </w:r>
+      <w:r>
+        <w:rPr>
+          <w:rFonts w:ascii="Arial" w:hAnsi="Arial" w:cs="Arial"/>
+        </w:rPr>
+        <w:t>áttekinthetők</w:t>
+      </w:r>
+      <w:r>
+        <w:rPr>
+          <w:rFonts w:ascii="Arial" w:hAnsi="Arial" w:cs="Arial"/>
+        </w:rPr>
+        <w:t xml:space="preserve"> a felhasználók által beküldött visszajelzések. A hitelesítés itt is ugyanazon a titkos admin kulcson keresztül történik, mint az adatbázis export/import funkció esetében. A sikeres belépést követően a felület automatikusan lekérdezi a beérkezett visszajelzéseket a backend megfelelő végpontjáról.</w:t>
+      </w:r>
+    </w:p>
+    <w:p>
+      <w:pPr>
+        <w:spacing w:line="360" w:lineRule="auto"/>
+        <w:jc w:val="both"/>
+        <w:rPr>
+          <w:rFonts w:ascii="Arial" w:hAnsi="Arial" w:cs="Arial"/>
+        </w:rPr>
+      </w:pPr>
+      <w:r>
+        <w:rPr>
+          <w:rFonts w:ascii="Arial" w:hAnsi="Arial" w:cs="Arial"/>
+        </w:rPr>
+        <w:t>A szerver oldalon a lekérdezésért felelős, admin</w:t>
       </w:r>
       <w:r>
         <w:rPr>
@@ -12967,168 +13759,31 @@
         <w:rPr>
           <w:rFonts w:ascii="Arial" w:hAnsi="Arial" w:cs="Arial"/>
         </w:rPr>
-        <w:t>A</w:t>
-      </w:r>
-      <w:r>
-        <w:rPr>
-          <w:rFonts w:ascii="Arial" w:hAnsi="Arial" w:cs="Arial"/>
-        </w:rPr>
-        <w:t xml:space="preserve">mennyiben a szerveren nincs beállítva </w:t>
-      </w:r>
-      <w:r>
-        <w:rPr>
-          <w:rFonts w:ascii="Arial" w:hAnsi="Arial" w:cs="Arial"/>
-        </w:rPr>
-        <w:t xml:space="preserve">titkos </w:t>
-      </w:r>
-      <w:r>
-        <w:rPr>
-          <w:rFonts w:ascii="Arial" w:hAnsi="Arial" w:cs="Arial"/>
-        </w:rPr>
-        <w:t>admin kulcs, a rendszer 503-as státuszkóddal jelzi, hogy az admin funkció nem elérhető, helytelen kulcs esetén pedig 401-es hibaüzenettel utasítja el a kérést.</w:t>
-      </w:r>
-    </w:p>
-    <w:p>
-      <w:pPr>
-        <w:spacing w:line="360" w:lineRule="auto"/>
-        <w:jc w:val="both"/>
-        <w:rPr>
-          <w:rFonts w:ascii="Arial" w:hAnsi="Arial" w:cs="Arial"/>
-        </w:rPr>
-      </w:pPr>
-      <w:r>
-        <w:rPr>
-          <w:rFonts w:ascii="Arial" w:hAnsi="Arial" w:cs="Arial"/>
-        </w:rPr>
-        <w:t>5.9.2. Adatexportálás</w:t>
-      </w:r>
-    </w:p>
-    <w:p>
-      <w:pPr>
-        <w:spacing w:line="360" w:lineRule="auto"/>
-        <w:jc w:val="both"/>
-        <w:rPr>
-          <w:rFonts w:ascii="Arial" w:hAnsi="Arial" w:cs="Arial"/>
-        </w:rPr>
-      </w:pPr>
-      <w:r>
-        <w:rPr>
-          <w:rFonts w:ascii="Arial" w:hAnsi="Arial" w:cs="Arial"/>
-        </w:rPr>
-        <w:t>A sikeres hitelesítést követően megjelenő admin panelen az „Export” gomb megnyomására a kliens egy GET kérést küld a </w:t>
-      </w:r>
-      <w:r>
-        <w:rPr>
-          <w:rFonts w:ascii="Arial" w:hAnsi="Arial" w:cs="Arial"/>
-          <w:i/>
-          <w:iCs/>
-        </w:rPr>
-        <w:t>/api/admin/export</w:t>
-      </w:r>
-      <w:r>
-        <w:rPr>
-          <w:rFonts w:ascii="Arial" w:hAnsi="Arial" w:cs="Arial"/>
-        </w:rPr>
-        <w:t> végpontra. A szerver oldalon ez a végpont, az </w:t>
-      </w:r>
-      <w:r>
-        <w:rPr>
-          <w:rFonts w:ascii="Arial" w:hAnsi="Arial" w:cs="Arial"/>
-          <w:i/>
-          <w:iCs/>
-        </w:rPr>
-        <w:t>admin.py</w:t>
-      </w:r>
-      <w:r>
-        <w:rPr>
-          <w:rFonts w:ascii="Arial" w:hAnsi="Arial" w:cs="Arial"/>
-        </w:rPr>
-        <w:t> fájlban definiált </w:t>
-      </w:r>
-      <w:r>
-        <w:rPr>
-          <w:rFonts w:ascii="Arial" w:hAnsi="Arial" w:cs="Arial"/>
-          <w:i/>
-          <w:iCs/>
-        </w:rPr>
-        <w:t>_EXPORT_MODELS</w:t>
-      </w:r>
-      <w:r>
-        <w:rPr>
-          <w:rFonts w:ascii="Arial" w:hAnsi="Arial" w:cs="Arial"/>
-        </w:rPr>
-        <w:t> listában rögzített sorrendben végigiterál az alkalmazás mind a 12 adatbázis-tábláján, és minden sorát szótár formátumúra alakítja, a dátum- és decimális típusú mezőket JSON-kompatibilis formára konvertálva.</w:t>
-      </w:r>
-    </w:p>
-    <w:p>
-      <w:pPr>
-        <w:spacing w:line="360" w:lineRule="auto"/>
-        <w:jc w:val="both"/>
-        <w:rPr>
-          <w:rFonts w:ascii="Arial" w:hAnsi="Arial" w:cs="Arial"/>
-        </w:rPr>
-      </w:pPr>
-      <w:r>
-        <w:rPr>
-          <w:rFonts w:ascii="Arial" w:hAnsi="Arial" w:cs="Arial"/>
-        </w:rPr>
-        <w:t>Az adattáblák tartalma mellett a rendszer a feltöltött fényképfájlokat is beemeli az exportba: a helyszínekhez tartozó képeket (image_files), valamint a visszajelzésekhez csatolt képeket (feedback_image_files) a szerver a lemezről beolvassa, és Base64 kódolással szövegessé alakítva csatolja a JSON válaszhoz. Ennek köszönhetően egyetlen fájl (travelapp-export-&lt;időbélyeg&gt;.json) tartalmazza a teljes adatbázis tartalmát és a hozzá tartozó képi állományokat is, amely a böngésző oldalán egy automatikusan generált, letölthető fájlként jelenik meg a felhasználó számára.</w:t>
-      </w:r>
-    </w:p>
-    <w:p>
-      <w:pPr>
-        <w:spacing w:line="360" w:lineRule="auto"/>
-        <w:jc w:val="both"/>
-        <w:rPr>
-          <w:rFonts w:ascii="Arial" w:hAnsi="Arial" w:cs="Arial"/>
-        </w:rPr>
-      </w:pPr>
-      <w:r>
-        <w:rPr>
-          <w:rFonts w:ascii="Arial" w:hAnsi="Arial" w:cs="Arial"/>
-        </w:rPr>
-        <w:t>5.9.3. Adatimportálás</w:t>
-      </w:r>
-    </w:p>
-    <w:p>
-      <w:pPr>
-        <w:spacing w:line="360" w:lineRule="auto"/>
-        <w:jc w:val="both"/>
-        <w:rPr>
-          <w:rFonts w:ascii="Arial" w:hAnsi="Arial" w:cs="Arial"/>
-        </w:rPr>
-      </w:pPr>
-      <w:r>
-        <w:rPr>
-          <w:rFonts w:ascii="Arial" w:hAnsi="Arial" w:cs="Arial"/>
-        </w:rPr>
-        <w:t xml:space="preserve">Az importálás a rendszer legkockázatosabb, visszafordíthatatlan műveletét jelenti, ezért ehhez a felület több védelmi réteget is </w:t>
-      </w:r>
-      <w:r>
-        <w:rPr>
-          <w:rFonts w:ascii="Arial" w:hAnsi="Arial" w:cs="Arial"/>
-        </w:rPr>
-        <w:t>tartalmaz</w:t>
-      </w:r>
-      <w:r>
-        <w:rPr>
-          <w:rFonts w:ascii="Arial" w:hAnsi="Arial" w:cs="Arial"/>
-        </w:rPr>
-        <w:t xml:space="preserve">. A felhasználónak egyrészt ki kell választania a korábban exportált </w:t>
-      </w:r>
-      <w:r>
-        <w:rPr>
-          <w:rFonts w:ascii="Arial" w:hAnsi="Arial" w:cs="Arial"/>
-          <w:i/>
-          <w:iCs/>
-        </w:rPr>
-        <w:t>JSON</w:t>
-      </w:r>
-      <w:r>
-        <w:rPr>
-          <w:rFonts w:ascii="Arial" w:hAnsi="Arial" w:cs="Arial"/>
-        </w:rPr>
-        <w:t xml:space="preserve"> fájlt, másrészt egy megerősítő mezőben pontosan be kell gépelnie a DELETE EVERYTHING szöveget</w:t>
+        <w:t>jogosultsághoz kötött végpont a visszajelzéseket a beküldés időpontja szerint csökkenő sorrendben</w:t>
+      </w:r>
+      <w:r>
+        <w:rPr>
+          <w:rFonts w:ascii="Arial" w:hAnsi="Arial" w:cs="Arial"/>
+        </w:rPr>
+        <w:t xml:space="preserve"> (</w:t>
+      </w:r>
+      <w:r>
+        <w:rPr>
+          <w:rFonts w:ascii="Arial" w:hAnsi="Arial" w:cs="Arial"/>
+        </w:rPr>
+        <w:t>legfeljebb 200 elem</w:t>
+      </w:r>
+      <w:r>
+        <w:rPr>
+          <w:rFonts w:ascii="Arial" w:hAnsi="Arial" w:cs="Arial"/>
+        </w:rPr>
+        <w:t>)</w:t>
+      </w:r>
+      <w:r>
+        <w:rPr>
+          <w:rFonts w:ascii="Arial" w:hAnsi="Arial" w:cs="Arial"/>
+        </w:rPr>
+        <w:t xml:space="preserve"> adja vissza. Minden egyes bejegyzéshez a rendszer megkísérli lekérdezni a küldő felhasználó nevét és e-mail címét</w:t>
       </w:r>
       <w:r>
         <w:rPr>
@@ -13140,269 +13795,28 @@
         <w:rPr>
           <w:rFonts w:ascii="Arial" w:hAnsi="Arial" w:cs="Arial"/>
         </w:rPr>
-        <w:t xml:space="preserve"> az import gomb (az </w:t>
-      </w:r>
-      <w:r>
-        <w:rPr>
-          <w:rFonts w:ascii="Arial" w:hAnsi="Arial" w:cs="Arial"/>
-          <w:i/>
-          <w:iCs/>
-        </w:rPr>
-        <w:t>admin.js</w:t>
-      </w:r>
-      <w:r>
-        <w:rPr>
-          <w:rFonts w:ascii="Arial" w:hAnsi="Arial" w:cs="Arial"/>
-        </w:rPr>
-        <w:t xml:space="preserve"> fájlban megvalósított </w:t>
-      </w:r>
-      <w:r>
-        <w:rPr>
-          <w:rFonts w:ascii="Arial" w:hAnsi="Arial" w:cs="Arial"/>
-          <w:i/>
-          <w:iCs/>
-        </w:rPr>
-        <w:t>updateImportButtonState</w:t>
-      </w:r>
-      <w:r>
-        <w:rPr>
-          <w:rFonts w:ascii="Arial" w:hAnsi="Arial" w:cs="Arial"/>
-        </w:rPr>
-        <w:t xml:space="preserve"> függvény révén) mindaddig inaktív marad, amíg mindkét feltétel nem teljesül. A gomb megnyomására a rendszer egy további, </w:t>
-      </w:r>
-      <w:r>
-        <w:rPr>
-          <w:rFonts w:ascii="Arial" w:hAnsi="Arial" w:cs="Arial"/>
-          <w:i/>
-          <w:iCs/>
-        </w:rPr>
-        <w:t>JavaScript</w:t>
-      </w:r>
-      <w:r>
-        <w:rPr>
-          <w:rFonts w:ascii="Arial" w:hAnsi="Arial" w:cs="Arial"/>
-        </w:rPr>
-        <w:t xml:space="preserve"> alapú megerősítő párbeszédablakot is megjelenít, mielőtt a tényleges importálási kérést elküldené.</w:t>
-      </w:r>
-    </w:p>
-    <w:p>
-      <w:pPr>
-        <w:spacing w:line="360" w:lineRule="auto"/>
-        <w:jc w:val="both"/>
-        <w:rPr>
-          <w:rFonts w:ascii="Arial" w:hAnsi="Arial" w:cs="Arial"/>
-        </w:rPr>
-      </w:pPr>
-      <w:r>
-        <w:rPr>
-          <w:rFonts w:ascii="Arial" w:hAnsi="Arial" w:cs="Arial"/>
-        </w:rPr>
-        <w:lastRenderedPageBreak/>
-        <w:t xml:space="preserve">A jóváhagyást követően a kliens beolvassa és </w:t>
-      </w:r>
-      <w:r>
-        <w:rPr>
-          <w:rFonts w:ascii="Arial" w:hAnsi="Arial" w:cs="Arial"/>
-          <w:i/>
-          <w:iCs/>
-        </w:rPr>
-        <w:t>JSON</w:t>
-      </w:r>
-      <w:r>
-        <w:rPr>
-          <w:rFonts w:ascii="Arial" w:hAnsi="Arial" w:cs="Arial"/>
-        </w:rPr>
-        <w:t xml:space="preserve"> formátumúra elemzi a kiválasztott fájlt, majd egy </w:t>
-      </w:r>
-      <w:r>
-        <w:rPr>
-          <w:rFonts w:ascii="Arial" w:hAnsi="Arial" w:cs="Arial"/>
-          <w:i/>
-          <w:iCs/>
-        </w:rPr>
-        <w:t>POST</w:t>
-      </w:r>
-      <w:r>
-        <w:rPr>
-          <w:rFonts w:ascii="Arial" w:hAnsi="Arial" w:cs="Arial"/>
-        </w:rPr>
-        <w:t xml:space="preserve"> kérésben továbbítja a </w:t>
-      </w:r>
-      <w:r>
-        <w:rPr>
-          <w:rFonts w:ascii="Arial" w:hAnsi="Arial" w:cs="Arial"/>
-          <w:i/>
-          <w:iCs/>
-        </w:rPr>
-        <w:t>/api/admin/import</w:t>
-      </w:r>
-      <w:r>
-        <w:rPr>
-          <w:rFonts w:ascii="Arial" w:hAnsi="Arial" w:cs="Arial"/>
-        </w:rPr>
-        <w:t xml:space="preserve"> végpontra. A szerver oldalon (</w:t>
-      </w:r>
-      <w:r>
-        <w:rPr>
-          <w:rFonts w:ascii="Arial" w:hAnsi="Arial" w:cs="Arial"/>
-          <w:i/>
-          <w:iCs/>
-        </w:rPr>
-        <w:t>admin.py</w:t>
-      </w:r>
-      <w:r>
-        <w:rPr>
-          <w:rFonts w:ascii="Arial" w:hAnsi="Arial" w:cs="Arial"/>
-        </w:rPr>
-        <w:t>) a végpont első lépésben minden érintett táblát kiürít (</w:t>
-      </w:r>
-      <w:r>
-        <w:rPr>
-          <w:rFonts w:ascii="Arial" w:hAnsi="Arial" w:cs="Arial"/>
-          <w:i/>
-          <w:iCs/>
-        </w:rPr>
-        <w:t xml:space="preserve">TRUNCATE </w:t>
-      </w:r>
-      <w:r>
-        <w:rPr>
-          <w:rFonts w:ascii="Arial" w:hAnsi="Arial" w:cs="Arial"/>
-        </w:rPr>
-        <w:t xml:space="preserve">... </w:t>
-      </w:r>
-      <w:r>
-        <w:rPr>
-          <w:rFonts w:ascii="Arial" w:hAnsi="Arial" w:cs="Arial"/>
-          <w:i/>
-          <w:iCs/>
-        </w:rPr>
-        <w:t>CASCADE</w:t>
-      </w:r>
-      <w:r>
-        <w:rPr>
-          <w:rFonts w:ascii="Arial" w:hAnsi="Arial" w:cs="Arial"/>
-        </w:rPr>
-        <w:t xml:space="preserve"> paranccsal), majd a beérkezett adatok alapján, táblánként újra feltölti azokat, ügyelve arra, hogy a dátum- és decimális típusú mezők a megfelelő </w:t>
-      </w:r>
-      <w:r>
-        <w:rPr>
-          <w:rFonts w:ascii="Arial" w:hAnsi="Arial" w:cs="Arial"/>
-          <w:i/>
-          <w:iCs/>
-        </w:rPr>
-        <w:t>Python</w:t>
-      </w:r>
-      <w:r>
-        <w:rPr>
-          <w:rFonts w:ascii="Arial" w:hAnsi="Arial" w:cs="Arial"/>
-        </w:rPr>
-        <w:t xml:space="preserve">-típusra legyenek visszaalakítva a </w:t>
-      </w:r>
-      <w:r>
-        <w:rPr>
-          <w:rFonts w:ascii="Arial" w:hAnsi="Arial" w:cs="Arial"/>
-          <w:i/>
-          <w:iCs/>
-        </w:rPr>
-        <w:t>_parse_value</w:t>
-      </w:r>
-      <w:r>
-        <w:rPr>
-          <w:rFonts w:ascii="Arial" w:hAnsi="Arial" w:cs="Arial"/>
-        </w:rPr>
-        <w:t xml:space="preserve"> segédfüggvény segítségével. A rekordok visszaírását követően a rendszer minden, egész szám típusú azonosítóval rendelkező tábla esetén helyreállítja az adatbázis automatikus sorszámgenerálását (szekvenciáját) a legnagyobb beimportált azonosító alapján, elkerülve ezáltal a jövőbeli új rekordok létrehozásakor fellépő azonosító-ütközéseket. Végül a rendszer az exportált </w:t>
-      </w:r>
-      <w:r>
-        <w:rPr>
-          <w:rFonts w:ascii="Arial" w:hAnsi="Arial" w:cs="Arial"/>
-          <w:i/>
-          <w:iCs/>
-        </w:rPr>
-        <w:t>Base64</w:t>
-      </w:r>
-      <w:r>
-        <w:rPr>
-          <w:rFonts w:ascii="Arial" w:hAnsi="Arial" w:cs="Arial"/>
-        </w:rPr>
-        <w:t>-kódolt képfájlokat visszaalakítja és elmenti a szerver megfelelő könyvtárába. A művelet hibája esetén a rendszer az összes elvégzett adatbázis-módosítást visszavonja (rollback), így egy sikertelen import nem hagyhatja az adatbázist részlegesen, inkonzisztens állapotban.</w:t>
-      </w:r>
-    </w:p>
-    <w:p>
-      <w:pPr>
-        <w:spacing w:line="360" w:lineRule="auto"/>
-        <w:jc w:val="both"/>
-        <w:rPr>
-          <w:rFonts w:ascii="Arial" w:hAnsi="Arial" w:cs="Arial"/>
-        </w:rPr>
-      </w:pPr>
-      <w:r>
-        <w:rPr>
-          <w:rFonts w:ascii="Arial" w:hAnsi="Arial" w:cs="Arial"/>
-        </w:rPr>
-        <w:t>A sikeres importálás után a felület táblánkénti bontásban visszajelzi a beimportált rekordok számát, ezzel is megerősítve a felhasználó számára a művelet eredményét.</w:t>
-      </w:r>
-    </w:p>
-    <w:p>
-      <w:pPr>
-        <w:spacing w:line="360" w:lineRule="auto"/>
-        <w:jc w:val="both"/>
-        <w:rPr>
-          <w:rFonts w:ascii="Arial" w:hAnsi="Arial" w:cs="Arial"/>
-        </w:rPr>
-      </w:pPr>
-      <w:r>
-        <w:rPr>
-          <w:rFonts w:ascii="Arial" w:hAnsi="Arial" w:cs="Arial"/>
-        </w:rPr>
-        <w:t>5.9.4. Visszajelzések kezelése</w:t>
-      </w:r>
-    </w:p>
-    <w:p>
-      <w:pPr>
-        <w:spacing w:line="360" w:lineRule="auto"/>
-        <w:jc w:val="both"/>
-        <w:rPr>
-          <w:rFonts w:ascii="Arial" w:hAnsi="Arial" w:cs="Arial"/>
-        </w:rPr>
-      </w:pPr>
-      <w:r>
-        <w:rPr>
-          <w:rFonts w:ascii="Arial" w:hAnsi="Arial" w:cs="Arial"/>
-        </w:rPr>
-        <w:t>Egy</w:t>
-      </w:r>
-      <w:r>
-        <w:rPr>
-          <w:rFonts w:ascii="Arial" w:hAnsi="Arial" w:cs="Arial"/>
-        </w:rPr>
-        <w:t xml:space="preserve"> külön oldalon (frontend/pages/admin/admin_feedback.html) </w:t>
-      </w:r>
-      <w:r>
-        <w:rPr>
-          <w:rFonts w:ascii="Arial" w:hAnsi="Arial" w:cs="Arial"/>
-        </w:rPr>
-        <w:t>áttekinthetők</w:t>
-      </w:r>
-      <w:r>
-        <w:rPr>
-          <w:rFonts w:ascii="Arial" w:hAnsi="Arial" w:cs="Arial"/>
-        </w:rPr>
-        <w:t xml:space="preserve"> a felhasználók által beküldött visszajelzések. A hitelesítés itt is ugyanazon a titkos admin kulcson keresztül történik, mint az adatbázis export/import funkció esetében. A sikeres belépést követően a felület automatikusan lekérdezi a beérkezett visszajelzéseket a backend megfelelő végpontjáról.</w:t>
-      </w:r>
-    </w:p>
-    <w:p>
-      <w:pPr>
-        <w:spacing w:line="360" w:lineRule="auto"/>
-        <w:jc w:val="both"/>
-        <w:rPr>
-          <w:rFonts w:ascii="Arial" w:hAnsi="Arial" w:cs="Arial"/>
-        </w:rPr>
-      </w:pPr>
-      <w:r>
-        <w:rPr>
-          <w:rFonts w:ascii="Arial" w:hAnsi="Arial" w:cs="Arial"/>
-        </w:rPr>
-        <w:t>A szerver oldalon a lekérdezésért felelős, admin</w:t>
+        <w:t xml:space="preserve"> amennyiben a felhasználói fiók időközben törlésre került, a rendszer egy, az azonosítót tartalmazó helyettesítő megjelenítést használ.</w:t>
+      </w:r>
+    </w:p>
+    <w:p>
+      <w:pPr>
+        <w:spacing w:line="360" w:lineRule="auto"/>
+        <w:jc w:val="both"/>
+        <w:rPr>
+          <w:rFonts w:ascii="Arial" w:hAnsi="Arial" w:cs="Arial"/>
+        </w:rPr>
+      </w:pPr>
+      <w:r>
+        <w:rPr>
+          <w:rFonts w:ascii="Arial" w:hAnsi="Arial" w:cs="Arial"/>
+        </w:rPr>
+        <w:t>A felületen minden visszajelzés önálló kártyaként jelenik meg, amely tartalmazza a küldő nevét, e-mail címét, a beküldés dátumát és az üzenet szövegét</w:t>
+      </w:r>
+      <w:r>
+        <w:rPr>
+          <w:rFonts w:ascii="Arial" w:hAnsi="Arial" w:cs="Arial"/>
+        </w:rPr>
+        <w:t>,</w:t>
       </w:r>
       <w:r>
         <w:rPr>
@@ -13414,89 +13828,13 @@
         <w:rPr>
           <w:rFonts w:ascii="Arial" w:hAnsi="Arial" w:cs="Arial"/>
         </w:rPr>
-        <w:t>jogosultsághoz kötött végpont a visszajelzéseket a beküldés időpontja szerint csökkenő sorrendben</w:t>
-      </w:r>
-      <w:r>
-        <w:rPr>
-          <w:rFonts w:ascii="Arial" w:hAnsi="Arial" w:cs="Arial"/>
-        </w:rPr>
-        <w:t xml:space="preserve"> (</w:t>
-      </w:r>
-      <w:r>
-        <w:rPr>
-          <w:rFonts w:ascii="Arial" w:hAnsi="Arial" w:cs="Arial"/>
-        </w:rPr>
-        <w:t>legfeljebb 200 elem</w:t>
-      </w:r>
-      <w:r>
-        <w:rPr>
-          <w:rFonts w:ascii="Arial" w:hAnsi="Arial" w:cs="Arial"/>
-        </w:rPr>
-        <w:t>)</w:t>
-      </w:r>
-      <w:r>
-        <w:rPr>
-          <w:rFonts w:ascii="Arial" w:hAnsi="Arial" w:cs="Arial"/>
-        </w:rPr>
-        <w:t xml:space="preserve"> adja vissza. Minden egyes bejegyzéshez a rendszer megkísérli lekérdezni a küldő felhasználó nevét és e-mail címét</w:t>
-      </w:r>
-      <w:r>
-        <w:rPr>
-          <w:rFonts w:ascii="Arial" w:hAnsi="Arial" w:cs="Arial"/>
-        </w:rPr>
-        <w:t>,</w:t>
-      </w:r>
-      <w:r>
-        <w:rPr>
-          <w:rFonts w:ascii="Arial" w:hAnsi="Arial" w:cs="Arial"/>
-        </w:rPr>
-        <w:t xml:space="preserve"> amennyiben a felhasználói fiók időközben törlésre került, a rendszer egy, az azonosítót tartalmazó helyettesítő megjelenítést használ.</w:t>
-      </w:r>
-    </w:p>
-    <w:p>
-      <w:pPr>
-        <w:spacing w:line="360" w:lineRule="auto"/>
-        <w:jc w:val="both"/>
-        <w:rPr>
-          <w:rFonts w:ascii="Arial" w:hAnsi="Arial" w:cs="Arial"/>
-        </w:rPr>
-      </w:pPr>
-      <w:r>
-        <w:rPr>
-          <w:rFonts w:ascii="Arial" w:hAnsi="Arial" w:cs="Arial"/>
-        </w:rPr>
-        <w:t>A felületen minden visszajelzés önálló kártyaként jelenik meg, amely tartalmazza a küldő nevét, e-mail címét, a beküldés dátumát és az üzenet szövegét</w:t>
-      </w:r>
-      <w:r>
-        <w:rPr>
-          <w:rFonts w:ascii="Arial" w:hAnsi="Arial" w:cs="Arial"/>
-        </w:rPr>
-        <w:t>,</w:t>
-      </w:r>
-      <w:r>
-        <w:rPr>
-          <w:rFonts w:ascii="Arial" w:hAnsi="Arial" w:cs="Arial"/>
-        </w:rPr>
-        <w:t xml:space="preserve"> </w:t>
-      </w:r>
-      <w:r>
-        <w:rPr>
-          <w:rFonts w:ascii="Arial" w:hAnsi="Arial" w:cs="Arial"/>
-        </w:rPr>
         <w:t>valamint, ha</w:t>
       </w:r>
       <w:r>
         <w:rPr>
           <w:rFonts w:ascii="Arial" w:hAnsi="Arial" w:cs="Arial"/>
         </w:rPr>
-        <w:t xml:space="preserve"> a bejegyzéshez kép is tartozik, az szintén megjelenik, és új lapon, teljes méretben is </w:t>
-      </w:r>
-      <w:r>
-        <w:rPr>
-          <w:rFonts w:ascii="Arial" w:hAnsi="Arial" w:cs="Arial"/>
-        </w:rPr>
-        <w:lastRenderedPageBreak/>
-        <w:t xml:space="preserve">megtekinthető. </w:t>
+        <w:t xml:space="preserve"> a bejegyzéshez kép is tartozik, az szintén megjelenik, és új lapon, teljes méretben is megtekinthető. </w:t>
       </w:r>
       <w:r>
         <w:rPr>
@@ -13684,7 +14022,14 @@
         <w:rPr>
           <w:rFonts w:ascii="Arial" w:hAnsi="Arial" w:cs="Arial"/>
         </w:rPr>
-        <w:t xml:space="preserve"> a két legnépszerűbb, alacsony költségű járatokat üzemeltető légitársaság (Ryanair és Wizz Air) mellett két további légitársaság (KLM és Lufthansa) adatait is felhasználtam, amelyek a nagyobb, interkontinentális csomóponti repülőterek lefedettségét biztosítják. Ez a négyes összetétel együttesen lehetővé teszi, hogy az alkalmazás mind a kisebb regionális, mind a nagyobb nemzetközi repülőterek közötti közvetlen összeköttetéseket megfelelő részletességgel tartalmazza.</w:t>
+        <w:t xml:space="preserve"> a két legnépszerűbb, alacsony költségű járatokat üzemeltető légitársaság (Ryanair és </w:t>
+      </w:r>
+      <w:r>
+        <w:rPr>
+          <w:rFonts w:ascii="Arial" w:hAnsi="Arial" w:cs="Arial"/>
+        </w:rPr>
+        <w:lastRenderedPageBreak/>
+        <w:t>Wizz Air) mellett két további légitársaság (KLM és Lufthansa) adatait is felhasználtam, amelyek a nagyobb, interkontinentális csomóponti repülőterek lefedettségét biztosítják. Ez a négyes összetétel együttesen lehetővé teszi, hogy az alkalmazás mind a kisebb regionális, mind a nagyobb nemzetközi repülőterek közötti közvetlen összeköttetéseket megfelelő részletességgel tartalmazza.</w:t>
       </w:r>
     </w:p>
     <w:p>
@@ -13783,176 +14128,170 @@
         <w:rPr>
           <w:rFonts w:ascii="Arial" w:hAnsi="Arial" w:cs="Arial"/>
         </w:rPr>
-        <w:t xml:space="preserve">nagybetűssé alakítja, kiszűri azokat a bejegyzéseket, amelyeknél hiányzik az indulási vagy érkezési repülőtér, amelyeknél az indulási és érkezési pont </w:t>
-      </w:r>
-      <w:r>
-        <w:rPr>
-          <w:rFonts w:ascii="Arial" w:hAnsi="Arial" w:cs="Arial"/>
+        <w:t>nagybetűssé alakítja, kiszűri azokat a bejegyzéseket, amelyeknél hiányzik az indulási vagy érkezési repülőtér, amelyeknél az indulási és érkezési pont megegyezik, vagy amelyek duplikáltak, és minderről egy stats szótárban statisztikát is vezet (lekérdezett, beszúrt, frissített és kihagyott útvonalak száma).</w:t>
+      </w:r>
+    </w:p>
+    <w:p>
+      <w:pPr>
+        <w:spacing w:line="360" w:lineRule="auto"/>
+        <w:jc w:val="both"/>
+        <w:rPr>
+          <w:rFonts w:ascii="Arial" w:hAnsi="Arial" w:cs="Arial"/>
+        </w:rPr>
+      </w:pPr>
+      <w:r>
+        <w:rPr>
+          <w:rFonts w:ascii="Arial" w:hAnsi="Arial" w:cs="Arial"/>
+        </w:rPr>
+        <w:t>Az adatbázisba mentés előtt a függvény biztosítja a hivatkozási integritást: minden előforduló légitársaságot és repülőteret ellenőriz, és amennyiben még nem szerepelnek az adatbázisban, a</w:t>
+      </w:r>
+      <w:r>
+        <w:rPr>
+          <w:rFonts w:ascii="Arial" w:hAnsi="Arial" w:cs="Arial"/>
+        </w:rPr>
+        <w:t>z</w:t>
+      </w:r>
+      <w:r>
+        <w:rPr>
+          <w:rFonts w:ascii="Arial" w:hAnsi="Arial" w:cs="Arial"/>
+        </w:rPr>
+        <w:t xml:space="preserve"> </w:t>
+      </w:r>
+      <w:r>
+        <w:rPr>
+          <w:rFonts w:ascii="Arial" w:hAnsi="Arial" w:cs="Arial"/>
+          <w:i/>
+          <w:iCs/>
+        </w:rPr>
+        <w:t>_ensure_airline</w:t>
+      </w:r>
+      <w:r>
+        <w:rPr>
+          <w:rFonts w:ascii="Arial" w:hAnsi="Arial" w:cs="Arial"/>
+        </w:rPr>
+        <w:t xml:space="preserve"> segédfüggvénnyel, illetve közvetlen </w:t>
+      </w:r>
+      <w:r>
+        <w:rPr>
+          <w:rFonts w:ascii="Arial" w:hAnsi="Arial" w:cs="Arial"/>
+          <w:i/>
+          <w:iCs/>
+        </w:rPr>
+        <w:t>Airport</w:t>
+      </w:r>
+      <w:r>
+        <w:rPr>
+          <w:rFonts w:ascii="Arial" w:hAnsi="Arial" w:cs="Arial"/>
+        </w:rPr>
+        <w:t xml:space="preserve"> rekord létrehozásával automatikusan felveszi őket. Ezt követően minden egyes útvonalhoz megvizsgálja, hogy az adott légitársaság–indulás–érkezés hármas már létezik-e az adatbázisban: amennyiben igen, a meglévő rekordot frissíti (pl. szezonalitás, érvényességi időszak), egyébként pedig új </w:t>
+      </w:r>
+      <w:r>
+        <w:rPr>
+          <w:rFonts w:ascii="Arial" w:hAnsi="Arial" w:cs="Arial"/>
+          <w:i/>
+          <w:iCs/>
+        </w:rPr>
+        <w:t>DirectRoute</w:t>
+      </w:r>
+      <w:r>
+        <w:rPr>
+          <w:rFonts w:ascii="Arial" w:hAnsi="Arial" w:cs="Arial"/>
+        </w:rPr>
+        <w:t xml:space="preserve"> rekordot hoz létre. A művelet tranzakcionálisan valósul meg: hiba esetén a rendszer az összes módosítást visszavonja (rollback), ezáltal megelőzve az adatbázis részleges, inkonzisztens állapotát.</w:t>
+      </w:r>
+    </w:p>
+    <w:p>
+      <w:pPr>
+        <w:spacing w:line="360" w:lineRule="auto"/>
+        <w:jc w:val="both"/>
+        <w:rPr>
+          <w:rFonts w:ascii="Arial" w:hAnsi="Arial" w:cs="Arial"/>
+        </w:rPr>
+      </w:pPr>
+      <w:r>
+        <w:rPr>
+          <w:rFonts w:ascii="Arial" w:hAnsi="Arial" w:cs="Arial"/>
+        </w:rPr>
+        <w:t>5.10.2. Légitársaságonkénti adatgyűjtés</w:t>
+      </w:r>
+    </w:p>
+    <w:p>
+      <w:pPr>
+        <w:spacing w:line="360" w:lineRule="auto"/>
+        <w:jc w:val="both"/>
+        <w:rPr>
+          <w:rFonts w:ascii="Arial" w:hAnsi="Arial" w:cs="Arial"/>
+        </w:rPr>
+      </w:pPr>
+      <w:r>
+        <w:rPr>
+          <w:rFonts w:ascii="Arial" w:hAnsi="Arial" w:cs="Arial"/>
+        </w:rPr>
+        <w:t>Az egyes légitársaságokhoz tartozó adatgyűjtő modulok (</w:t>
+      </w:r>
+      <w:r>
+        <w:rPr>
+          <w:rFonts w:ascii="Arial" w:hAnsi="Arial" w:cs="Arial"/>
+          <w:i/>
+          <w:iCs/>
+        </w:rPr>
+        <w:t>scrapers/klm.py</w:t>
+      </w:r>
+      <w:r>
+        <w:rPr>
+          <w:rFonts w:ascii="Arial" w:hAnsi="Arial" w:cs="Arial"/>
+        </w:rPr>
+        <w:t xml:space="preserve">, </w:t>
+      </w:r>
+      <w:r>
+        <w:rPr>
+          <w:rFonts w:ascii="Arial" w:hAnsi="Arial" w:cs="Arial"/>
+          <w:i/>
+          <w:iCs/>
+        </w:rPr>
+        <w:t>scrapers/lufthansa.py</w:t>
+      </w:r>
+      <w:r>
+        <w:rPr>
+          <w:rFonts w:ascii="Arial" w:hAnsi="Arial" w:cs="Arial"/>
+        </w:rPr>
+        <w:t xml:space="preserve">, </w:t>
+      </w:r>
+      <w:r>
+        <w:rPr>
+          <w:rFonts w:ascii="Arial" w:hAnsi="Arial" w:cs="Arial"/>
+          <w:i/>
+          <w:iCs/>
+        </w:rPr>
+        <w:t>scrapers/ryanair.py</w:t>
+      </w:r>
+      <w:r>
+        <w:rPr>
+          <w:rFonts w:ascii="Arial" w:hAnsi="Arial" w:cs="Arial"/>
+        </w:rPr>
+        <w:t xml:space="preserve">, </w:t>
+      </w:r>
+      <w:r>
+        <w:rPr>
+          <w:rFonts w:ascii="Arial" w:hAnsi="Arial" w:cs="Arial"/>
+          <w:i/>
+          <w:iCs/>
+        </w:rPr>
+        <w:t>scrapers/wizzair.py</w:t>
+      </w:r>
+      <w:r>
+        <w:rPr>
+          <w:rFonts w:ascii="Arial" w:hAnsi="Arial" w:cs="Arial"/>
+        </w:rPr>
+        <w:t xml:space="preserve">) mindegyike a saját forrásának sajátosságaihoz igazodva szerzi be a járatadatokat, azonban a </w:t>
+      </w:r>
+      <w:r>
+        <w:rPr>
+          <w:rFonts w:ascii="Arial" w:hAnsi="Arial" w:cs="Arial"/>
+          <w:i/>
+          <w:iCs/>
         </w:rPr>
         <w:lastRenderedPageBreak/>
-        <w:t>megegyezik, vagy amelyek duplikáltak, és minderről egy stats szótárban statisztikát is vezet (lekérdezett, beszúrt, frissített és kihagyott útvonalak száma).</w:t>
-      </w:r>
-    </w:p>
-    <w:p>
-      <w:pPr>
-        <w:spacing w:line="360" w:lineRule="auto"/>
-        <w:jc w:val="both"/>
-        <w:rPr>
-          <w:rFonts w:ascii="Arial" w:hAnsi="Arial" w:cs="Arial"/>
-        </w:rPr>
-      </w:pPr>
-      <w:r>
-        <w:rPr>
-          <w:rFonts w:ascii="Arial" w:hAnsi="Arial" w:cs="Arial"/>
-        </w:rPr>
-        <w:t>Az adatbázisba mentés előtt a függvény biztosítja a hivatkozási integritást: minden előforduló légitársaságot és repülőteret ellenőriz, és amennyiben még nem szerepelnek az adatbázisban, a</w:t>
-      </w:r>
-      <w:r>
-        <w:rPr>
-          <w:rFonts w:ascii="Arial" w:hAnsi="Arial" w:cs="Arial"/>
-        </w:rPr>
-        <w:t>z</w:t>
-      </w:r>
-      <w:r>
-        <w:rPr>
-          <w:rFonts w:ascii="Arial" w:hAnsi="Arial" w:cs="Arial"/>
-        </w:rPr>
-        <w:t xml:space="preserve"> </w:t>
-      </w:r>
-      <w:r>
-        <w:rPr>
-          <w:rFonts w:ascii="Arial" w:hAnsi="Arial" w:cs="Arial"/>
-          <w:i/>
-          <w:iCs/>
-        </w:rPr>
-        <w:t>_ensure_airline</w:t>
-      </w:r>
-      <w:r>
-        <w:rPr>
-          <w:rFonts w:ascii="Arial" w:hAnsi="Arial" w:cs="Arial"/>
-        </w:rPr>
-        <w:t xml:space="preserve"> segédfüggvénnyel, illetve közvetlen </w:t>
-      </w:r>
-      <w:r>
-        <w:rPr>
-          <w:rFonts w:ascii="Arial" w:hAnsi="Arial" w:cs="Arial"/>
-          <w:i/>
-          <w:iCs/>
-        </w:rPr>
-        <w:t>Airport</w:t>
-      </w:r>
-      <w:r>
-        <w:rPr>
-          <w:rFonts w:ascii="Arial" w:hAnsi="Arial" w:cs="Arial"/>
-        </w:rPr>
-        <w:t xml:space="preserve"> rekord létrehozásával automatikusan felveszi őket. Ezt követően minden egyes útvonalhoz megvizsgálja, hogy az adott légitársaság–indulás–érkezés hármas már létezik-e az adatbázisban: amennyiben igen, a meglévő rekordot frissíti (pl. szezonalitás, érvényességi időszak), egyébként pedig új </w:t>
-      </w:r>
-      <w:r>
-        <w:rPr>
-          <w:rFonts w:ascii="Arial" w:hAnsi="Arial" w:cs="Arial"/>
-          <w:i/>
-          <w:iCs/>
-        </w:rPr>
-        <w:t>DirectRoute</w:t>
-      </w:r>
-      <w:r>
-        <w:rPr>
-          <w:rFonts w:ascii="Arial" w:hAnsi="Arial" w:cs="Arial"/>
-        </w:rPr>
-        <w:t xml:space="preserve"> rekordot hoz létre. A művelet tranzakcionálisan valósul meg: hiba esetén a rendszer az összes módosítást visszavonja (rollback), ezáltal megelőzve az adatbázis részleges, inkonzisztens állapotát.</w:t>
-      </w:r>
-    </w:p>
-    <w:p>
-      <w:pPr>
-        <w:spacing w:line="360" w:lineRule="auto"/>
-        <w:jc w:val="both"/>
-        <w:rPr>
-          <w:rFonts w:ascii="Arial" w:hAnsi="Arial" w:cs="Arial"/>
-        </w:rPr>
-      </w:pPr>
-      <w:r>
-        <w:rPr>
-          <w:rFonts w:ascii="Arial" w:hAnsi="Arial" w:cs="Arial"/>
-        </w:rPr>
-        <w:t>5.10.2. Légitársaságonkénti adatgyűjtés</w:t>
-      </w:r>
-    </w:p>
-    <w:p>
-      <w:pPr>
-        <w:spacing w:line="360" w:lineRule="auto"/>
-        <w:jc w:val="both"/>
-        <w:rPr>
-          <w:rFonts w:ascii="Arial" w:hAnsi="Arial" w:cs="Arial"/>
-        </w:rPr>
-      </w:pPr>
-      <w:r>
-        <w:rPr>
-          <w:rFonts w:ascii="Arial" w:hAnsi="Arial" w:cs="Arial"/>
-        </w:rPr>
-        <w:t>Az egyes légitársaságokhoz tartozó adatgyűjtő modulok (</w:t>
-      </w:r>
-      <w:r>
-        <w:rPr>
-          <w:rFonts w:ascii="Arial" w:hAnsi="Arial" w:cs="Arial"/>
-          <w:i/>
-          <w:iCs/>
-        </w:rPr>
-        <w:t>scrapers/klm.py</w:t>
-      </w:r>
-      <w:r>
-        <w:rPr>
-          <w:rFonts w:ascii="Arial" w:hAnsi="Arial" w:cs="Arial"/>
-        </w:rPr>
-        <w:t xml:space="preserve">, </w:t>
-      </w:r>
-      <w:r>
-        <w:rPr>
-          <w:rFonts w:ascii="Arial" w:hAnsi="Arial" w:cs="Arial"/>
-          <w:i/>
-          <w:iCs/>
-        </w:rPr>
-        <w:t>scrapers/lufthansa.py</w:t>
-      </w:r>
-      <w:r>
-        <w:rPr>
-          <w:rFonts w:ascii="Arial" w:hAnsi="Arial" w:cs="Arial"/>
-        </w:rPr>
-        <w:t xml:space="preserve">, </w:t>
-      </w:r>
-      <w:r>
-        <w:rPr>
-          <w:rFonts w:ascii="Arial" w:hAnsi="Arial" w:cs="Arial"/>
-          <w:i/>
-          <w:iCs/>
-        </w:rPr>
-        <w:t>scrapers/ryanair.py</w:t>
-      </w:r>
-      <w:r>
-        <w:rPr>
-          <w:rFonts w:ascii="Arial" w:hAnsi="Arial" w:cs="Arial"/>
-        </w:rPr>
-        <w:t xml:space="preserve">, </w:t>
-      </w:r>
-      <w:r>
-        <w:rPr>
-          <w:rFonts w:ascii="Arial" w:hAnsi="Arial" w:cs="Arial"/>
-          <w:i/>
-          <w:iCs/>
-        </w:rPr>
-        <w:t>scrapers/wizzair.py</w:t>
-      </w:r>
-      <w:r>
-        <w:rPr>
-          <w:rFonts w:ascii="Arial" w:hAnsi="Arial" w:cs="Arial"/>
-        </w:rPr>
-        <w:t xml:space="preserve">) mindegyike a saját forrásának sajátosságaihoz igazodva szerzi be a járatadatokat, azonban a </w:t>
-      </w:r>
-      <w:r>
-        <w:rPr>
-          <w:rFonts w:ascii="Arial" w:hAnsi="Arial" w:cs="Arial"/>
-          <w:i/>
-          <w:iCs/>
-        </w:rPr>
         <w:t>save_routes</w:t>
       </w:r>
       <w:r>
@@ -14111,14 +14450,7 @@
         <w:rPr>
           <w:rFonts w:ascii="Arial" w:hAnsi="Arial" w:cs="Arial"/>
         </w:rPr>
-        <w:t xml:space="preserve">-ját (/api/views/locate/3/routes) hívja meg, amely közvetlenül strukturált formában adja vissza az összes üzemeltetett útvonalat, a szezonalitásra </w:t>
-      </w:r>
-      <w:r>
-        <w:rPr>
-          <w:rFonts w:ascii="Arial" w:hAnsi="Arial" w:cs="Arial"/>
-        </w:rPr>
-        <w:lastRenderedPageBreak/>
-        <w:t xml:space="preserve">vonatkozó jelzéssel együtt. Az </w:t>
+        <w:t xml:space="preserve">-ját (/api/views/locate/3/routes) hívja meg, amely közvetlenül strukturált formában adja vissza az összes üzemeltetett útvonalat, a szezonalitásra vonatkozó jelzéssel együtt. Az </w:t>
       </w:r>
       <w:r>
         <w:rPr>
@@ -14336,6 +14668,7 @@
         <w:rPr>
           <w:rFonts w:ascii="Arial" w:hAnsi="Arial" w:cs="Arial"/>
         </w:rPr>
+        <w:lastRenderedPageBreak/>
         <w:t xml:space="preserve">A fordítások egy központi </w:t>
       </w:r>
       <w:r>
@@ -14500,7 +14833,6 @@
         <w:rPr>
           <w:rFonts w:ascii="Arial" w:hAnsi="Arial" w:cs="Arial"/>
         </w:rPr>
-        <w:lastRenderedPageBreak/>
         <w:t xml:space="preserve">A modul globálisan elérhető </w:t>
       </w:r>
       <w:r>
@@ -14740,6 +15072,7 @@
           <w:i/>
           <w:iCs/>
         </w:rPr>
+        <w:lastRenderedPageBreak/>
         <w:t>pytest</w:t>
       </w:r>
       <w:r>
@@ -14868,14 +15201,7 @@
         <w:rPr>
           <w:rFonts w:ascii="Arial" w:hAnsi="Arial" w:cs="Arial"/>
         </w:rPr>
-        <w:t xml:space="preserve">és a </w:t>
-      </w:r>
-      <w:r>
-        <w:rPr>
-          <w:rFonts w:ascii="Arial" w:hAnsi="Arial" w:cs="Arial"/>
-        </w:rPr>
-        <w:lastRenderedPageBreak/>
-        <w:t>hozzájuk kapcsolódó teljes kéréskezelési folyamat helyességét vizsgálják, valós adatbázis-műveletek mellett. Ezáltal</w:t>
+        <w:t>és a hozzájuk kapcsolódó teljes kéréskezelési folyamat helyességét vizsgálják, valós adatbázis-műveletek mellett. Ezáltal</w:t>
       </w:r>
       <w:r>
         <w:rPr>
@@ -15077,7 +15403,14 @@
         <w:rPr>
           <w:rFonts w:ascii="Arial" w:hAnsi="Arial" w:cs="Arial"/>
         </w:rPr>
-        <w:t xml:space="preserve"> modul mutatja, ami a DeepSeek API tényleges meghívásáért felelős. Ez utóbbi alacsonyabb értéke azzal magyarázható, hogy egy külső, fizetős szolgáltatás valós hívásainak automatizált, minden ágra kiterjedő tesztelése nem célszerű, ezért ez a modul elsősorban a felhasználást körülvevő logika szintjén van tesztelve.</w:t>
+        <w:t xml:space="preserve"> modul mutatja, ami a DeepSeek API tényleges meghívásáért felelős. Ez utóbbi alacsonyabb értéke azzal magyarázható, hogy egy külső, fizetős szolgáltatás valós hívásainak </w:t>
+      </w:r>
+      <w:r>
+        <w:rPr>
+          <w:rFonts w:ascii="Arial" w:hAnsi="Arial" w:cs="Arial"/>
+        </w:rPr>
+        <w:lastRenderedPageBreak/>
+        <w:t>automatizált, minden ágra kiterjedő tesztelése nem célszerű, ezért ez a modul elsősorban a felhasználást körülvevő logika szintjén van tesztelve.</w:t>
       </w:r>
     </w:p>
     <w:p>
@@ -15158,14 +15491,7 @@
         <w:rPr>
           <w:rFonts w:ascii="Arial" w:hAnsi="Arial" w:cs="Arial"/>
         </w:rPr>
-        <w:t xml:space="preserve">, akik körülbelül két héten keresztül, önállóan használták a rendszert. A tesztelés során arra kértem őket, hogy tervezzenek meg saját utazásokat, mentsenek el korábban meglátogatott helyeket, valamint általánosságban is próbálgassák végig az </w:t>
-      </w:r>
-      <w:r>
-        <w:rPr>
-          <w:rFonts w:ascii="Arial" w:hAnsi="Arial" w:cs="Arial"/>
-        </w:rPr>
-        <w:lastRenderedPageBreak/>
-        <w:t>alkalmazás funkcióit, és az eközben tapasztalt hibákról, problémákról, illetve fejlesztési javaslataikról adjanak visszajelzést.</w:t>
+        <w:t>, akik körülbelül két héten keresztül, önállóan használták a rendszert. A tesztelés során arra kértem őket, hogy tervezzenek meg saját utazásokat, mentsenek el korábban meglátogatott helyeket, valamint általánosságban is próbálgassák végig az alkalmazás funkcióit, és az eközben tapasztalt hibákról, problémákról, illetve fejlesztési javaslataikról adjanak visszajelzést.</w:t>
       </w:r>
     </w:p>
     <w:p>
@@ -15261,6 +15587,7 @@
         <w:rPr>
           <w:rFonts w:ascii="Arial" w:hAnsi="Arial" w:cs="Arial"/>
         </w:rPr>
+        <w:lastRenderedPageBreak/>
         <w:t xml:space="preserve">A projekt a későbbiekben több irányban is továbbfejleszthető. Az egyik lehetőség egy chatbot alapú asszisztens integrálása, amely támogatná a felhasználót új helyszínek és utazások létrehozásában, illetve a meglévők szerkesztésében, ezáltal gyorsabbá és intuitívabbá téve a tervezési folyamatot. </w:t>
       </w:r>
     </w:p>
@@ -15342,14 +15669,7 @@
         <w:rPr>
           <w:rFonts w:ascii="Arial" w:hAnsi="Arial" w:cs="Arial"/>
         </w:rPr>
-        <w:t xml:space="preserve"> a minél jobb és élvezetesebb utazások tervezése érdekében indokolt lenne figyelembe venni a különböző helyszínekhez adott értékeléseket is. Első lépésként csak a felhasználó saját, korábban bejárt helyszínekhez fűzött véleményét vehetné </w:t>
-      </w:r>
-      <w:r>
-        <w:rPr>
-          <w:rFonts w:ascii="Arial" w:hAnsi="Arial" w:cs="Arial"/>
-        </w:rPr>
-        <w:lastRenderedPageBreak/>
-        <w:t>figyelembe a rendszer, később azonban kiterjeszthető lenne az összes felhasználó értékelésének felhasználására is.</w:t>
+        <w:t xml:space="preserve"> a minél jobb és élvezetesebb utazások tervezése érdekében indokolt lenne figyelembe venni a különböző helyszínekhez adott értékeléseket is. Első lépésként csak a felhasználó saját, korábban bejárt helyszínekhez fűzött véleményét vehetné figyelembe a rendszer, később azonban kiterjeszthető lenne az összes felhasználó értékelésének felhasználására is.</w:t>
       </w:r>
     </w:p>
     <w:p>
@@ -15700,6 +16020,7 @@
         <w:rPr>
           <w:rFonts w:ascii="Arial" w:hAnsi="Arial" w:cs="Arial"/>
         </w:rPr>
+        <w:lastRenderedPageBreak/>
         <w:t xml:space="preserve">[2] </w:t>
       </w:r>
       <w:r>
@@ -16062,273 +16383,273 @@
         <w:rPr>
           <w:rFonts w:ascii="Arial" w:hAnsi="Arial" w:cs="Arial"/>
         </w:rPr>
+        <w:t>[12] api-docs.deepseek.com: JSON output-</w:t>
+      </w:r>
+      <w:r>
+        <w:rPr>
+          <w:rFonts w:ascii="Arial" w:hAnsi="Arial" w:cs="Arial"/>
+        </w:rPr>
+        <w:t>https://api-docs.deepseek.com/guides/json_mode</w:t>
+      </w:r>
+    </w:p>
+    <w:p>
+      <w:pPr>
+        <w:spacing w:line="360" w:lineRule="auto"/>
+        <w:rPr>
+          <w:rFonts w:ascii="Arial" w:hAnsi="Arial" w:cs="Arial"/>
+        </w:rPr>
+      </w:pPr>
+      <w:r>
+        <w:rPr>
+          <w:rFonts w:ascii="Arial" w:hAnsi="Arial" w:cs="Arial"/>
+        </w:rPr>
+        <w:t>[1</w:t>
+      </w:r>
+      <w:r>
+        <w:rPr>
+          <w:rFonts w:ascii="Arial" w:hAnsi="Arial" w:cs="Arial"/>
+        </w:rPr>
+        <w:t>3</w:t>
+      </w:r>
+      <w:r>
+        <w:rPr>
+          <w:rFonts w:ascii="Arial" w:hAnsi="Arial" w:cs="Arial"/>
+        </w:rPr>
+        <w:t xml:space="preserve">] </w:t>
+      </w:r>
+      <w:r>
+        <w:rPr>
+          <w:rFonts w:ascii="Arial" w:hAnsi="Arial" w:cs="Arial"/>
+        </w:rPr>
+        <w:t>nominatim.org: Nominatim 5.3.2 manual-</w:t>
+      </w:r>
+      <w:r>
+        <w:rPr>
+          <w:rFonts w:ascii="Arial" w:hAnsi="Arial" w:cs="Arial"/>
+        </w:rPr>
+        <w:t>https://nominatim.org/release-docs/latest/</w:t>
+      </w:r>
+      <w:r>
+        <w:rPr>
+          <w:rFonts w:ascii="Arial" w:hAnsi="Arial" w:cs="Arial"/>
+        </w:rPr>
+        <w:t xml:space="preserve"> </w:t>
+      </w:r>
+    </w:p>
+    <w:p>
+      <w:pPr>
+        <w:spacing w:line="360" w:lineRule="auto"/>
+        <w:rPr>
+          <w:rFonts w:ascii="Arial" w:hAnsi="Arial" w:cs="Arial"/>
+        </w:rPr>
+      </w:pPr>
+      <w:r>
+        <w:rPr>
+          <w:rFonts w:ascii="Arial" w:hAnsi="Arial" w:cs="Arial"/>
+        </w:rPr>
+        <w:t>[1</w:t>
+      </w:r>
+      <w:r>
+        <w:rPr>
+          <w:rFonts w:ascii="Arial" w:hAnsi="Arial" w:cs="Arial"/>
+        </w:rPr>
+        <w:t>4</w:t>
+      </w:r>
+      <w:r>
+        <w:rPr>
+          <w:rFonts w:ascii="Arial" w:hAnsi="Arial" w:cs="Arial"/>
+        </w:rPr>
+        <w:t xml:space="preserve">] </w:t>
+      </w:r>
+      <w:r>
+        <w:rPr>
+          <w:rFonts w:ascii="Arial" w:hAnsi="Arial" w:cs="Arial"/>
+        </w:rPr>
+        <w:t xml:space="preserve">developers.google.com: </w:t>
+      </w:r>
+      <w:r>
+        <w:rPr>
+          <w:rFonts w:ascii="Arial" w:hAnsi="Arial" w:cs="Arial"/>
+        </w:rPr>
+        <w:t>Using OAuth 2.0 to Access Google APIs</w:t>
+      </w:r>
+      <w:r>
+        <w:rPr>
+          <w:rFonts w:ascii="Arial" w:hAnsi="Arial" w:cs="Arial"/>
+        </w:rPr>
+        <w:t>-</w:t>
+      </w:r>
+      <w:r>
+        <w:rPr>
+          <w:rFonts w:ascii="Arial" w:hAnsi="Arial" w:cs="Arial"/>
+        </w:rPr>
+        <w:t>https://developers.google.com/identity/protocols/oauth2</w:t>
+      </w:r>
+    </w:p>
+    <w:p>
+      <w:pPr>
+        <w:spacing w:line="360" w:lineRule="auto"/>
+        <w:rPr>
+          <w:rFonts w:ascii="Arial" w:hAnsi="Arial" w:cs="Arial"/>
+        </w:rPr>
+      </w:pPr>
+      <w:r>
+        <w:rPr>
+          <w:rFonts w:ascii="Arial" w:hAnsi="Arial" w:cs="Arial"/>
+        </w:rPr>
+        <w:t>[1</w:t>
+      </w:r>
+      <w:r>
+        <w:rPr>
+          <w:rFonts w:ascii="Arial" w:hAnsi="Arial" w:cs="Arial"/>
+        </w:rPr>
+        <w:t>5</w:t>
+      </w:r>
+      <w:r>
+        <w:rPr>
+          <w:rFonts w:ascii="Arial" w:hAnsi="Arial" w:cs="Arial"/>
+        </w:rPr>
+        <w:t xml:space="preserve">] docs.pytest.org: </w:t>
+      </w:r>
+      <w:r>
+        <w:rPr>
+          <w:rFonts w:ascii="Arial" w:hAnsi="Arial" w:cs="Arial"/>
+        </w:rPr>
+        <w:t>pytest: helps you write better programs</w:t>
+      </w:r>
+      <w:r>
+        <w:rPr>
+          <w:rFonts w:ascii="Arial" w:hAnsi="Arial" w:cs="Arial"/>
+        </w:rPr>
+        <w:t>-</w:t>
+      </w:r>
+      <w:r>
+        <w:rPr>
+          <w:rFonts w:ascii="Arial" w:hAnsi="Arial" w:cs="Arial"/>
+        </w:rPr>
+        <w:t>https://docs.pytest.org/en/stable/index.html</w:t>
+      </w:r>
+    </w:p>
+    <w:p>
+      <w:pPr>
+        <w:spacing w:line="360" w:lineRule="auto"/>
+        <w:rPr>
+          <w:rFonts w:ascii="Arial" w:hAnsi="Arial" w:cs="Arial"/>
+        </w:rPr>
+      </w:pPr>
+      <w:r>
+        <w:rPr>
+          <w:rFonts w:ascii="Arial" w:hAnsi="Arial" w:cs="Arial"/>
+        </w:rPr>
+        <w:t>[1</w:t>
+      </w:r>
+      <w:r>
+        <w:rPr>
+          <w:rFonts w:ascii="Arial" w:hAnsi="Arial" w:cs="Arial"/>
+        </w:rPr>
+        <w:t>6</w:t>
+      </w:r>
+      <w:r>
+        <w:rPr>
+          <w:rFonts w:ascii="Arial" w:hAnsi="Arial" w:cs="Arial"/>
+        </w:rPr>
+        <w:t xml:space="preserve">] </w:t>
+      </w:r>
+      <w:r>
+        <w:rPr>
+          <w:rFonts w:ascii="Arial" w:hAnsi="Arial" w:cs="Arial"/>
+        </w:rPr>
+        <w:t>docs.github.com: GitHub Actions documentation-</w:t>
+      </w:r>
+      <w:r>
+        <w:rPr>
+          <w:rFonts w:ascii="Arial" w:hAnsi="Arial" w:cs="Arial"/>
+        </w:rPr>
+        <w:t>https://docs.github.com/en/actions</w:t>
+      </w:r>
+    </w:p>
+    <w:p>
+      <w:pPr>
+        <w:spacing w:line="360" w:lineRule="auto"/>
+        <w:rPr>
+          <w:rFonts w:ascii="Arial" w:hAnsi="Arial" w:cs="Arial"/>
+        </w:rPr>
+      </w:pPr>
+      <w:r>
+        <w:rPr>
+          <w:rFonts w:ascii="Arial" w:hAnsi="Arial" w:cs="Arial"/>
+        </w:rPr>
+        <w:t>[1</w:t>
+      </w:r>
+      <w:r>
+        <w:rPr>
+          <w:rFonts w:ascii="Arial" w:hAnsi="Arial" w:cs="Arial"/>
+        </w:rPr>
+        <w:t>7</w:t>
+      </w:r>
+      <w:r>
+        <w:rPr>
+          <w:rFonts w:ascii="Arial" w:hAnsi="Arial" w:cs="Arial"/>
+        </w:rPr>
+        <w:t>] code.visualstudio.com: Visual Studio Code documentation-</w:t>
+      </w:r>
+      <w:r>
+        <w:rPr>
+          <w:rFonts w:ascii="Arial" w:hAnsi="Arial" w:cs="Arial"/>
+        </w:rPr>
+        <w:t>https://code.visualstudio.com/docs</w:t>
+      </w:r>
+    </w:p>
+    <w:p>
+      <w:pPr>
+        <w:spacing w:line="360" w:lineRule="auto"/>
+        <w:rPr>
+          <w:rFonts w:ascii="Arial" w:hAnsi="Arial" w:cs="Arial"/>
+        </w:rPr>
+      </w:pPr>
+      <w:r>
+        <w:rPr>
+          <w:rFonts w:ascii="Arial" w:hAnsi="Arial" w:cs="Arial"/>
+        </w:rPr>
+        <w:t>[1</w:t>
+      </w:r>
+      <w:r>
+        <w:rPr>
+          <w:rFonts w:ascii="Arial" w:hAnsi="Arial" w:cs="Arial"/>
+        </w:rPr>
+        <w:t>8</w:t>
+      </w:r>
+      <w:r>
+        <w:rPr>
+          <w:rFonts w:ascii="Arial" w:hAnsi="Arial" w:cs="Arial"/>
+        </w:rPr>
+        <w:t xml:space="preserve">] </w:t>
+      </w:r>
+      <w:r>
+        <w:rPr>
+          <w:rFonts w:ascii="Arial" w:hAnsi="Arial" w:cs="Arial"/>
+        </w:rPr>
+        <w:t>coolify.io: Coolify-</w:t>
+      </w:r>
+      <w:r>
+        <w:rPr>
+          <w:rFonts w:ascii="Arial" w:hAnsi="Arial" w:cs="Arial"/>
+        </w:rPr>
+        <w:t>https://coolify.io/docs</w:t>
+      </w:r>
+    </w:p>
+    <w:p>
+      <w:pPr>
+        <w:spacing w:line="360" w:lineRule="auto"/>
+        <w:rPr>
+          <w:rFonts w:ascii="Arial" w:hAnsi="Arial" w:cs="Arial"/>
+        </w:rPr>
+      </w:pPr>
+      <w:r>
+        <w:rPr>
+          <w:rFonts w:ascii="Arial" w:hAnsi="Arial" w:cs="Arial"/>
+        </w:rPr>
         <w:lastRenderedPageBreak/>
-        <w:t>[12] api-docs.deepseek.com: JSON output-</w:t>
-      </w:r>
-      <w:r>
-        <w:rPr>
-          <w:rFonts w:ascii="Arial" w:hAnsi="Arial" w:cs="Arial"/>
-        </w:rPr>
-        <w:t>https://api-docs.deepseek.com/guides/json_mode</w:t>
-      </w:r>
-    </w:p>
-    <w:p>
-      <w:pPr>
-        <w:spacing w:line="360" w:lineRule="auto"/>
-        <w:rPr>
-          <w:rFonts w:ascii="Arial" w:hAnsi="Arial" w:cs="Arial"/>
-        </w:rPr>
-      </w:pPr>
-      <w:r>
-        <w:rPr>
-          <w:rFonts w:ascii="Arial" w:hAnsi="Arial" w:cs="Arial"/>
-        </w:rPr>
-        <w:t>[1</w:t>
-      </w:r>
-      <w:r>
-        <w:rPr>
-          <w:rFonts w:ascii="Arial" w:hAnsi="Arial" w:cs="Arial"/>
-        </w:rPr>
-        <w:t>3</w:t>
-      </w:r>
-      <w:r>
-        <w:rPr>
-          <w:rFonts w:ascii="Arial" w:hAnsi="Arial" w:cs="Arial"/>
-        </w:rPr>
-        <w:t xml:space="preserve">] </w:t>
-      </w:r>
-      <w:r>
-        <w:rPr>
-          <w:rFonts w:ascii="Arial" w:hAnsi="Arial" w:cs="Arial"/>
-        </w:rPr>
-        <w:t>nominatim.org: Nominatim 5.3.2 manual-</w:t>
-      </w:r>
-      <w:r>
-        <w:rPr>
-          <w:rFonts w:ascii="Arial" w:hAnsi="Arial" w:cs="Arial"/>
-        </w:rPr>
-        <w:t>https://nominatim.org/release-docs/latest/</w:t>
-      </w:r>
-      <w:r>
-        <w:rPr>
-          <w:rFonts w:ascii="Arial" w:hAnsi="Arial" w:cs="Arial"/>
-        </w:rPr>
-        <w:t xml:space="preserve"> </w:t>
-      </w:r>
-    </w:p>
-    <w:p>
-      <w:pPr>
-        <w:spacing w:line="360" w:lineRule="auto"/>
-        <w:rPr>
-          <w:rFonts w:ascii="Arial" w:hAnsi="Arial" w:cs="Arial"/>
-        </w:rPr>
-      </w:pPr>
-      <w:r>
-        <w:rPr>
-          <w:rFonts w:ascii="Arial" w:hAnsi="Arial" w:cs="Arial"/>
-        </w:rPr>
-        <w:t>[1</w:t>
-      </w:r>
-      <w:r>
-        <w:rPr>
-          <w:rFonts w:ascii="Arial" w:hAnsi="Arial" w:cs="Arial"/>
-        </w:rPr>
-        <w:t>4</w:t>
-      </w:r>
-      <w:r>
-        <w:rPr>
-          <w:rFonts w:ascii="Arial" w:hAnsi="Arial" w:cs="Arial"/>
-        </w:rPr>
-        <w:t xml:space="preserve">] </w:t>
-      </w:r>
-      <w:r>
-        <w:rPr>
-          <w:rFonts w:ascii="Arial" w:hAnsi="Arial" w:cs="Arial"/>
-        </w:rPr>
-        <w:t xml:space="preserve">developers.google.com: </w:t>
-      </w:r>
-      <w:r>
-        <w:rPr>
-          <w:rFonts w:ascii="Arial" w:hAnsi="Arial" w:cs="Arial"/>
-        </w:rPr>
-        <w:t>Using OAuth 2.0 to Access Google APIs</w:t>
-      </w:r>
-      <w:r>
-        <w:rPr>
-          <w:rFonts w:ascii="Arial" w:hAnsi="Arial" w:cs="Arial"/>
-        </w:rPr>
-        <w:t>-</w:t>
-      </w:r>
-      <w:r>
-        <w:rPr>
-          <w:rFonts w:ascii="Arial" w:hAnsi="Arial" w:cs="Arial"/>
-        </w:rPr>
-        <w:t>https://developers.google.com/identity/protocols/oauth2</w:t>
-      </w:r>
-    </w:p>
-    <w:p>
-      <w:pPr>
-        <w:spacing w:line="360" w:lineRule="auto"/>
-        <w:rPr>
-          <w:rFonts w:ascii="Arial" w:hAnsi="Arial" w:cs="Arial"/>
-        </w:rPr>
-      </w:pPr>
-      <w:r>
-        <w:rPr>
-          <w:rFonts w:ascii="Arial" w:hAnsi="Arial" w:cs="Arial"/>
-        </w:rPr>
-        <w:t>[1</w:t>
-      </w:r>
-      <w:r>
-        <w:rPr>
-          <w:rFonts w:ascii="Arial" w:hAnsi="Arial" w:cs="Arial"/>
-        </w:rPr>
-        <w:t>5</w:t>
-      </w:r>
-      <w:r>
-        <w:rPr>
-          <w:rFonts w:ascii="Arial" w:hAnsi="Arial" w:cs="Arial"/>
-        </w:rPr>
-        <w:t xml:space="preserve">] docs.pytest.org: </w:t>
-      </w:r>
-      <w:r>
-        <w:rPr>
-          <w:rFonts w:ascii="Arial" w:hAnsi="Arial" w:cs="Arial"/>
-        </w:rPr>
-        <w:t>pytest: helps you write better programs</w:t>
-      </w:r>
-      <w:r>
-        <w:rPr>
-          <w:rFonts w:ascii="Arial" w:hAnsi="Arial" w:cs="Arial"/>
-        </w:rPr>
-        <w:t>-</w:t>
-      </w:r>
-      <w:r>
-        <w:rPr>
-          <w:rFonts w:ascii="Arial" w:hAnsi="Arial" w:cs="Arial"/>
-        </w:rPr>
-        <w:t>https://docs.pytest.org/en/stable/index.html</w:t>
-      </w:r>
-    </w:p>
-    <w:p>
-      <w:pPr>
-        <w:spacing w:line="360" w:lineRule="auto"/>
-        <w:rPr>
-          <w:rFonts w:ascii="Arial" w:hAnsi="Arial" w:cs="Arial"/>
-        </w:rPr>
-      </w:pPr>
-      <w:r>
-        <w:rPr>
-          <w:rFonts w:ascii="Arial" w:hAnsi="Arial" w:cs="Arial"/>
-        </w:rPr>
-        <w:t>[1</w:t>
-      </w:r>
-      <w:r>
-        <w:rPr>
-          <w:rFonts w:ascii="Arial" w:hAnsi="Arial" w:cs="Arial"/>
-        </w:rPr>
-        <w:t>6</w:t>
-      </w:r>
-      <w:r>
-        <w:rPr>
-          <w:rFonts w:ascii="Arial" w:hAnsi="Arial" w:cs="Arial"/>
-        </w:rPr>
-        <w:t xml:space="preserve">] </w:t>
-      </w:r>
-      <w:r>
-        <w:rPr>
-          <w:rFonts w:ascii="Arial" w:hAnsi="Arial" w:cs="Arial"/>
-        </w:rPr>
-        <w:t>docs.github.com: GitHub Actions documentation-</w:t>
-      </w:r>
-      <w:r>
-        <w:rPr>
-          <w:rFonts w:ascii="Arial" w:hAnsi="Arial" w:cs="Arial"/>
-        </w:rPr>
-        <w:t>https://docs.github.com/en/actions</w:t>
-      </w:r>
-    </w:p>
-    <w:p>
-      <w:pPr>
-        <w:spacing w:line="360" w:lineRule="auto"/>
-        <w:rPr>
-          <w:rFonts w:ascii="Arial" w:hAnsi="Arial" w:cs="Arial"/>
-        </w:rPr>
-      </w:pPr>
-      <w:r>
-        <w:rPr>
-          <w:rFonts w:ascii="Arial" w:hAnsi="Arial" w:cs="Arial"/>
-        </w:rPr>
-        <w:t>[1</w:t>
-      </w:r>
-      <w:r>
-        <w:rPr>
-          <w:rFonts w:ascii="Arial" w:hAnsi="Arial" w:cs="Arial"/>
-        </w:rPr>
-        <w:t>7</w:t>
-      </w:r>
-      <w:r>
-        <w:rPr>
-          <w:rFonts w:ascii="Arial" w:hAnsi="Arial" w:cs="Arial"/>
-        </w:rPr>
-        <w:t>] code.visualstudio.com: Visual Studio Code documentation-</w:t>
-      </w:r>
-      <w:r>
-        <w:rPr>
-          <w:rFonts w:ascii="Arial" w:hAnsi="Arial" w:cs="Arial"/>
-        </w:rPr>
-        <w:t>https://code.visualstudio.com/docs</w:t>
-      </w:r>
-    </w:p>
-    <w:p>
-      <w:pPr>
-        <w:spacing w:line="360" w:lineRule="auto"/>
-        <w:rPr>
-          <w:rFonts w:ascii="Arial" w:hAnsi="Arial" w:cs="Arial"/>
-        </w:rPr>
-      </w:pPr>
-      <w:r>
-        <w:rPr>
-          <w:rFonts w:ascii="Arial" w:hAnsi="Arial" w:cs="Arial"/>
-        </w:rPr>
-        <w:t>[1</w:t>
-      </w:r>
-      <w:r>
-        <w:rPr>
-          <w:rFonts w:ascii="Arial" w:hAnsi="Arial" w:cs="Arial"/>
-        </w:rPr>
-        <w:t>8</w:t>
-      </w:r>
-      <w:r>
-        <w:rPr>
-          <w:rFonts w:ascii="Arial" w:hAnsi="Arial" w:cs="Arial"/>
-        </w:rPr>
-        <w:t xml:space="preserve">] </w:t>
-      </w:r>
-      <w:r>
-        <w:rPr>
-          <w:rFonts w:ascii="Arial" w:hAnsi="Arial" w:cs="Arial"/>
-        </w:rPr>
-        <w:t>coolify.io: Coolify-</w:t>
-      </w:r>
-      <w:r>
-        <w:rPr>
-          <w:rFonts w:ascii="Arial" w:hAnsi="Arial" w:cs="Arial"/>
-        </w:rPr>
-        <w:t>https://coolify.io/docs</w:t>
-      </w:r>
-    </w:p>
-    <w:p>
-      <w:pPr>
-        <w:spacing w:line="360" w:lineRule="auto"/>
-        <w:rPr>
-          <w:rFonts w:ascii="Arial" w:hAnsi="Arial" w:cs="Arial"/>
-        </w:rPr>
-      </w:pPr>
-      <w:r>
-        <w:rPr>
-          <w:rFonts w:ascii="Arial" w:hAnsi="Arial" w:cs="Arial"/>
-        </w:rPr>
         <w:t>[</w:t>
       </w:r>
       <w:r>
@@ -16491,7 +16812,7 @@
 </file>
 
 <file path=word/numbering.xml><?xml version="1.0" encoding="utf-8"?>
-<w:numbering xmlns:wpc="http://schemas.microsoft.com/office/word/2010/wordprocessingCanvas" xmlns:cx="http://schemas.microsoft.com/office/drawing/2014/chartex" xmlns:cx1="http://schemas.microsoft.com/office/drawing/2015/9/8/chartex" xmlns:cx2="http://schemas.microsoft.com/office/drawing/2015/10/21/chartex" xmlns:cx3="http://schemas.microsoft.com/office/drawing/2016/5/9/chartex" xmlns:cx4="http://schemas.microsoft.com/office/drawing/2016/5/10/chartex" xmlns:cx5="http://schemas.microsoft.com/office/drawing/2016/5/11/chartex" xmlns:cx6="http://schemas.microsoft.com/office/drawing/2016/5/12/chartex" xmlns:cx7="http://schemas.microsoft.com/office/drawing/2016/5/13/chartex" xmlns:cx8="http://schemas.microsoft.com/office/drawing/2016/5/14/chartex" xmlns:mc="http://schemas.openxmlformats.org/markup-compatibility/2006" xmlns:aink="http://schemas.microsoft.com/office/drawing/2016/ink" xmlns:am3d="http://schemas.microsoft.com/office/drawing/2017/model3d" xmlns:o="urn:schemas-microsoft-com:office:office" xmlns:oel="http://schemas.microsoft.com/office/2019/extlst" xmlns:r="http://schemas.openxmlformats.org/officeDocument/2006/relationships" xmlns:m="http://schemas.openxmlformats.org/officeDocument/2006/math" xmlns:v="urn:schemas-microsoft-com:vml" xmlns:wp14="http://schemas.microsoft.com/office/word/2010/wordprocessingDrawing" xmlns:wp="http://schemas.openxmlformats.org/drawingml/2006/wordprocessingDrawing" xmlns:w10="urn:schemas-microsoft-com:office:word" xmlns:w="http://schemas.openxmlformats.org/wordprocessingml/2006/main" xmlns:w14="http://schemas.microsoft.com/office/word/2010/wordml" xmlns:w15="http://schemas.microsoft.com/office/word/2012/wordml" xmlns:w16cei="http://schemas.microsoft.com/office/word/2026/wordml/cei" xmlns:w16cex="http://schemas.microsoft.com/office/word/2018/wordml/cex" xmlns:w16cid="http://schemas.microsoft.com/office/word/2016/wordml/cid" xmlns:w16="http://schemas.microsoft.com/office/word/2018/wordml" xmlns:w16du="http://schemas.microsoft.com/office/word/2023/wordml/word16du" xmlns:w16sdtdh="http://schemas.microsoft.com/office/word/2020/wordml/sdtdatahash" xmlns:w16sdtfl="http://schemas.microsoft.com/office/word/2024/wordml/sdtformatlock" xmlns:w16se="http://schemas.microsoft.com/office/word/2015/wordml/symex" xmlns:wpg="http://schemas.microsoft.com/office/word/2010/wordprocessingGroup" xmlns:wpi="http://schemas.microsoft.com/office/word/2010/wordprocessingInk" xmlns:wne="http://schemas.microsoft.com/office/word/2006/wordml" xmlns:wps="http://schemas.microsoft.com/office/word/2010/wordprocessingShape" mc:Ignorable="w14 w15 w16se w16cid w16 w16cex w16sdtdh w16sdtfl w16du wp14">
+<w:numbering xmlns:wpc="http://schemas.microsoft.com/office/word/2010/wordprocessingCanvas" xmlns:cx="http://schemas.microsoft.com/office/drawing/2014/chartex" xmlns:cx1="http://schemas.microsoft.com/office/drawing/2015/9/8/chartex" xmlns:cx2="http://schemas.microsoft.com/office/drawing/2015/10/21/chartex" xmlns:cx3="http://schemas.microsoft.com/office/drawing/2016/5/9/chartex" xmlns:cx4="http://schemas.microsoft.com/office/drawing/2016/5/10/chartex" xmlns:cx5="http://schemas.microsoft.com/office/drawing/2016/5/11/chartex" xmlns:cx6="http://schemas.microsoft.com/office/drawing/2016/5/12/chartex" xmlns:cx7="http://schemas.microsoft.com/office/drawing/2016/5/13/chartex" xmlns:cx8="http://schemas.microsoft.com/office/drawing/2016/5/14/chartex" xmlns:mc="http://schemas.openxmlformats.org/markup-compatibility/2006" xmlns:aink="http://schemas.microsoft.com/office/drawing/2016/ink" xmlns:am3d="http://schemas.microsoft.com/office/drawing/2017/model3d" xmlns:o="urn:schemas-microsoft-com:office:office" xmlns:oel="http://schemas.microsoft.com/office/2019/extlst" xmlns:r="http://schemas.openxmlformats.org/officeDocument/2006/relationships" xmlns:m="http://schemas.openxmlformats.org/officeDocument/2006/math" xmlns:v="urn:schemas-microsoft-com:vml" xmlns:wp14="http://schemas.microsoft.com/office/word/2010/wordprocessingDrawing" xmlns:wp="http://schemas.openxmlformats.org/drawingml/2006/wordprocessingDrawing" xmlns:w10="urn:schemas-microsoft-com:office:word" xmlns:w="http://schemas.openxmlformats.org/wordprocessingml/2006/main" xmlns:w14="http://schemas.microsoft.com/office/word/2010/wordml" xmlns:w15="http://schemas.microsoft.com/office/word/2012/wordml" xmlns:w16cex="http://schemas.microsoft.com/office/word/2018/wordml/cex" xmlns:w16cid="http://schemas.microsoft.com/office/word/2016/wordml/cid" xmlns:w16="http://schemas.microsoft.com/office/word/2018/wordml" xmlns:w16du="http://schemas.microsoft.com/office/word/2023/wordml/word16du" xmlns:w16sdtdh="http://schemas.microsoft.com/office/word/2020/wordml/sdtdatahash" xmlns:w16sdtfl="http://schemas.microsoft.com/office/word/2024/wordml/sdtformatlock" xmlns:w16se="http://schemas.microsoft.com/office/word/2015/wordml/symex" xmlns:wpg="http://schemas.microsoft.com/office/word/2010/wordprocessingGroup" xmlns:wpi="http://schemas.microsoft.com/office/word/2010/wordprocessingInk" xmlns:wne="http://schemas.microsoft.com/office/word/2006/wordml" xmlns:wps="http://schemas.microsoft.com/office/word/2010/wordprocessingShape" mc:Ignorable="w14 w15 w16se w16cid w16 w16cex w16sdtdh w16sdtfl w16du wp14">
   <w:abstractNum w:abstractNumId="0" w15:restartNumberingAfterBreak="0">
     <w:nsid w:val="057A4E51"/>
     <w:multiLevelType w:val="multilevel"/>
@@ -20375,6 +20696,7 @@
   <w:style w:type="paragraph" w:default="1" w:styleId="Normal">
     <w:name w:val="Normal"/>
     <w:qFormat/>
+    <w:rsid w:val="00223CE7"/>
   </w:style>
   <w:style w:type="paragraph" w:styleId="Heading1">
     <w:name w:val="heading 1"/>

</xml_diff>